<commit_message>
Add mission review guidance to planner system prompt
</commit_message>
<xml_diff>
--- a/15.docx
+++ b/15.docx
@@ -2249,16 +2249,479 @@
       </w:r>
       <w:r>
         <w:rPr>
+          <w:b/>
+          <w:bCs/>
+        </w:rPr>
+        <w:t>Updated Bottleneck Ranking</w:t>
+      </w:r>
+    </w:p>
+    <w:tbl>
+      <w:tblPr>
+        <w:tblW w:w="0" w:type="auto"/>
+        <w:tblCellSpacing w:w="15" w:type="dxa"/>
+        <w:tblCellMar>
+          <w:top w:w="15" w:type="dxa"/>
+          <w:left w:w="15" w:type="dxa"/>
+          <w:bottom w:w="15" w:type="dxa"/>
+          <w:right w:w="15" w:type="dxa"/>
+        </w:tblCellMar>
+        <w:tblLook w:val="04A0" w:firstRow="1" w:lastRow="0" w:firstColumn="1" w:lastColumn="0" w:noHBand="0" w:noVBand="1"/>
+      </w:tblPr>
+      <w:tblGrid>
+        <w:gridCol w:w="573"/>
+        <w:gridCol w:w="3778"/>
+        <w:gridCol w:w="1723"/>
+      </w:tblGrid>
+      <w:tr>
+        <w:trPr>
+          <w:tblHeader/>
+          <w:tblCellSpacing w:w="15" w:type="dxa"/>
+        </w:trPr>
+        <w:tc>
+          <w:tcPr>
+            <w:tcW w:w="0" w:type="auto"/>
+            <w:vAlign w:val="center"/>
+            <w:hideMark/>
+          </w:tcPr>
+          <w:p>
+            <w:pPr>
+              <w:rPr>
+                <w:b/>
+                <w:bCs/>
+              </w:rPr>
+            </w:pPr>
+            <w:r>
+              <w:rPr>
+                <w:b/>
+                <w:bCs/>
+              </w:rPr>
+              <w:t>Rank</w:t>
+            </w:r>
+          </w:p>
+        </w:tc>
+        <w:tc>
+          <w:tcPr>
+            <w:tcW w:w="0" w:type="auto"/>
+            <w:vAlign w:val="center"/>
+            <w:hideMark/>
+          </w:tcPr>
+          <w:p>
+            <w:pPr>
+              <w:rPr>
+                <w:b/>
+                <w:bCs/>
+              </w:rPr>
+            </w:pPr>
+            <w:r>
+              <w:rPr>
+                <w:b/>
+                <w:bCs/>
+              </w:rPr>
+              <w:t>Root Cause</w:t>
+            </w:r>
+          </w:p>
+        </w:tc>
+        <w:tc>
+          <w:tcPr>
+            <w:tcW w:w="0" w:type="auto"/>
+            <w:vAlign w:val="center"/>
+            <w:hideMark/>
+          </w:tcPr>
+          <w:p>
+            <w:pPr>
+              <w:rPr>
+                <w:b/>
+                <w:bCs/>
+              </w:rPr>
+            </w:pPr>
+            <w:r>
+              <w:rPr>
+                <w:b/>
+                <w:bCs/>
+              </w:rPr>
+              <w:t>Severity</w:t>
+            </w:r>
+          </w:p>
+        </w:tc>
+      </w:tr>
+      <w:tr>
+        <w:trPr>
+          <w:tblCellSpacing w:w="15" w:type="dxa"/>
+        </w:trPr>
+        <w:tc>
+          <w:tcPr>
+            <w:tcW w:w="0" w:type="auto"/>
+            <w:vAlign w:val="center"/>
+            <w:hideMark/>
+          </w:tcPr>
+          <w:p>
+            <w:r>
+              <w:t>1</w:t>
+            </w:r>
+          </w:p>
+        </w:tc>
+        <w:tc>
+          <w:tcPr>
+            <w:tcW w:w="0" w:type="auto"/>
+            <w:vAlign w:val="center"/>
+            <w:hideMark/>
+          </w:tcPr>
+          <w:p>
+            <w:r>
+              <w:t>Mission intelligence incomplete</w:t>
+            </w:r>
+          </w:p>
+        </w:tc>
+        <w:tc>
+          <w:tcPr>
+            <w:tcW w:w="0" w:type="auto"/>
+            <w:vAlign w:val="center"/>
+            <w:hideMark/>
+          </w:tcPr>
+          <w:p>
+            <w:r>
+              <w:rPr>
+                <w:rFonts w:ascii="Segoe UI Emoji" w:hAnsi="Segoe UI Emoji" w:cs="Segoe UI Emoji"/>
+              </w:rPr>
+              <w:t>⭐⭐⭐⭐⭐</w:t>
+            </w:r>
+          </w:p>
+        </w:tc>
+      </w:tr>
+      <w:tr>
+        <w:trPr>
+          <w:tblCellSpacing w:w="15" w:type="dxa"/>
+        </w:trPr>
+        <w:tc>
+          <w:tcPr>
+            <w:tcW w:w="0" w:type="auto"/>
+            <w:vAlign w:val="center"/>
+            <w:hideMark/>
+          </w:tcPr>
+          <w:p>
+            <w:r>
+              <w:t>2</w:t>
+            </w:r>
+          </w:p>
+        </w:tc>
+        <w:tc>
+          <w:tcPr>
+            <w:tcW w:w="0" w:type="auto"/>
+            <w:vAlign w:val="center"/>
+            <w:hideMark/>
+          </w:tcPr>
+          <w:p>
+            <w:r>
+              <w:t>Planner ignores execution feedback</w:t>
+            </w:r>
+          </w:p>
+        </w:tc>
+        <w:tc>
+          <w:tcPr>
+            <w:tcW w:w="0" w:type="auto"/>
+            <w:vAlign w:val="center"/>
+            <w:hideMark/>
+          </w:tcPr>
+          <w:p>
+            <w:r>
+              <w:rPr>
+                <w:rFonts w:ascii="Segoe UI Emoji" w:hAnsi="Segoe UI Emoji" w:cs="Segoe UI Emoji"/>
+              </w:rPr>
+              <w:t>⭐⭐⭐⭐⭐</w:t>
+            </w:r>
+          </w:p>
+        </w:tc>
+      </w:tr>
+      <w:tr>
+        <w:trPr>
+          <w:tblCellSpacing w:w="15" w:type="dxa"/>
+        </w:trPr>
+        <w:tc>
+          <w:tcPr>
+            <w:tcW w:w="0" w:type="auto"/>
+            <w:vAlign w:val="center"/>
+            <w:hideMark/>
+          </w:tcPr>
+          <w:p>
+            <w:r>
+              <w:t>3</w:t>
+            </w:r>
+          </w:p>
+        </w:tc>
+        <w:tc>
+          <w:tcPr>
+            <w:tcW w:w="0" w:type="auto"/>
+            <w:vAlign w:val="center"/>
+            <w:hideMark/>
+          </w:tcPr>
+          <w:p>
+            <w:r>
+              <w:t>Missing subgoal completion reasoning</w:t>
+            </w:r>
+          </w:p>
+        </w:tc>
+        <w:tc>
+          <w:tcPr>
+            <w:tcW w:w="0" w:type="auto"/>
+            <w:vAlign w:val="center"/>
+            <w:hideMark/>
+          </w:tcPr>
+          <w:p>
+            <w:r>
+              <w:rPr>
+                <w:rFonts w:ascii="Segoe UI Emoji" w:hAnsi="Segoe UI Emoji" w:cs="Segoe UI Emoji"/>
+              </w:rPr>
+              <w:t>⭐⭐⭐⭐⭐</w:t>
+            </w:r>
+          </w:p>
+        </w:tc>
+      </w:tr>
+      <w:tr>
+        <w:trPr>
+          <w:tblCellSpacing w:w="15" w:type="dxa"/>
+        </w:trPr>
+        <w:tc>
+          <w:tcPr>
+            <w:tcW w:w="0" w:type="auto"/>
+            <w:vAlign w:val="center"/>
+            <w:hideMark/>
+          </w:tcPr>
+          <w:p>
+            <w:r>
+              <w:t>4</w:t>
+            </w:r>
+          </w:p>
+        </w:tc>
+        <w:tc>
+          <w:tcPr>
+            <w:tcW w:w="0" w:type="auto"/>
+            <w:vAlign w:val="center"/>
+            <w:hideMark/>
+          </w:tcPr>
+          <w:p>
+            <w:r>
+              <w:t>Semantic action selection</w:t>
+            </w:r>
+          </w:p>
+        </w:tc>
+        <w:tc>
+          <w:tcPr>
+            <w:tcW w:w="0" w:type="auto"/>
+            <w:vAlign w:val="center"/>
+            <w:hideMark/>
+          </w:tcPr>
+          <w:p>
+            <w:r>
+              <w:rPr>
+                <w:rFonts w:ascii="Segoe UI Emoji" w:hAnsi="Segoe UI Emoji" w:cs="Segoe UI Emoji"/>
+              </w:rPr>
+              <w:t>⭐⭐⭐⭐</w:t>
+            </w:r>
+          </w:p>
+        </w:tc>
+      </w:tr>
+      <w:tr>
+        <w:trPr>
+          <w:tblCellSpacing w:w="15" w:type="dxa"/>
+        </w:trPr>
+        <w:tc>
+          <w:tcPr>
+            <w:tcW w:w="0" w:type="auto"/>
+            <w:vAlign w:val="center"/>
+            <w:hideMark/>
+          </w:tcPr>
+          <w:p>
+            <w:r>
+              <w:t>5</w:t>
+            </w:r>
+          </w:p>
+        </w:tc>
+        <w:tc>
+          <w:tcPr>
+            <w:tcW w:w="0" w:type="auto"/>
+            <w:vAlign w:val="center"/>
+            <w:hideMark/>
+          </w:tcPr>
+          <w:p>
+            <w:r>
+              <w:t>Missing completion detector</w:t>
+            </w:r>
+          </w:p>
+        </w:tc>
+        <w:tc>
+          <w:tcPr>
+            <w:tcW w:w="0" w:type="auto"/>
+            <w:vAlign w:val="center"/>
+            <w:hideMark/>
+          </w:tcPr>
+          <w:p>
+            <w:r>
+              <w:rPr>
+                <w:rFonts w:ascii="Segoe UI Emoji" w:hAnsi="Segoe UI Emoji" w:cs="Segoe UI Emoji"/>
+              </w:rPr>
+              <w:t>⭐⭐⭐⭐</w:t>
+            </w:r>
+          </w:p>
+        </w:tc>
+      </w:tr>
+      <w:tr>
+        <w:trPr>
+          <w:tblCellSpacing w:w="15" w:type="dxa"/>
+        </w:trPr>
+        <w:tc>
+          <w:tcPr>
+            <w:tcW w:w="0" w:type="auto"/>
+            <w:vAlign w:val="center"/>
+            <w:hideMark/>
+          </w:tcPr>
+          <w:p>
+            <w:r>
+              <w:t>6</w:t>
+            </w:r>
+          </w:p>
+        </w:tc>
+        <w:tc>
+          <w:tcPr>
+            <w:tcW w:w="0" w:type="auto"/>
+            <w:vAlign w:val="center"/>
+            <w:hideMark/>
+          </w:tcPr>
+          <w:p>
+            <w:r>
+              <w:t>Extraction reasoning</w:t>
+            </w:r>
+          </w:p>
+        </w:tc>
+        <w:tc>
+          <w:tcPr>
+            <w:tcW w:w="0" w:type="auto"/>
+            <w:vAlign w:val="center"/>
+            <w:hideMark/>
+          </w:tcPr>
+          <w:p>
+            <w:r>
+              <w:rPr>
+                <w:rFonts w:ascii="Segoe UI Emoji" w:hAnsi="Segoe UI Emoji" w:cs="Segoe UI Emoji"/>
+              </w:rPr>
+              <w:t>⭐⭐⭐⭐</w:t>
+            </w:r>
+          </w:p>
+        </w:tc>
+      </w:tr>
+      <w:tr>
+        <w:trPr>
+          <w:tblCellSpacing w:w="15" w:type="dxa"/>
+        </w:trPr>
+        <w:tc>
+          <w:tcPr>
+            <w:tcW w:w="0" w:type="auto"/>
+            <w:vAlign w:val="center"/>
+            <w:hideMark/>
+          </w:tcPr>
+          <w:p>
+            <w:r>
+              <w:t>7</w:t>
+            </w:r>
+          </w:p>
+        </w:tc>
+        <w:tc>
+          <w:tcPr>
+            <w:tcW w:w="0" w:type="auto"/>
+            <w:vAlign w:val="center"/>
+            <w:hideMark/>
+          </w:tcPr>
+          <w:p>
+            <w:r>
+              <w:t>Browser execution</w:t>
+            </w:r>
+          </w:p>
+        </w:tc>
+        <w:tc>
+          <w:tcPr>
+            <w:tcW w:w="0" w:type="auto"/>
+            <w:vAlign w:val="center"/>
+            <w:hideMark/>
+          </w:tcPr>
+          <w:p>
+            <w:r>
+              <w:rPr>
+                <w:rFonts w:ascii="Segoe UI Emoji" w:hAnsi="Segoe UI Emoji" w:cs="Segoe UI Emoji"/>
+              </w:rPr>
+              <w:t>⭐⭐</w:t>
+            </w:r>
+          </w:p>
+        </w:tc>
+      </w:tr>
+      <w:tr>
+        <w:trPr>
+          <w:tblCellSpacing w:w="15" w:type="dxa"/>
+        </w:trPr>
+        <w:tc>
+          <w:tcPr>
+            <w:tcW w:w="0" w:type="auto"/>
+            <w:vAlign w:val="center"/>
+            <w:hideMark/>
+          </w:tcPr>
+          <w:p>
+            <w:r>
+              <w:t>8</w:t>
+            </w:r>
+          </w:p>
+        </w:tc>
+        <w:tc>
+          <w:tcPr>
+            <w:tcW w:w="0" w:type="auto"/>
+            <w:vAlign w:val="center"/>
+            <w:hideMark/>
+          </w:tcPr>
+          <w:p>
+            <w:r>
+              <w:t>Environment</w:t>
+            </w:r>
+          </w:p>
+        </w:tc>
+        <w:tc>
+          <w:tcPr>
+            <w:tcW w:w="0" w:type="auto"/>
+            <w:vAlign w:val="center"/>
+            <w:hideMark/>
+          </w:tcPr>
+          <w:p>
+            <w:r>
+              <w:rPr>
+                <w:rFonts w:ascii="Segoe UI Emoji" w:hAnsi="Segoe UI Emoji" w:cs="Segoe UI Emoji"/>
+              </w:rPr>
+              <w:t>⭐</w:t>
+            </w:r>
+          </w:p>
+        </w:tc>
+      </w:tr>
+    </w:tbl>
+    <w:p>
+      <w:pPr>
+        <w:rPr>
+          <w:b/>
+          <w:bCs/>
+        </w:rPr>
+      </w:pPr>
+      <w:r>
+        <w:rPr>
           <w:lang w:val="en-US"/>
         </w:rPr>
         <w:br/>
       </w:r>
       <w:r>
         <w:rPr>
-          <w:b/>
-          <w:bCs/>
           <w:lang w:val="en-US"/>
         </w:rPr>
+        <w:br/>
+      </w:r>
+      <w:r>
+        <w:rPr>
+          <w:b/>
+          <w:bCs/>
+          <w:lang w:val="en-US"/>
+        </w:rPr>
         <w:t>Tasks for Testing</w:t>
       </w:r>
       <w:r>
@@ -2296,6 +2759,7 @@
     </w:p>
     <w:p>
       <w:r>
+        <w:lastRenderedPageBreak/>
         <w:t>text</w:t>
       </w:r>
     </w:p>
@@ -2356,8 +2820,184 @@
     </w:p>
     <w:p>
       <w:r>
+        <w:t>The task is currently blocked due to previous attempts to open the top 5 relevant results in new tabs failing. The next step is to open the first relevant search result that has not been opened yet.</w:t>
+      </w:r>
+    </w:p>
+    <w:p>
+      <w:r>
+        <w:rPr>
+          <w:rFonts w:ascii="Segoe UI Emoji" w:hAnsi="Segoe UI Emoji" w:cs="Segoe UI Emoji"/>
+          <w:b/>
+          <w:bCs/>
+        </w:rPr>
+        <w:t>⚡</w:t>
+      </w:r>
+    </w:p>
+    <w:p>
+      <w:r>
+        <w:rPr>
+          <w:b/>
+          <w:bCs/>
+        </w:rPr>
+        <w:t>Step 1NAVIGATE</w:t>
+      </w:r>
+      <w:r>
+        <w:t>This action will open Google Search in the current tab.</w:t>
+      </w:r>
+    </w:p>
+    <w:p>
+      <w:r>
+        <w:rPr>
+          <w:rFonts w:ascii="Segoe UI Emoji" w:hAnsi="Segoe UI Emoji" w:cs="Segoe UI Emoji"/>
+          <w:b/>
+          <w:bCs/>
+        </w:rPr>
+        <w:t>⚡</w:t>
+      </w:r>
+    </w:p>
+    <w:p>
+      <w:r>
+        <w:rPr>
+          <w:b/>
+          <w:bCs/>
+        </w:rPr>
+        <w:t>Step 2FILL</w:t>
+      </w:r>
+      <w:r>
+        <w:t>Fills the search input with the specified query to perform the search.</w:t>
+      </w:r>
+    </w:p>
+    <w:p>
+      <w:r>
+        <w:rPr>
+          <w:rFonts w:ascii="Segoe UI Emoji" w:hAnsi="Segoe UI Emoji" w:cs="Segoe UI Emoji"/>
+          <w:b/>
+          <w:bCs/>
+        </w:rPr>
+        <w:t>⚡</w:t>
+      </w:r>
+    </w:p>
+    <w:p>
+      <w:r>
+        <w:rPr>
+          <w:b/>
+          <w:bCs/>
+        </w:rPr>
+        <w:t>Step 3CLICK</w:t>
+      </w:r>
+      <w:r>
+        <w:t>Clicks the Google Search button to perform the search.</w:t>
+      </w:r>
+    </w:p>
+    <w:p>
+      <w:r>
+        <w:rPr>
+          <w:rFonts w:ascii="Segoe UI Emoji" w:hAnsi="Segoe UI Emoji" w:cs="Segoe UI Emoji"/>
+          <w:b/>
+          <w:bCs/>
+        </w:rPr>
+        <w:t>⚡</w:t>
+      </w:r>
+    </w:p>
+    <w:p>
+      <w:r>
+        <w:rPr>
+          <w:b/>
+          <w:bCs/>
+        </w:rPr>
+        <w:t>Step 4CLICK</w:t>
+      </w:r>
+      <w:r>
+        <w:t>Opens the first relevant search result in a new tab.</w:t>
+      </w:r>
+    </w:p>
+    <w:p>
+      <w:r>
+        <w:rPr>
+          <w:rFonts w:ascii="Segoe UI Emoji" w:hAnsi="Segoe UI Emoji" w:cs="Segoe UI Emoji"/>
+          <w:b/>
+          <w:bCs/>
+        </w:rPr>
+        <w:t>⚡</w:t>
+      </w:r>
+    </w:p>
+    <w:p>
+      <w:r>
+        <w:rPr>
+          <w:b/>
+          <w:bCs/>
+        </w:rPr>
+        <w:t>Step 5CLICK</w:t>
+      </w:r>
+      <w:r>
+        <w:t>Opens the second relevant search result in a new tab.</w:t>
+      </w:r>
+    </w:p>
+    <w:p>
+      <w:r>
+        <w:rPr>
+          <w:rFonts w:ascii="Segoe UI Emoji" w:hAnsi="Segoe UI Emoji" w:cs="Segoe UI Emoji"/>
+          <w:b/>
+          <w:bCs/>
+        </w:rPr>
+        <w:t>⚡</w:t>
+      </w:r>
+    </w:p>
+    <w:p>
+      <w:r>
+        <w:rPr>
+          <w:b/>
+          <w:bCs/>
+        </w:rPr>
+        <w:t>Step 6CLICK</w:t>
+      </w:r>
+      <w:r>
+        <w:t>Opens the third relevant search result in a new tab.</w:t>
+      </w:r>
+    </w:p>
+    <w:p>
+      <w:r>
+        <w:rPr>
+          <w:rFonts w:ascii="Segoe UI Emoji" w:hAnsi="Segoe UI Emoji" w:cs="Segoe UI Emoji"/>
+          <w:b/>
+          <w:bCs/>
+        </w:rPr>
+        <w:t>⚡</w:t>
+      </w:r>
+    </w:p>
+    <w:p>
+      <w:r>
+        <w:rPr>
+          <w:b/>
+          <w:bCs/>
+        </w:rPr>
+        <w:t>Step 7CLICK</w:t>
+      </w:r>
+      <w:r>
+        <w:t>Opens the fourth relevant search result in a new tab.</w:t>
+      </w:r>
+    </w:p>
+    <w:p>
+      <w:r>
+        <w:rPr>
+          <w:rFonts w:ascii="Segoe UI Emoji" w:hAnsi="Segoe UI Emoji" w:cs="Segoe UI Emoji"/>
+          <w:b/>
+          <w:bCs/>
+        </w:rPr>
         <w:lastRenderedPageBreak/>
-        <w:t>The user has successfully opened the first four search results in new tabs. However, there was an issue with opening the fifth result. I will attempt to open the fifth search result again.</w:t>
+        <w:t>⚡</w:t>
+      </w:r>
+    </w:p>
+    <w:p>
+      <w:r>
+        <w:rPr>
+          <w:b/>
+          <w:bCs/>
+        </w:rPr>
+        <w:t>Step 8CLICK</w:t>
+      </w:r>
+      <w:r>
+        <w:t>Opens the fifth relevant search result in a new tab.</w:t>
       </w:r>
     </w:p>
     <w:p>
@@ -2376,6 +3016,171 @@
           <w:b/>
           <w:bCs/>
         </w:rPr>
+        <w:t>Step 9WAIT</w:t>
+      </w:r>
+      <w:r>
+        <w:t>Wait for 5 seconds to allow time to read the opened tabs.</w:t>
+      </w:r>
+    </w:p>
+    <w:p>
+      <w:r>
+        <w:rPr>
+          <w:rFonts w:ascii="Segoe UI Emoji" w:hAnsi="Segoe UI Emoji" w:cs="Segoe UI Emoji"/>
+          <w:b/>
+          <w:bCs/>
+        </w:rPr>
+        <w:t>⚡</w:t>
+      </w:r>
+    </w:p>
+    <w:p>
+      <w:r>
+        <w:rPr>
+          <w:b/>
+          <w:bCs/>
+        </w:rPr>
+        <w:t>Step 10CLICK</w:t>
+      </w:r>
+      <w:r>
+        <w:t>Opens the first relevant search result in a new tab.</w:t>
+      </w:r>
+    </w:p>
+    <w:p/>
+    <w:p/>
+    <w:p>
+      <w:pPr>
+        <w:rPr>
+          <w:b/>
+          <w:bCs/>
+        </w:rPr>
+      </w:pPr>
+      <w:r>
+        <w:rPr>
+          <w:b/>
+          <w:bCs/>
+        </w:rPr>
+        <w:t>2) Find and extract contact details</w:t>
+      </w:r>
+    </w:p>
+    <w:p>
+      <w:r>
+        <w:rPr>
+          <w:b/>
+          <w:bCs/>
+        </w:rPr>
+        <w:t>Prompt:</w:t>
+      </w:r>
+    </w:p>
+    <w:p>
+      <w:r>
+        <w:t>text</w:t>
+      </w:r>
+    </w:p>
+    <w:p>
+      <w:r>
+        <w:t xml:space="preserve">Open Google Search and search for: `Hyderabad software </w:t>
+      </w:r>
+      <w:proofErr w:type="gramStart"/>
+      <w:r>
+        <w:t>companies</w:t>
+      </w:r>
+      <w:proofErr w:type="gramEnd"/>
+      <w:r>
+        <w:t xml:space="preserve"> careers`.</w:t>
+      </w:r>
+    </w:p>
+    <w:p/>
+    <w:p>
+      <w:r>
+        <w:t>Choose 3 company websites from the results that look relevant.</w:t>
+      </w:r>
+    </w:p>
+    <w:p/>
+    <w:p>
+      <w:r>
+        <w:t>For each company:</w:t>
+      </w:r>
+    </w:p>
+    <w:p>
+      <w:r>
+        <w:t>1. Open the careers page.</w:t>
+      </w:r>
+    </w:p>
+    <w:p>
+      <w:r>
+        <w:t>2. Find any current software developer or full stack developer openings.</w:t>
+      </w:r>
+    </w:p>
+    <w:p>
+      <w:r>
+        <w:t>3. Extract the job title, location, experience needed, and application link.</w:t>
+      </w:r>
+    </w:p>
+    <w:p>
+      <w:r>
+        <w:t>4. Return the result in a table.</w:t>
+      </w:r>
+      <w:r>
+        <w:br/>
+      </w:r>
+      <w:r>
+        <w:br/>
+      </w:r>
+      <w:r>
+        <w:t>Analysis failed: [object Object]</w:t>
+      </w:r>
+    </w:p>
+    <w:p>
+      <w:pPr>
+        <w:rPr>
+          <w:b/>
+          <w:bCs/>
+        </w:rPr>
+      </w:pPr>
+      <w:r>
+        <w:rPr>
+          <w:b/>
+          <w:bCs/>
+        </w:rPr>
+        <w:t>AI Analysis</w:t>
+      </w:r>
+    </w:p>
+    <w:p>
+      <w:r>
+        <w:t xml:space="preserve">The user has successfully navigated to the job details for 'Software Developer / Application Developer' at </w:t>
+      </w:r>
+      <w:proofErr w:type="spellStart"/>
+      <w:r>
+        <w:t>Aiconnectz</w:t>
+      </w:r>
+      <w:proofErr w:type="spellEnd"/>
+      <w:r>
+        <w:t xml:space="preserve">. However, the next step is to extract specific job information such as job title, location, experience needed, and application link. This information is necessary to </w:t>
+      </w:r>
+      <w:proofErr w:type="spellStart"/>
+      <w:r>
+        <w:t>fulfill</w:t>
+      </w:r>
+      <w:proofErr w:type="spellEnd"/>
+      <w:r>
+        <w:t xml:space="preserve"> the user's goal of compiling job openings. Report claim: This information is essential to complete the user's task of compiling job openings.</w:t>
+      </w:r>
+    </w:p>
+    <w:p>
+      <w:r>
+        <w:rPr>
+          <w:rFonts w:ascii="Segoe UI Emoji" w:hAnsi="Segoe UI Emoji" w:cs="Segoe UI Emoji"/>
+          <w:b/>
+          <w:bCs/>
+        </w:rPr>
+        <w:t>⚡</w:t>
+      </w:r>
+    </w:p>
+    <w:p>
+      <w:r>
+        <w:rPr>
+          <w:b/>
+          <w:bCs/>
+        </w:rPr>
         <w:t>Step 1NAVIGATE</w:t>
       </w:r>
       <w:r>
@@ -2389,6 +3194,7 @@
           <w:b/>
           <w:bCs/>
         </w:rPr>
+        <w:lastRenderedPageBreak/>
         <w:t>⚡</w:t>
       </w:r>
     </w:p>
@@ -2401,7 +3207,7 @@
         <w:t>Step 2FILL</w:t>
       </w:r>
       <w:r>
-        <w:t>Fills the search input with the specified query.</w:t>
+        <w:t>Fills the search input with the query 'Hyderabad software companies careers'.</w:t>
       </w:r>
     </w:p>
     <w:p>
@@ -2423,7 +3229,7 @@
         <w:t>Step 3CLICK</w:t>
       </w:r>
       <w:r>
-        <w:t>Submits the search form to retrieve results for the query.</w:t>
+        <w:t>This action clicks the 'Google Search' button to execute the search for the query.</w:t>
       </w:r>
     </w:p>
     <w:p>
@@ -2445,7 +3251,7 @@
         <w:t>Step 4CLICK</w:t>
       </w:r>
       <w:r>
-        <w:t>Open the first search result in a new tab.</w:t>
+        <w:t>Click on the first relevant company link for 'Hyderabad software companies careers for freshers'.</w:t>
       </w:r>
     </w:p>
     <w:p>
@@ -2467,7 +3273,7 @@
         <w:t>Step 5CLICK</w:t>
       </w:r>
       <w:r>
-        <w:t>Open the second search result in a new tab.</w:t>
+        <w:t>Click on the link for 'Hyderabad software companies careers for freshers salary' to access the relevant company information.</w:t>
       </w:r>
     </w:p>
     <w:p>
@@ -2489,7 +3295,7 @@
         <w:t>Step 6CLICK</w:t>
       </w:r>
       <w:r>
-        <w:t>Opens the third search result in a new tab.</w:t>
+        <w:t>Click on the link for 'Software Developer Fresher Jobs in Hyderabad' to access relevant job openings.</w:t>
       </w:r>
     </w:p>
     <w:p>
@@ -2511,7 +3317,195 @@
         <w:t>Step 7CLICK</w:t>
       </w:r>
       <w:r>
-        <w:t>Opens the fourth search result in a new tab.</w:t>
+        <w:t xml:space="preserve">Click on the job posting for 'Software Developer / Application Developer </w:t>
+      </w:r>
+      <w:proofErr w:type="spellStart"/>
+      <w:r>
+        <w:t>Aiconnectz</w:t>
+      </w:r>
+      <w:proofErr w:type="spellEnd"/>
+      <w:r>
+        <w:t>' to access the job details.</w:t>
+      </w:r>
+    </w:p>
+    <w:p/>
+    <w:p/>
+    <w:p>
+      <w:pPr>
+        <w:rPr>
+          <w:b/>
+          <w:bCs/>
+        </w:rPr>
+      </w:pPr>
+      <w:r>
+        <w:rPr>
+          <w:b/>
+          <w:bCs/>
+        </w:rPr>
+        <w:t>3) Job application discovery</w:t>
+      </w:r>
+    </w:p>
+    <w:p>
+      <w:r>
+        <w:rPr>
+          <w:b/>
+          <w:bCs/>
+        </w:rPr>
+        <w:t>Prompt:</w:t>
+      </w:r>
+    </w:p>
+    <w:p>
+      <w:r>
+        <w:t>text</w:t>
+      </w:r>
+    </w:p>
+    <w:p>
+      <w:r>
+        <w:t>Go to LinkedIn Jobs and search for: `Full Stack Java Developer Hyderabad`.</w:t>
+      </w:r>
+    </w:p>
+    <w:p/>
+    <w:p>
+      <w:r>
+        <w:t>Apply these filters if available:</w:t>
+      </w:r>
+    </w:p>
+    <w:p>
+      <w:r>
+        <w:t>- Experience level: Entry level or Associate</w:t>
+      </w:r>
+    </w:p>
+    <w:p>
+      <w:r>
+        <w:t>- Date posted: Past week</w:t>
+      </w:r>
+    </w:p>
+    <w:p>
+      <w:r>
+        <w:t>- On-site/Hybrid/Remote: any</w:t>
+      </w:r>
+    </w:p>
+    <w:p/>
+    <w:p>
+      <w:r>
+        <w:t>Then:</w:t>
+      </w:r>
+    </w:p>
+    <w:p>
+      <w:r>
+        <w:lastRenderedPageBreak/>
+        <w:t>1. Collect the first 10 relevant jobs.</w:t>
+      </w:r>
+    </w:p>
+    <w:p>
+      <w:r>
+        <w:t>2. For each job, capture title, company, location, posted date, and job link.</w:t>
+      </w:r>
+    </w:p>
+    <w:p>
+      <w:r>
+        <w:t>3. Remove duplicates.</w:t>
+      </w:r>
+    </w:p>
+    <w:p>
+      <w:r>
+        <w:t>4. Return the jobs ranked by relevance.</w:t>
+      </w:r>
+      <w:r>
+        <w:br/>
+      </w:r>
+      <w:r>
+        <w:br/>
+      </w:r>
+    </w:p>
+    <w:p/>
+    <w:p>
+      <w:pPr>
+        <w:rPr>
+          <w:b/>
+          <w:bCs/>
+        </w:rPr>
+      </w:pPr>
+      <w:r>
+        <w:rPr>
+          <w:b/>
+          <w:bCs/>
+        </w:rPr>
+        <w:t>4) Product pricing comparison</w:t>
+      </w:r>
+    </w:p>
+    <w:p>
+      <w:r>
+        <w:rPr>
+          <w:b/>
+          <w:bCs/>
+        </w:rPr>
+        <w:t>Prompt:</w:t>
+      </w:r>
+    </w:p>
+    <w:p>
+      <w:r>
+        <w:t>text</w:t>
+      </w:r>
+    </w:p>
+    <w:p>
+      <w:r>
+        <w:t>Open the official websites of 3 AI code assistant products from search results.</w:t>
+      </w:r>
+    </w:p>
+    <w:p/>
+    <w:p>
+      <w:r>
+        <w:t>For each product:</w:t>
+      </w:r>
+    </w:p>
+    <w:p>
+      <w:r>
+        <w:t>1. Find the pricing page.</w:t>
+      </w:r>
+    </w:p>
+    <w:p>
+      <w:r>
+        <w:t>2. Capture the free plan, paid plan starting price, and whether a trial is available.</w:t>
+      </w:r>
+    </w:p>
+    <w:p>
+      <w:r>
+        <w:t>3. Capture one feature that is clearly mentioned on the pricing or product page.</w:t>
+      </w:r>
+    </w:p>
+    <w:p>
+      <w:r>
+        <w:t>4. Return a comparison table with source URLs.</w:t>
+      </w:r>
+      <w:r>
+        <w:br/>
+      </w:r>
+      <w:r>
+        <w:br/>
+      </w:r>
+      <w:r>
+        <w:t>Analysis failed: [object Object]</w:t>
+      </w:r>
+    </w:p>
+    <w:p>
+      <w:pPr>
+        <w:rPr>
+          <w:b/>
+          <w:bCs/>
+        </w:rPr>
+      </w:pPr>
+      <w:r>
+        <w:rPr>
+          <w:b/>
+          <w:bCs/>
+        </w:rPr>
+        <w:t>AI Analysis</w:t>
+      </w:r>
+    </w:p>
+    <w:p>
+      <w:r>
+        <w:t>The task is currently blocked as previous attempts to access the pricing information for Gemini Code Assist have not yielded the desired results. The next step is to try a different link to access the pricing information.</w:t>
       </w:r>
     </w:p>
     <w:p>
@@ -2530,10 +3524,165 @@
           <w:b/>
           <w:bCs/>
         </w:rPr>
+        <w:t>Step 1NAVIGATE</w:t>
+      </w:r>
+      <w:r>
+        <w:t>This action will open Google to search for AI code assistant products.</w:t>
+      </w:r>
+    </w:p>
+    <w:p>
+      <w:r>
+        <w:rPr>
+          <w:rFonts w:ascii="Segoe UI Emoji" w:hAnsi="Segoe UI Emoji" w:cs="Segoe UI Emoji"/>
+          <w:b/>
+          <w:bCs/>
+        </w:rPr>
+        <w:t>⚡</w:t>
+      </w:r>
+    </w:p>
+    <w:p>
+      <w:r>
+        <w:rPr>
+          <w:b/>
+          <w:bCs/>
+        </w:rPr>
+        <w:t>Step 2FILL</w:t>
+      </w:r>
+      <w:r>
+        <w:t>This fills the search input with the query to find AI code assistant products.</w:t>
+      </w:r>
+    </w:p>
+    <w:p>
+      <w:r>
+        <w:rPr>
+          <w:rFonts w:ascii="Segoe UI Emoji" w:hAnsi="Segoe UI Emoji" w:cs="Segoe UI Emoji"/>
+          <w:b/>
+          <w:bCs/>
+        </w:rPr>
+        <w:t>⚡</w:t>
+      </w:r>
+    </w:p>
+    <w:p>
+      <w:r>
+        <w:rPr>
+          <w:b/>
+          <w:bCs/>
+        </w:rPr>
+        <w:t>Step 3CLICK</w:t>
+      </w:r>
+      <w:r>
+        <w:t>Click the Google Search button to perform the search for AI code assistant products.</w:t>
+      </w:r>
+    </w:p>
+    <w:p>
+      <w:r>
+        <w:rPr>
+          <w:rFonts w:ascii="Segoe UI Emoji" w:hAnsi="Segoe UI Emoji" w:cs="Segoe UI Emoji"/>
+          <w:b/>
+          <w:bCs/>
+        </w:rPr>
+        <w:lastRenderedPageBreak/>
+        <w:t>⚡</w:t>
+      </w:r>
+    </w:p>
+    <w:p>
+      <w:r>
+        <w:rPr>
+          <w:b/>
+          <w:bCs/>
+        </w:rPr>
+        <w:t>Step 4CLICK</w:t>
+      </w:r>
+      <w:r>
+        <w:t>Open the official website for Gemini Code Assist.</w:t>
+      </w:r>
+    </w:p>
+    <w:p>
+      <w:r>
+        <w:rPr>
+          <w:rFonts w:ascii="Segoe UI Emoji" w:hAnsi="Segoe UI Emoji" w:cs="Segoe UI Emoji"/>
+          <w:b/>
+          <w:bCs/>
+        </w:rPr>
+        <w:t>⚡</w:t>
+      </w:r>
+    </w:p>
+    <w:p>
+      <w:r>
+        <w:rPr>
+          <w:b/>
+          <w:bCs/>
+        </w:rPr>
+        <w:t>Step 5CLICK</w:t>
+      </w:r>
+      <w:r>
+        <w:t>Click the pricing link to access the pricing page for Gemini Code Assist.</w:t>
+      </w:r>
+    </w:p>
+    <w:p>
+      <w:r>
+        <w:rPr>
+          <w:rFonts w:ascii="Segoe UI Emoji" w:hAnsi="Segoe UI Emoji" w:cs="Segoe UI Emoji"/>
+          <w:b/>
+          <w:bCs/>
+        </w:rPr>
+        <w:t>⚡</w:t>
+      </w:r>
+    </w:p>
+    <w:p>
+      <w:r>
+        <w:rPr>
+          <w:b/>
+          <w:bCs/>
+        </w:rPr>
+        <w:t>Step 6CLICK</w:t>
+      </w:r>
+      <w:r>
+        <w:t>Click the link for Gemini Code Assist Standard and Enterprise to access the pricing information.</w:t>
+      </w:r>
+    </w:p>
+    <w:p>
+      <w:r>
+        <w:rPr>
+          <w:rFonts w:ascii="Segoe UI Emoji" w:hAnsi="Segoe UI Emoji" w:cs="Segoe UI Emoji"/>
+          <w:b/>
+          <w:bCs/>
+        </w:rPr>
+        <w:t>⚡</w:t>
+      </w:r>
+    </w:p>
+    <w:p>
+      <w:r>
+        <w:rPr>
+          <w:b/>
+          <w:bCs/>
+        </w:rPr>
+        <w:t>Step 7CLICK</w:t>
+      </w:r>
+      <w:r>
+        <w:t>Click the link for Gemini Cloud Assist Pricing Overview to access the pricing information.</w:t>
+      </w:r>
+    </w:p>
+    <w:p>
+      <w:r>
+        <w:rPr>
+          <w:rFonts w:ascii="Segoe UI Emoji" w:hAnsi="Segoe UI Emoji" w:cs="Segoe UI Emoji"/>
+          <w:b/>
+          <w:bCs/>
+        </w:rPr>
+        <w:t>⚡</w:t>
+      </w:r>
+    </w:p>
+    <w:p>
+      <w:r>
+        <w:rPr>
+          <w:b/>
+          <w:bCs/>
+        </w:rPr>
         <w:t>Step 8CLICK</w:t>
       </w:r>
       <w:r>
-        <w:t>Open the fifth search result in a new tab.</w:t>
+        <w:t>Click the link to access the pricing information for Gemini Code Assist Standard and Enterprise.</w:t>
       </w:r>
     </w:p>
     <w:p>
@@ -2555,7 +3704,111 @@
         <w:t>Step 9CLICK</w:t>
       </w:r>
       <w:r>
-        <w:t>Opens the fifth search result in a new tab.</w:t>
+        <w:t>Click the link for Gemini Code Assist pricing to access the pricing information.</w:t>
+      </w:r>
+    </w:p>
+    <w:p/>
+    <w:p>
+      <w:r>
+        <w:br/>
+      </w:r>
+    </w:p>
+    <w:p>
+      <w:pPr>
+        <w:rPr>
+          <w:b/>
+          <w:bCs/>
+        </w:rPr>
+      </w:pPr>
+      <w:r>
+        <w:rPr>
+          <w:b/>
+          <w:bCs/>
+        </w:rPr>
+        <w:t>5) Long form research extraction</w:t>
+      </w:r>
+    </w:p>
+    <w:p>
+      <w:r>
+        <w:rPr>
+          <w:b/>
+          <w:bCs/>
+        </w:rPr>
+        <w:t>Prompt:</w:t>
+      </w:r>
+    </w:p>
+    <w:p>
+      <w:r>
+        <w:t>text</w:t>
+      </w:r>
+    </w:p>
+    <w:p>
+      <w:r>
+        <w:t>Search the web for official documentation or product pages about browser automation tools.</w:t>
+      </w:r>
+    </w:p>
+    <w:p/>
+    <w:p>
+      <w:r>
+        <w:t>Pick 3 different tools and for each one:</w:t>
+      </w:r>
+    </w:p>
+    <w:p>
+      <w:r>
+        <w:t>1. Find the official documentation page.</w:t>
+      </w:r>
+    </w:p>
+    <w:p>
+      <w:r>
+        <w:t>2. Extract the supported languages, main use case, and whether it supports browser control.</w:t>
+      </w:r>
+    </w:p>
+    <w:p>
+      <w:r>
+        <w:t>3. Note one setup requirement.</w:t>
+      </w:r>
+    </w:p>
+    <w:p>
+      <w:r>
+        <w:lastRenderedPageBreak/>
+        <w:t>4. Return the answer in markdown bullets, grouped by tool.</w:t>
+      </w:r>
+      <w:r>
+        <w:br/>
+      </w:r>
+      <w:r>
+        <w:br/>
+      </w:r>
+      <w:r>
+        <w:t xml:space="preserve">Analysis failed: </w:t>
+      </w:r>
+      <w:proofErr w:type="spellStart"/>
+      <w:r>
+        <w:t>OpenRouter</w:t>
+      </w:r>
+      <w:proofErr w:type="spellEnd"/>
+      <w:r>
+        <w:t xml:space="preserve"> API error: Prompt tokens limit exceeded: 7136 &gt; 6591. To increase, visit https://openrouter.ai/settings/credits and upgrade to a paid account</w:t>
+      </w:r>
+    </w:p>
+    <w:p>
+      <w:pPr>
+        <w:rPr>
+          <w:b/>
+          <w:bCs/>
+        </w:rPr>
+      </w:pPr>
+      <w:r>
+        <w:rPr>
+          <w:b/>
+          <w:bCs/>
+        </w:rPr>
+        <w:t>AI Analysis</w:t>
+      </w:r>
+    </w:p>
+    <w:p>
+      <w:r>
+        <w:t>The user has successfully clicked on a search result for 'browser automation tools free', but the page does not contain the necessary documentation or product pages for the tools. The next step is to click on another relevant search result to gather more information.</w:t>
       </w:r>
     </w:p>
     <w:p>
@@ -2574,143 +3827,10 @@
           <w:b/>
           <w:bCs/>
         </w:rPr>
-        <w:t>Step 10CLICK</w:t>
-      </w:r>
-      <w:r>
-        <w:t>Open the fifth search result in a new tab.</w:t>
-      </w:r>
-    </w:p>
-    <w:p/>
-    <w:p>
-      <w:pPr>
-        <w:rPr>
-          <w:b/>
-          <w:bCs/>
-        </w:rPr>
-      </w:pPr>
-      <w:r>
-        <w:rPr>
-          <w:b/>
-          <w:bCs/>
-        </w:rPr>
-        <w:t>2) Find and extract contact details</w:t>
-      </w:r>
-    </w:p>
-    <w:p>
-      <w:r>
-        <w:rPr>
-          <w:b/>
-          <w:bCs/>
-        </w:rPr>
-        <w:t>Prompt:</w:t>
-      </w:r>
-    </w:p>
-    <w:p>
-      <w:r>
-        <w:t>text</w:t>
-      </w:r>
-    </w:p>
-    <w:p>
-      <w:r>
-        <w:t xml:space="preserve">Open Google Search and search for: `Hyderabad software </w:t>
-      </w:r>
-      <w:proofErr w:type="gramStart"/>
-      <w:r>
-        <w:t>companies</w:t>
-      </w:r>
-      <w:proofErr w:type="gramEnd"/>
-      <w:r>
-        <w:t xml:space="preserve"> careers`.</w:t>
-      </w:r>
-    </w:p>
-    <w:p/>
-    <w:p>
-      <w:r>
-        <w:lastRenderedPageBreak/>
-        <w:t>Choose 3 company websites from the results that look relevant.</w:t>
-      </w:r>
-    </w:p>
-    <w:p/>
-    <w:p>
-      <w:r>
-        <w:t>For each company:</w:t>
-      </w:r>
-    </w:p>
-    <w:p>
-      <w:r>
-        <w:t>1. Open the careers page.</w:t>
-      </w:r>
-    </w:p>
-    <w:p>
-      <w:r>
-        <w:t>2. Find any current software developer or full stack developer openings.</w:t>
-      </w:r>
-    </w:p>
-    <w:p>
-      <w:r>
-        <w:t>3. Extract the job title, location, experience needed, and application link.</w:t>
-      </w:r>
-    </w:p>
-    <w:p>
-      <w:r>
-        <w:t>4. Return the result in a table.</w:t>
-      </w:r>
-      <w:r>
-        <w:br/>
-      </w:r>
-      <w:r>
-        <w:br/>
-      </w:r>
-      <w:r>
-        <w:t>Stopped because the assistant proposed a repeated browser action instead of making progress.</w:t>
-      </w:r>
-    </w:p>
-    <w:p>
-      <w:pPr>
-        <w:rPr>
-          <w:b/>
-          <w:bCs/>
-        </w:rPr>
-      </w:pPr>
-      <w:r>
-        <w:rPr>
-          <w:b/>
-          <w:bCs/>
-        </w:rPr>
-        <w:t>AI Analysis</w:t>
-      </w:r>
-    </w:p>
-    <w:p>
-      <w:r>
-        <w:t xml:space="preserve">The Google Search button is visible and needs to be clicked to perform the search for 'Hyderabad software </w:t>
-      </w:r>
-      <w:proofErr w:type="gramStart"/>
-      <w:r>
-        <w:t>companies</w:t>
-      </w:r>
-      <w:proofErr w:type="gramEnd"/>
-      <w:r>
-        <w:t xml:space="preserve"> careers'.</w:t>
-      </w:r>
-    </w:p>
-    <w:p>
-      <w:pPr>
-        <w:rPr>
-          <w:b/>
-          <w:bCs/>
-        </w:rPr>
-      </w:pPr>
-      <w:r>
-        <w:rPr>
-          <w:b/>
-          <w:bCs/>
-        </w:rPr>
-        <w:t>Goal convergence</w:t>
-      </w:r>
-    </w:p>
-    <w:p>
-      <w:r>
-        <w:t>Semantic progress has stalled.</w:t>
+        <w:t>Step 1NAVIGATE</w:t>
+      </w:r>
+      <w:r>
+        <w:t>This will open Google to start searching for browser automation tools.</w:t>
       </w:r>
     </w:p>
     <w:p>
@@ -2729,10 +3849,10 @@
           <w:b/>
           <w:bCs/>
         </w:rPr>
-        <w:t>Step 1NAVIGATE</w:t>
-      </w:r>
-      <w:r>
-        <w:t>This action opens Google Search to perform the required search.</w:t>
+        <w:t>Step 2FILL</w:t>
+      </w:r>
+      <w:r>
+        <w:t>This fills the search input with the query for browser automation tools.</w:t>
       </w:r>
     </w:p>
     <w:p>
@@ -2751,10 +3871,10 @@
           <w:b/>
           <w:bCs/>
         </w:rPr>
-        <w:t>Step 2FILL</w:t>
-      </w:r>
-      <w:r>
-        <w:t>Fills the search input with the query to search for relevant companies.</w:t>
+        <w:t>Step 3CLICK</w:t>
+      </w:r>
+      <w:r>
+        <w:t>This clicks the 'Google Search' button to perform the search for browser automation tools.</w:t>
       </w:r>
     </w:p>
     <w:p>
@@ -2773,108 +3893,36 @@
           <w:b/>
           <w:bCs/>
         </w:rPr>
-        <w:t>Step 3CLICK</w:t>
-      </w:r>
-      <w:r>
-        <w:t xml:space="preserve">This action clicks the Google Search button to perform the search for 'Hyderabad software </w:t>
-      </w:r>
-      <w:proofErr w:type="gramStart"/>
-      <w:r>
-        <w:t>companies</w:t>
-      </w:r>
-      <w:proofErr w:type="gramEnd"/>
-      <w:r>
-        <w:t xml:space="preserve"> careers'.</w:t>
-      </w:r>
-    </w:p>
-    <w:p>
-      <w:r>
-        <w:rPr>
-          <w:rFonts w:ascii="Segoe UI Emoji" w:hAnsi="Segoe UI Emoji" w:cs="Segoe UI Emoji"/>
-          <w:b/>
-          <w:bCs/>
-        </w:rPr>
-        <w:t>⚡</w:t>
-      </w:r>
-    </w:p>
-    <w:p>
-      <w:r>
-        <w:rPr>
-          <w:b/>
-          <w:bCs/>
-        </w:rPr>
         <w:t>Step 4CLICK</w:t>
       </w:r>
       <w:r>
-        <w:t xml:space="preserve">Click on the link for Software Engineering jobs in Hyderabad on </w:t>
+        <w:t>Click on the search result for 'browser automation tools free' to access its documentation page.</w:t>
+      </w:r>
+    </w:p>
+    <w:p>
+      <w:r>
+        <w:rPr>
+          <w:rFonts w:ascii="Segoe UI Symbol" w:hAnsi="Segoe UI Symbol" w:cs="Segoe UI Symbol"/>
+          <w:b/>
+          <w:bCs/>
+        </w:rPr>
+        <w:t>✗</w:t>
+      </w:r>
+    </w:p>
+    <w:p>
+      <w:r>
+        <w:rPr>
+          <w:b/>
+          <w:bCs/>
+        </w:rPr>
+        <w:t>Step 5CLICK</w:t>
+      </w:r>
+      <w:r>
+        <w:t xml:space="preserve">Click on the link for 'Top 9 Browser Automation Tools for Web Testing and ...' to access its documentation </w:t>
       </w:r>
       <w:proofErr w:type="spellStart"/>
       <w:r>
-        <w:t>Instahyre</w:t>
-      </w:r>
-      <w:proofErr w:type="spellEnd"/>
-      <w:r>
-        <w:t>.</w:t>
-      </w:r>
-    </w:p>
-    <w:p>
-      <w:r>
-        <w:rPr>
-          <w:rFonts w:ascii="Segoe UI Emoji" w:hAnsi="Segoe UI Emoji" w:cs="Segoe UI Emoji"/>
-          <w:b/>
-          <w:bCs/>
-        </w:rPr>
-        <w:t>⚡</w:t>
-      </w:r>
-    </w:p>
-    <w:p>
-      <w:r>
-        <w:rPr>
-          <w:b/>
-          <w:bCs/>
-        </w:rPr>
-        <w:t>Step 5NAVIGATE</w:t>
-      </w:r>
-      <w:r>
-        <w:t>This action opens Google Search to perform the required search.</w:t>
-      </w:r>
-    </w:p>
-    <w:p>
-      <w:r>
-        <w:rPr>
-          <w:rFonts w:ascii="Segoe UI Symbol" w:hAnsi="Segoe UI Symbol" w:cs="Segoe UI Symbol"/>
-          <w:b/>
-          <w:bCs/>
-        </w:rPr>
-        <w:t>✗</w:t>
-      </w:r>
-    </w:p>
-    <w:p>
-      <w:r>
-        <w:rPr>
-          <w:b/>
-          <w:bCs/>
-        </w:rPr>
-        <w:t>Step 6CLICK</w:t>
-      </w:r>
-      <w:r>
-        <w:t xml:space="preserve">Clicks the Google Search button to perform the search for 'Hyderabad software </w:t>
-      </w:r>
-      <w:proofErr w:type="gramStart"/>
-      <w:r>
-        <w:t>companies</w:t>
-      </w:r>
-      <w:proofErr w:type="gramEnd"/>
-      <w:r>
-        <w:t xml:space="preserve"> </w:t>
-      </w:r>
-      <w:proofErr w:type="spellStart"/>
-      <w:r>
-        <w:t>careers</w:t>
-      </w:r>
-      <w:proofErr w:type="gramStart"/>
-      <w:r>
-        <w:t>'.</w:t>
+        <w:t>page.</w:t>
       </w:r>
       <w:r>
         <w:rPr>
@@ -2884,7 +3932,6 @@
         <w:t>Action</w:t>
       </w:r>
       <w:proofErr w:type="spellEnd"/>
-      <w:proofErr w:type="gramEnd"/>
       <w:r>
         <w:rPr>
           <w:i/>
@@ -2893,105 +3940,293 @@
         <w:t xml:space="preserve"> reported success, but the page did not visibly change after click. Retrying from the current page state.</w:t>
       </w:r>
     </w:p>
-    <w:p>
-      <w:r>
-        <w:rPr>
-          <w:rFonts w:ascii="Segoe UI Emoji" w:hAnsi="Segoe UI Emoji" w:cs="Segoe UI Emoji"/>
-          <w:b/>
-          <w:bCs/>
-        </w:rPr>
+    <w:p/>
+    <w:p/>
+    <w:p>
+      <w:pPr>
+        <w:rPr>
+          <w:b/>
+          <w:bCs/>
+        </w:rPr>
+      </w:pPr>
+      <w:r>
+        <w:rPr>
+          <w:b/>
+          <w:bCs/>
+        </w:rPr>
+        <w:t>6) Multi-page directory collection</w:t>
+      </w:r>
+    </w:p>
+    <w:p>
+      <w:r>
+        <w:rPr>
+          <w:b/>
+          <w:bCs/>
+        </w:rPr>
+        <w:t>Prompt:</w:t>
+      </w:r>
+    </w:p>
+    <w:p>
+      <w:r>
+        <w:t>text</w:t>
+      </w:r>
+    </w:p>
+    <w:p>
+      <w:r>
+        <w:t>Open a real public business directory or professional directory search result.</w:t>
+      </w:r>
+    </w:p>
+    <w:p/>
+    <w:p>
+      <w:r>
+        <w:t>Collect 20 entries across at least 3 pages.</w:t>
+      </w:r>
+    </w:p>
+    <w:p/>
+    <w:p>
+      <w:r>
+        <w:t>For each entry:</w:t>
+      </w:r>
+    </w:p>
+    <w:p>
+      <w:r>
+        <w:t>1. Capture name, category, city, and website if available.</w:t>
+      </w:r>
+    </w:p>
+    <w:p>
+      <w:r>
+        <w:t>2. Avoid duplicates.</w:t>
+      </w:r>
+    </w:p>
+    <w:p>
+      <w:r>
+        <w:t>3. Put the results into a table.</w:t>
+      </w:r>
+    </w:p>
+    <w:p>
+      <w:r>
+        <w:t>4. If any entry is missing a website, leave it blank rather than guessing.</w:t>
+      </w:r>
+      <w:r>
+        <w:br/>
+      </w:r>
+      <w:r>
+        <w:br/>
+      </w:r>
+    </w:p>
+    <w:p/>
+    <w:p>
+      <w:pPr>
+        <w:rPr>
+          <w:b/>
+          <w:bCs/>
+        </w:rPr>
+      </w:pPr>
+      <w:r>
+        <w:rPr>
+          <w:b/>
+          <w:bCs/>
+        </w:rPr>
+        <w:t>7) Real application workflow</w:t>
+      </w:r>
+    </w:p>
+    <w:p>
+      <w:r>
+        <w:rPr>
+          <w:b/>
+          <w:bCs/>
+        </w:rPr>
+        <w:t>Prompt:</w:t>
+      </w:r>
+    </w:p>
+    <w:p>
+      <w:r>
+        <w:t>text</w:t>
+      </w:r>
+    </w:p>
+    <w:p>
+      <w:r>
+        <w:t>Open a real SaaS website that offers a free account or free trial.</w:t>
+      </w:r>
+    </w:p>
+    <w:p/>
+    <w:p>
+      <w:r>
+        <w:t>Complete the full signup flow using only a test email you control.</w:t>
+      </w:r>
+    </w:p>
+    <w:p/>
+    <w:p>
+      <w:r>
+        <w:t>After signup:</w:t>
+      </w:r>
+    </w:p>
+    <w:p>
+      <w:r>
+        <w:t>1. Verify the welcome page or dashboard loads.</w:t>
+      </w:r>
+    </w:p>
+    <w:p>
+      <w:r>
+        <w:t>2. Locate one setting, one profile field, and one billing or plan page.</w:t>
+      </w:r>
+    </w:p>
+    <w:p>
+      <w:r>
+        <w:t>3. Capture screenshots of the successful login state and the profile page.</w:t>
+      </w:r>
+    </w:p>
+    <w:p>
+      <w:r>
+        <w:t>4. Return a short report with what worked and what failed.</w:t>
+      </w:r>
+    </w:p>
+    <w:p>
+      <w:pPr>
+        <w:rPr>
+          <w:b/>
+          <w:bCs/>
+        </w:rPr>
+      </w:pPr>
+      <w:r>
+        <w:rPr>
+          <w:b/>
+          <w:bCs/>
+        </w:rPr>
+        <w:t>8) Real file upload and report</w:t>
+      </w:r>
+    </w:p>
+    <w:p>
+      <w:r>
+        <w:rPr>
+          <w:b/>
+          <w:bCs/>
+        </w:rPr>
+        <w:t>Prompt:</w:t>
+      </w:r>
+    </w:p>
+    <w:p>
+      <w:r>
+        <w:t>text</w:t>
+      </w:r>
+    </w:p>
+    <w:p>
+      <w:r>
+        <w:t>Open a real website that allows file upload for logged-in users or public upload.</w:t>
+      </w:r>
+    </w:p>
+    <w:p/>
+    <w:p>
+      <w:r>
+        <w:t>Upload a small PDF or image file.</w:t>
+      </w:r>
+    </w:p>
+    <w:p/>
+    <w:p>
+      <w:r>
+        <w:t>Then:</w:t>
+      </w:r>
+    </w:p>
+    <w:p>
+      <w:r>
         <w:lastRenderedPageBreak/>
-        <w:t>⚡</w:t>
-      </w:r>
-    </w:p>
-    <w:p>
-      <w:r>
-        <w:rPr>
-          <w:b/>
-          <w:bCs/>
-        </w:rPr>
-        <w:t>Step 7CLICK</w:t>
-      </w:r>
-      <w:r>
-        <w:t xml:space="preserve">Clicks the Google Search button to perform the search for 'Hyderabad software </w:t>
-      </w:r>
-      <w:proofErr w:type="gramStart"/>
-      <w:r>
-        <w:t>companies</w:t>
-      </w:r>
-      <w:proofErr w:type="gramEnd"/>
-      <w:r>
-        <w:t xml:space="preserve"> careers'.</w:t>
-      </w:r>
-    </w:p>
-    <w:p>
-      <w:r>
-        <w:rPr>
-          <w:rFonts w:ascii="Segoe UI Symbol" w:hAnsi="Segoe UI Symbol" w:cs="Segoe UI Symbol"/>
-          <w:b/>
-          <w:bCs/>
-        </w:rPr>
-        <w:t>✗</w:t>
-      </w:r>
-    </w:p>
-    <w:p>
-      <w:r>
-        <w:rPr>
-          <w:b/>
-          <w:bCs/>
-        </w:rPr>
-        <w:t>Step 8CLICK</w:t>
-      </w:r>
-      <w:r>
-        <w:t xml:space="preserve">Clicks the Google Search button to perform the search for 'Hyderabad software </w:t>
-      </w:r>
-      <w:proofErr w:type="gramStart"/>
-      <w:r>
-        <w:t>companies</w:t>
-      </w:r>
-      <w:proofErr w:type="gramEnd"/>
-      <w:r>
-        <w:t xml:space="preserve"> </w:t>
-      </w:r>
-      <w:proofErr w:type="spellStart"/>
-      <w:r>
-        <w:t>careers</w:t>
-      </w:r>
-      <w:proofErr w:type="gramStart"/>
-      <w:r>
-        <w:t>'.</w:t>
-      </w:r>
-      <w:r>
-        <w:rPr>
-          <w:i/>
-          <w:iCs/>
-        </w:rPr>
-        <w:t>Action</w:t>
-      </w:r>
-      <w:proofErr w:type="spellEnd"/>
-      <w:proofErr w:type="gramEnd"/>
-      <w:r>
-        <w:rPr>
-          <w:i/>
-          <w:iCs/>
-        </w:rPr>
-        <w:t xml:space="preserve"> reported success, but the page did not visibly change after click. Retrying from the current page state.</w:t>
+        <w:t>1. Confirm the file was accepted.</w:t>
+      </w:r>
+    </w:p>
+    <w:p>
+      <w:r>
+        <w:t>2. Find where the uploaded file appears.</w:t>
+      </w:r>
+    </w:p>
+    <w:p>
+      <w:r>
+        <w:t>3. If the site provides a share link or processing result, copy it.</w:t>
+      </w:r>
+    </w:p>
+    <w:p>
+      <w:r>
+        <w:t>4. Return the result with the exact page path and any visible status text.</w:t>
+      </w:r>
+    </w:p>
+    <w:p>
+      <w:pPr>
+        <w:rPr>
+          <w:b/>
+          <w:bCs/>
+        </w:rPr>
+      </w:pPr>
+      <w:r>
+        <w:rPr>
+          <w:b/>
+          <w:bCs/>
+        </w:rPr>
+        <w:t>9) Real data entry with validation</w:t>
+      </w:r>
+    </w:p>
+    <w:p>
+      <w:r>
+        <w:rPr>
+          <w:b/>
+          <w:bCs/>
+        </w:rPr>
+        <w:t>Prompt:</w:t>
+      </w:r>
+    </w:p>
+    <w:p>
+      <w:r>
+        <w:t>text</w:t>
+      </w:r>
+    </w:p>
+    <w:p>
+      <w:r>
+        <w:t>Open a real government, university, or company form that is publicly accessible and safe to use with test data.</w:t>
       </w:r>
     </w:p>
     <w:p/>
     <w:p>
-      <w:pPr>
-        <w:rPr>
-          <w:b/>
-          <w:bCs/>
-        </w:rPr>
-      </w:pPr>
-      <w:r>
-        <w:rPr>
-          <w:b/>
-          <w:bCs/>
-        </w:rPr>
-        <w:t>3) Job application discovery</w:t>
+      <w:r>
+        <w:t>Fill the form with clearly fake test data, but make it look realistic.</w:t>
+      </w:r>
+    </w:p>
+    <w:p/>
+    <w:p>
+      <w:r>
+        <w:t>Then:</w:t>
+      </w:r>
+    </w:p>
+    <w:p>
+      <w:r>
+        <w:t>1. Check whether the form shows validation errors.</w:t>
+      </w:r>
+    </w:p>
+    <w:p>
+      <w:r>
+        <w:t>2. Fix any errors the page reports.</w:t>
+      </w:r>
+    </w:p>
+    <w:p>
+      <w:r>
+        <w:t>3. Submit only if it is a genuine test or sandbox form.</w:t>
+      </w:r>
+    </w:p>
+    <w:p>
+      <w:r>
+        <w:t>4. Report the validation rules you encountered and whether submission succeeded.</w:t>
+      </w:r>
+    </w:p>
+    <w:p>
+      <w:pPr>
+        <w:rPr>
+          <w:b/>
+          <w:bCs/>
+        </w:rPr>
+      </w:pPr>
+      <w:r>
+        <w:rPr>
+          <w:b/>
+          <w:bCs/>
+        </w:rPr>
+        <w:t>10) Complex multi-step research and output</w:t>
       </w:r>
     </w:p>
     <w:p>
@@ -3010,1820 +4245,43 @@
     </w:p>
     <w:p>
       <w:r>
-        <w:t>Go to LinkedIn Jobs and search for: `Full Stack Java Developer Hyderabad`.</w:t>
+        <w:t>Use Google Search and official websites to research:</w:t>
+      </w:r>
+    </w:p>
+    <w:p>
+      <w:r>
+        <w:t>`AI browser automation testing best practices`</w:t>
       </w:r>
     </w:p>
     <w:p/>
     <w:p>
       <w:r>
-        <w:t>Apply these filters if available:</w:t>
-      </w:r>
-    </w:p>
-    <w:p>
-      <w:r>
-        <w:t>- Experience level: Entry level or Associate</w:t>
-      </w:r>
-    </w:p>
-    <w:p>
-      <w:r>
-        <w:t>- Date posted: Past week</w:t>
-      </w:r>
-    </w:p>
-    <w:p>
-      <w:r>
-        <w:t>- On-site/Hybrid/Remote: any</w:t>
-      </w:r>
-    </w:p>
-    <w:p/>
-    <w:p>
-      <w:r>
-        <w:t>Then:</w:t>
-      </w:r>
-    </w:p>
-    <w:p>
-      <w:r>
-        <w:t>1. Collect the first 10 relevant jobs.</w:t>
-      </w:r>
-    </w:p>
-    <w:p>
-      <w:r>
-        <w:t>2. For each job, capture title, company, location, posted date, and job link.</w:t>
-      </w:r>
-    </w:p>
-    <w:p>
-      <w:r>
-        <w:t>3. Remove duplicates.</w:t>
-      </w:r>
-    </w:p>
-    <w:p>
-      <w:r>
-        <w:t>4. Return the jobs ranked by relevance.</w:t>
-      </w:r>
-      <w:r>
-        <w:br/>
-      </w:r>
-      <w:r>
-        <w:br/>
-      </w:r>
-      <w:r>
-        <w:t>Analysis failed: [object Object]</w:t>
-      </w:r>
-    </w:p>
-    <w:p>
-      <w:pPr>
-        <w:rPr>
-          <w:b/>
-          <w:bCs/>
-        </w:rPr>
-      </w:pPr>
-      <w:r>
-        <w:rPr>
-          <w:b/>
-          <w:bCs/>
-        </w:rPr>
-        <w:t>AI Analysis</w:t>
-      </w:r>
-    </w:p>
-    <w:p>
-      <w:r>
-        <w:t>The job search input field is still not available, and previous attempts to refresh the page have failed. I will attempt to wait for a longer duration to allow the page to load completely before checking for the job search input field again.</w:t>
-      </w:r>
-    </w:p>
-    <w:p>
-      <w:r>
-        <w:rPr>
-          <w:rFonts w:ascii="Segoe UI Emoji" w:hAnsi="Segoe UI Emoji" w:cs="Segoe UI Emoji"/>
-          <w:b/>
-          <w:bCs/>
-        </w:rPr>
-        <w:t>⚡</w:t>
-      </w:r>
-    </w:p>
-    <w:p>
-      <w:r>
-        <w:rPr>
-          <w:b/>
-          <w:bCs/>
-        </w:rPr>
+        <w:t>Do this in order:</w:t>
+      </w:r>
+    </w:p>
+    <w:p>
+      <w:r>
+        <w:t>1. Open at least 5 authoritative sources.</w:t>
+      </w:r>
+    </w:p>
+    <w:p>
+      <w:r>
+        <w:t>2. Extract the top recommended testing practices.</w:t>
+      </w:r>
+    </w:p>
+    <w:p>
+      <w:r>
+        <w:t>3. Separate practices into: reliability, observability, recovery, and safety.</w:t>
+      </w:r>
+    </w:p>
+    <w:p>
+      <w:r>
+        <w:t>4. Create a final checklist with 1 line per practice.</w:t>
+      </w:r>
+    </w:p>
+    <w:p>
+      <w:r>
         <w:lastRenderedPageBreak/>
-        <w:t>Step 1NAVIGATE</w:t>
-      </w:r>
-      <w:r>
-        <w:t>Navigates to the LinkedIn Jobs page to initiate the job search.</w:t>
-      </w:r>
-    </w:p>
-    <w:p>
-      <w:r>
-        <w:rPr>
-          <w:rFonts w:ascii="Segoe UI Symbol" w:hAnsi="Segoe UI Symbol" w:cs="Segoe UI Symbol"/>
-          <w:b/>
-          <w:bCs/>
-        </w:rPr>
-        <w:t>✗</w:t>
-      </w:r>
-    </w:p>
-    <w:p>
-      <w:r>
-        <w:rPr>
-          <w:b/>
-          <w:bCs/>
-        </w:rPr>
-        <w:t>Step 2FILL</w:t>
-      </w:r>
-      <w:r>
-        <w:t xml:space="preserve">Fills the job search input with the specified job title and </w:t>
-      </w:r>
-      <w:proofErr w:type="spellStart"/>
-      <w:proofErr w:type="gramStart"/>
-      <w:r>
-        <w:t>location.</w:t>
-      </w:r>
-      <w:r>
-        <w:rPr>
-          <w:i/>
-          <w:iCs/>
-        </w:rPr>
-        <w:t>No</w:t>
-      </w:r>
-      <w:proofErr w:type="spellEnd"/>
-      <w:proofErr w:type="gramEnd"/>
-      <w:r>
-        <w:rPr>
-          <w:i/>
-          <w:iCs/>
-        </w:rPr>
-        <w:t xml:space="preserve"> fillable input found for: </w:t>
-      </w:r>
-      <w:proofErr w:type="gramStart"/>
-      <w:r>
-        <w:rPr>
-          <w:i/>
-          <w:iCs/>
-        </w:rPr>
-        <w:t>input[</w:t>
-      </w:r>
-      <w:proofErr w:type="gramEnd"/>
-      <w:r>
-        <w:rPr>
-          <w:i/>
-          <w:iCs/>
-        </w:rPr>
-        <w:t>aria-label="Search jobs"]</w:t>
-      </w:r>
-    </w:p>
-    <w:p>
-      <w:r>
-        <w:rPr>
-          <w:rFonts w:ascii="Segoe UI Emoji" w:hAnsi="Segoe UI Emoji" w:cs="Segoe UI Emoji"/>
-          <w:b/>
-          <w:bCs/>
-        </w:rPr>
-        <w:t>⚡</w:t>
-      </w:r>
-    </w:p>
-    <w:p>
-      <w:r>
-        <w:rPr>
-          <w:b/>
-          <w:bCs/>
-        </w:rPr>
-        <w:t>Step 3CLICK</w:t>
-      </w:r>
-      <w:r>
-        <w:t>Click on the Jobs link to navigate to the job search page.</w:t>
-      </w:r>
-    </w:p>
-    <w:p>
-      <w:r>
-        <w:rPr>
-          <w:rFonts w:ascii="Segoe UI Emoji" w:hAnsi="Segoe UI Emoji" w:cs="Segoe UI Emoji"/>
-          <w:b/>
-          <w:bCs/>
-        </w:rPr>
-        <w:t>⚡</w:t>
-      </w:r>
-    </w:p>
-    <w:p>
-      <w:r>
-        <w:rPr>
-          <w:b/>
-          <w:bCs/>
-        </w:rPr>
-        <w:t>Step 4WAIT</w:t>
-      </w:r>
-      <w:r>
-        <w:t>Wait for the page to load completely to check for the job search input field.</w:t>
-      </w:r>
-    </w:p>
-    <w:p>
-      <w:r>
-        <w:rPr>
-          <w:rFonts w:ascii="Segoe UI Emoji" w:hAnsi="Segoe UI Emoji" w:cs="Segoe UI Emoji"/>
-          <w:b/>
-          <w:bCs/>
-        </w:rPr>
-        <w:t>⚡</w:t>
-      </w:r>
-    </w:p>
-    <w:p>
-      <w:r>
-        <w:rPr>
-          <w:b/>
-          <w:bCs/>
-        </w:rPr>
-        <w:t>Step 5NAVIGATE</w:t>
-      </w:r>
-      <w:r>
-        <w:t>Refresh the LinkedIn Jobs page to check if the job search input field becomes available.</w:t>
-      </w:r>
-    </w:p>
-    <w:p>
-      <w:r>
-        <w:rPr>
-          <w:rFonts w:ascii="Segoe UI Emoji" w:hAnsi="Segoe UI Emoji" w:cs="Segoe UI Emoji"/>
-          <w:b/>
-          <w:bCs/>
-        </w:rPr>
-        <w:t>⚡</w:t>
-      </w:r>
-    </w:p>
-    <w:p>
-      <w:r>
-        <w:rPr>
-          <w:b/>
-          <w:bCs/>
-        </w:rPr>
-        <w:t>Step 6CLICK</w:t>
-      </w:r>
-      <w:r>
-        <w:t>Click on the 'Show all' link to reveal more job listings.</w:t>
-      </w:r>
-    </w:p>
-    <w:p>
-      <w:r>
-        <w:rPr>
-          <w:rFonts w:ascii="Segoe UI Emoji" w:hAnsi="Segoe UI Emoji" w:cs="Segoe UI Emoji"/>
-          <w:b/>
-          <w:bCs/>
-        </w:rPr>
-        <w:t>⚡</w:t>
-      </w:r>
-    </w:p>
-    <w:p>
-      <w:r>
-        <w:rPr>
-          <w:b/>
-          <w:bCs/>
-        </w:rPr>
-        <w:t>Step 7WAIT</w:t>
-      </w:r>
-      <w:r>
-        <w:t>Wait for the page to load completely to check for the job search input field.</w:t>
-      </w:r>
-    </w:p>
-    <w:p>
-      <w:r>
-        <w:rPr>
-          <w:rFonts w:ascii="Segoe UI Symbol" w:hAnsi="Segoe UI Symbol" w:cs="Segoe UI Symbol"/>
-          <w:b/>
-          <w:bCs/>
-        </w:rPr>
-        <w:t>✗</w:t>
-      </w:r>
-    </w:p>
-    <w:p>
-      <w:r>
-        <w:rPr>
-          <w:b/>
-          <w:bCs/>
-        </w:rPr>
-        <w:t>Step 8FILL</w:t>
-      </w:r>
-      <w:r>
-        <w:t xml:space="preserve">Fills the job search input field with the specified job title and </w:t>
-      </w:r>
-      <w:proofErr w:type="spellStart"/>
-      <w:proofErr w:type="gramStart"/>
-      <w:r>
-        <w:t>location.</w:t>
-      </w:r>
-      <w:r>
-        <w:rPr>
-          <w:i/>
-          <w:iCs/>
-        </w:rPr>
-        <w:t>No</w:t>
-      </w:r>
-      <w:proofErr w:type="spellEnd"/>
-      <w:proofErr w:type="gramEnd"/>
-      <w:r>
-        <w:rPr>
-          <w:i/>
-          <w:iCs/>
-        </w:rPr>
-        <w:t xml:space="preserve"> fillable input found for: </w:t>
-      </w:r>
-      <w:proofErr w:type="gramStart"/>
-      <w:r>
-        <w:rPr>
-          <w:i/>
-          <w:iCs/>
-        </w:rPr>
-        <w:t>input[</w:t>
-      </w:r>
-      <w:proofErr w:type="gramEnd"/>
-      <w:r>
-        <w:rPr>
-          <w:i/>
-          <w:iCs/>
-        </w:rPr>
-        <w:t>placeholder="Search jobs"]</w:t>
-      </w:r>
-    </w:p>
-    <w:p>
-      <w:r>
-        <w:rPr>
-          <w:rFonts w:ascii="Segoe UI Symbol" w:hAnsi="Segoe UI Symbol" w:cs="Segoe UI Symbol"/>
-          <w:b/>
-          <w:bCs/>
-        </w:rPr>
-        <w:t>✗</w:t>
-      </w:r>
-    </w:p>
-    <w:p>
-      <w:r>
-        <w:rPr>
-          <w:b/>
-          <w:bCs/>
-        </w:rPr>
-        <w:t>Step 9NAVIGATE</w:t>
-      </w:r>
-      <w:r>
-        <w:t xml:space="preserve">Refresh the current page to check for the job search input field </w:t>
-      </w:r>
-      <w:proofErr w:type="spellStart"/>
-      <w:proofErr w:type="gramStart"/>
-      <w:r>
-        <w:t>availability.</w:t>
-      </w:r>
-      <w:r>
-        <w:rPr>
-          <w:i/>
-          <w:iCs/>
-        </w:rPr>
-        <w:t>Unsafe</w:t>
-      </w:r>
-      <w:proofErr w:type="spellEnd"/>
-      <w:proofErr w:type="gramEnd"/>
-      <w:r>
-        <w:rPr>
-          <w:i/>
-          <w:iCs/>
-        </w:rPr>
-        <w:t xml:space="preserve"> URL rejected (must be http/https): current</w:t>
-      </w:r>
-    </w:p>
-    <w:p>
-      <w:r>
-        <w:rPr>
-          <w:rFonts w:ascii="Segoe UI Emoji" w:hAnsi="Segoe UI Emoji" w:cs="Segoe UI Emoji"/>
-          <w:b/>
-          <w:bCs/>
-        </w:rPr>
-        <w:t>⚡</w:t>
-      </w:r>
-    </w:p>
-    <w:p>
-      <w:r>
-        <w:rPr>
-          <w:b/>
-          <w:bCs/>
-        </w:rPr>
-        <w:t>Step 10WAIT</w:t>
-      </w:r>
-      <w:r>
-        <w:t>Wait for 5000 milliseconds to allow the page to load completely.</w:t>
-      </w:r>
-    </w:p>
-    <w:p/>
-    <w:p>
-      <w:pPr>
-        <w:rPr>
-          <w:b/>
-          <w:bCs/>
-        </w:rPr>
-      </w:pPr>
-      <w:r>
-        <w:rPr>
-          <w:b/>
-          <w:bCs/>
-        </w:rPr>
-        <w:t>4) Product pricing comparison</w:t>
-      </w:r>
-    </w:p>
-    <w:p>
-      <w:r>
-        <w:rPr>
-          <w:b/>
-          <w:bCs/>
-        </w:rPr>
-        <w:t>Prompt:</w:t>
-      </w:r>
-    </w:p>
-    <w:p>
-      <w:r>
-        <w:t>text</w:t>
-      </w:r>
-    </w:p>
-    <w:p>
-      <w:r>
-        <w:t>Open the official websites of 3 AI code assistant products from search results.</w:t>
-      </w:r>
-    </w:p>
-    <w:p/>
-    <w:p>
-      <w:r>
-        <w:lastRenderedPageBreak/>
-        <w:t>For each product:</w:t>
-      </w:r>
-    </w:p>
-    <w:p>
-      <w:r>
-        <w:t>1. Find the pricing page.</w:t>
-      </w:r>
-    </w:p>
-    <w:p>
-      <w:r>
-        <w:t>2. Capture the free plan, paid plan starting price, and whether a trial is available.</w:t>
-      </w:r>
-    </w:p>
-    <w:p>
-      <w:r>
-        <w:t>3. Capture one feature that is clearly mentioned on the pricing or product page.</w:t>
-      </w:r>
-    </w:p>
-    <w:p>
-      <w:r>
-        <w:t>4. Return a comparison table with source URLs.</w:t>
-      </w:r>
-      <w:r>
-        <w:br/>
-      </w:r>
-      <w:r>
-        <w:br/>
-      </w:r>
-      <w:r>
-        <w:t>Analysis failed: [object Object]</w:t>
-      </w:r>
-    </w:p>
-    <w:p>
-      <w:pPr>
-        <w:rPr>
-          <w:b/>
-          <w:bCs/>
-        </w:rPr>
-      </w:pPr>
-      <w:r>
-        <w:rPr>
-          <w:b/>
-          <w:bCs/>
-        </w:rPr>
-        <w:t>AI Analysis</w:t>
-      </w:r>
-    </w:p>
-    <w:p>
-      <w:r>
-        <w:t>The task is currently blocked due to previous failures in opening the official website of the first AI code assistant product. The next step is to attempt to click the 'Contact' link again to explore potential alternative resources or links that may help in finding the desired product information.</w:t>
-      </w:r>
-    </w:p>
-    <w:p>
-      <w:r>
-        <w:rPr>
-          <w:rFonts w:ascii="Segoe UI Emoji" w:hAnsi="Segoe UI Emoji" w:cs="Segoe UI Emoji"/>
-          <w:b/>
-          <w:bCs/>
-        </w:rPr>
-        <w:t>⚡</w:t>
-      </w:r>
-    </w:p>
-    <w:p>
-      <w:r>
-        <w:rPr>
-          <w:b/>
-          <w:bCs/>
-        </w:rPr>
-        <w:t>Step 1NAVIGATE</w:t>
-      </w:r>
-      <w:r>
-        <w:t>This action opens Google to search for AI code assistant products.</w:t>
-      </w:r>
-    </w:p>
-    <w:p>
-      <w:r>
-        <w:rPr>
-          <w:rFonts w:ascii="Segoe UI Emoji" w:hAnsi="Segoe UI Emoji" w:cs="Segoe UI Emoji"/>
-          <w:b/>
-          <w:bCs/>
-        </w:rPr>
-        <w:t>⚡</w:t>
-      </w:r>
-    </w:p>
-    <w:p>
-      <w:r>
-        <w:rPr>
-          <w:b/>
-          <w:bCs/>
-        </w:rPr>
-        <w:t>Step 2FILL</w:t>
-      </w:r>
-      <w:r>
-        <w:t>Fills the search input with the query to find AI code assistant products.</w:t>
-      </w:r>
-    </w:p>
-    <w:p>
-      <w:r>
-        <w:rPr>
-          <w:rFonts w:ascii="Segoe UI Symbol" w:hAnsi="Segoe UI Symbol" w:cs="Segoe UI Symbol"/>
-          <w:b/>
-          <w:bCs/>
-        </w:rPr>
-        <w:t>✗</w:t>
-      </w:r>
-    </w:p>
-    <w:p>
-      <w:r>
-        <w:rPr>
-          <w:b/>
-          <w:bCs/>
-        </w:rPr>
-        <w:t>Step 3CLICK</w:t>
-      </w:r>
-      <w:r>
-        <w:t xml:space="preserve">Open the official website of the first AI code assistant </w:t>
-      </w:r>
-      <w:proofErr w:type="spellStart"/>
-      <w:proofErr w:type="gramStart"/>
-      <w:r>
-        <w:t>product.</w:t>
-      </w:r>
-      <w:r>
-        <w:rPr>
-          <w:i/>
-          <w:iCs/>
-        </w:rPr>
-        <w:t>Element</w:t>
-      </w:r>
-      <w:proofErr w:type="spellEnd"/>
-      <w:proofErr w:type="gramEnd"/>
-      <w:r>
-        <w:rPr>
-          <w:i/>
-          <w:iCs/>
-        </w:rPr>
-        <w:t xml:space="preserve"> not found: div &gt; div &gt; </w:t>
-      </w:r>
-      <w:proofErr w:type="spellStart"/>
-      <w:proofErr w:type="gramStart"/>
-      <w:r>
-        <w:rPr>
-          <w:i/>
-          <w:iCs/>
-        </w:rPr>
-        <w:t>div:nth</w:t>
-      </w:r>
-      <w:proofErr w:type="gramEnd"/>
-      <w:r>
-        <w:rPr>
-          <w:i/>
-          <w:iCs/>
-        </w:rPr>
-        <w:t>-of-</w:t>
-      </w:r>
-      <w:proofErr w:type="gramStart"/>
-      <w:r>
-        <w:rPr>
-          <w:i/>
-          <w:iCs/>
-        </w:rPr>
-        <w:t>type</w:t>
-      </w:r>
-      <w:proofErr w:type="spellEnd"/>
-      <w:r>
-        <w:rPr>
-          <w:i/>
-          <w:iCs/>
-        </w:rPr>
-        <w:t>(</w:t>
-      </w:r>
-      <w:proofErr w:type="gramEnd"/>
-      <w:r>
-        <w:rPr>
-          <w:i/>
-          <w:iCs/>
-        </w:rPr>
-        <w:t>2) &gt; div</w:t>
-      </w:r>
-    </w:p>
-    <w:p>
-      <w:r>
-        <w:rPr>
-          <w:rFonts w:ascii="Segoe UI Symbol" w:hAnsi="Segoe UI Symbol" w:cs="Segoe UI Symbol"/>
-          <w:b/>
-          <w:bCs/>
-        </w:rPr>
-        <w:t>✗</w:t>
-      </w:r>
-    </w:p>
-    <w:p>
-      <w:r>
-        <w:rPr>
-          <w:b/>
-          <w:bCs/>
-        </w:rPr>
-        <w:t>Step 4CLICK</w:t>
-      </w:r>
-      <w:r>
-        <w:t xml:space="preserve">Attempt to open the official website of the first AI code assistant product from the search </w:t>
-      </w:r>
-      <w:proofErr w:type="spellStart"/>
-      <w:proofErr w:type="gramStart"/>
-      <w:r>
-        <w:t>results.</w:t>
-      </w:r>
-      <w:r>
-        <w:rPr>
-          <w:i/>
-          <w:iCs/>
-        </w:rPr>
-        <w:t>Element</w:t>
-      </w:r>
-      <w:proofErr w:type="spellEnd"/>
-      <w:proofErr w:type="gramEnd"/>
-      <w:r>
-        <w:rPr>
-          <w:i/>
-          <w:iCs/>
-        </w:rPr>
-        <w:t xml:space="preserve"> not found: div &gt; div &gt; </w:t>
-      </w:r>
-      <w:proofErr w:type="spellStart"/>
-      <w:proofErr w:type="gramStart"/>
-      <w:r>
-        <w:rPr>
-          <w:i/>
-          <w:iCs/>
-        </w:rPr>
-        <w:t>div:nth</w:t>
-      </w:r>
-      <w:proofErr w:type="gramEnd"/>
-      <w:r>
-        <w:rPr>
-          <w:i/>
-          <w:iCs/>
-        </w:rPr>
-        <w:t>-of-</w:t>
-      </w:r>
-      <w:proofErr w:type="gramStart"/>
-      <w:r>
-        <w:rPr>
-          <w:i/>
-          <w:iCs/>
-        </w:rPr>
-        <w:t>type</w:t>
-      </w:r>
-      <w:proofErr w:type="spellEnd"/>
-      <w:r>
-        <w:rPr>
-          <w:i/>
-          <w:iCs/>
-        </w:rPr>
-        <w:t>(</w:t>
-      </w:r>
-      <w:proofErr w:type="gramEnd"/>
-      <w:r>
-        <w:rPr>
-          <w:i/>
-          <w:iCs/>
-        </w:rPr>
-        <w:t>2) &gt; div</w:t>
-      </w:r>
-    </w:p>
-    <w:p>
-      <w:r>
-        <w:rPr>
-          <w:rFonts w:ascii="Segoe UI Symbol" w:hAnsi="Segoe UI Symbol" w:cs="Segoe UI Symbol"/>
-          <w:b/>
-          <w:bCs/>
-        </w:rPr>
-        <w:t>✗</w:t>
-      </w:r>
-    </w:p>
-    <w:p>
-      <w:r>
-        <w:rPr>
-          <w:b/>
-          <w:bCs/>
-        </w:rPr>
-        <w:t>Step 5CLICK</w:t>
-      </w:r>
-      <w:r>
-        <w:t xml:space="preserve">Attempt to open the official website of the first AI code assistant product from the search </w:t>
-      </w:r>
-      <w:proofErr w:type="spellStart"/>
-      <w:proofErr w:type="gramStart"/>
-      <w:r>
-        <w:t>results.</w:t>
-      </w:r>
-      <w:r>
-        <w:rPr>
-          <w:i/>
-          <w:iCs/>
-        </w:rPr>
-        <w:t>Element</w:t>
-      </w:r>
-      <w:proofErr w:type="spellEnd"/>
-      <w:proofErr w:type="gramEnd"/>
-      <w:r>
-        <w:rPr>
-          <w:i/>
-          <w:iCs/>
-        </w:rPr>
-        <w:t xml:space="preserve"> not found: div &gt; div &gt; </w:t>
-      </w:r>
-      <w:proofErr w:type="spellStart"/>
-      <w:proofErr w:type="gramStart"/>
-      <w:r>
-        <w:rPr>
-          <w:i/>
-          <w:iCs/>
-        </w:rPr>
-        <w:t>div:nth</w:t>
-      </w:r>
-      <w:proofErr w:type="gramEnd"/>
-      <w:r>
-        <w:rPr>
-          <w:i/>
-          <w:iCs/>
-        </w:rPr>
-        <w:t>-of-</w:t>
-      </w:r>
-      <w:proofErr w:type="gramStart"/>
-      <w:r>
-        <w:rPr>
-          <w:i/>
-          <w:iCs/>
-        </w:rPr>
-        <w:t>type</w:t>
-      </w:r>
-      <w:proofErr w:type="spellEnd"/>
-      <w:r>
-        <w:rPr>
-          <w:i/>
-          <w:iCs/>
-        </w:rPr>
-        <w:t>(</w:t>
-      </w:r>
-      <w:proofErr w:type="gramEnd"/>
-      <w:r>
-        <w:rPr>
-          <w:i/>
-          <w:iCs/>
-        </w:rPr>
-        <w:t>2) &gt; div</w:t>
-      </w:r>
-    </w:p>
-    <w:p>
-      <w:r>
-        <w:rPr>
-          <w:rFonts w:ascii="Segoe UI Emoji" w:hAnsi="Segoe UI Emoji" w:cs="Segoe UI Emoji"/>
-          <w:b/>
-          <w:bCs/>
-        </w:rPr>
-        <w:t>⚡</w:t>
-      </w:r>
-    </w:p>
-    <w:p>
-      <w:r>
-        <w:rPr>
-          <w:b/>
-          <w:bCs/>
-        </w:rPr>
-        <w:t>Step 6CLICK</w:t>
-      </w:r>
-      <w:r>
-        <w:t>This action clicks the link to open the official website of the AI code assistant product.</w:t>
-      </w:r>
-    </w:p>
-    <w:p>
-      <w:r>
-        <w:rPr>
-          <w:rFonts w:ascii="Segoe UI Symbol" w:hAnsi="Segoe UI Symbol" w:cs="Segoe UI Symbol"/>
-          <w:b/>
-          <w:bCs/>
-        </w:rPr>
-        <w:t>✗</w:t>
-      </w:r>
-    </w:p>
-    <w:p>
-      <w:r>
-        <w:rPr>
-          <w:b/>
-          <w:bCs/>
-        </w:rPr>
-        <w:lastRenderedPageBreak/>
-        <w:t>Step 7CLICK</w:t>
-      </w:r>
-      <w:r>
-        <w:t xml:space="preserve">Click the 'Contact' link to access potential alternative resources or </w:t>
-      </w:r>
-      <w:proofErr w:type="spellStart"/>
-      <w:proofErr w:type="gramStart"/>
-      <w:r>
-        <w:t>links.</w:t>
-      </w:r>
-      <w:r>
-        <w:rPr>
-          <w:i/>
-          <w:iCs/>
-        </w:rPr>
-        <w:t>Action</w:t>
-      </w:r>
-      <w:proofErr w:type="spellEnd"/>
-      <w:proofErr w:type="gramEnd"/>
-      <w:r>
-        <w:rPr>
-          <w:i/>
-          <w:iCs/>
-        </w:rPr>
-        <w:t xml:space="preserve"> reported success, but the page did not visibly change after click. Retrying from the current page state.</w:t>
-      </w:r>
-    </w:p>
-    <w:p>
-      <w:r>
-        <w:rPr>
-          <w:rFonts w:ascii="Segoe UI Symbol" w:hAnsi="Segoe UI Symbol" w:cs="Segoe UI Symbol"/>
-          <w:b/>
-          <w:bCs/>
-        </w:rPr>
-        <w:t>✗</w:t>
-      </w:r>
-    </w:p>
-    <w:p>
-      <w:r>
-        <w:rPr>
-          <w:b/>
-          <w:bCs/>
-        </w:rPr>
-        <w:t>Step 8CLICK</w:t>
-      </w:r>
-      <w:r>
-        <w:t xml:space="preserve">Click the 'Contact' link to access potential alternative resources or </w:t>
-      </w:r>
-      <w:proofErr w:type="spellStart"/>
-      <w:proofErr w:type="gramStart"/>
-      <w:r>
-        <w:t>links.</w:t>
-      </w:r>
-      <w:r>
-        <w:rPr>
-          <w:i/>
-          <w:iCs/>
-        </w:rPr>
-        <w:t>Action</w:t>
-      </w:r>
-      <w:proofErr w:type="spellEnd"/>
-      <w:proofErr w:type="gramEnd"/>
-      <w:r>
-        <w:rPr>
-          <w:i/>
-          <w:iCs/>
-        </w:rPr>
-        <w:t xml:space="preserve"> reported success, but the page did not visibly change after click. Retrying from the current page state.</w:t>
-      </w:r>
-    </w:p>
-    <w:p>
-      <w:r>
-        <w:br/>
-      </w:r>
-    </w:p>
-    <w:p>
-      <w:pPr>
-        <w:rPr>
-          <w:b/>
-          <w:bCs/>
-        </w:rPr>
-      </w:pPr>
-      <w:r>
-        <w:rPr>
-          <w:b/>
-          <w:bCs/>
-        </w:rPr>
-        <w:t>5) Long form research extraction</w:t>
-      </w:r>
-    </w:p>
-    <w:p>
-      <w:r>
-        <w:rPr>
-          <w:b/>
-          <w:bCs/>
-        </w:rPr>
-        <w:t>Prompt:</w:t>
-      </w:r>
-    </w:p>
-    <w:p>
-      <w:r>
-        <w:t>text</w:t>
-      </w:r>
-    </w:p>
-    <w:p>
-      <w:r>
-        <w:t>Search the web for official documentation or product pages about browser automation tools.</w:t>
-      </w:r>
-    </w:p>
-    <w:p/>
-    <w:p>
-      <w:r>
-        <w:t>Pick 3 different tools and for each one:</w:t>
-      </w:r>
-    </w:p>
-    <w:p>
-      <w:r>
-        <w:t>1. Find the official documentation page.</w:t>
-      </w:r>
-    </w:p>
-    <w:p>
-      <w:r>
-        <w:t>2. Extract the supported languages, main use case, and whether it supports browser control.</w:t>
-      </w:r>
-    </w:p>
-    <w:p>
-      <w:r>
-        <w:t>3. Note one setup requirement.</w:t>
-      </w:r>
-    </w:p>
-    <w:p>
-      <w:r>
-        <w:t>4. Return the answer in markdown bullets, grouped by tool.</w:t>
-      </w:r>
-      <w:r>
-        <w:br/>
-      </w:r>
-      <w:r>
-        <w:br/>
-      </w:r>
-      <w:r>
-        <w:t>Analysis failed: [object Object]</w:t>
-      </w:r>
-    </w:p>
-    <w:p>
-      <w:pPr>
-        <w:rPr>
-          <w:b/>
-          <w:bCs/>
-        </w:rPr>
-      </w:pPr>
-      <w:r>
-        <w:rPr>
-          <w:b/>
-          <w:bCs/>
-        </w:rPr>
-        <w:t>AI Analysis</w:t>
-      </w:r>
-    </w:p>
-    <w:p>
-      <w:r>
-        <w:t>The task is currently blocked due to previous click actions not yielding the expected results. To proceed, I will attempt to click on a different link that may lead to official documentation for browser automation tools.</w:t>
-      </w:r>
-    </w:p>
-    <w:p>
-      <w:r>
-        <w:rPr>
-          <w:rFonts w:ascii="Segoe UI Emoji" w:hAnsi="Segoe UI Emoji" w:cs="Segoe UI Emoji"/>
-          <w:b/>
-          <w:bCs/>
-        </w:rPr>
-        <w:t>⚡</w:t>
-      </w:r>
-    </w:p>
-    <w:p>
-      <w:r>
-        <w:rPr>
-          <w:b/>
-          <w:bCs/>
-        </w:rPr>
-        <w:t>Step 1NAVIGATE</w:t>
-      </w:r>
-      <w:r>
-        <w:t>Navigate to Google to search for browser automation tools.</w:t>
-      </w:r>
-    </w:p>
-    <w:p>
-      <w:r>
-        <w:rPr>
-          <w:rFonts w:ascii="Segoe UI Emoji" w:hAnsi="Segoe UI Emoji" w:cs="Segoe UI Emoji"/>
-          <w:b/>
-          <w:bCs/>
-        </w:rPr>
-        <w:t>⚡</w:t>
-      </w:r>
-    </w:p>
-    <w:p>
-      <w:r>
-        <w:rPr>
-          <w:b/>
-          <w:bCs/>
-        </w:rPr>
-        <w:t>Step 2FILL</w:t>
-      </w:r>
-      <w:r>
-        <w:t>Fills the search input with the query for browser automation tools.</w:t>
-      </w:r>
-    </w:p>
-    <w:p>
-      <w:r>
-        <w:rPr>
-          <w:rFonts w:ascii="Segoe UI Emoji" w:hAnsi="Segoe UI Emoji" w:cs="Segoe UI Emoji"/>
-          <w:b/>
-          <w:bCs/>
-        </w:rPr>
-        <w:t>⚡</w:t>
-      </w:r>
-    </w:p>
-    <w:p>
-      <w:r>
-        <w:rPr>
-          <w:b/>
-          <w:bCs/>
-        </w:rPr>
-        <w:lastRenderedPageBreak/>
-        <w:t>Step 3CLICK</w:t>
-      </w:r>
-      <w:r>
-        <w:t>Click the Google Search button to perform the search for browser automation tools.</w:t>
-      </w:r>
-    </w:p>
-    <w:p>
-      <w:r>
-        <w:rPr>
-          <w:rFonts w:ascii="Segoe UI Emoji" w:hAnsi="Segoe UI Emoji" w:cs="Segoe UI Emoji"/>
-          <w:b/>
-          <w:bCs/>
-        </w:rPr>
-        <w:t>⚡</w:t>
-      </w:r>
-    </w:p>
-    <w:p>
-      <w:r>
-        <w:rPr>
-          <w:b/>
-          <w:bCs/>
-        </w:rPr>
-        <w:t>Step 4CLICK</w:t>
-      </w:r>
-      <w:r>
-        <w:t>Click on the first search result for 'browser automation tools free' to access its documentation page.</w:t>
-      </w:r>
-    </w:p>
-    <w:p>
-      <w:r>
-        <w:rPr>
-          <w:rFonts w:ascii="Segoe UI Emoji" w:hAnsi="Segoe UI Emoji" w:cs="Segoe UI Emoji"/>
-          <w:b/>
-          <w:bCs/>
-        </w:rPr>
-        <w:t>⚡</w:t>
-      </w:r>
-    </w:p>
-    <w:p>
-      <w:r>
-        <w:rPr>
-          <w:b/>
-          <w:bCs/>
-        </w:rPr>
-        <w:t>Step 5CLICK</w:t>
-      </w:r>
-      <w:r>
-        <w:t xml:space="preserve">Click on the link to access the official documentation page for </w:t>
-      </w:r>
-      <w:proofErr w:type="spellStart"/>
-      <w:r>
-        <w:t>Firecrawl</w:t>
-      </w:r>
-      <w:proofErr w:type="spellEnd"/>
-      <w:r>
-        <w:t>.</w:t>
-      </w:r>
-    </w:p>
-    <w:p>
-      <w:r>
-        <w:rPr>
-          <w:rFonts w:ascii="Segoe UI Emoji" w:hAnsi="Segoe UI Emoji" w:cs="Segoe UI Emoji"/>
-          <w:b/>
-          <w:bCs/>
-        </w:rPr>
-        <w:t>⚡</w:t>
-      </w:r>
-    </w:p>
-    <w:p>
-      <w:r>
-        <w:rPr>
-          <w:b/>
-          <w:bCs/>
-        </w:rPr>
-        <w:t>Step 6CLICK</w:t>
-      </w:r>
-      <w:r>
-        <w:t>Click on the link to access the documentation page for the best browser automation tools.</w:t>
-      </w:r>
-    </w:p>
-    <w:p>
-      <w:r>
-        <w:rPr>
-          <w:rFonts w:ascii="Segoe UI Emoji" w:hAnsi="Segoe UI Emoji" w:cs="Segoe UI Emoji"/>
-          <w:b/>
-          <w:bCs/>
-        </w:rPr>
-        <w:t>⚡</w:t>
-      </w:r>
-    </w:p>
-    <w:p>
-      <w:r>
-        <w:rPr>
-          <w:b/>
-          <w:bCs/>
-        </w:rPr>
-        <w:t>Step 7CLICK</w:t>
-      </w:r>
-      <w:r>
-        <w:t xml:space="preserve">Click on the link to access the documentation page for </w:t>
-      </w:r>
-      <w:proofErr w:type="spellStart"/>
-      <w:r>
-        <w:t>Skyvern</w:t>
-      </w:r>
-      <w:proofErr w:type="spellEnd"/>
-      <w:r>
-        <w:t>, a browser automation tool.</w:t>
-      </w:r>
-    </w:p>
-    <w:p>
-      <w:r>
-        <w:rPr>
-          <w:rFonts w:ascii="Segoe UI Emoji" w:hAnsi="Segoe UI Emoji" w:cs="Segoe UI Emoji"/>
-          <w:b/>
-          <w:bCs/>
-        </w:rPr>
-        <w:t>⚡</w:t>
-      </w:r>
-    </w:p>
-    <w:p>
-      <w:r>
-        <w:rPr>
-          <w:b/>
-          <w:bCs/>
-        </w:rPr>
-        <w:t>Step 8CLICK</w:t>
-      </w:r>
-      <w:r>
-        <w:t>Click on the link to access the documentation page for '10 Best Web Automation Tools Reviewed for 2026' on The CTO Club.</w:t>
-      </w:r>
-    </w:p>
-    <w:p>
-      <w:r>
-        <w:rPr>
-          <w:rFonts w:ascii="Segoe UI Emoji" w:hAnsi="Segoe UI Emoji" w:cs="Segoe UI Emoji"/>
-          <w:b/>
-          <w:bCs/>
-        </w:rPr>
-        <w:t>⚡</w:t>
-      </w:r>
-    </w:p>
-    <w:p>
-      <w:r>
-        <w:rPr>
-          <w:b/>
-          <w:bCs/>
-        </w:rPr>
-        <w:t>Step 9CLICK</w:t>
-      </w:r>
-      <w:r>
-        <w:t xml:space="preserve">Click on the link for </w:t>
-      </w:r>
-      <w:proofErr w:type="spellStart"/>
-      <w:r>
-        <w:t>TestGrid</w:t>
-      </w:r>
-      <w:proofErr w:type="spellEnd"/>
-      <w:r>
-        <w:t xml:space="preserve"> to access its official documentation page.</w:t>
-      </w:r>
-    </w:p>
-    <w:p>
-      <w:r>
-        <w:rPr>
-          <w:rFonts w:ascii="Segoe UI Emoji" w:hAnsi="Segoe UI Emoji" w:cs="Segoe UI Emoji"/>
-          <w:b/>
-          <w:bCs/>
-        </w:rPr>
-        <w:t>⚡</w:t>
-      </w:r>
-    </w:p>
-    <w:p>
-      <w:r>
-        <w:rPr>
-          <w:b/>
-          <w:bCs/>
-        </w:rPr>
-        <w:t>Step 10CLICK</w:t>
-      </w:r>
-      <w:r>
-        <w:t>Click on the Automation Testing link to access its documentation page.</w:t>
-      </w:r>
-    </w:p>
-    <w:p/>
-    <w:p>
-      <w:pPr>
-        <w:rPr>
-          <w:b/>
-          <w:bCs/>
-        </w:rPr>
-      </w:pPr>
-      <w:r>
-        <w:rPr>
-          <w:b/>
-          <w:bCs/>
-        </w:rPr>
-        <w:t>6) Multi-page directory collection</w:t>
-      </w:r>
-    </w:p>
-    <w:p>
-      <w:r>
-        <w:rPr>
-          <w:b/>
-          <w:bCs/>
-        </w:rPr>
-        <w:t>Prompt:</w:t>
-      </w:r>
-    </w:p>
-    <w:p>
-      <w:r>
-        <w:t>text</w:t>
-      </w:r>
-    </w:p>
-    <w:p>
-      <w:r>
-        <w:t>Open a real public business directory or professional directory search result.</w:t>
-      </w:r>
-    </w:p>
-    <w:p/>
-    <w:p>
-      <w:r>
-        <w:t>Collect 20 entries across at least 3 pages.</w:t>
-      </w:r>
-    </w:p>
-    <w:p/>
-    <w:p>
-      <w:r>
-        <w:t>For each entry:</w:t>
-      </w:r>
-    </w:p>
-    <w:p>
-      <w:r>
-        <w:lastRenderedPageBreak/>
-        <w:t>1. Capture name, category, city, and website if available.</w:t>
-      </w:r>
-    </w:p>
-    <w:p>
-      <w:r>
-        <w:t>2. Avoid duplicates.</w:t>
-      </w:r>
-    </w:p>
-    <w:p>
-      <w:r>
-        <w:t>3. Put the results into a table.</w:t>
-      </w:r>
-    </w:p>
-    <w:p>
-      <w:r>
-        <w:t>4. If any entry is missing a website, leave it blank rather than guessing.</w:t>
-      </w:r>
-      <w:r>
-        <w:br/>
-      </w:r>
-      <w:r>
-        <w:br/>
-      </w:r>
-      <w:r>
-        <w:t>Stopped because the assistant proposed a repeated browser action instead of making progress.</w:t>
-      </w:r>
-    </w:p>
-    <w:p>
-      <w:pPr>
-        <w:rPr>
-          <w:b/>
-          <w:bCs/>
-        </w:rPr>
-      </w:pPr>
-      <w:r>
-        <w:rPr>
-          <w:b/>
-          <w:bCs/>
-        </w:rPr>
-        <w:t>AI Analysis</w:t>
-      </w:r>
-    </w:p>
-    <w:p>
-      <w:r>
-        <w:t>The previous attempts to click the 'Find' button have not resulted in any visible change on the page. Therefore, I will try clicking the 'Find' button again to see if it produces a different outcome this time.</w:t>
-      </w:r>
-    </w:p>
-    <w:p>
-      <w:r>
-        <w:rPr>
-          <w:rFonts w:ascii="Segoe UI Emoji" w:hAnsi="Segoe UI Emoji" w:cs="Segoe UI Emoji"/>
-          <w:b/>
-          <w:bCs/>
-        </w:rPr>
-        <w:t>⚡</w:t>
-      </w:r>
-    </w:p>
-    <w:p>
-      <w:r>
-        <w:rPr>
-          <w:b/>
-          <w:bCs/>
-        </w:rPr>
-        <w:t>Step 1NAVIGATE</w:t>
-      </w:r>
-      <w:r>
-        <w:t>This action navigates to a public business directory website.</w:t>
-      </w:r>
-    </w:p>
-    <w:p>
-      <w:r>
-        <w:rPr>
-          <w:rFonts w:ascii="Segoe UI Emoji" w:hAnsi="Segoe UI Emoji" w:cs="Segoe UI Emoji"/>
-          <w:b/>
-          <w:bCs/>
-        </w:rPr>
-        <w:t>⚡</w:t>
-      </w:r>
-    </w:p>
-    <w:p>
-      <w:r>
-        <w:rPr>
-          <w:b/>
-          <w:bCs/>
-        </w:rPr>
-        <w:t>Step 2FILL</w:t>
-      </w:r>
-      <w:r>
-        <w:t>Fills the search input with 'Restaurants' to find relevant business listings.</w:t>
-      </w:r>
-    </w:p>
-    <w:p>
-      <w:r>
-        <w:rPr>
-          <w:rFonts w:ascii="Segoe UI Emoji" w:hAnsi="Segoe UI Emoji" w:cs="Segoe UI Emoji"/>
-          <w:b/>
-          <w:bCs/>
-        </w:rPr>
-        <w:t>⚡</w:t>
-      </w:r>
-    </w:p>
-    <w:p>
-      <w:r>
-        <w:rPr>
-          <w:b/>
-          <w:bCs/>
-        </w:rPr>
-        <w:t>Step 3CLICK</w:t>
-      </w:r>
-      <w:r>
-        <w:t>Click the 'Find' button to initiate the search for restaurants.</w:t>
-      </w:r>
-    </w:p>
-    <w:p>
-      <w:r>
-        <w:rPr>
-          <w:rFonts w:ascii="Segoe UI Emoji" w:hAnsi="Segoe UI Emoji" w:cs="Segoe UI Emoji"/>
-          <w:b/>
-          <w:bCs/>
-        </w:rPr>
-        <w:t>⚡</w:t>
-      </w:r>
-    </w:p>
-    <w:p>
-      <w:r>
-        <w:rPr>
-          <w:b/>
-          <w:bCs/>
-        </w:rPr>
-        <w:t>Step 4CLICK</w:t>
-      </w:r>
-      <w:r>
-        <w:t>Click the 'Find' button to initiate the search for restaurants.</w:t>
-      </w:r>
-    </w:p>
-    <w:p>
-      <w:r>
-        <w:rPr>
-          <w:rFonts w:ascii="Segoe UI Symbol" w:hAnsi="Segoe UI Symbol" w:cs="Segoe UI Symbol"/>
-          <w:b/>
-          <w:bCs/>
-        </w:rPr>
-        <w:t>✗</w:t>
-      </w:r>
-    </w:p>
-    <w:p>
-      <w:r>
-        <w:rPr>
-          <w:b/>
-          <w:bCs/>
-        </w:rPr>
-        <w:t>Step 5CLICK</w:t>
-      </w:r>
-      <w:r>
-        <w:t xml:space="preserve">Click the 'Find' button to initiate the search for </w:t>
-      </w:r>
-      <w:proofErr w:type="spellStart"/>
-      <w:proofErr w:type="gramStart"/>
-      <w:r>
-        <w:t>restaurants.</w:t>
-      </w:r>
-      <w:r>
-        <w:rPr>
-          <w:i/>
-          <w:iCs/>
-        </w:rPr>
-        <w:t>Action</w:t>
-      </w:r>
-      <w:proofErr w:type="spellEnd"/>
-      <w:proofErr w:type="gramEnd"/>
-      <w:r>
-        <w:rPr>
-          <w:i/>
-          <w:iCs/>
-        </w:rPr>
-        <w:t xml:space="preserve"> reported success, but the page did not visibly change after click. Retrying from the current page state.</w:t>
-      </w:r>
-    </w:p>
-    <w:p>
-      <w:r>
-        <w:rPr>
-          <w:rFonts w:ascii="Segoe UI Emoji" w:hAnsi="Segoe UI Emoji" w:cs="Segoe UI Emoji"/>
-          <w:b/>
-          <w:bCs/>
-        </w:rPr>
-        <w:t>⚡</w:t>
-      </w:r>
-    </w:p>
-    <w:p>
-      <w:r>
-        <w:rPr>
-          <w:b/>
-          <w:bCs/>
-        </w:rPr>
-        <w:t>Step 6WAIT</w:t>
-      </w:r>
-      <w:r>
-        <w:t>Wait for 2 seconds to allow the page to stabilize.</w:t>
-      </w:r>
-    </w:p>
-    <w:p>
-      <w:r>
-        <w:rPr>
-          <w:rFonts w:ascii="Segoe UI Emoji" w:hAnsi="Segoe UI Emoji" w:cs="Segoe UI Emoji"/>
-          <w:b/>
-          <w:bCs/>
-        </w:rPr>
-        <w:t>⚡</w:t>
-      </w:r>
-    </w:p>
-    <w:p>
-      <w:r>
-        <w:rPr>
-          <w:b/>
-          <w:bCs/>
-        </w:rPr>
-        <w:t>Step 7CLICK</w:t>
-      </w:r>
-      <w:r>
-        <w:t>Click the 'Find' button to initiate the search for restaurants.</w:t>
-      </w:r>
-    </w:p>
-    <w:p>
-      <w:r>
-        <w:rPr>
-          <w:rFonts w:ascii="Segoe UI Emoji" w:hAnsi="Segoe UI Emoji" w:cs="Segoe UI Emoji"/>
-          <w:b/>
-          <w:bCs/>
-        </w:rPr>
-        <w:t>⚡</w:t>
-      </w:r>
-    </w:p>
-    <w:p>
-      <w:r>
-        <w:rPr>
-          <w:b/>
-          <w:bCs/>
-        </w:rPr>
-        <w:t>Step 8CLICK</w:t>
-      </w:r>
-      <w:r>
-        <w:t>Click the 'Find' button to initiate the search for restaurants.</w:t>
-      </w:r>
-    </w:p>
-    <w:p>
-      <w:r>
-        <w:rPr>
-          <w:rFonts w:ascii="Segoe UI Emoji" w:hAnsi="Segoe UI Emoji" w:cs="Segoe UI Emoji"/>
-          <w:b/>
-          <w:bCs/>
-        </w:rPr>
-        <w:t>⚡</w:t>
-      </w:r>
-    </w:p>
-    <w:p>
-      <w:r>
-        <w:rPr>
-          <w:b/>
-          <w:bCs/>
-        </w:rPr>
-        <w:lastRenderedPageBreak/>
-        <w:t>Step 9CLICK</w:t>
-      </w:r>
-      <w:r>
-        <w:t>Click the 'Find' button to initiate the search for restaurants.</w:t>
-      </w:r>
-    </w:p>
-    <w:p/>
-    <w:p>
-      <w:pPr>
-        <w:rPr>
-          <w:b/>
-          <w:bCs/>
-        </w:rPr>
-      </w:pPr>
-      <w:r>
-        <w:rPr>
-          <w:b/>
-          <w:bCs/>
-        </w:rPr>
-        <w:t>7) Real application workflow</w:t>
-      </w:r>
-    </w:p>
-    <w:p>
-      <w:r>
-        <w:rPr>
-          <w:b/>
-          <w:bCs/>
-        </w:rPr>
-        <w:t>Prompt:</w:t>
-      </w:r>
-    </w:p>
-    <w:p>
-      <w:r>
-        <w:t>text</w:t>
-      </w:r>
-    </w:p>
-    <w:p>
-      <w:r>
-        <w:t>Open a real SaaS website that offers a free account or free trial.</w:t>
-      </w:r>
-    </w:p>
-    <w:p/>
-    <w:p>
-      <w:r>
-        <w:t>Complete the full signup flow using only a test email you control.</w:t>
-      </w:r>
-    </w:p>
-    <w:p/>
-    <w:p>
-      <w:r>
-        <w:t>After signup:</w:t>
-      </w:r>
-    </w:p>
-    <w:p>
-      <w:r>
-        <w:t>1. Verify the welcome page or dashboard loads.</w:t>
-      </w:r>
-    </w:p>
-    <w:p>
-      <w:r>
-        <w:t>2. Locate one setting, one profile field, and one billing or plan page.</w:t>
-      </w:r>
-    </w:p>
-    <w:p>
-      <w:r>
-        <w:t>3. Capture screenshots of the successful login state and the profile page.</w:t>
-      </w:r>
-    </w:p>
-    <w:p>
-      <w:r>
-        <w:t>4. Return a short report with what worked and what failed.</w:t>
-      </w:r>
-    </w:p>
-    <w:p>
-      <w:pPr>
-        <w:rPr>
-          <w:b/>
-          <w:bCs/>
-        </w:rPr>
-      </w:pPr>
-      <w:r>
-        <w:rPr>
-          <w:b/>
-          <w:bCs/>
-        </w:rPr>
-        <w:t>8) Real file upload and report</w:t>
-      </w:r>
-    </w:p>
-    <w:p>
-      <w:r>
-        <w:rPr>
-          <w:b/>
-          <w:bCs/>
-        </w:rPr>
-        <w:t>Prompt:</w:t>
-      </w:r>
-    </w:p>
-    <w:p>
-      <w:r>
-        <w:t>text</w:t>
-      </w:r>
-    </w:p>
-    <w:p>
-      <w:r>
-        <w:t>Open a real website that allows file upload for logged-in users or public upload.</w:t>
-      </w:r>
-    </w:p>
-    <w:p/>
-    <w:p>
-      <w:r>
-        <w:t>Upload a small PDF or image file.</w:t>
-      </w:r>
-    </w:p>
-    <w:p/>
-    <w:p>
-      <w:r>
-        <w:t>Then:</w:t>
-      </w:r>
-    </w:p>
-    <w:p>
-      <w:r>
-        <w:t>1. Confirm the file was accepted.</w:t>
-      </w:r>
-    </w:p>
-    <w:p>
-      <w:r>
-        <w:t>2. Find where the uploaded file appears.</w:t>
-      </w:r>
-    </w:p>
-    <w:p>
-      <w:r>
-        <w:t>3. If the site provides a share link or processing result, copy it.</w:t>
-      </w:r>
-    </w:p>
-    <w:p>
-      <w:r>
-        <w:t>4. Return the result with the exact page path and any visible status text.</w:t>
-      </w:r>
-    </w:p>
-    <w:p>
-      <w:pPr>
-        <w:rPr>
-          <w:b/>
-          <w:bCs/>
-        </w:rPr>
-      </w:pPr>
-      <w:r>
-        <w:rPr>
-          <w:b/>
-          <w:bCs/>
-        </w:rPr>
-        <w:t>9) Real data entry with validation</w:t>
-      </w:r>
-    </w:p>
-    <w:p>
-      <w:r>
-        <w:rPr>
-          <w:b/>
-          <w:bCs/>
-        </w:rPr>
-        <w:t>Prompt:</w:t>
-      </w:r>
-    </w:p>
-    <w:p>
-      <w:r>
-        <w:lastRenderedPageBreak/>
-        <w:t>text</w:t>
-      </w:r>
-    </w:p>
-    <w:p>
-      <w:r>
-        <w:t>Open a real government, university, or company form that is publicly accessible and safe to use with test data.</w:t>
-      </w:r>
-    </w:p>
-    <w:p/>
-    <w:p>
-      <w:r>
-        <w:t>Fill the form with clearly fake test data, but make it look realistic.</w:t>
-      </w:r>
-    </w:p>
-    <w:p/>
-    <w:p>
-      <w:r>
-        <w:t>Then:</w:t>
-      </w:r>
-    </w:p>
-    <w:p>
-      <w:r>
-        <w:t>1. Check whether the form shows validation errors.</w:t>
-      </w:r>
-    </w:p>
-    <w:p>
-      <w:r>
-        <w:t>2. Fix any errors the page reports.</w:t>
-      </w:r>
-    </w:p>
-    <w:p>
-      <w:r>
-        <w:t>3. Submit only if it is a genuine test or sandbox form.</w:t>
-      </w:r>
-    </w:p>
-    <w:p>
-      <w:r>
-        <w:t>4. Report the validation rules you encountered and whether submission succeeded.</w:t>
-      </w:r>
-    </w:p>
-    <w:p>
-      <w:pPr>
-        <w:rPr>
-          <w:b/>
-          <w:bCs/>
-        </w:rPr>
-      </w:pPr>
-      <w:r>
-        <w:rPr>
-          <w:b/>
-          <w:bCs/>
-        </w:rPr>
-        <w:t>10) Complex multi-step research and output</w:t>
-      </w:r>
-    </w:p>
-    <w:p>
-      <w:r>
-        <w:rPr>
-          <w:b/>
-          <w:bCs/>
-        </w:rPr>
-        <w:t>Prompt:</w:t>
-      </w:r>
-    </w:p>
-    <w:p>
-      <w:r>
-        <w:t>text</w:t>
-      </w:r>
-    </w:p>
-    <w:p>
-      <w:r>
-        <w:t>Use Google Search and official websites to research:</w:t>
-      </w:r>
-    </w:p>
-    <w:p>
-      <w:r>
-        <w:t>`AI browser automation testing best practices`</w:t>
-      </w:r>
-    </w:p>
-    <w:p/>
-    <w:p>
-      <w:r>
-        <w:t>Do this in order:</w:t>
-      </w:r>
-    </w:p>
-    <w:p>
-      <w:r>
-        <w:t>1. Open at least 5 authoritative sources.</w:t>
-      </w:r>
-    </w:p>
-    <w:p>
-      <w:r>
-        <w:t>2. Extract the top recommended testing practices.</w:t>
-      </w:r>
-    </w:p>
-    <w:p>
-      <w:r>
-        <w:t>3. Separate practices into: reliability, observability, recovery, and safety.</w:t>
-      </w:r>
-    </w:p>
-    <w:p>
-      <w:r>
-        <w:t>4. Create a final checklist with 1 line per practice.</w:t>
-      </w:r>
-    </w:p>
-    <w:p>
-      <w:r>
         <w:t>5. Cite the source URL next to each line.</w:t>
       </w:r>
     </w:p>

</xml_diff>

<commit_message>
Refine planner reasoning for mission modes and site suitability
</commit_message>
<xml_diff>
--- a/15.docx
+++ b/15.docx
@@ -2820,7 +2820,7 @@
     </w:p>
     <w:p>
       <w:r>
-        <w:t>The task is currently blocked due to previous attempts to open the top 5 relevant results in new tabs failing. The next step is to open the first relevant search result that has not been opened yet.</w:t>
+        <w:t>The current task is to open the top 5 relevant search results in new tabs. The first four results have been opened successfully, but the fifth result could not be found. Therefore, I will attempt to open the next available relevant result, which is the sixth one, to ensure that I can gather enough information for the comparison table.</w:t>
       </w:r>
     </w:p>
     <w:p>
@@ -2842,7 +2842,7 @@
         <w:t>Step 1NAVIGATE</w:t>
       </w:r>
       <w:r>
-        <w:t>This action will open Google Search in the current tab.</w:t>
+        <w:t>This action opens Google Search to perform the required search.</w:t>
       </w:r>
     </w:p>
     <w:p>
@@ -2864,7 +2864,7 @@
         <w:t>Step 2FILL</w:t>
       </w:r>
       <w:r>
-        <w:t>Fills the search input with the specified query to perform the search.</w:t>
+        <w:t>Fills the search input field with the query for the search.</w:t>
       </w:r>
     </w:p>
     <w:p>
@@ -2886,7 +2886,7 @@
         <w:t>Step 3CLICK</w:t>
       </w:r>
       <w:r>
-        <w:t>Clicks the Google Search button to perform the search.</w:t>
+        <w:t>This action submits the search query to Google.</w:t>
       </w:r>
     </w:p>
     <w:p>
@@ -2908,7 +2908,7 @@
         <w:t>Step 4CLICK</w:t>
       </w:r>
       <w:r>
-        <w:t>Opens the first relevant search result in a new tab.</w:t>
+        <w:t>This action opens the first relevant search result in a new tab.</w:t>
       </w:r>
     </w:p>
     <w:p>
@@ -2930,7 +2930,7 @@
         <w:t>Step 5CLICK</w:t>
       </w:r>
       <w:r>
-        <w:t>Opens the second relevant search result in a new tab.</w:t>
+        <w:t>This action opens the second relevant search result in a new tab.</w:t>
       </w:r>
     </w:p>
     <w:p>
@@ -2952,7 +2952,7 @@
         <w:t>Step 6CLICK</w:t>
       </w:r>
       <w:r>
-        <w:t>Opens the third relevant search result in a new tab.</w:t>
+        <w:t>This action opens the third relevant search result in a new tab.</w:t>
       </w:r>
     </w:p>
     <w:p>
@@ -2971,10 +2971,157 @@
           <w:b/>
           <w:bCs/>
         </w:rPr>
+        <w:lastRenderedPageBreak/>
         <w:t>Step 7CLICK</w:t>
       </w:r>
       <w:r>
-        <w:t>Opens the fourth relevant search result in a new tab.</w:t>
+        <w:t>This action opens the fourth relevant search result in a new tab.</w:t>
+      </w:r>
+    </w:p>
+    <w:p>
+      <w:r>
+        <w:rPr>
+          <w:rFonts w:ascii="Segoe UI Symbol" w:hAnsi="Segoe UI Symbol" w:cs="Segoe UI Symbol"/>
+          <w:b/>
+          <w:bCs/>
+        </w:rPr>
+        <w:t>✗</w:t>
+      </w:r>
+    </w:p>
+    <w:p>
+      <w:r>
+        <w:rPr>
+          <w:b/>
+          <w:bCs/>
+        </w:rPr>
+        <w:t>Step 8CLICK</w:t>
+      </w:r>
+      <w:r>
+        <w:t xml:space="preserve">This action opens the fifth relevant search result in a new </w:t>
+      </w:r>
+      <w:proofErr w:type="spellStart"/>
+      <w:r>
+        <w:t>tab.</w:t>
+      </w:r>
+      <w:r>
+        <w:rPr>
+          <w:i/>
+          <w:iCs/>
+        </w:rPr>
+        <w:t>Element</w:t>
+      </w:r>
+      <w:proofErr w:type="spellEnd"/>
+      <w:r>
+        <w:rPr>
+          <w:i/>
+          <w:iCs/>
+        </w:rPr>
+        <w:t xml:space="preserve"> not found: div &gt; div &gt; div &gt; ul &gt; </w:t>
+      </w:r>
+      <w:proofErr w:type="spellStart"/>
+      <w:r>
+        <w:rPr>
+          <w:i/>
+          <w:iCs/>
+        </w:rPr>
+        <w:t>li:nth-of-type</w:t>
+      </w:r>
+      <w:proofErr w:type="spellEnd"/>
+      <w:r>
+        <w:rPr>
+          <w:i/>
+          <w:iCs/>
+        </w:rPr>
+        <w:t xml:space="preserve">(5) &gt; </w:t>
+      </w:r>
+      <w:proofErr w:type="spellStart"/>
+      <w:r>
+        <w:rPr>
+          <w:i/>
+          <w:iCs/>
+        </w:rPr>
+        <w:t>div:nth-of-type</w:t>
+      </w:r>
+      <w:proofErr w:type="spellEnd"/>
+      <w:r>
+        <w:rPr>
+          <w:i/>
+          <w:iCs/>
+        </w:rPr>
+        <w:t>(1) &gt; a</w:t>
+      </w:r>
+    </w:p>
+    <w:p>
+      <w:r>
+        <w:rPr>
+          <w:rFonts w:ascii="Segoe UI Symbol" w:hAnsi="Segoe UI Symbol" w:cs="Segoe UI Symbol"/>
+          <w:b/>
+          <w:bCs/>
+        </w:rPr>
+        <w:t>✗</w:t>
+      </w:r>
+    </w:p>
+    <w:p>
+      <w:r>
+        <w:rPr>
+          <w:b/>
+          <w:bCs/>
+        </w:rPr>
+        <w:t>Step 9CLICK</w:t>
+      </w:r>
+      <w:r>
+        <w:t xml:space="preserve">This action opens the sixth relevant search result in a new </w:t>
+      </w:r>
+      <w:proofErr w:type="spellStart"/>
+      <w:r>
+        <w:t>tab.</w:t>
+      </w:r>
+      <w:r>
+        <w:rPr>
+          <w:i/>
+          <w:iCs/>
+        </w:rPr>
+        <w:t>Element</w:t>
+      </w:r>
+      <w:proofErr w:type="spellEnd"/>
+      <w:r>
+        <w:rPr>
+          <w:i/>
+          <w:iCs/>
+        </w:rPr>
+        <w:t xml:space="preserve"> not found: div &gt; div &gt; div &gt; ul &gt; </w:t>
+      </w:r>
+      <w:proofErr w:type="spellStart"/>
+      <w:r>
+        <w:rPr>
+          <w:i/>
+          <w:iCs/>
+        </w:rPr>
+        <w:t>li:nth-of-type</w:t>
+      </w:r>
+      <w:proofErr w:type="spellEnd"/>
+      <w:r>
+        <w:rPr>
+          <w:i/>
+          <w:iCs/>
+        </w:rPr>
+        <w:t xml:space="preserve">(6) &gt; </w:t>
+      </w:r>
+      <w:proofErr w:type="spellStart"/>
+      <w:r>
+        <w:rPr>
+          <w:i/>
+          <w:iCs/>
+        </w:rPr>
+        <w:t>div:nth-of-type</w:t>
+      </w:r>
+      <w:proofErr w:type="spellEnd"/>
+      <w:r>
+        <w:rPr>
+          <w:i/>
+          <w:iCs/>
+        </w:rPr>
+        <w:t>(1) &gt; a</w:t>
       </w:r>
     </w:p>
     <w:p>
@@ -2984,7 +3131,6 @@
           <w:b/>
           <w:bCs/>
         </w:rPr>
-        <w:lastRenderedPageBreak/>
         <w:t>⚡</w:t>
       </w:r>
     </w:p>
@@ -2994,58 +3140,15 @@
           <w:b/>
           <w:bCs/>
         </w:rPr>
-        <w:t>Step 8CLICK</w:t>
-      </w:r>
-      <w:r>
-        <w:t>Opens the fifth relevant search result in a new tab.</w:t>
-      </w:r>
-    </w:p>
-    <w:p>
-      <w:r>
-        <w:rPr>
-          <w:rFonts w:ascii="Segoe UI Emoji" w:hAnsi="Segoe UI Emoji" w:cs="Segoe UI Emoji"/>
-          <w:b/>
-          <w:bCs/>
-        </w:rPr>
-        <w:t>⚡</w:t>
-      </w:r>
-    </w:p>
-    <w:p>
-      <w:r>
-        <w:rPr>
-          <w:b/>
-          <w:bCs/>
-        </w:rPr>
-        <w:t>Step 9WAIT</w:t>
-      </w:r>
-      <w:r>
-        <w:t>Wait for 5 seconds to allow time to read the opened tabs.</w:t>
-      </w:r>
-    </w:p>
-    <w:p>
-      <w:r>
-        <w:rPr>
-          <w:rFonts w:ascii="Segoe UI Emoji" w:hAnsi="Segoe UI Emoji" w:cs="Segoe UI Emoji"/>
-          <w:b/>
-          <w:bCs/>
-        </w:rPr>
-        <w:t>⚡</w:t>
-      </w:r>
-    </w:p>
-    <w:p>
-      <w:r>
-        <w:rPr>
-          <w:b/>
-          <w:bCs/>
-        </w:rPr>
         <w:t>Step 10CLICK</w:t>
       </w:r>
       <w:r>
-        <w:t>Opens the first relevant search result in a new tab.</w:t>
+        <w:t>This action opens the sixth relevant search result in a new tab.</w:t>
       </w:r>
     </w:p>
     <w:p/>
     <w:p/>
+    <w:p/>
     <w:p>
       <w:pPr>
         <w:rPr>
@@ -3154,7 +3257,11 @@
       </w:r>
       <w:proofErr w:type="spellEnd"/>
       <w:r>
-        <w:t xml:space="preserve">. However, the next step is to extract specific job information such as job title, location, experience needed, and application link. This information is necessary to </w:t>
+        <w:t xml:space="preserve">. However, the next step is to extract specific job information such as job title, location, experience needed, and application link. This information is necessary </w:t>
+      </w:r>
+      <w:r>
+        <w:lastRenderedPageBreak/>
+        <w:t xml:space="preserve">to </w:t>
       </w:r>
       <w:proofErr w:type="spellStart"/>
       <w:r>
@@ -3194,7 +3301,6 @@
           <w:b/>
           <w:bCs/>
         </w:rPr>
-        <w:lastRenderedPageBreak/>
         <w:t>⚡</w:t>
       </w:r>
     </w:p>
@@ -3377,6 +3483,7 @@
     </w:p>
     <w:p>
       <w:r>
+        <w:lastRenderedPageBreak/>
         <w:t>- Date posted: Past week</w:t>
       </w:r>
     </w:p>
@@ -3393,45 +3500,828 @@
     </w:p>
     <w:p>
       <w:r>
+        <w:t>1. Collect the first 10 relevant jobs.</w:t>
+      </w:r>
+    </w:p>
+    <w:p>
+      <w:r>
+        <w:t>2. For each job, capture title, company, location, posted date, and job link.</w:t>
+      </w:r>
+    </w:p>
+    <w:p>
+      <w:r>
+        <w:t>3. Remove duplicates.</w:t>
+      </w:r>
+    </w:p>
+    <w:p>
+      <w:r>
+        <w:t>4. Return the jobs ranked by relevance.</w:t>
+      </w:r>
+      <w:r>
+        <w:br/>
+      </w:r>
+      <w:r>
+        <w:br/>
+      </w:r>
+    </w:p>
+    <w:p/>
+    <w:p>
+      <w:pPr>
+        <w:rPr>
+          <w:b/>
+          <w:bCs/>
+        </w:rPr>
+      </w:pPr>
+      <w:r>
+        <w:rPr>
+          <w:b/>
+          <w:bCs/>
+        </w:rPr>
+        <w:t>4) Product pricing comparison</w:t>
+      </w:r>
+    </w:p>
+    <w:p>
+      <w:r>
+        <w:rPr>
+          <w:b/>
+          <w:bCs/>
+        </w:rPr>
+        <w:t>Prompt:</w:t>
+      </w:r>
+    </w:p>
+    <w:p>
+      <w:r>
+        <w:t>text</w:t>
+      </w:r>
+    </w:p>
+    <w:p>
+      <w:r>
+        <w:t>Open the official websites of 3 AI code assistant products from search results.</w:t>
+      </w:r>
+    </w:p>
+    <w:p/>
+    <w:p>
+      <w:r>
+        <w:t>For each product:</w:t>
+      </w:r>
+    </w:p>
+    <w:p>
+      <w:r>
+        <w:t>1. Find the pricing page.</w:t>
+      </w:r>
+    </w:p>
+    <w:p>
+      <w:r>
+        <w:t>2. Capture the free plan, paid plan starting price, and whether a trial is available.</w:t>
+      </w:r>
+    </w:p>
+    <w:p>
+      <w:r>
+        <w:t>3. Capture one feature that is clearly mentioned on the pricing or product page.</w:t>
+      </w:r>
+    </w:p>
+    <w:p>
+      <w:r>
+        <w:t>4. Return a comparison table with source URLs.</w:t>
+      </w:r>
+      <w:r>
+        <w:br/>
+      </w:r>
+      <w:r>
+        <w:br/>
+      </w:r>
+      <w:r>
+        <w:t>Analysis failed: [object Object]</w:t>
+      </w:r>
+    </w:p>
+    <w:p>
+      <w:pPr>
+        <w:rPr>
+          <w:b/>
+          <w:bCs/>
+        </w:rPr>
+      </w:pPr>
+      <w:r>
+        <w:rPr>
+          <w:b/>
+          <w:bCs/>
+        </w:rPr>
+        <w:t>AI Analysis</w:t>
+      </w:r>
+    </w:p>
+    <w:p>
+      <w:r>
+        <w:t>The task is currently blocked as previous attempts to access the pricing information for Gemini Code Assist have not yielded the desired results. The next step is to try a different link to access the pricing information.</w:t>
+      </w:r>
+    </w:p>
+    <w:p>
+      <w:r>
+        <w:rPr>
+          <w:rFonts w:ascii="Segoe UI Emoji" w:hAnsi="Segoe UI Emoji" w:cs="Segoe UI Emoji"/>
+          <w:b/>
+          <w:bCs/>
+        </w:rPr>
+        <w:t>⚡</w:t>
+      </w:r>
+    </w:p>
+    <w:p>
+      <w:r>
+        <w:rPr>
+          <w:b/>
+          <w:bCs/>
+        </w:rPr>
+        <w:t>Step 1NAVIGATE</w:t>
+      </w:r>
+      <w:r>
+        <w:t>This action will open Google to search for AI code assistant products.</w:t>
+      </w:r>
+    </w:p>
+    <w:p>
+      <w:r>
+        <w:rPr>
+          <w:rFonts w:ascii="Segoe UI Emoji" w:hAnsi="Segoe UI Emoji" w:cs="Segoe UI Emoji"/>
+          <w:b/>
+          <w:bCs/>
+        </w:rPr>
+        <w:t>⚡</w:t>
+      </w:r>
+    </w:p>
+    <w:p>
+      <w:r>
+        <w:rPr>
+          <w:b/>
+          <w:bCs/>
+        </w:rPr>
         <w:lastRenderedPageBreak/>
-        <w:t>1. Collect the first 10 relevant jobs.</w:t>
-      </w:r>
-    </w:p>
-    <w:p>
-      <w:r>
-        <w:t>2. For each job, capture title, company, location, posted date, and job link.</w:t>
-      </w:r>
-    </w:p>
-    <w:p>
-      <w:r>
-        <w:t>3. Remove duplicates.</w:t>
-      </w:r>
-    </w:p>
-    <w:p>
-      <w:r>
-        <w:t>4. Return the jobs ranked by relevance.</w:t>
-      </w:r>
+        <w:t>Step 2FILL</w:t>
+      </w:r>
+      <w:r>
+        <w:t>This fills the search input with the query to find AI code assistant products.</w:t>
+      </w:r>
+    </w:p>
+    <w:p>
+      <w:r>
+        <w:rPr>
+          <w:rFonts w:ascii="Segoe UI Emoji" w:hAnsi="Segoe UI Emoji" w:cs="Segoe UI Emoji"/>
+          <w:b/>
+          <w:bCs/>
+        </w:rPr>
+        <w:t>⚡</w:t>
+      </w:r>
+    </w:p>
+    <w:p>
+      <w:r>
+        <w:rPr>
+          <w:b/>
+          <w:bCs/>
+        </w:rPr>
+        <w:t>Step 3CLICK</w:t>
+      </w:r>
+      <w:r>
+        <w:t>Click the Google Search button to perform the search for AI code assistant products.</w:t>
+      </w:r>
+    </w:p>
+    <w:p>
+      <w:r>
+        <w:rPr>
+          <w:rFonts w:ascii="Segoe UI Emoji" w:hAnsi="Segoe UI Emoji" w:cs="Segoe UI Emoji"/>
+          <w:b/>
+          <w:bCs/>
+        </w:rPr>
+        <w:t>⚡</w:t>
+      </w:r>
+    </w:p>
+    <w:p>
+      <w:r>
+        <w:rPr>
+          <w:b/>
+          <w:bCs/>
+        </w:rPr>
+        <w:t>Step 4CLICK</w:t>
+      </w:r>
+      <w:r>
+        <w:t>Open the official website for Gemini Code Assist.</w:t>
+      </w:r>
+    </w:p>
+    <w:p>
+      <w:r>
+        <w:rPr>
+          <w:rFonts w:ascii="Segoe UI Emoji" w:hAnsi="Segoe UI Emoji" w:cs="Segoe UI Emoji"/>
+          <w:b/>
+          <w:bCs/>
+        </w:rPr>
+        <w:t>⚡</w:t>
+      </w:r>
+    </w:p>
+    <w:p>
+      <w:r>
+        <w:rPr>
+          <w:b/>
+          <w:bCs/>
+        </w:rPr>
+        <w:t>Step 5CLICK</w:t>
+      </w:r>
+      <w:r>
+        <w:t>Click the pricing link to access the pricing page for Gemini Code Assist.</w:t>
+      </w:r>
+    </w:p>
+    <w:p>
+      <w:r>
+        <w:rPr>
+          <w:rFonts w:ascii="Segoe UI Emoji" w:hAnsi="Segoe UI Emoji" w:cs="Segoe UI Emoji"/>
+          <w:b/>
+          <w:bCs/>
+        </w:rPr>
+        <w:t>⚡</w:t>
+      </w:r>
+    </w:p>
+    <w:p>
+      <w:r>
+        <w:rPr>
+          <w:b/>
+          <w:bCs/>
+        </w:rPr>
+        <w:t>Step 6CLICK</w:t>
+      </w:r>
+      <w:r>
+        <w:t>Click the link for Gemini Code Assist Standard and Enterprise to access the pricing information.</w:t>
+      </w:r>
+    </w:p>
+    <w:p>
+      <w:r>
+        <w:rPr>
+          <w:rFonts w:ascii="Segoe UI Emoji" w:hAnsi="Segoe UI Emoji" w:cs="Segoe UI Emoji"/>
+          <w:b/>
+          <w:bCs/>
+        </w:rPr>
+        <w:t>⚡</w:t>
+      </w:r>
+    </w:p>
+    <w:p>
+      <w:r>
+        <w:rPr>
+          <w:b/>
+          <w:bCs/>
+        </w:rPr>
+        <w:t>Step 7CLICK</w:t>
+      </w:r>
+      <w:r>
+        <w:t>Click the link for Gemini Cloud Assist Pricing Overview to access the pricing information.</w:t>
+      </w:r>
+    </w:p>
+    <w:p>
+      <w:r>
+        <w:rPr>
+          <w:rFonts w:ascii="Segoe UI Emoji" w:hAnsi="Segoe UI Emoji" w:cs="Segoe UI Emoji"/>
+          <w:b/>
+          <w:bCs/>
+        </w:rPr>
+        <w:t>⚡</w:t>
+      </w:r>
+    </w:p>
+    <w:p>
+      <w:r>
+        <w:rPr>
+          <w:b/>
+          <w:bCs/>
+        </w:rPr>
+        <w:t>Step 8CLICK</w:t>
+      </w:r>
+      <w:r>
+        <w:t>Click the link to access the pricing information for Gemini Code Assist Standard and Enterprise.</w:t>
+      </w:r>
+    </w:p>
+    <w:p>
+      <w:r>
+        <w:rPr>
+          <w:rFonts w:ascii="Segoe UI Emoji" w:hAnsi="Segoe UI Emoji" w:cs="Segoe UI Emoji"/>
+          <w:b/>
+          <w:bCs/>
+        </w:rPr>
+        <w:t>⚡</w:t>
+      </w:r>
+    </w:p>
+    <w:p>
+      <w:r>
+        <w:rPr>
+          <w:b/>
+          <w:bCs/>
+        </w:rPr>
+        <w:t>Step 9CLICK</w:t>
+      </w:r>
+      <w:r>
+        <w:t>Click the link for Gemini Code Assist pricing to access the pricing information.</w:t>
+      </w:r>
+    </w:p>
+    <w:p/>
+    <w:p>
       <w:r>
         <w:br/>
       </w:r>
+    </w:p>
+    <w:p>
+      <w:pPr>
+        <w:rPr>
+          <w:b/>
+          <w:bCs/>
+        </w:rPr>
+      </w:pPr>
+      <w:r>
+        <w:rPr>
+          <w:b/>
+          <w:bCs/>
+        </w:rPr>
+        <w:t>5) Long form research extraction</w:t>
+      </w:r>
+    </w:p>
+    <w:p>
+      <w:r>
+        <w:rPr>
+          <w:b/>
+          <w:bCs/>
+        </w:rPr>
+        <w:t>Prompt:</w:t>
+      </w:r>
+    </w:p>
+    <w:p>
+      <w:r>
+        <w:t>text</w:t>
+      </w:r>
+    </w:p>
+    <w:p>
+      <w:r>
+        <w:t>Search the web for official documentation or product pages about browser automation tools.</w:t>
+      </w:r>
+    </w:p>
+    <w:p/>
+    <w:p>
+      <w:r>
+        <w:t>Pick 3 different tools and for each one:</w:t>
+      </w:r>
+    </w:p>
+    <w:p>
+      <w:r>
+        <w:lastRenderedPageBreak/>
+        <w:t>1. Find the official documentation page.</w:t>
+      </w:r>
+    </w:p>
+    <w:p>
+      <w:r>
+        <w:t>2. Extract the supported languages, main use case, and whether it supports browser control.</w:t>
+      </w:r>
+    </w:p>
+    <w:p>
+      <w:r>
+        <w:t>3. Note one setup requirement.</w:t>
+      </w:r>
+    </w:p>
+    <w:p>
+      <w:pPr>
+        <w:rPr>
+          <w:b/>
+          <w:bCs/>
+        </w:rPr>
+      </w:pPr>
+      <w:r>
+        <w:t>4. Return the answer in markdown bullets, grouped by tool.</w:t>
+      </w:r>
       <w:r>
         <w:br/>
       </w:r>
+      <w:r>
+        <w:br/>
+      </w:r>
+      <w:r>
+        <w:rPr>
+          <w:b/>
+          <w:bCs/>
+        </w:rPr>
+        <w:t>AI Analysis</w:t>
+      </w:r>
+    </w:p>
+    <w:p>
+      <w:pPr>
+        <w:rPr>
+          <w:b/>
+          <w:bCs/>
+        </w:rPr>
+      </w:pPr>
+      <w:r>
+        <w:rPr>
+          <w:b/>
+          <w:bCs/>
+        </w:rPr>
+        <w:t>The task is currently blocked due to repeated failures in clicking links to access documentation for browser automation tools. The next step is to gather more information about available links to documentation or product pages for different tools. Replan reason: The current approach of clicking links has resulted in no effect. A different strategy is needed to find the documentation for browser automation tools.</w:t>
+      </w:r>
+    </w:p>
+    <w:p>
+      <w:pPr>
+        <w:rPr>
+          <w:b/>
+          <w:bCs/>
+        </w:rPr>
+      </w:pPr>
+      <w:r>
+        <w:rPr>
+          <w:rFonts w:ascii="Segoe UI Emoji" w:hAnsi="Segoe UI Emoji" w:cs="Segoe UI Emoji"/>
+          <w:b/>
+          <w:bCs/>
+        </w:rPr>
+        <w:t>⚡</w:t>
+      </w:r>
+    </w:p>
+    <w:p>
+      <w:pPr>
+        <w:rPr>
+          <w:b/>
+          <w:bCs/>
+        </w:rPr>
+      </w:pPr>
+      <w:r>
+        <w:rPr>
+          <w:b/>
+          <w:bCs/>
+        </w:rPr>
+        <w:t>Step 1NAVIGATENavigate to Google to search for browser automation tools.</w:t>
+      </w:r>
+    </w:p>
+    <w:p>
+      <w:pPr>
+        <w:rPr>
+          <w:b/>
+          <w:bCs/>
+        </w:rPr>
+      </w:pPr>
+      <w:r>
+        <w:rPr>
+          <w:rFonts w:ascii="Segoe UI Emoji" w:hAnsi="Segoe UI Emoji" w:cs="Segoe UI Emoji"/>
+          <w:b/>
+          <w:bCs/>
+        </w:rPr>
+        <w:t>⚡</w:t>
+      </w:r>
+    </w:p>
+    <w:p>
+      <w:pPr>
+        <w:rPr>
+          <w:b/>
+          <w:bCs/>
+        </w:rPr>
+      </w:pPr>
+      <w:r>
+        <w:rPr>
+          <w:b/>
+          <w:bCs/>
+        </w:rPr>
+        <w:t>Step 2FILLThis fills the search input with the query for browser automation tools.</w:t>
+      </w:r>
+    </w:p>
+    <w:p>
+      <w:pPr>
+        <w:rPr>
+          <w:b/>
+          <w:bCs/>
+        </w:rPr>
+      </w:pPr>
+      <w:r>
+        <w:rPr>
+          <w:rFonts w:ascii="Segoe UI Emoji" w:hAnsi="Segoe UI Emoji" w:cs="Segoe UI Emoji"/>
+          <w:b/>
+          <w:bCs/>
+        </w:rPr>
+        <w:t>⚡</w:t>
+      </w:r>
+    </w:p>
+    <w:p>
+      <w:pPr>
+        <w:rPr>
+          <w:b/>
+          <w:bCs/>
+        </w:rPr>
+      </w:pPr>
+      <w:r>
+        <w:rPr>
+          <w:b/>
+          <w:bCs/>
+        </w:rPr>
+        <w:t>Step 3CLICKClick the 'Google Search' button to perform the search for browser automation tools.</w:t>
+      </w:r>
+    </w:p>
+    <w:p>
+      <w:pPr>
+        <w:rPr>
+          <w:b/>
+          <w:bCs/>
+        </w:rPr>
+      </w:pPr>
+      <w:r>
+        <w:rPr>
+          <w:rFonts w:ascii="Segoe UI Emoji" w:hAnsi="Segoe UI Emoji" w:cs="Segoe UI Emoji"/>
+          <w:b/>
+          <w:bCs/>
+        </w:rPr>
+        <w:t>⚡</w:t>
+      </w:r>
+    </w:p>
+    <w:p>
+      <w:pPr>
+        <w:rPr>
+          <w:b/>
+          <w:bCs/>
+        </w:rPr>
+      </w:pPr>
+      <w:r>
+        <w:rPr>
+          <w:b/>
+          <w:bCs/>
+        </w:rPr>
+        <w:t>Step 4CLICKClick the first link to access the documentation for the first browser automation tool.</w:t>
+      </w:r>
+    </w:p>
+    <w:p>
+      <w:pPr>
+        <w:rPr>
+          <w:b/>
+          <w:bCs/>
+        </w:rPr>
+      </w:pPr>
+      <w:r>
+        <w:rPr>
+          <w:rFonts w:ascii="Segoe UI Emoji" w:hAnsi="Segoe UI Emoji" w:cs="Segoe UI Emoji"/>
+          <w:b/>
+          <w:bCs/>
+        </w:rPr>
+        <w:t>⚡</w:t>
+      </w:r>
+    </w:p>
+    <w:p>
+      <w:pPr>
+        <w:rPr>
+          <w:b/>
+          <w:bCs/>
+        </w:rPr>
+      </w:pPr>
+      <w:r>
+        <w:rPr>
+          <w:b/>
+          <w:bCs/>
+        </w:rPr>
+        <w:t>Step 5CLICKClick the second link in the search results to access the documentation for the second browser automation tool.</w:t>
+      </w:r>
+    </w:p>
+    <w:p>
+      <w:pPr>
+        <w:rPr>
+          <w:b/>
+          <w:bCs/>
+        </w:rPr>
+      </w:pPr>
+      <w:r>
+        <w:rPr>
+          <w:rFonts w:ascii="Segoe UI Emoji" w:hAnsi="Segoe UI Emoji" w:cs="Segoe UI Emoji"/>
+          <w:b/>
+          <w:bCs/>
+        </w:rPr>
+        <w:t>⚡</w:t>
+      </w:r>
+    </w:p>
+    <w:p>
+      <w:pPr>
+        <w:rPr>
+          <w:b/>
+          <w:bCs/>
+        </w:rPr>
+      </w:pPr>
+      <w:r>
+        <w:rPr>
+          <w:b/>
+          <w:bCs/>
+        </w:rPr>
+        <w:t>Step 6CLICKClick the link to access the documentation for Axiom Browser Automation.</w:t>
+      </w:r>
+    </w:p>
+    <w:p>
+      <w:pPr>
+        <w:rPr>
+          <w:b/>
+          <w:bCs/>
+        </w:rPr>
+      </w:pPr>
+      <w:r>
+        <w:rPr>
+          <w:rFonts w:ascii="Segoe UI Emoji" w:hAnsi="Segoe UI Emoji" w:cs="Segoe UI Emoji"/>
+          <w:b/>
+          <w:bCs/>
+        </w:rPr>
+        <w:t>⚡</w:t>
+      </w:r>
+    </w:p>
+    <w:p>
+      <w:pPr>
+        <w:rPr>
+          <w:b/>
+          <w:bCs/>
+        </w:rPr>
+      </w:pPr>
+      <w:r>
+        <w:rPr>
+          <w:b/>
+          <w:bCs/>
+        </w:rPr>
+        <w:t>Step 7CLICKClick the link to access the official documentation for Axiom Browser Automation.</w:t>
+      </w:r>
+    </w:p>
+    <w:p>
+      <w:pPr>
+        <w:rPr>
+          <w:b/>
+          <w:bCs/>
+        </w:rPr>
+      </w:pPr>
+      <w:r>
+        <w:rPr>
+          <w:b/>
+          <w:bCs/>
+        </w:rPr>
+        <w:t>Planner requested replan</w:t>
+      </w:r>
+    </w:p>
+    <w:p>
+      <w:pPr>
+        <w:rPr>
+          <w:b/>
+          <w:bCs/>
+        </w:rPr>
+      </w:pPr>
+      <w:r>
+        <w:rPr>
+          <w:b/>
+          <w:bCs/>
+        </w:rPr>
+        <w:lastRenderedPageBreak/>
+        <w:t>The current approach of clicking links has resulted in no effect. A different strategy is needed to find the documentation for browser automation tools.</w:t>
+      </w:r>
+    </w:p>
+    <w:p>
+      <w:pPr>
+        <w:rPr>
+          <w:b/>
+          <w:bCs/>
+        </w:rPr>
+      </w:pPr>
+    </w:p>
+    <w:p>
+      <w:pPr>
+        <w:rPr>
+          <w:b/>
+          <w:bCs/>
+        </w:rPr>
+      </w:pPr>
+      <w:r>
+        <w:rPr>
+          <w:b/>
+          <w:bCs/>
+        </w:rPr>
+        <w:t>6) Multi-page directory collection</w:t>
+      </w:r>
+    </w:p>
+    <w:p>
+      <w:r>
+        <w:rPr>
+          <w:b/>
+          <w:bCs/>
+        </w:rPr>
+        <w:t>Prompt:</w:t>
+      </w:r>
+    </w:p>
+    <w:p>
+      <w:r>
+        <w:t>text</w:t>
+      </w:r>
+    </w:p>
+    <w:p>
+      <w:r>
+        <w:t>Open a real public business directory or professional directory search result.</w:t>
+      </w:r>
     </w:p>
     <w:p/>
     <w:p>
-      <w:pPr>
-        <w:rPr>
-          <w:b/>
-          <w:bCs/>
-        </w:rPr>
-      </w:pPr>
-      <w:r>
-        <w:rPr>
-          <w:b/>
-          <w:bCs/>
-        </w:rPr>
-        <w:t>4) Product pricing comparison</w:t>
+      <w:r>
+        <w:t>Collect 20 entries across at least 3 pages.</w:t>
+      </w:r>
+    </w:p>
+    <w:p/>
+    <w:p>
+      <w:r>
+        <w:t>For each entry:</w:t>
+      </w:r>
+    </w:p>
+    <w:p>
+      <w:r>
+        <w:t>1. Capture name, category, city, and website if available.</w:t>
+      </w:r>
+    </w:p>
+    <w:p>
+      <w:r>
+        <w:t>2. Avoid duplicates.</w:t>
+      </w:r>
+    </w:p>
+    <w:p>
+      <w:r>
+        <w:t>3. Put the results into a table.</w:t>
+      </w:r>
+    </w:p>
+    <w:p>
+      <w:r>
+        <w:t>4. If any entry is missing a website, leave it blank rather than guessing.</w:t>
+      </w:r>
+      <w:r>
+        <w:br/>
+      </w:r>
+    </w:p>
+    <w:p>
+      <w:pPr>
+        <w:rPr>
+          <w:b/>
+          <w:bCs/>
+        </w:rPr>
+      </w:pPr>
+      <w:r>
+        <w:rPr>
+          <w:b/>
+          <w:bCs/>
+        </w:rPr>
+        <w:t>AI Analysis</w:t>
+      </w:r>
+    </w:p>
+    <w:p>
+      <w:r>
+        <w:t>The current page indicates that access to the desired public business directory is blocked by Cloudflare due to security measures. The next step is to gather more information about the block and potentially resolve it by contacting the site owner.</w:t>
+      </w:r>
+    </w:p>
+    <w:p>
+      <w:r>
+        <w:rPr>
+          <w:rFonts w:ascii="Segoe UI Emoji" w:hAnsi="Segoe UI Emoji" w:cs="Segoe UI Emoji"/>
+          <w:b/>
+          <w:bCs/>
+        </w:rPr>
+        <w:t>⚡</w:t>
+      </w:r>
+    </w:p>
+    <w:p>
+      <w:r>
+        <w:rPr>
+          <w:b/>
+          <w:bCs/>
+        </w:rPr>
+        <w:t>Step 1NAVIGATE</w:t>
+      </w:r>
+      <w:r>
+        <w:t>This action navigates to a public business directory website.</w:t>
+      </w:r>
+    </w:p>
+    <w:p>
+      <w:r>
+        <w:rPr>
+          <w:rFonts w:ascii="Segoe UI Emoji" w:hAnsi="Segoe UI Emoji" w:cs="Segoe UI Emoji"/>
+          <w:b/>
+          <w:bCs/>
+        </w:rPr>
+        <w:t>⚡</w:t>
+      </w:r>
+    </w:p>
+    <w:p>
+      <w:r>
+        <w:rPr>
+          <w:b/>
+          <w:bCs/>
+        </w:rPr>
+        <w:t>Step 2CLICK</w:t>
+      </w:r>
+      <w:r>
+        <w:t>Click to reveal the IP address, which may help in understanding the block.</w:t>
+      </w:r>
+    </w:p>
+    <w:p>
+      <w:r>
+        <w:br/>
+      </w:r>
+    </w:p>
+    <w:p/>
+    <w:p>
+      <w:pPr>
+        <w:rPr>
+          <w:b/>
+          <w:bCs/>
+        </w:rPr>
+      </w:pPr>
+      <w:r>
+        <w:rPr>
+          <w:b/>
+          <w:bCs/>
+        </w:rPr>
+        <w:t>7) Real application workflow</w:t>
       </w:r>
     </w:p>
     <w:p>
@@ -3445,47 +4335,50 @@
     </w:p>
     <w:p>
       <w:r>
+        <w:lastRenderedPageBreak/>
         <w:t>text</w:t>
       </w:r>
     </w:p>
     <w:p>
       <w:r>
-        <w:t>Open the official websites of 3 AI code assistant products from search results.</w:t>
+        <w:t>Open a real SaaS website that offers a free account or free trial.</w:t>
       </w:r>
     </w:p>
     <w:p/>
     <w:p>
       <w:r>
-        <w:t>For each product:</w:t>
-      </w:r>
-    </w:p>
-    <w:p>
-      <w:r>
-        <w:t>1. Find the pricing page.</w:t>
-      </w:r>
-    </w:p>
-    <w:p>
-      <w:r>
-        <w:t>2. Capture the free plan, paid plan starting price, and whether a trial is available.</w:t>
-      </w:r>
-    </w:p>
-    <w:p>
-      <w:r>
-        <w:t>3. Capture one feature that is clearly mentioned on the pricing or product page.</w:t>
-      </w:r>
-    </w:p>
-    <w:p>
-      <w:r>
-        <w:t>4. Return a comparison table with source URLs.</w:t>
-      </w:r>
-      <w:r>
-        <w:br/>
-      </w:r>
-      <w:r>
-        <w:br/>
-      </w:r>
-      <w:r>
-        <w:t>Analysis failed: [object Object]</w:t>
+        <w:t>Complete the full signup flow using only a test email you control.</w:t>
+      </w:r>
+    </w:p>
+    <w:p/>
+    <w:p>
+      <w:r>
+        <w:t>After signup:</w:t>
+      </w:r>
+    </w:p>
+    <w:p>
+      <w:r>
+        <w:t>1. Verify the welcome page or dashboard loads.</w:t>
+      </w:r>
+    </w:p>
+    <w:p>
+      <w:r>
+        <w:t>2. Locate one setting, one profile field, and one billing or plan page.</w:t>
+      </w:r>
+    </w:p>
+    <w:p>
+      <w:r>
+        <w:t>3. Capture screenshots of the successful login state and the profile page.</w:t>
+      </w:r>
+    </w:p>
+    <w:p>
+      <w:r>
+        <w:t>4. Return a short report with what worked and what failed.</w:t>
+      </w:r>
+    </w:p>
+    <w:p>
+      <w:r>
+        <w:t>Refresh failed: Extraction failed: Error: Error: Frame with ID 0 is showing error page</w:t>
       </w:r>
     </w:p>
     <w:p>
@@ -3505,17 +4398,17 @@
     </w:p>
     <w:p>
       <w:r>
-        <w:t>The task is currently blocked as previous attempts to access the pricing information for Gemini Code Assist have not yielded the desired results. The next step is to try a different link to access the pricing information.</w:t>
-      </w:r>
-    </w:p>
-    <w:p>
-      <w:r>
-        <w:rPr>
-          <w:rFonts w:ascii="Segoe UI Emoji" w:hAnsi="Segoe UI Emoji" w:cs="Segoe UI Emoji"/>
-          <w:b/>
-          <w:bCs/>
-        </w:rPr>
-        <w:t>⚡</w:t>
+        <w:t>The current page is a blank browser tab, and no website is loaded. To proceed with the task of opening a SaaS website that offers a free account or free trial, I need to navigate to a suitable URL.</w:t>
+      </w:r>
+    </w:p>
+    <w:p>
+      <w:r>
+        <w:rPr>
+          <w:rFonts w:ascii="Segoe UI Symbol" w:hAnsi="Segoe UI Symbol" w:cs="Segoe UI Symbol"/>
+          <w:b/>
+          <w:bCs/>
+        </w:rPr>
+        <w:t>✗</w:t>
       </w:r>
     </w:p>
     <w:p>
@@ -3527,434 +4420,175 @@
         <w:t>Step 1NAVIGATE</w:t>
       </w:r>
       <w:r>
-        <w:t>This action will open Google to search for AI code assistant products.</w:t>
-      </w:r>
-    </w:p>
-    <w:p>
-      <w:r>
-        <w:rPr>
-          <w:rFonts w:ascii="Segoe UI Emoji" w:hAnsi="Segoe UI Emoji" w:cs="Segoe UI Emoji"/>
-          <w:b/>
-          <w:bCs/>
-        </w:rPr>
-        <w:t>⚡</w:t>
-      </w:r>
-    </w:p>
-    <w:p>
-      <w:r>
-        <w:rPr>
-          <w:b/>
-          <w:bCs/>
-        </w:rPr>
-        <w:t>Step 2FILL</w:t>
-      </w:r>
-      <w:r>
-        <w:t>This fills the search input with the query to find AI code assistant products.</w:t>
-      </w:r>
-    </w:p>
-    <w:p>
-      <w:r>
-        <w:rPr>
-          <w:rFonts w:ascii="Segoe UI Emoji" w:hAnsi="Segoe UI Emoji" w:cs="Segoe UI Emoji"/>
-          <w:b/>
-          <w:bCs/>
-        </w:rPr>
-        <w:t>⚡</w:t>
-      </w:r>
-    </w:p>
-    <w:p>
-      <w:r>
-        <w:rPr>
-          <w:b/>
-          <w:bCs/>
-        </w:rPr>
-        <w:t>Step 3CLICK</w:t>
-      </w:r>
-      <w:r>
-        <w:t>Click the Google Search button to perform the search for AI code assistant products.</w:t>
-      </w:r>
-    </w:p>
-    <w:p>
-      <w:r>
-        <w:rPr>
-          <w:rFonts w:ascii="Segoe UI Emoji" w:hAnsi="Segoe UI Emoji" w:cs="Segoe UI Emoji"/>
-          <w:b/>
-          <w:bCs/>
-        </w:rPr>
-        <w:lastRenderedPageBreak/>
-        <w:t>⚡</w:t>
-      </w:r>
-    </w:p>
-    <w:p>
-      <w:r>
-        <w:rPr>
-          <w:b/>
-          <w:bCs/>
-        </w:rPr>
-        <w:t>Step 4CLICK</w:t>
-      </w:r>
-      <w:r>
-        <w:t>Open the official website for Gemini Code Assist.</w:t>
-      </w:r>
-    </w:p>
-    <w:p>
-      <w:r>
-        <w:rPr>
-          <w:rFonts w:ascii="Segoe UI Emoji" w:hAnsi="Segoe UI Emoji" w:cs="Segoe UI Emoji"/>
-          <w:b/>
-          <w:bCs/>
-        </w:rPr>
-        <w:t>⚡</w:t>
-      </w:r>
-    </w:p>
-    <w:p>
-      <w:r>
-        <w:rPr>
-          <w:b/>
-          <w:bCs/>
-        </w:rPr>
-        <w:t>Step 5CLICK</w:t>
-      </w:r>
-      <w:r>
-        <w:t>Click the pricing link to access the pricing page for Gemini Code Assist.</w:t>
-      </w:r>
-    </w:p>
-    <w:p>
-      <w:r>
-        <w:rPr>
-          <w:rFonts w:ascii="Segoe UI Emoji" w:hAnsi="Segoe UI Emoji" w:cs="Segoe UI Emoji"/>
-          <w:b/>
-          <w:bCs/>
-        </w:rPr>
-        <w:t>⚡</w:t>
-      </w:r>
-    </w:p>
-    <w:p>
-      <w:r>
-        <w:rPr>
-          <w:b/>
-          <w:bCs/>
-        </w:rPr>
-        <w:t>Step 6CLICK</w:t>
-      </w:r>
-      <w:r>
-        <w:t>Click the link for Gemini Code Assist Standard and Enterprise to access the pricing information.</w:t>
-      </w:r>
-    </w:p>
-    <w:p>
-      <w:r>
-        <w:rPr>
-          <w:rFonts w:ascii="Segoe UI Emoji" w:hAnsi="Segoe UI Emoji" w:cs="Segoe UI Emoji"/>
-          <w:b/>
-          <w:bCs/>
-        </w:rPr>
-        <w:t>⚡</w:t>
-      </w:r>
-    </w:p>
-    <w:p>
-      <w:r>
-        <w:rPr>
-          <w:b/>
-          <w:bCs/>
-        </w:rPr>
-        <w:t>Step 7CLICK</w:t>
-      </w:r>
-      <w:r>
-        <w:t>Click the link for Gemini Cloud Assist Pricing Overview to access the pricing information.</w:t>
-      </w:r>
-    </w:p>
-    <w:p>
-      <w:r>
-        <w:rPr>
-          <w:rFonts w:ascii="Segoe UI Emoji" w:hAnsi="Segoe UI Emoji" w:cs="Segoe UI Emoji"/>
-          <w:b/>
-          <w:bCs/>
-        </w:rPr>
-        <w:t>⚡</w:t>
-      </w:r>
-    </w:p>
-    <w:p>
-      <w:r>
-        <w:rPr>
-          <w:b/>
-          <w:bCs/>
-        </w:rPr>
-        <w:t>Step 8CLICK</w:t>
-      </w:r>
-      <w:r>
-        <w:t>Click the link to access the pricing information for Gemini Code Assist Standard and Enterprise.</w:t>
-      </w:r>
-    </w:p>
-    <w:p>
-      <w:r>
-        <w:rPr>
-          <w:rFonts w:ascii="Segoe UI Emoji" w:hAnsi="Segoe UI Emoji" w:cs="Segoe UI Emoji"/>
-          <w:b/>
-          <w:bCs/>
-        </w:rPr>
-        <w:t>⚡</w:t>
-      </w:r>
-    </w:p>
-    <w:p>
-      <w:r>
-        <w:rPr>
-          <w:b/>
-          <w:bCs/>
-        </w:rPr>
-        <w:t>Step 9CLICK</w:t>
-      </w:r>
-      <w:r>
-        <w:t>Click the link for Gemini Code Assist pricing to access the pricing information.</w:t>
-      </w:r>
-    </w:p>
-    <w:p/>
-    <w:p>
-      <w:r>
-        <w:br/>
-      </w:r>
-    </w:p>
-    <w:p>
-      <w:pPr>
-        <w:rPr>
-          <w:b/>
-          <w:bCs/>
-        </w:rPr>
-      </w:pPr>
-      <w:r>
-        <w:rPr>
-          <w:b/>
-          <w:bCs/>
-        </w:rPr>
-        <w:t>5) Long form research extraction</w:t>
-      </w:r>
-    </w:p>
-    <w:p>
-      <w:r>
-        <w:rPr>
-          <w:b/>
-          <w:bCs/>
-        </w:rPr>
-        <w:t>Prompt:</w:t>
-      </w:r>
-    </w:p>
-    <w:p>
-      <w:r>
-        <w:t>text</w:t>
-      </w:r>
-    </w:p>
-    <w:p>
-      <w:r>
-        <w:t>Search the web for official documentation or product pages about browser automation tools.</w:t>
-      </w:r>
-    </w:p>
-    <w:p/>
-    <w:p>
-      <w:r>
-        <w:t>Pick 3 different tools and for each one:</w:t>
-      </w:r>
-    </w:p>
-    <w:p>
-      <w:r>
-        <w:t>1. Find the official documentation page.</w:t>
-      </w:r>
-    </w:p>
-    <w:p>
-      <w:r>
-        <w:t>2. Extract the supported languages, main use case, and whether it supports browser control.</w:t>
-      </w:r>
-    </w:p>
-    <w:p>
-      <w:r>
-        <w:t>3. Note one setup requirement.</w:t>
-      </w:r>
-    </w:p>
-    <w:p>
-      <w:r>
-        <w:lastRenderedPageBreak/>
-        <w:t>4. Return the answer in markdown bullets, grouped by tool.</w:t>
-      </w:r>
-      <w:r>
-        <w:br/>
-      </w:r>
-      <w:r>
-        <w:br/>
-      </w:r>
-      <w:r>
-        <w:t xml:space="preserve">Analysis failed: </w:t>
+        <w:t xml:space="preserve">This action navigates to a SaaS website that offers a free account or free </w:t>
       </w:r>
       <w:proofErr w:type="spellStart"/>
-      <w:r>
-        <w:t>OpenRouter</w:t>
-      </w:r>
-      <w:proofErr w:type="spellEnd"/>
-      <w:r>
-        <w:t xml:space="preserve"> API error: Prompt tokens limit exceeded: 7136 &gt; 6591. To increase, visit https://openrouter.ai/settings/credits and upgrade to a paid account</w:t>
-      </w:r>
-    </w:p>
-    <w:p>
-      <w:pPr>
-        <w:rPr>
-          <w:b/>
-          <w:bCs/>
-        </w:rPr>
-      </w:pPr>
-      <w:r>
-        <w:rPr>
-          <w:b/>
-          <w:bCs/>
-        </w:rPr>
-        <w:t>AI Analysis</w:t>
-      </w:r>
-    </w:p>
-    <w:p>
-      <w:r>
-        <w:t>The user has successfully clicked on a search result for 'browser automation tools free', but the page does not contain the necessary documentation or product pages for the tools. The next step is to click on another relevant search result to gather more information.</w:t>
-      </w:r>
-    </w:p>
-    <w:p>
-      <w:r>
-        <w:rPr>
-          <w:rFonts w:ascii="Segoe UI Emoji" w:hAnsi="Segoe UI Emoji" w:cs="Segoe UI Emoji"/>
-          <w:b/>
-          <w:bCs/>
-        </w:rPr>
-        <w:t>⚡</w:t>
-      </w:r>
-    </w:p>
-    <w:p>
-      <w:r>
-        <w:rPr>
-          <w:b/>
-          <w:bCs/>
-        </w:rPr>
-        <w:t>Step 1NAVIGATE</w:t>
-      </w:r>
-      <w:r>
-        <w:t>This will open Google to start searching for browser automation tools.</w:t>
-      </w:r>
-    </w:p>
-    <w:p>
-      <w:r>
-        <w:rPr>
-          <w:rFonts w:ascii="Segoe UI Emoji" w:hAnsi="Segoe UI Emoji" w:cs="Segoe UI Emoji"/>
-          <w:b/>
-          <w:bCs/>
-        </w:rPr>
-        <w:t>⚡</w:t>
-      </w:r>
-    </w:p>
-    <w:p>
-      <w:r>
-        <w:rPr>
-          <w:b/>
-          <w:bCs/>
-        </w:rPr>
-        <w:t>Step 2FILL</w:t>
-      </w:r>
-      <w:r>
-        <w:t>This fills the search input with the query for browser automation tools.</w:t>
-      </w:r>
-    </w:p>
-    <w:p>
-      <w:r>
-        <w:rPr>
-          <w:rFonts w:ascii="Segoe UI Emoji" w:hAnsi="Segoe UI Emoji" w:cs="Segoe UI Emoji"/>
-          <w:b/>
-          <w:bCs/>
-        </w:rPr>
-        <w:t>⚡</w:t>
-      </w:r>
-    </w:p>
-    <w:p>
-      <w:r>
-        <w:rPr>
-          <w:b/>
-          <w:bCs/>
-        </w:rPr>
-        <w:t>Step 3CLICK</w:t>
-      </w:r>
-      <w:r>
-        <w:t>This clicks the 'Google Search' button to perform the search for browser automation tools.</w:t>
-      </w:r>
-    </w:p>
-    <w:p>
-      <w:r>
-        <w:rPr>
-          <w:rFonts w:ascii="Segoe UI Emoji" w:hAnsi="Segoe UI Emoji" w:cs="Segoe UI Emoji"/>
-          <w:b/>
-          <w:bCs/>
-        </w:rPr>
-        <w:t>⚡</w:t>
-      </w:r>
-    </w:p>
-    <w:p>
-      <w:r>
-        <w:rPr>
-          <w:b/>
-          <w:bCs/>
-        </w:rPr>
-        <w:t>Step 4CLICK</w:t>
-      </w:r>
-      <w:r>
-        <w:t>Click on the search result for 'browser automation tools free' to access its documentation page.</w:t>
-      </w:r>
-    </w:p>
-    <w:p>
-      <w:r>
-        <w:rPr>
-          <w:rFonts w:ascii="Segoe UI Symbol" w:hAnsi="Segoe UI Symbol" w:cs="Segoe UI Symbol"/>
-          <w:b/>
-          <w:bCs/>
-        </w:rPr>
-        <w:t>✗</w:t>
-      </w:r>
-    </w:p>
-    <w:p>
-      <w:r>
-        <w:rPr>
-          <w:b/>
-          <w:bCs/>
-        </w:rPr>
-        <w:t>Step 5CLICK</w:t>
-      </w:r>
-      <w:r>
-        <w:t xml:space="preserve">Click on the link for 'Top 9 Browser Automation Tools for Web Testing and ...' to access its documentation </w:t>
-      </w:r>
-      <w:proofErr w:type="spellStart"/>
-      <w:r>
-        <w:t>page.</w:t>
+      <w:proofErr w:type="gramStart"/>
+      <w:r>
+        <w:t>trial.</w:t>
       </w:r>
       <w:r>
         <w:rPr>
           <w:i/>
           <w:iCs/>
         </w:rPr>
-        <w:t>Action</w:t>
+        <w:t>Could</w:t>
       </w:r>
       <w:proofErr w:type="spellEnd"/>
+      <w:proofErr w:type="gramEnd"/>
       <w:r>
         <w:rPr>
           <w:i/>
           <w:iCs/>
         </w:rPr>
-        <w:t xml:space="preserve"> reported success, but the page did not visibly change after click. Retrying from the current page state.</w:t>
+        <w:t xml:space="preserve"> not verify page progress after navigate: Extraction failed: Error: Error: Frame with ID 0 is showing error page</w:t>
       </w:r>
     </w:p>
     <w:p/>
+    <w:p>
+      <w:pPr>
+        <w:rPr>
+          <w:b/>
+          <w:bCs/>
+        </w:rPr>
+      </w:pPr>
+      <w:r>
+        <w:rPr>
+          <w:b/>
+          <w:bCs/>
+        </w:rPr>
+        <w:t>8) Real file upload and report</w:t>
+      </w:r>
+    </w:p>
+    <w:p>
+      <w:r>
+        <w:rPr>
+          <w:b/>
+          <w:bCs/>
+        </w:rPr>
+        <w:t>Prompt:</w:t>
+      </w:r>
+    </w:p>
+    <w:p>
+      <w:r>
+        <w:t>text</w:t>
+      </w:r>
+    </w:p>
+    <w:p>
+      <w:r>
+        <w:t>Open a real website that allows file upload for logged-in users or public upload.</w:t>
+      </w:r>
+    </w:p>
     <w:p/>
     <w:p>
-      <w:pPr>
-        <w:rPr>
-          <w:b/>
-          <w:bCs/>
-        </w:rPr>
-      </w:pPr>
-      <w:r>
-        <w:rPr>
-          <w:b/>
-          <w:bCs/>
-        </w:rPr>
-        <w:t>6) Multi-page directory collection</w:t>
+      <w:r>
+        <w:t>Upload a small PDF or image file.</w:t>
+      </w:r>
+    </w:p>
+    <w:p/>
+    <w:p>
+      <w:r>
+        <w:t>Then:</w:t>
+      </w:r>
+    </w:p>
+    <w:p>
+      <w:r>
+        <w:t>1. Confirm the file was accepted.</w:t>
+      </w:r>
+    </w:p>
+    <w:p>
+      <w:r>
+        <w:lastRenderedPageBreak/>
+        <w:t>2. Find where the uploaded file appears.</w:t>
+      </w:r>
+    </w:p>
+    <w:p>
+      <w:r>
+        <w:t>3. If the site provides a share link or processing result, copy it.</w:t>
+      </w:r>
+    </w:p>
+    <w:p>
+      <w:r>
+        <w:t>4. Return the result with the exact page path and any visible status text.</w:t>
+      </w:r>
+    </w:p>
+    <w:p/>
+    <w:p>
+      <w:pPr>
+        <w:rPr>
+          <w:b/>
+          <w:bCs/>
+        </w:rPr>
+      </w:pPr>
+      <w:r>
+        <w:rPr>
+          <w:b/>
+          <w:bCs/>
+        </w:rPr>
+        <w:t>AI Analysis</w:t>
+      </w:r>
+    </w:p>
+    <w:p>
+      <w:r>
+        <w:t>The current page is the 'Example Domain', which does not allow file uploads. The previous attempt to navigate to a file upload site was unsuccessful. Therefore, I need to find a new website that allows file uploads. Replan reason: The current approach is not working as the 'Example Domain' does not support file uploads. A different strategy is needed to find a suitable website.</w:t>
+      </w:r>
+    </w:p>
+    <w:p>
+      <w:r>
+        <w:rPr>
+          <w:rFonts w:ascii="Segoe UI Emoji" w:hAnsi="Segoe UI Emoji" w:cs="Segoe UI Emoji"/>
+          <w:b/>
+          <w:bCs/>
+        </w:rPr>
+        <w:t>⚡</w:t>
+      </w:r>
+    </w:p>
+    <w:p>
+      <w:r>
+        <w:rPr>
+          <w:b/>
+          <w:bCs/>
+        </w:rPr>
+        <w:t>Step 1NAVIGATE</w:t>
+      </w:r>
+      <w:r>
+        <w:t>Navigate to a website that allows file uploads.</w:t>
+      </w:r>
+    </w:p>
+    <w:p>
+      <w:pPr>
+        <w:rPr>
+          <w:b/>
+          <w:bCs/>
+        </w:rPr>
+      </w:pPr>
+      <w:r>
+        <w:rPr>
+          <w:b/>
+          <w:bCs/>
+        </w:rPr>
+        <w:t>Planner requested replan</w:t>
+      </w:r>
+    </w:p>
+    <w:p>
+      <w:r>
+        <w:t>The current approach is not working as the 'Example Domain' does not support file uploads. A different strategy is needed to find a suitable website.</w:t>
+      </w:r>
+    </w:p>
+    <w:p/>
+    <w:p>
+      <w:pPr>
+        <w:rPr>
+          <w:b/>
+          <w:bCs/>
+        </w:rPr>
+      </w:pPr>
+      <w:r>
+        <w:rPr>
+          <w:b/>
+          <w:bCs/>
+        </w:rPr>
+        <w:t>9) Real data entry with validation</w:t>
       </w:r>
     </w:p>
     <w:p>
@@ -3973,323 +4607,473 @@
     </w:p>
     <w:p>
       <w:r>
-        <w:t>Open a real public business directory or professional directory search result.</w:t>
+        <w:t>Open a real government, university, or company form that is publicly accessible and safe to use with test data.</w:t>
       </w:r>
     </w:p>
     <w:p/>
     <w:p>
       <w:r>
-        <w:t>Collect 20 entries across at least 3 pages.</w:t>
+        <w:t>Fill the form with clearly fake test data, but make it look realistic.</w:t>
       </w:r>
     </w:p>
     <w:p/>
     <w:p>
       <w:r>
-        <w:t>For each entry:</w:t>
-      </w:r>
-    </w:p>
-    <w:p>
-      <w:r>
-        <w:t>1. Capture name, category, city, and website if available.</w:t>
-      </w:r>
-    </w:p>
-    <w:p>
-      <w:r>
-        <w:t>2. Avoid duplicates.</w:t>
-      </w:r>
-    </w:p>
-    <w:p>
-      <w:r>
-        <w:t>3. Put the results into a table.</w:t>
-      </w:r>
-    </w:p>
-    <w:p>
-      <w:r>
-        <w:t>4. If any entry is missing a website, leave it blank rather than guessing.</w:t>
-      </w:r>
+        <w:t>Then:</w:t>
+      </w:r>
+    </w:p>
+    <w:p>
+      <w:r>
+        <w:t>1. Check whether the form shows validation errors.</w:t>
+      </w:r>
+    </w:p>
+    <w:p>
+      <w:r>
+        <w:t>2. Fix any errors the page reports.</w:t>
+      </w:r>
+    </w:p>
+    <w:p>
+      <w:r>
+        <w:t>3. Submit only if it is a genuine test or sandbox form.</w:t>
+      </w:r>
+    </w:p>
+    <w:p>
+      <w:r>
+        <w:t>4. Report the validation rules you encountered and whether submission succeeded.</w:t>
+      </w:r>
+    </w:p>
+    <w:p/>
+    <w:p>
+      <w:pPr>
+        <w:rPr>
+          <w:b/>
+          <w:bCs/>
+        </w:rPr>
+      </w:pPr>
+      <w:r>
+        <w:rPr>
+          <w:b/>
+          <w:bCs/>
+        </w:rPr>
+        <w:lastRenderedPageBreak/>
+        <w:t>AI Analysis</w:t>
+      </w:r>
+    </w:p>
+    <w:p>
+      <w:r>
+        <w:t>The current page is the Example Domain, which does not contain any links to real government, university, or company forms. The previous navigation attempt did not yield the intended results. Therefore, I need to find a new source for accessing a valid form. Replan reason: The current page does not provide access to any real forms. A different approach is needed to find a publicly accessible form.</w:t>
+      </w:r>
+    </w:p>
+    <w:p>
+      <w:r>
+        <w:rPr>
+          <w:rFonts w:ascii="Segoe UI Emoji" w:hAnsi="Segoe UI Emoji" w:cs="Segoe UI Emoji"/>
+          <w:b/>
+          <w:bCs/>
+        </w:rPr>
+        <w:t>⚡</w:t>
+      </w:r>
+    </w:p>
+    <w:p>
+      <w:r>
+        <w:rPr>
+          <w:b/>
+          <w:bCs/>
+        </w:rPr>
+        <w:t>Step 1NAVIGATE</w:t>
+      </w:r>
+      <w:r>
+        <w:t>This action navigates to Example Domain, which may provide links to government or company forms.</w:t>
+      </w:r>
+    </w:p>
+    <w:p>
+      <w:pPr>
+        <w:rPr>
+          <w:b/>
+          <w:bCs/>
+        </w:rPr>
+      </w:pPr>
+      <w:r>
+        <w:rPr>
+          <w:b/>
+          <w:bCs/>
+        </w:rPr>
+        <w:t>Planner requested replan</w:t>
+      </w:r>
+    </w:p>
+    <w:p>
+      <w:r>
+        <w:t>The current page does not provide access to any real forms. A different approach is needed to find a publicly accessible form.</w:t>
+      </w:r>
+    </w:p>
+    <w:p/>
+    <w:p>
+      <w:pPr>
+        <w:rPr>
+          <w:b/>
+          <w:bCs/>
+        </w:rPr>
+      </w:pPr>
+      <w:r>
+        <w:rPr>
+          <w:b/>
+          <w:bCs/>
+        </w:rPr>
+        <w:t>10) Complex multi-step research and output</w:t>
+      </w:r>
+    </w:p>
+    <w:p>
+      <w:r>
+        <w:rPr>
+          <w:b/>
+          <w:bCs/>
+        </w:rPr>
+        <w:t>Prompt:</w:t>
+      </w:r>
+    </w:p>
+    <w:p>
+      <w:r>
+        <w:t>text</w:t>
+      </w:r>
+    </w:p>
+    <w:p>
+      <w:r>
+        <w:t>Use Google Search and official websites to research:</w:t>
+      </w:r>
+    </w:p>
+    <w:p>
+      <w:r>
+        <w:t>`AI browser automation testing best practices`</w:t>
+      </w:r>
+    </w:p>
+    <w:p/>
+    <w:p>
+      <w:r>
+        <w:t>Do this in order:</w:t>
+      </w:r>
+    </w:p>
+    <w:p>
+      <w:r>
+        <w:t>1. Open at least 5 authoritative sources.</w:t>
+      </w:r>
+    </w:p>
+    <w:p>
+      <w:r>
+        <w:t>2. Extract the top recommended testing practices.</w:t>
+      </w:r>
+    </w:p>
+    <w:p>
+      <w:r>
+        <w:t>3. Separate practices into: reliability, observability, recovery, and safety.</w:t>
+      </w:r>
+    </w:p>
+    <w:p>
+      <w:r>
+        <w:t>4. Create a final checklist with 1 line per practice.</w:t>
+      </w:r>
+    </w:p>
+    <w:p>
+      <w:r>
+        <w:t>5. Cite the source URL next to each line.</w:t>
+      </w:r>
+    </w:p>
+    <w:p>
       <w:r>
         <w:br/>
       </w:r>
       <w:r>
-        <w:br/>
-      </w:r>
-    </w:p>
-    <w:p/>
-    <w:p>
-      <w:pPr>
-        <w:rPr>
-          <w:b/>
-          <w:bCs/>
-        </w:rPr>
-      </w:pPr>
-      <w:r>
-        <w:rPr>
-          <w:b/>
-          <w:bCs/>
-        </w:rPr>
-        <w:t>7) Real application workflow</w:t>
-      </w:r>
-    </w:p>
-    <w:p>
-      <w:r>
-        <w:rPr>
-          <w:b/>
-          <w:bCs/>
-        </w:rPr>
-        <w:t>Prompt:</w:t>
-      </w:r>
-    </w:p>
-    <w:p>
-      <w:r>
-        <w:t>text</w:t>
-      </w:r>
-    </w:p>
-    <w:p>
-      <w:r>
-        <w:t>Open a real SaaS website that offers a free account or free trial.</w:t>
-      </w:r>
-    </w:p>
-    <w:p/>
-    <w:p>
-      <w:r>
-        <w:t>Complete the full signup flow using only a test email you control.</w:t>
-      </w:r>
-    </w:p>
-    <w:p/>
-    <w:p>
-      <w:r>
-        <w:t>After signup:</w:t>
-      </w:r>
-    </w:p>
-    <w:p>
-      <w:r>
-        <w:t>1. Verify the welcome page or dashboard loads.</w:t>
-      </w:r>
-    </w:p>
-    <w:p>
-      <w:r>
-        <w:t>2. Locate one setting, one profile field, and one billing or plan page.</w:t>
-      </w:r>
-    </w:p>
-    <w:p>
-      <w:r>
-        <w:t>3. Capture screenshots of the successful login state and the profile page.</w:t>
-      </w:r>
-    </w:p>
-    <w:p>
-      <w:r>
-        <w:t>4. Return a short report with what worked and what failed.</w:t>
-      </w:r>
-    </w:p>
-    <w:p>
-      <w:pPr>
-        <w:rPr>
-          <w:b/>
-          <w:bCs/>
-        </w:rPr>
-      </w:pPr>
-      <w:r>
-        <w:rPr>
-          <w:b/>
-          <w:bCs/>
-        </w:rPr>
-        <w:t>8) Real file upload and report</w:t>
-      </w:r>
-    </w:p>
-    <w:p>
-      <w:r>
-        <w:rPr>
-          <w:b/>
-          <w:bCs/>
-        </w:rPr>
-        <w:t>Prompt:</w:t>
-      </w:r>
-    </w:p>
-    <w:p>
-      <w:r>
-        <w:t>text</w:t>
-      </w:r>
-    </w:p>
-    <w:p>
-      <w:r>
-        <w:t>Open a real website that allows file upload for logged-in users or public upload.</w:t>
-      </w:r>
-    </w:p>
-    <w:p/>
-    <w:p>
-      <w:r>
-        <w:t>Upload a small PDF or image file.</w:t>
-      </w:r>
-    </w:p>
-    <w:p/>
-    <w:p>
-      <w:r>
-        <w:t>Then:</w:t>
-      </w:r>
-    </w:p>
-    <w:p>
-      <w:r>
+        <w:t>Analysis failed: [object Object]</w:t>
+      </w:r>
+    </w:p>
+    <w:p>
+      <w:pPr>
+        <w:rPr>
+          <w:b/>
+          <w:bCs/>
+        </w:rPr>
+      </w:pPr>
+      <w:r>
+        <w:rPr>
+          <w:b/>
+          <w:bCs/>
+        </w:rPr>
+        <w:t>AI Analysis</w:t>
+      </w:r>
+    </w:p>
+    <w:p>
+      <w:r>
+        <w:t>The task is currently blocked due to previous attempts to open sources that did not yield the expected results. To proceed, I will open a different source that is visible and relevant to the research goal.</w:t>
+      </w:r>
+    </w:p>
+    <w:p>
+      <w:r>
+        <w:rPr>
+          <w:rFonts w:ascii="Segoe UI Symbol" w:hAnsi="Segoe UI Symbol" w:cs="Segoe UI Symbol"/>
+          <w:b/>
+          <w:bCs/>
+        </w:rPr>
         <w:lastRenderedPageBreak/>
-        <w:t>1. Confirm the file was accepted.</w:t>
-      </w:r>
-    </w:p>
-    <w:p>
-      <w:r>
-        <w:t>2. Find where the uploaded file appears.</w:t>
-      </w:r>
-    </w:p>
-    <w:p>
-      <w:r>
-        <w:t>3. If the site provides a share link or processing result, copy it.</w:t>
-      </w:r>
-    </w:p>
-    <w:p>
-      <w:r>
-        <w:t>4. Return the result with the exact page path and any visible status text.</w:t>
-      </w:r>
-    </w:p>
-    <w:p>
-      <w:pPr>
-        <w:rPr>
-          <w:b/>
-          <w:bCs/>
-        </w:rPr>
-      </w:pPr>
-      <w:r>
-        <w:rPr>
-          <w:b/>
-          <w:bCs/>
-        </w:rPr>
-        <w:t>9) Real data entry with validation</w:t>
-      </w:r>
-    </w:p>
-    <w:p>
-      <w:r>
-        <w:rPr>
-          <w:b/>
-          <w:bCs/>
-        </w:rPr>
-        <w:t>Prompt:</w:t>
-      </w:r>
-    </w:p>
-    <w:p>
-      <w:r>
-        <w:t>text</w:t>
-      </w:r>
-    </w:p>
-    <w:p>
-      <w:r>
-        <w:t>Open a real government, university, or company form that is publicly accessible and safe to use with test data.</w:t>
-      </w:r>
-    </w:p>
-    <w:p/>
-    <w:p>
-      <w:r>
-        <w:t>Fill the form with clearly fake test data, but make it look realistic.</w:t>
-      </w:r>
-    </w:p>
-    <w:p/>
-    <w:p>
-      <w:r>
-        <w:t>Then:</w:t>
-      </w:r>
-    </w:p>
-    <w:p>
-      <w:r>
-        <w:t>1. Check whether the form shows validation errors.</w:t>
-      </w:r>
-    </w:p>
-    <w:p>
-      <w:r>
-        <w:t>2. Fix any errors the page reports.</w:t>
-      </w:r>
-    </w:p>
-    <w:p>
-      <w:r>
-        <w:t>3. Submit only if it is a genuine test or sandbox form.</w:t>
-      </w:r>
-    </w:p>
-    <w:p>
-      <w:r>
-        <w:t>4. Report the validation rules you encountered and whether submission succeeded.</w:t>
-      </w:r>
-    </w:p>
-    <w:p>
-      <w:pPr>
-        <w:rPr>
-          <w:b/>
-          <w:bCs/>
-        </w:rPr>
-      </w:pPr>
-      <w:r>
-        <w:rPr>
-          <w:b/>
-          <w:bCs/>
-        </w:rPr>
-        <w:t>10) Complex multi-step research and output</w:t>
-      </w:r>
-    </w:p>
-    <w:p>
-      <w:r>
-        <w:rPr>
-          <w:b/>
-          <w:bCs/>
-        </w:rPr>
-        <w:t>Prompt:</w:t>
-      </w:r>
-    </w:p>
-    <w:p>
-      <w:r>
-        <w:t>text</w:t>
-      </w:r>
-    </w:p>
-    <w:p>
-      <w:r>
-        <w:t>Use Google Search and official websites to research:</w:t>
-      </w:r>
-    </w:p>
-    <w:p>
-      <w:r>
-        <w:t>`AI browser automation testing best practices`</w:t>
-      </w:r>
-    </w:p>
-    <w:p/>
-    <w:p>
-      <w:r>
-        <w:t>Do this in order:</w:t>
-      </w:r>
-    </w:p>
-    <w:p>
-      <w:r>
-        <w:t>1. Open at least 5 authoritative sources.</w:t>
-      </w:r>
-    </w:p>
-    <w:p>
-      <w:r>
-        <w:t>2. Extract the top recommended testing practices.</w:t>
-      </w:r>
-    </w:p>
-    <w:p>
-      <w:r>
-        <w:t>3. Separate practices into: reliability, observability, recovery, and safety.</w:t>
-      </w:r>
-    </w:p>
-    <w:p>
-      <w:r>
-        <w:t>4. Create a final checklist with 1 line per practice.</w:t>
+        <w:t>✗</w:t>
+      </w:r>
+    </w:p>
+    <w:p>
+      <w:r>
+        <w:rPr>
+          <w:b/>
+          <w:bCs/>
+        </w:rPr>
+        <w:t>Step 1FILL</w:t>
+      </w:r>
+      <w:r>
+        <w:t xml:space="preserve">This action fills the Google search input with the query for AI browser automation testing best </w:t>
+      </w:r>
+      <w:proofErr w:type="spellStart"/>
+      <w:proofErr w:type="gramStart"/>
+      <w:r>
+        <w:t>practices.</w:t>
+      </w:r>
+      <w:r>
+        <w:rPr>
+          <w:i/>
+          <w:iCs/>
+        </w:rPr>
+        <w:t>Cannot</w:t>
+      </w:r>
+      <w:proofErr w:type="spellEnd"/>
+      <w:proofErr w:type="gramEnd"/>
+      <w:r>
+        <w:rPr>
+          <w:i/>
+          <w:iCs/>
+        </w:rPr>
+        <w:t xml:space="preserve"> execute on this page. Navigate to a regular webpage.</w:t>
+      </w:r>
+    </w:p>
+    <w:p>
+      <w:r>
+        <w:rPr>
+          <w:rFonts w:ascii="Segoe UI Emoji" w:hAnsi="Segoe UI Emoji" w:cs="Segoe UI Emoji"/>
+          <w:b/>
+          <w:bCs/>
+        </w:rPr>
+        <w:t>⚡</w:t>
+      </w:r>
+    </w:p>
+    <w:p>
+      <w:r>
+        <w:rPr>
+          <w:b/>
+          <w:bCs/>
+        </w:rPr>
+        <w:t>Step 2NAVIGATE</w:t>
+      </w:r>
+      <w:r>
+        <w:t>This action opens Google Search to begin the research.</w:t>
+      </w:r>
+    </w:p>
+    <w:p>
+      <w:r>
+        <w:rPr>
+          <w:rFonts w:ascii="Segoe UI Emoji" w:hAnsi="Segoe UI Emoji" w:cs="Segoe UI Emoji"/>
+          <w:b/>
+          <w:bCs/>
+        </w:rPr>
+        <w:t>⚡</w:t>
+      </w:r>
+    </w:p>
+    <w:p>
+      <w:r>
+        <w:rPr>
+          <w:b/>
+          <w:bCs/>
+        </w:rPr>
+        <w:t>Step 3FILL</w:t>
+      </w:r>
+      <w:r>
+        <w:t>Fills the Google search input with the query for AI browser automation testing best practices.</w:t>
+      </w:r>
+    </w:p>
+    <w:p>
+      <w:r>
+        <w:rPr>
+          <w:rFonts w:ascii="Segoe UI Emoji" w:hAnsi="Segoe UI Emoji" w:cs="Segoe UI Emoji"/>
+          <w:b/>
+          <w:bCs/>
+        </w:rPr>
+        <w:t>⚡</w:t>
+      </w:r>
+    </w:p>
+    <w:p>
+      <w:r>
+        <w:rPr>
+          <w:b/>
+          <w:bCs/>
+        </w:rPr>
+        <w:t>Step 4CLICK</w:t>
+      </w:r>
+      <w:r>
+        <w:t>Click the Google Search button to execute the search for AI browser automation testing best practices.</w:t>
+      </w:r>
+    </w:p>
+    <w:p>
+      <w:r>
+        <w:rPr>
+          <w:rFonts w:ascii="Segoe UI Emoji" w:hAnsi="Segoe UI Emoji" w:cs="Segoe UI Emoji"/>
+          <w:b/>
+          <w:bCs/>
+        </w:rPr>
+        <w:t>⚡</w:t>
+      </w:r>
+    </w:p>
+    <w:p>
+      <w:r>
+        <w:rPr>
+          <w:b/>
+          <w:bCs/>
+        </w:rPr>
+        <w:t>Step 5CLICK</w:t>
+      </w:r>
+      <w:r>
+        <w:t>Open the source titled 'Top 9 Browser Automation Tools for Web Testing and ...</w:t>
+      </w:r>
+      <w:proofErr w:type="spellStart"/>
+      <w:r>
+        <w:t>Firecrawl</w:t>
+      </w:r>
+      <w:proofErr w:type="spellEnd"/>
+      <w:r>
+        <w:t>' to extract recommended testing practices.</w:t>
+      </w:r>
+    </w:p>
+    <w:p>
+      <w:r>
+        <w:rPr>
+          <w:rFonts w:ascii="Segoe UI Emoji" w:hAnsi="Segoe UI Emoji" w:cs="Segoe UI Emoji"/>
+          <w:b/>
+          <w:bCs/>
+        </w:rPr>
+        <w:t>⚡</w:t>
+      </w:r>
+    </w:p>
+    <w:p>
+      <w:r>
+        <w:rPr>
+          <w:b/>
+          <w:bCs/>
+        </w:rPr>
+        <w:t>Step 6CLICK</w:t>
+      </w:r>
+      <w:r>
+        <w:t xml:space="preserve">Opens the source titled 'The best </w:t>
+      </w:r>
+      <w:proofErr w:type="gramStart"/>
+      <w:r>
+        <w:t>open source</w:t>
+      </w:r>
+      <w:proofErr w:type="gramEnd"/>
+      <w:r>
+        <w:t xml:space="preserve"> frameworks for building AI agents in 2026' to gather more information on AI browser automation testing best practices.</w:t>
+      </w:r>
+    </w:p>
+    <w:p>
+      <w:r>
+        <w:rPr>
+          <w:rFonts w:ascii="Segoe UI Emoji" w:hAnsi="Segoe UI Emoji" w:cs="Segoe UI Emoji"/>
+          <w:b/>
+          <w:bCs/>
+        </w:rPr>
+        <w:t>⚡</w:t>
+      </w:r>
+    </w:p>
+    <w:p>
+      <w:r>
+        <w:rPr>
+          <w:b/>
+          <w:bCs/>
+        </w:rPr>
+        <w:t>Step 7CLICK</w:t>
+      </w:r>
+      <w:r>
+        <w:t xml:space="preserve">Opens the source titled 'The best </w:t>
+      </w:r>
+      <w:proofErr w:type="gramStart"/>
+      <w:r>
+        <w:t>open source</w:t>
+      </w:r>
+      <w:proofErr w:type="gramEnd"/>
+      <w:r>
+        <w:t xml:space="preserve"> frameworks for building AI agents in 2026' to gather more information on AI browser automation testing best practices.</w:t>
+      </w:r>
+    </w:p>
+    <w:p>
+      <w:r>
+        <w:rPr>
+          <w:rFonts w:ascii="Segoe UI Emoji" w:hAnsi="Segoe UI Emoji" w:cs="Segoe UI Emoji"/>
+          <w:b/>
+          <w:bCs/>
+        </w:rPr>
+        <w:t>⚡</w:t>
+      </w:r>
+    </w:p>
+    <w:p>
+      <w:r>
+        <w:rPr>
+          <w:b/>
+          <w:bCs/>
+        </w:rPr>
+        <w:t>Step 8CLICK</w:t>
+      </w:r>
+      <w:r>
+        <w:t>Open the source titled 'Top 7 AI-Powered Web Scraping Solutions in 2026' to gather more information on AI browser automation testing best practices.</w:t>
+      </w:r>
+    </w:p>
+    <w:p>
+      <w:r>
+        <w:rPr>
+          <w:rFonts w:ascii="Segoe UI Emoji" w:hAnsi="Segoe UI Emoji" w:cs="Segoe UI Emoji"/>
+          <w:b/>
+          <w:bCs/>
+        </w:rPr>
+        <w:t>⚡</w:t>
+      </w:r>
+    </w:p>
+    <w:p>
+      <w:r>
+        <w:rPr>
+          <w:b/>
+          <w:bCs/>
+        </w:rPr>
+        <w:t>Step 9CLICK</w:t>
+      </w:r>
+      <w:r>
+        <w:t>Open the source titled 'Top 7 AI-Powered Web Scraping Solutions in 2026' to gather more information on AI browser automation testing best practices.</w:t>
+      </w:r>
+    </w:p>
+    <w:p>
+      <w:r>
+        <w:rPr>
+          <w:rFonts w:ascii="Segoe UI Emoji" w:hAnsi="Segoe UI Emoji" w:cs="Segoe UI Emoji"/>
+          <w:b/>
+          <w:bCs/>
+        </w:rPr>
+        <w:t>⚡</w:t>
+      </w:r>
+    </w:p>
+    <w:p>
+      <w:r>
+        <w:rPr>
+          <w:b/>
+          <w:bCs/>
+        </w:rPr>
+        <w:t>Step 10CLICK</w:t>
+      </w:r>
+      <w:r>
+        <w:t>Opens the source titled 'Top 7 AI-Powered Web Scraping Solutions in 2026' to gather more information on AI browser automation testing best practices.</w:t>
       </w:r>
     </w:p>
     <w:p>
       <w:r>
         <w:lastRenderedPageBreak/>
-        <w:t>5. Cite the source URL next to each line.</w:t>
-      </w:r>
-    </w:p>
-    <w:p>
-      <w:r>
-        <w:br/>
-      </w:r>
-      <w:r>
         <w:br/>
       </w:r>
     </w:p>

</xml_diff>

<commit_message>
Add V4.9 runtime state management and ordinal tab resolution
</commit_message>
<xml_diff>
--- a/15.docx
+++ b/15.docx
@@ -2781,6 +2781,87 @@
       <w:r>
         <w:t>4. Return the table only.</w:t>
       </w:r>
+    </w:p>
+    <w:p/>
+    <w:p/>
+    <w:p>
+      <w:pPr>
+        <w:rPr>
+          <w:b/>
+          <w:bCs/>
+        </w:rPr>
+      </w:pPr>
+      <w:r>
+        <w:rPr>
+          <w:b/>
+          <w:bCs/>
+        </w:rPr>
+        <w:t>2) Find and extract contact details</w:t>
+      </w:r>
+    </w:p>
+    <w:p>
+      <w:r>
+        <w:rPr>
+          <w:b/>
+          <w:bCs/>
+        </w:rPr>
+        <w:lastRenderedPageBreak/>
+        <w:t>Prompt:</w:t>
+      </w:r>
+    </w:p>
+    <w:p>
+      <w:r>
+        <w:t>text</w:t>
+      </w:r>
+    </w:p>
+    <w:p>
+      <w:r>
+        <w:t xml:space="preserve">Open Google Search and search for: `Hyderabad software </w:t>
+      </w:r>
+      <w:proofErr w:type="gramStart"/>
+      <w:r>
+        <w:t>companies</w:t>
+      </w:r>
+      <w:proofErr w:type="gramEnd"/>
+      <w:r>
+        <w:t xml:space="preserve"> careers`.</w:t>
+      </w:r>
+    </w:p>
+    <w:p>
+      <w:r>
+        <w:t>Choose 3 company websites from the results that look relevant.</w:t>
+      </w:r>
+    </w:p>
+    <w:p>
+      <w:r>
+        <w:t>For each company:</w:t>
+      </w:r>
+    </w:p>
+    <w:p>
+      <w:r>
+        <w:t>1. Open the careers page.</w:t>
+      </w:r>
+    </w:p>
+    <w:p>
+      <w:r>
+        <w:t>2. Find any current software developer or full stack developer openings.</w:t>
+      </w:r>
+    </w:p>
+    <w:p>
+      <w:r>
+        <w:t>3. Extract the job title, location, experience needed, and application link.</w:t>
+      </w:r>
+    </w:p>
+    <w:p>
+      <w:pPr>
+        <w:rPr>
+          <w:b/>
+          <w:bCs/>
+        </w:rPr>
+      </w:pPr>
+      <w:r>
+        <w:t>4. Return the result in a table.</w:t>
+      </w:r>
       <w:r>
         <w:br/>
       </w:r>
@@ -2788,7 +2869,376 @@
         <w:br/>
       </w:r>
       <w:r>
-        <w:t>Analysis failed: [object Object]</w:t>
+        <w:rPr>
+          <w:b/>
+          <w:bCs/>
+        </w:rPr>
+        <w:br/>
+      </w:r>
+      <w:r>
+        <w:rPr>
+          <w:b/>
+          <w:bCs/>
+        </w:rPr>
+        <w:t>3) Job application discovery</w:t>
+      </w:r>
+    </w:p>
+    <w:p>
+      <w:r>
+        <w:rPr>
+          <w:b/>
+          <w:bCs/>
+        </w:rPr>
+        <w:t>Prompt:</w:t>
+      </w:r>
+    </w:p>
+    <w:p>
+      <w:r>
+        <w:t>text</w:t>
+      </w:r>
+    </w:p>
+    <w:p>
+      <w:r>
+        <w:t>Go to LinkedIn Jobs and search for: `Full Stack Java Developer Hyderabad`.</w:t>
+      </w:r>
+    </w:p>
+    <w:p>
+      <w:r>
+        <w:t>Apply these filters if available:</w:t>
+      </w:r>
+    </w:p>
+    <w:p>
+      <w:r>
+        <w:t>- Experience level: Entry level or Associate</w:t>
+      </w:r>
+    </w:p>
+    <w:p>
+      <w:r>
+        <w:t>- Date posted: Past week</w:t>
+      </w:r>
+    </w:p>
+    <w:p>
+      <w:r>
+        <w:t>- On-site/Hybrid/Remote: any</w:t>
+      </w:r>
+    </w:p>
+    <w:p>
+      <w:r>
+        <w:t>Then:</w:t>
+      </w:r>
+    </w:p>
+    <w:p>
+      <w:r>
+        <w:t>1. Collect the first 10 relevant jobs.</w:t>
+      </w:r>
+    </w:p>
+    <w:p>
+      <w:r>
+        <w:t>2. For each job, capture title, company, location, posted date, and job link.</w:t>
+      </w:r>
+    </w:p>
+    <w:p>
+      <w:r>
+        <w:t>3. Remove duplicates.</w:t>
+      </w:r>
+    </w:p>
+    <w:p>
+      <w:r>
+        <w:t>4. Return the jobs ranked by relevance.</w:t>
+      </w:r>
+      <w:r>
+        <w:br/>
+      </w:r>
+      <w:r>
+        <w:br/>
+      </w:r>
+    </w:p>
+    <w:p>
+      <w:pPr>
+        <w:rPr>
+          <w:b/>
+          <w:bCs/>
+        </w:rPr>
+      </w:pPr>
+      <w:r>
+        <w:rPr>
+          <w:b/>
+          <w:bCs/>
+        </w:rPr>
+        <w:t>4) Product pricing comparison</w:t>
+      </w:r>
+    </w:p>
+    <w:p>
+      <w:r>
+        <w:rPr>
+          <w:b/>
+          <w:bCs/>
+        </w:rPr>
+        <w:t>Prompt:</w:t>
+      </w:r>
+    </w:p>
+    <w:p>
+      <w:r>
+        <w:t>text</w:t>
+      </w:r>
+    </w:p>
+    <w:p>
+      <w:r>
+        <w:lastRenderedPageBreak/>
+        <w:t>Open the official websites of 3 AI code assistant products from search results.</w:t>
+      </w:r>
+    </w:p>
+    <w:p>
+      <w:r>
+        <w:t>For each product:</w:t>
+      </w:r>
+    </w:p>
+    <w:p>
+      <w:r>
+        <w:t>1. Find the pricing page.</w:t>
+      </w:r>
+    </w:p>
+    <w:p>
+      <w:r>
+        <w:t>2. Capture the free plan, paid plan starting price, and whether a trial is available.</w:t>
+      </w:r>
+    </w:p>
+    <w:p>
+      <w:r>
+        <w:t>3. Capture one feature that is clearly mentioned on the pricing or product page.</w:t>
+      </w:r>
+    </w:p>
+    <w:p>
+      <w:r>
+        <w:t>4. Return a comparison table with source URLs.</w:t>
+      </w:r>
+      <w:r>
+        <w:br/>
+      </w:r>
+      <w:r>
+        <w:br/>
+      </w:r>
+    </w:p>
+    <w:p/>
+    <w:p>
+      <w:pPr>
+        <w:rPr>
+          <w:b/>
+          <w:bCs/>
+        </w:rPr>
+      </w:pPr>
+      <w:r>
+        <w:rPr>
+          <w:b/>
+          <w:bCs/>
+        </w:rPr>
+        <w:t>5) Long form research extraction</w:t>
+      </w:r>
+    </w:p>
+    <w:p>
+      <w:r>
+        <w:rPr>
+          <w:b/>
+          <w:bCs/>
+        </w:rPr>
+        <w:t>Prompt:</w:t>
+      </w:r>
+    </w:p>
+    <w:p>
+      <w:r>
+        <w:t>text</w:t>
+      </w:r>
+    </w:p>
+    <w:p>
+      <w:r>
+        <w:t>Search the web for official documentation or product pages about browser automation tools.</w:t>
+      </w:r>
+    </w:p>
+    <w:p>
+      <w:r>
+        <w:t>Pick 3 different tools and for each one:</w:t>
+      </w:r>
+    </w:p>
+    <w:p>
+      <w:r>
+        <w:t>1. Find the official documentation page.</w:t>
+      </w:r>
+    </w:p>
+    <w:p>
+      <w:r>
+        <w:t>2. Extract the supported languages, main use case, and whether it supports browser control.</w:t>
+      </w:r>
+    </w:p>
+    <w:p>
+      <w:r>
+        <w:t>3. Note one setup requirement.</w:t>
+      </w:r>
+    </w:p>
+    <w:p>
+      <w:pPr>
+        <w:rPr>
+          <w:b/>
+          <w:bCs/>
+        </w:rPr>
+      </w:pPr>
+      <w:r>
+        <w:t>4. Return the answer in markdown bullets, grouped by tool.</w:t>
+      </w:r>
+      <w:r>
+        <w:br/>
+      </w:r>
+      <w:r>
+        <w:br/>
+      </w:r>
+    </w:p>
+    <w:p>
+      <w:pPr>
+        <w:rPr>
+          <w:b/>
+          <w:bCs/>
+        </w:rPr>
+      </w:pPr>
+    </w:p>
+    <w:p>
+      <w:pPr>
+        <w:rPr>
+          <w:b/>
+          <w:bCs/>
+        </w:rPr>
+      </w:pPr>
+      <w:r>
+        <w:rPr>
+          <w:b/>
+          <w:bCs/>
+        </w:rPr>
+        <w:t>6) Multi-page directory collection</w:t>
+      </w:r>
+    </w:p>
+    <w:p>
+      <w:r>
+        <w:rPr>
+          <w:b/>
+          <w:bCs/>
+        </w:rPr>
+        <w:t>Prompt:</w:t>
+      </w:r>
+    </w:p>
+    <w:p>
+      <w:r>
+        <w:t>text</w:t>
+      </w:r>
+    </w:p>
+    <w:p>
+      <w:r>
+        <w:t>Open a real public business directory or professional directory search result.</w:t>
+      </w:r>
+    </w:p>
+    <w:p>
+      <w:r>
+        <w:t>Collect 20 entries across at least 3 pages.</w:t>
+      </w:r>
+    </w:p>
+    <w:p>
+      <w:r>
+        <w:t>For each entry:</w:t>
+      </w:r>
+    </w:p>
+    <w:p>
+      <w:r>
+        <w:t>1. Capture name, category, city, and website if available.</w:t>
+      </w:r>
+    </w:p>
+    <w:p>
+      <w:r>
+        <w:lastRenderedPageBreak/>
+        <w:t>2. Avoid duplicates.</w:t>
+      </w:r>
+    </w:p>
+    <w:p>
+      <w:r>
+        <w:t>3. Put the results into a table.</w:t>
+      </w:r>
+    </w:p>
+    <w:p>
+      <w:r>
+        <w:t>4. If any entry is missing a website, leave it blank rather than guessing.</w:t>
+      </w:r>
+      <w:r>
+        <w:br/>
+      </w:r>
+    </w:p>
+    <w:p>
+      <w:r>
+        <w:br/>
+      </w:r>
+    </w:p>
+    <w:p>
+      <w:pPr>
+        <w:rPr>
+          <w:b/>
+          <w:bCs/>
+        </w:rPr>
+      </w:pPr>
+      <w:r>
+        <w:rPr>
+          <w:b/>
+          <w:bCs/>
+        </w:rPr>
+        <w:t>7) Real application workflow</w:t>
+      </w:r>
+    </w:p>
+    <w:p>
+      <w:r>
+        <w:rPr>
+          <w:b/>
+          <w:bCs/>
+        </w:rPr>
+        <w:t>Prompt:</w:t>
+      </w:r>
+    </w:p>
+    <w:p>
+      <w:r>
+        <w:t>text</w:t>
+      </w:r>
+    </w:p>
+    <w:p>
+      <w:r>
+        <w:t>Open a real SaaS website that offers a free account or free trial.</w:t>
+      </w:r>
+    </w:p>
+    <w:p>
+      <w:r>
+        <w:t>Complete the full signup flow using only a test email you control.</w:t>
+      </w:r>
+    </w:p>
+    <w:p>
+      <w:r>
+        <w:t>After signup:</w:t>
+      </w:r>
+    </w:p>
+    <w:p>
+      <w:r>
+        <w:t>1. Verify the welcome page or dashboard loads.</w:t>
+      </w:r>
+    </w:p>
+    <w:p>
+      <w:r>
+        <w:t>2. Locate one setting, one profile field, and one billing or plan page.</w:t>
+      </w:r>
+    </w:p>
+    <w:p>
+      <w:r>
+        <w:t>3. Capture screenshots of the successful login state and the profile page.</w:t>
+      </w:r>
+    </w:p>
+    <w:p>
+      <w:r>
+        <w:t>4. Return a short report with what worked and what failed.</w:t>
+      </w:r>
+    </w:p>
+    <w:p>
+      <w:r>
+        <w:t>Refresh failed: Extraction failed: Error: Error: Frame with ID 0 is showing error page</w:t>
       </w:r>
     </w:p>
     <w:p>
@@ -2808,18 +3258,17 @@
     </w:p>
     <w:p>
       <w:r>
-        <w:lastRenderedPageBreak/>
-        <w:t>The current task is to open the top 5 relevant search results in new tabs. The first four results have been opened successfully, but the fifth result could not be found. Therefore, I will attempt to open the next available relevant result, which is the sixth one, to ensure that I can gather enough information for the comparison table.</w:t>
-      </w:r>
-    </w:p>
-    <w:p>
-      <w:r>
-        <w:rPr>
-          <w:rFonts w:ascii="Segoe UI Emoji" w:hAnsi="Segoe UI Emoji" w:cs="Segoe UI Emoji"/>
-          <w:b/>
-          <w:bCs/>
-        </w:rPr>
-        <w:t>⚡</w:t>
+        <w:t>The current page is a blank browser tab, and no website is loaded. To proceed with the task of opening a SaaS website that offers a free account or free trial, I need to navigate to a suitable URL.</w:t>
+      </w:r>
+    </w:p>
+    <w:p>
+      <w:r>
+        <w:rPr>
+          <w:rFonts w:ascii="Segoe UI Symbol" w:hAnsi="Segoe UI Symbol" w:cs="Segoe UI Symbol"/>
+          <w:b/>
+          <w:bCs/>
+        </w:rPr>
+        <w:t>✗</w:t>
       </w:r>
     </w:p>
     <w:p>
@@ -2831,285 +3280,425 @@
         <w:t>Step 1NAVIGATE</w:t>
       </w:r>
       <w:r>
-        <w:t>This action opens Google Search to perform the required search.</w:t>
-      </w:r>
-    </w:p>
-    <w:p>
-      <w:r>
-        <w:rPr>
-          <w:rFonts w:ascii="Segoe UI Emoji" w:hAnsi="Segoe UI Emoji" w:cs="Segoe UI Emoji"/>
-          <w:b/>
-          <w:bCs/>
-        </w:rPr>
-        <w:t>⚡</w:t>
-      </w:r>
-    </w:p>
-    <w:p>
-      <w:r>
-        <w:rPr>
-          <w:b/>
-          <w:bCs/>
-        </w:rPr>
-        <w:t>Step 2FILL</w:t>
-      </w:r>
-      <w:r>
-        <w:t>Fills the search input field with the query for the search.</w:t>
-      </w:r>
-    </w:p>
-    <w:p>
-      <w:r>
-        <w:rPr>
-          <w:rFonts w:ascii="Segoe UI Emoji" w:hAnsi="Segoe UI Emoji" w:cs="Segoe UI Emoji"/>
-          <w:b/>
-          <w:bCs/>
-        </w:rPr>
-        <w:t>⚡</w:t>
-      </w:r>
-    </w:p>
-    <w:p>
-      <w:r>
-        <w:rPr>
-          <w:b/>
-          <w:bCs/>
-        </w:rPr>
-        <w:t>Step 3CLICK</w:t>
-      </w:r>
-      <w:r>
-        <w:t>This action submits the search query to Google.</w:t>
-      </w:r>
-    </w:p>
-    <w:p>
-      <w:r>
-        <w:rPr>
-          <w:rFonts w:ascii="Segoe UI Emoji" w:hAnsi="Segoe UI Emoji" w:cs="Segoe UI Emoji"/>
-          <w:b/>
-          <w:bCs/>
-        </w:rPr>
-        <w:t>⚡</w:t>
-      </w:r>
-    </w:p>
-    <w:p>
-      <w:r>
-        <w:rPr>
-          <w:b/>
-          <w:bCs/>
-        </w:rPr>
-        <w:t>Step 4CLICK</w:t>
-      </w:r>
-      <w:r>
-        <w:t>This action opens the first relevant search result in a new tab.</w:t>
-      </w:r>
-    </w:p>
-    <w:p>
-      <w:r>
-        <w:rPr>
-          <w:rFonts w:ascii="Segoe UI Emoji" w:hAnsi="Segoe UI Emoji" w:cs="Segoe UI Emoji"/>
-          <w:b/>
-          <w:bCs/>
-        </w:rPr>
-        <w:t>⚡</w:t>
-      </w:r>
-    </w:p>
-    <w:p>
-      <w:r>
-        <w:rPr>
-          <w:b/>
-          <w:bCs/>
-        </w:rPr>
-        <w:t>Step 5CLICK</w:t>
-      </w:r>
-      <w:r>
-        <w:t>This action opens the second relevant search result in a new tab.</w:t>
-      </w:r>
-    </w:p>
-    <w:p>
-      <w:r>
-        <w:rPr>
-          <w:rFonts w:ascii="Segoe UI Emoji" w:hAnsi="Segoe UI Emoji" w:cs="Segoe UI Emoji"/>
-          <w:b/>
-          <w:bCs/>
-        </w:rPr>
-        <w:t>⚡</w:t>
-      </w:r>
-    </w:p>
-    <w:p>
-      <w:r>
-        <w:rPr>
-          <w:b/>
-          <w:bCs/>
-        </w:rPr>
-        <w:t>Step 6CLICK</w:t>
-      </w:r>
-      <w:r>
-        <w:t>This action opens the third relevant search result in a new tab.</w:t>
-      </w:r>
-    </w:p>
-    <w:p>
-      <w:r>
-        <w:rPr>
-          <w:rFonts w:ascii="Segoe UI Emoji" w:hAnsi="Segoe UI Emoji" w:cs="Segoe UI Emoji"/>
-          <w:b/>
-          <w:bCs/>
-        </w:rPr>
-        <w:t>⚡</w:t>
-      </w:r>
-    </w:p>
-    <w:p>
-      <w:r>
-        <w:rPr>
-          <w:b/>
-          <w:bCs/>
-        </w:rPr>
-        <w:t>Step 7CLICK</w:t>
-      </w:r>
-      <w:r>
-        <w:t>This action opens the fourth relevant search result in a new tab.</w:t>
-      </w:r>
-    </w:p>
-    <w:p>
-      <w:r>
-        <w:rPr>
-          <w:rFonts w:ascii="Segoe UI Symbol" w:hAnsi="Segoe UI Symbol" w:cs="Segoe UI Symbol"/>
-          <w:b/>
-          <w:bCs/>
-        </w:rPr>
-        <w:t>✗</w:t>
-      </w:r>
-    </w:p>
-    <w:p>
-      <w:r>
-        <w:rPr>
-          <w:b/>
-          <w:bCs/>
-        </w:rPr>
-        <w:t>Step 8CLICK</w:t>
-      </w:r>
-      <w:r>
-        <w:t xml:space="preserve">This action opens the fifth relevant search result in a new </w:t>
+        <w:t xml:space="preserve">This action navigates to a SaaS website that offers a free account or free </w:t>
       </w:r>
       <w:proofErr w:type="spellStart"/>
-      <w:r>
-        <w:t>tab.</w:t>
+      <w:proofErr w:type="gramStart"/>
+      <w:r>
+        <w:t>trial.</w:t>
       </w:r>
       <w:r>
         <w:rPr>
           <w:i/>
           <w:iCs/>
         </w:rPr>
-        <w:t>Element</w:t>
+        <w:t>Could</w:t>
       </w:r>
       <w:proofErr w:type="spellEnd"/>
+      <w:proofErr w:type="gramEnd"/>
       <w:r>
         <w:rPr>
           <w:i/>
           <w:iCs/>
         </w:rPr>
-        <w:t xml:space="preserve"> not found: div &gt; div &gt; div &gt; ul &gt; </w:t>
+        <w:t xml:space="preserve"> not verify page progress after navigate: Extraction failed: Error: Error: Frame with ID 0 is showing error page</w:t>
+      </w:r>
+    </w:p>
+    <w:p>
+      <w:pPr>
+        <w:rPr>
+          <w:b/>
+          <w:bCs/>
+        </w:rPr>
+      </w:pPr>
+      <w:r>
+        <w:rPr>
+          <w:b/>
+          <w:bCs/>
+        </w:rPr>
+        <w:t>8) Real file upload and report</w:t>
+      </w:r>
+    </w:p>
+    <w:p>
+      <w:r>
+        <w:rPr>
+          <w:b/>
+          <w:bCs/>
+        </w:rPr>
+        <w:t>Prompt:</w:t>
+      </w:r>
+    </w:p>
+    <w:p>
+      <w:r>
+        <w:t>text</w:t>
+      </w:r>
+    </w:p>
+    <w:p>
+      <w:r>
+        <w:t>Open a real website that allows file upload for logged-in users or public upload.</w:t>
+      </w:r>
+    </w:p>
+    <w:p>
+      <w:r>
+        <w:t>Upload a small PDF or image file.</w:t>
+      </w:r>
+    </w:p>
+    <w:p>
+      <w:r>
+        <w:lastRenderedPageBreak/>
+        <w:t>Then:</w:t>
+      </w:r>
+    </w:p>
+    <w:p>
+      <w:r>
+        <w:t>1. Confirm the file was accepted.</w:t>
+      </w:r>
+    </w:p>
+    <w:p>
+      <w:r>
+        <w:t>2. Find where the uploaded file appears.</w:t>
+      </w:r>
+    </w:p>
+    <w:p>
+      <w:r>
+        <w:t>3. If the site provides a share link or processing result, copy it.</w:t>
+      </w:r>
+    </w:p>
+    <w:p>
+      <w:r>
+        <w:t>4. Return the result with the exact page path and any visible status text.</w:t>
+      </w:r>
+    </w:p>
+    <w:p>
+      <w:pPr>
+        <w:rPr>
+          <w:b/>
+          <w:bCs/>
+        </w:rPr>
+      </w:pPr>
+      <w:r>
+        <w:rPr>
+          <w:b/>
+          <w:bCs/>
+        </w:rPr>
+        <w:t>AI Analysis</w:t>
+      </w:r>
+    </w:p>
+    <w:p>
+      <w:r>
+        <w:t>The current page is the 'Example Domain', which does not allow file uploads. The previous attempt to navigate to a file upload site was unsuccessful. Therefore, I need to find a new website that allows file uploads. Replan reason: The current approach is not working as the 'Example Domain' does not support file uploads. A different strategy is needed to find a suitable website.</w:t>
+      </w:r>
+    </w:p>
+    <w:p>
+      <w:r>
+        <w:rPr>
+          <w:rFonts w:ascii="Segoe UI Emoji" w:hAnsi="Segoe UI Emoji" w:cs="Segoe UI Emoji"/>
+          <w:b/>
+          <w:bCs/>
+        </w:rPr>
+        <w:t>⚡</w:t>
+      </w:r>
+    </w:p>
+    <w:p>
+      <w:r>
+        <w:rPr>
+          <w:b/>
+          <w:bCs/>
+        </w:rPr>
+        <w:t>Step 1NAVIGATE</w:t>
+      </w:r>
+      <w:r>
+        <w:t>Navigate to a website that allows file uploads.</w:t>
+      </w:r>
+    </w:p>
+    <w:p>
+      <w:pPr>
+        <w:rPr>
+          <w:b/>
+          <w:bCs/>
+        </w:rPr>
+      </w:pPr>
+      <w:r>
+        <w:rPr>
+          <w:b/>
+          <w:bCs/>
+        </w:rPr>
+        <w:t>Planner requested replan</w:t>
+      </w:r>
+    </w:p>
+    <w:p>
+      <w:r>
+        <w:t>The current approach is not working as the 'Example Domain' does not support file uploads. A different strategy is needed to find a suitable website.</w:t>
+      </w:r>
+    </w:p>
+    <w:p>
+      <w:pPr>
+        <w:rPr>
+          <w:b/>
+          <w:bCs/>
+        </w:rPr>
+      </w:pPr>
+      <w:r>
+        <w:rPr>
+          <w:b/>
+          <w:bCs/>
+        </w:rPr>
+        <w:t>9) Real data entry with validation</w:t>
+      </w:r>
+    </w:p>
+    <w:p>
+      <w:r>
+        <w:rPr>
+          <w:b/>
+          <w:bCs/>
+        </w:rPr>
+        <w:t>Prompt:</w:t>
+      </w:r>
+    </w:p>
+    <w:p>
+      <w:r>
+        <w:t>text</w:t>
+      </w:r>
+    </w:p>
+    <w:p>
+      <w:r>
+        <w:t>Open a real government, university, or company form that is publicly accessible and safe to use with test data.</w:t>
+      </w:r>
+    </w:p>
+    <w:p>
+      <w:r>
+        <w:t>Fill the form with clearly fake test data, but make it look realistic.</w:t>
+      </w:r>
+    </w:p>
+    <w:p>
+      <w:r>
+        <w:t>Then:</w:t>
+      </w:r>
+    </w:p>
+    <w:p>
+      <w:r>
+        <w:t>1. Check whether the form shows validation errors.</w:t>
+      </w:r>
+    </w:p>
+    <w:p>
+      <w:r>
+        <w:t>2. Fix any errors the page reports.</w:t>
+      </w:r>
+    </w:p>
+    <w:p>
+      <w:r>
+        <w:t>3. Submit only if it is a genuine test or sandbox form.</w:t>
+      </w:r>
+    </w:p>
+    <w:p>
+      <w:r>
+        <w:t>4. Report the validation rules you encountered and whether submission succeeded.</w:t>
+      </w:r>
+    </w:p>
+    <w:p>
+      <w:pPr>
+        <w:rPr>
+          <w:b/>
+          <w:bCs/>
+        </w:rPr>
+      </w:pPr>
+      <w:r>
+        <w:rPr>
+          <w:b/>
+          <w:bCs/>
+        </w:rPr>
+        <w:t>AI Analysis</w:t>
+      </w:r>
+    </w:p>
+    <w:p>
+      <w:r>
+        <w:t xml:space="preserve">The current page is the Example Domain, which does not contain any links to real government, university, or company forms. The previous navigation attempt did not yield </w:t>
+      </w:r>
+      <w:r>
+        <w:lastRenderedPageBreak/>
+        <w:t>the intended results. Therefore, I need to find a new source for accessing a valid form. Replan reason: The current page does not provide access to any real forms. A different approach is needed to find a publicly accessible form.</w:t>
+      </w:r>
+    </w:p>
+    <w:p>
+      <w:r>
+        <w:rPr>
+          <w:rFonts w:ascii="Segoe UI Emoji" w:hAnsi="Segoe UI Emoji" w:cs="Segoe UI Emoji"/>
+          <w:b/>
+          <w:bCs/>
+        </w:rPr>
+        <w:t>⚡</w:t>
+      </w:r>
+    </w:p>
+    <w:p>
+      <w:r>
+        <w:rPr>
+          <w:b/>
+          <w:bCs/>
+        </w:rPr>
+        <w:t>Step 1NAVIGATE</w:t>
+      </w:r>
+      <w:r>
+        <w:t>This action navigates to Example Domain, which may provide links to government or company forms.</w:t>
+      </w:r>
+    </w:p>
+    <w:p>
+      <w:pPr>
+        <w:rPr>
+          <w:b/>
+          <w:bCs/>
+        </w:rPr>
+      </w:pPr>
+      <w:r>
+        <w:rPr>
+          <w:b/>
+          <w:bCs/>
+        </w:rPr>
+        <w:t>Planner requested replan</w:t>
+      </w:r>
+    </w:p>
+    <w:p>
+      <w:r>
+        <w:t>The current page does not provide access to any real forms. A different approach is needed to find a publicly accessible form.</w:t>
+      </w:r>
+    </w:p>
+    <w:p>
+      <w:pPr>
+        <w:rPr>
+          <w:b/>
+          <w:bCs/>
+        </w:rPr>
+      </w:pPr>
+      <w:r>
+        <w:rPr>
+          <w:b/>
+          <w:bCs/>
+        </w:rPr>
+        <w:t>10) Complex multi-step research and output</w:t>
+      </w:r>
+    </w:p>
+    <w:p>
+      <w:r>
+        <w:rPr>
+          <w:b/>
+          <w:bCs/>
+        </w:rPr>
+        <w:t>Prompt:</w:t>
+      </w:r>
+    </w:p>
+    <w:p>
+      <w:r>
+        <w:t>text</w:t>
+      </w:r>
+    </w:p>
+    <w:p>
+      <w:r>
+        <w:t>Use Google Search and official websites to research:</w:t>
+      </w:r>
+    </w:p>
+    <w:p>
+      <w:r>
+        <w:t>`AI browser automation testing best practices`</w:t>
+      </w:r>
+    </w:p>
+    <w:p>
+      <w:r>
+        <w:t>Do this in order:</w:t>
+      </w:r>
+    </w:p>
+    <w:p>
+      <w:r>
+        <w:t>1. Open at least 5 authoritative sources.</w:t>
+      </w:r>
+    </w:p>
+    <w:p>
+      <w:r>
+        <w:t>2. Extract the top recommended testing practices.</w:t>
+      </w:r>
+    </w:p>
+    <w:p>
+      <w:r>
+        <w:t>3. Separate practices into: reliability, observability, recovery, and safety.</w:t>
+      </w:r>
+    </w:p>
+    <w:p>
+      <w:r>
+        <w:t>4. Create a final checklist with 1 line per practice.</w:t>
+      </w:r>
+    </w:p>
+    <w:p>
+      <w:r>
+        <w:t>5. Cite the source URL next to each line.</w:t>
+      </w:r>
+    </w:p>
+    <w:p>
+      <w:r>
+        <w:br/>
+      </w:r>
+      <w:r>
+        <w:t>Analysis failed: [object Object]</w:t>
+      </w:r>
+    </w:p>
+    <w:p>
+      <w:pPr>
+        <w:rPr>
+          <w:b/>
+          <w:bCs/>
+        </w:rPr>
+      </w:pPr>
+      <w:r>
+        <w:rPr>
+          <w:b/>
+          <w:bCs/>
+        </w:rPr>
+        <w:t>AI Analysis</w:t>
+      </w:r>
+    </w:p>
+    <w:p>
+      <w:r>
+        <w:t>The task is currently blocked due to previous attempts to open sources that did not yield the expected results. To proceed, I will open a different source that is visible and relevant to the research goal.</w:t>
+      </w:r>
+    </w:p>
+    <w:p>
+      <w:r>
+        <w:rPr>
+          <w:rFonts w:ascii="Segoe UI Symbol" w:hAnsi="Segoe UI Symbol" w:cs="Segoe UI Symbol"/>
+          <w:b/>
+          <w:bCs/>
+        </w:rPr>
+        <w:t>✗</w:t>
+      </w:r>
+    </w:p>
+    <w:p>
+      <w:r>
+        <w:rPr>
+          <w:b/>
+          <w:bCs/>
+        </w:rPr>
+        <w:t>Step 1FILL</w:t>
+      </w:r>
+      <w:r>
+        <w:t xml:space="preserve">This action fills the Google search input with the query for AI browser automation testing best </w:t>
       </w:r>
       <w:proofErr w:type="spellStart"/>
+      <w:proofErr w:type="gramStart"/>
+      <w:r>
+        <w:t>practices.</w:t>
+      </w:r>
       <w:r>
         <w:rPr>
           <w:i/>
           <w:iCs/>
         </w:rPr>
-        <w:t>li:nth-of-type</w:t>
+        <w:t>Cannot</w:t>
       </w:r>
       <w:proofErr w:type="spellEnd"/>
+      <w:proofErr w:type="gramEnd"/>
       <w:r>
         <w:rPr>
           <w:i/>
           <w:iCs/>
         </w:rPr>
-        <w:t xml:space="preserve">(5) &gt; </w:t>
-      </w:r>
-      <w:proofErr w:type="spellStart"/>
-      <w:r>
-        <w:rPr>
-          <w:i/>
-          <w:iCs/>
-        </w:rPr>
-        <w:t>div:nth-of-type</w:t>
-      </w:r>
-      <w:proofErr w:type="spellEnd"/>
-      <w:r>
-        <w:rPr>
-          <w:i/>
-          <w:iCs/>
-        </w:rPr>
-        <w:t>(1) &gt; a</w:t>
-      </w:r>
-    </w:p>
-    <w:p>
-      <w:r>
-        <w:rPr>
-          <w:rFonts w:ascii="Segoe UI Symbol" w:hAnsi="Segoe UI Symbol" w:cs="Segoe UI Symbol"/>
-          <w:b/>
-          <w:bCs/>
-        </w:rPr>
-        <w:t>✗</w:t>
-      </w:r>
-    </w:p>
-    <w:p>
-      <w:r>
-        <w:rPr>
-          <w:b/>
-          <w:bCs/>
-        </w:rPr>
-        <w:t>Step 9CLICK</w:t>
-      </w:r>
-      <w:r>
-        <w:t xml:space="preserve">This action opens the sixth relevant search result in a new </w:t>
-      </w:r>
-      <w:proofErr w:type="spellStart"/>
-      <w:r>
-        <w:t>tab.</w:t>
-      </w:r>
-      <w:r>
-        <w:rPr>
-          <w:i/>
-          <w:iCs/>
-        </w:rPr>
-        <w:t>Element</w:t>
-      </w:r>
-      <w:proofErr w:type="spellEnd"/>
-      <w:r>
-        <w:rPr>
-          <w:i/>
-          <w:iCs/>
-        </w:rPr>
-        <w:t xml:space="preserve"> not found: div &gt; div &gt; div &gt; ul &gt; </w:t>
-      </w:r>
-      <w:proofErr w:type="spellStart"/>
-      <w:r>
-        <w:rPr>
-          <w:i/>
-          <w:iCs/>
-        </w:rPr>
-        <w:t>li:nth-of-type</w:t>
-      </w:r>
-      <w:proofErr w:type="spellEnd"/>
-      <w:r>
-        <w:rPr>
-          <w:i/>
-          <w:iCs/>
-        </w:rPr>
-        <w:t xml:space="preserve">(6) &gt; </w:t>
-      </w:r>
-      <w:proofErr w:type="spellStart"/>
-      <w:r>
-        <w:rPr>
-          <w:i/>
-          <w:iCs/>
-        </w:rPr>
-        <w:t>div:nth-of-type</w:t>
-      </w:r>
-      <w:proofErr w:type="spellEnd"/>
-      <w:r>
-        <w:rPr>
-          <w:i/>
-          <w:iCs/>
-        </w:rPr>
-        <w:t>(1) &gt; a</w:t>
+        <w:t xml:space="preserve"> execute on this page. Navigate to a regular webpage.</w:t>
       </w:r>
     </w:p>
     <w:p>
@@ -3128,129 +3717,11 @@
           <w:b/>
           <w:bCs/>
         </w:rPr>
-        <w:t>Step 10CLICK</w:t>
-      </w:r>
-      <w:r>
-        <w:t>This action opens the sixth relevant search result in a new tab.</w:t>
-      </w:r>
-    </w:p>
-    <w:p/>
-    <w:p>
-      <w:pPr>
-        <w:rPr>
-          <w:b/>
-          <w:bCs/>
-        </w:rPr>
-      </w:pPr>
-      <w:r>
-        <w:rPr>
-          <w:b/>
-          <w:bCs/>
-        </w:rPr>
-        <w:t>2) Find and extract contact details</w:t>
-      </w:r>
-    </w:p>
-    <w:p>
-      <w:r>
-        <w:rPr>
-          <w:b/>
-          <w:bCs/>
-        </w:rPr>
-        <w:t>Prompt:</w:t>
-      </w:r>
-    </w:p>
-    <w:p>
-      <w:r>
         <w:lastRenderedPageBreak/>
-        <w:t>text</w:t>
-      </w:r>
-    </w:p>
-    <w:p>
-      <w:r>
-        <w:t xml:space="preserve">Open Google Search and search for: `Hyderabad software </w:t>
-      </w:r>
-      <w:proofErr w:type="gramStart"/>
-      <w:r>
-        <w:t>companies</w:t>
-      </w:r>
-      <w:proofErr w:type="gramEnd"/>
-      <w:r>
-        <w:t xml:space="preserve"> careers`.</w:t>
-      </w:r>
-    </w:p>
-    <w:p>
-      <w:r>
-        <w:t>Choose 3 company websites from the results that look relevant.</w:t>
-      </w:r>
-    </w:p>
-    <w:p>
-      <w:r>
-        <w:t>For each company:</w:t>
-      </w:r>
-    </w:p>
-    <w:p>
-      <w:r>
-        <w:t>1. Open the careers page.</w:t>
-      </w:r>
-    </w:p>
-    <w:p>
-      <w:r>
-        <w:t>2. Find any current software developer or full stack developer openings.</w:t>
-      </w:r>
-    </w:p>
-    <w:p>
-      <w:r>
-        <w:t>3. Extract the job title, location, experience needed, and application link.</w:t>
-      </w:r>
-    </w:p>
-    <w:p>
-      <w:r>
-        <w:t>4. Return the result in a table.</w:t>
-      </w:r>
-      <w:r>
-        <w:br/>
-      </w:r>
-      <w:r>
-        <w:br/>
-      </w:r>
-      <w:r>
-        <w:t>Analysis failed: [object Object]</w:t>
-      </w:r>
-    </w:p>
-    <w:p>
-      <w:pPr>
-        <w:rPr>
-          <w:b/>
-          <w:bCs/>
-        </w:rPr>
-      </w:pPr>
-      <w:r>
-        <w:rPr>
-          <w:b/>
-          <w:bCs/>
-        </w:rPr>
-        <w:t>AI Analysis</w:t>
-      </w:r>
-    </w:p>
-    <w:p>
-      <w:r>
-        <w:t xml:space="preserve">The user has successfully navigated to the job details for 'Software Developer / Application Developer' at </w:t>
-      </w:r>
-      <w:proofErr w:type="spellStart"/>
-      <w:r>
-        <w:t>Aiconnectz</w:t>
-      </w:r>
-      <w:proofErr w:type="spellEnd"/>
-      <w:r>
-        <w:t xml:space="preserve">. However, the next step is to extract specific job information such as job title, location, experience needed, and application link. This information is necessary to </w:t>
-      </w:r>
-      <w:proofErr w:type="spellStart"/>
-      <w:r>
-        <w:t>fulfill</w:t>
-      </w:r>
-      <w:proofErr w:type="spellEnd"/>
-      <w:r>
-        <w:t xml:space="preserve"> the user's goal of compiling job openings. Report claim: This information is essential to complete the user's task of compiling job openings.</w:t>
+        <w:t>Step 2NAVIGATE</w:t>
+      </w:r>
+      <w:r>
+        <w:t>This action opens Google Search to begin the research.</w:t>
       </w:r>
     </w:p>
     <w:p>
@@ -3269,10 +3740,10 @@
           <w:b/>
           <w:bCs/>
         </w:rPr>
-        <w:t>Step 1NAVIGATE</w:t>
-      </w:r>
-      <w:r>
-        <w:t>This action opens Google Search in the current tab.</w:t>
+        <w:t>Step 3FILL</w:t>
+      </w:r>
+      <w:r>
+        <w:t>Fills the Google search input with the query for AI browser automation testing best practices.</w:t>
       </w:r>
     </w:p>
     <w:p>
@@ -3282,1575 +3753,6 @@
           <w:b/>
           <w:bCs/>
         </w:rPr>
-        <w:t>⚡</w:t>
-      </w:r>
-    </w:p>
-    <w:p>
-      <w:r>
-        <w:rPr>
-          <w:b/>
-          <w:bCs/>
-        </w:rPr>
-        <w:t>Step 2FILL</w:t>
-      </w:r>
-      <w:r>
-        <w:t>Fills the search input with the query 'Hyderabad software companies careers'.</w:t>
-      </w:r>
-    </w:p>
-    <w:p>
-      <w:r>
-        <w:rPr>
-          <w:rFonts w:ascii="Segoe UI Emoji" w:hAnsi="Segoe UI Emoji" w:cs="Segoe UI Emoji"/>
-          <w:b/>
-          <w:bCs/>
-        </w:rPr>
-        <w:t>⚡</w:t>
-      </w:r>
-    </w:p>
-    <w:p>
-      <w:r>
-        <w:rPr>
-          <w:b/>
-          <w:bCs/>
-        </w:rPr>
-        <w:t>Step 3CLICK</w:t>
-      </w:r>
-      <w:r>
-        <w:t>This action clicks the 'Google Search' button to execute the search for the query.</w:t>
-      </w:r>
-    </w:p>
-    <w:p>
-      <w:r>
-        <w:rPr>
-          <w:rFonts w:ascii="Segoe UI Emoji" w:hAnsi="Segoe UI Emoji" w:cs="Segoe UI Emoji"/>
-          <w:b/>
-          <w:bCs/>
-        </w:rPr>
-        <w:t>⚡</w:t>
-      </w:r>
-    </w:p>
-    <w:p>
-      <w:r>
-        <w:rPr>
-          <w:b/>
-          <w:bCs/>
-        </w:rPr>
-        <w:t>Step 4CLICK</w:t>
-      </w:r>
-      <w:r>
-        <w:t>Click on the first relevant company link for 'Hyderabad software companies careers for freshers'.</w:t>
-      </w:r>
-    </w:p>
-    <w:p>
-      <w:r>
-        <w:rPr>
-          <w:rFonts w:ascii="Segoe UI Emoji" w:hAnsi="Segoe UI Emoji" w:cs="Segoe UI Emoji"/>
-          <w:b/>
-          <w:bCs/>
-        </w:rPr>
-        <w:t>⚡</w:t>
-      </w:r>
-    </w:p>
-    <w:p>
-      <w:r>
-        <w:rPr>
-          <w:b/>
-          <w:bCs/>
-        </w:rPr>
-        <w:t>Step 5CLICK</w:t>
-      </w:r>
-      <w:r>
-        <w:t>Click on the link for 'Hyderabad software companies careers for freshers salary' to access the relevant company information.</w:t>
-      </w:r>
-    </w:p>
-    <w:p>
-      <w:r>
-        <w:rPr>
-          <w:rFonts w:ascii="Segoe UI Emoji" w:hAnsi="Segoe UI Emoji" w:cs="Segoe UI Emoji"/>
-          <w:b/>
-          <w:bCs/>
-        </w:rPr>
-        <w:t>⚡</w:t>
-      </w:r>
-    </w:p>
-    <w:p>
-      <w:r>
-        <w:rPr>
-          <w:b/>
-          <w:bCs/>
-        </w:rPr>
-        <w:lastRenderedPageBreak/>
-        <w:t>Step 6CLICK</w:t>
-      </w:r>
-      <w:r>
-        <w:t>Click on the link for 'Software Developer Fresher Jobs in Hyderabad' to access relevant job openings.</w:t>
-      </w:r>
-    </w:p>
-    <w:p>
-      <w:r>
-        <w:rPr>
-          <w:rFonts w:ascii="Segoe UI Emoji" w:hAnsi="Segoe UI Emoji" w:cs="Segoe UI Emoji"/>
-          <w:b/>
-          <w:bCs/>
-        </w:rPr>
-        <w:t>⚡</w:t>
-      </w:r>
-    </w:p>
-    <w:p>
-      <w:r>
-        <w:rPr>
-          <w:b/>
-          <w:bCs/>
-        </w:rPr>
-        <w:t>Step 7CLICK</w:t>
-      </w:r>
-      <w:r>
-        <w:t xml:space="preserve">Click on the job posting for 'Software Developer / Application Developer </w:t>
-      </w:r>
-      <w:proofErr w:type="spellStart"/>
-      <w:r>
-        <w:t>Aiconnectz</w:t>
-      </w:r>
-      <w:proofErr w:type="spellEnd"/>
-      <w:r>
-        <w:t>' to access the job details.</w:t>
-      </w:r>
-    </w:p>
-    <w:p/>
-    <w:p>
-      <w:pPr>
-        <w:rPr>
-          <w:b/>
-          <w:bCs/>
-        </w:rPr>
-      </w:pPr>
-      <w:r>
-        <w:rPr>
-          <w:b/>
-          <w:bCs/>
-        </w:rPr>
-        <w:t>3) Job application discovery</w:t>
-      </w:r>
-    </w:p>
-    <w:p>
-      <w:r>
-        <w:rPr>
-          <w:b/>
-          <w:bCs/>
-        </w:rPr>
-        <w:t>Prompt:</w:t>
-      </w:r>
-    </w:p>
-    <w:p>
-      <w:r>
-        <w:t>text</w:t>
-      </w:r>
-    </w:p>
-    <w:p>
-      <w:r>
-        <w:t>Go to LinkedIn Jobs and search for: `Full Stack Java Developer Hyderabad`.</w:t>
-      </w:r>
-    </w:p>
-    <w:p>
-      <w:r>
-        <w:t>Apply these filters if available:</w:t>
-      </w:r>
-    </w:p>
-    <w:p>
-      <w:r>
-        <w:t>- Experience level: Entry level or Associate</w:t>
-      </w:r>
-    </w:p>
-    <w:p>
-      <w:r>
-        <w:t>- Date posted: Past week</w:t>
-      </w:r>
-    </w:p>
-    <w:p>
-      <w:r>
-        <w:t>- On-site/Hybrid/Remote: any</w:t>
-      </w:r>
-    </w:p>
-    <w:p>
-      <w:r>
-        <w:t>Then:</w:t>
-      </w:r>
-    </w:p>
-    <w:p>
-      <w:r>
-        <w:t>1. Collect the first 10 relevant jobs.</w:t>
-      </w:r>
-    </w:p>
-    <w:p>
-      <w:r>
-        <w:t>2. For each job, capture title, company, location, posted date, and job link.</w:t>
-      </w:r>
-    </w:p>
-    <w:p>
-      <w:r>
-        <w:t>3. Remove duplicates.</w:t>
-      </w:r>
-    </w:p>
-    <w:p>
-      <w:r>
-        <w:t>4. Return the jobs ranked by relevance.</w:t>
-      </w:r>
-      <w:r>
-        <w:br/>
-      </w:r>
-      <w:r>
-        <w:br/>
-      </w:r>
-    </w:p>
-    <w:p>
-      <w:pPr>
-        <w:rPr>
-          <w:b/>
-          <w:bCs/>
-        </w:rPr>
-      </w:pPr>
-      <w:r>
-        <w:rPr>
-          <w:b/>
-          <w:bCs/>
-        </w:rPr>
-        <w:t>4) Product pricing comparison</w:t>
-      </w:r>
-    </w:p>
-    <w:p>
-      <w:r>
-        <w:rPr>
-          <w:b/>
-          <w:bCs/>
-        </w:rPr>
-        <w:t>Prompt:</w:t>
-      </w:r>
-    </w:p>
-    <w:p>
-      <w:r>
-        <w:t>text</w:t>
-      </w:r>
-    </w:p>
-    <w:p>
-      <w:r>
-        <w:t>Open the official websites of 3 AI code assistant products from search results.</w:t>
-      </w:r>
-    </w:p>
-    <w:p>
-      <w:r>
-        <w:t>For each product:</w:t>
-      </w:r>
-    </w:p>
-    <w:p>
-      <w:r>
-        <w:t>1. Find the pricing page.</w:t>
-      </w:r>
-    </w:p>
-    <w:p>
-      <w:r>
-        <w:t>2. Capture the free plan, paid plan starting price, and whether a trial is available.</w:t>
-      </w:r>
-    </w:p>
-    <w:p>
-      <w:r>
-        <w:t>3. Capture one feature that is clearly mentioned on the pricing or product page.</w:t>
-      </w:r>
-    </w:p>
-    <w:p>
-      <w:r>
-        <w:lastRenderedPageBreak/>
-        <w:t>4. Return a comparison table with source URLs.</w:t>
-      </w:r>
-      <w:r>
-        <w:br/>
-      </w:r>
-      <w:r>
-        <w:br/>
-      </w:r>
-      <w:r>
-        <w:t>Analysis failed: [object Object]</w:t>
-      </w:r>
-    </w:p>
-    <w:p>
-      <w:pPr>
-        <w:rPr>
-          <w:b/>
-          <w:bCs/>
-        </w:rPr>
-      </w:pPr>
-      <w:r>
-        <w:rPr>
-          <w:b/>
-          <w:bCs/>
-        </w:rPr>
-        <w:t>AI Analysis</w:t>
-      </w:r>
-    </w:p>
-    <w:p>
-      <w:r>
-        <w:t>The task is currently blocked as previous attempts to access the pricing information for Gemini Code Assist have not yielded the desired results. The next step is to try a different link to access the pricing information.</w:t>
-      </w:r>
-    </w:p>
-    <w:p>
-      <w:r>
-        <w:rPr>
-          <w:rFonts w:ascii="Segoe UI Emoji" w:hAnsi="Segoe UI Emoji" w:cs="Segoe UI Emoji"/>
-          <w:b/>
-          <w:bCs/>
-        </w:rPr>
-        <w:t>⚡</w:t>
-      </w:r>
-    </w:p>
-    <w:p>
-      <w:r>
-        <w:rPr>
-          <w:b/>
-          <w:bCs/>
-        </w:rPr>
-        <w:t>Step 1NAVIGATE</w:t>
-      </w:r>
-      <w:r>
-        <w:t>This action will open Google to search for AI code assistant products.</w:t>
-      </w:r>
-    </w:p>
-    <w:p>
-      <w:r>
-        <w:rPr>
-          <w:rFonts w:ascii="Segoe UI Emoji" w:hAnsi="Segoe UI Emoji" w:cs="Segoe UI Emoji"/>
-          <w:b/>
-          <w:bCs/>
-        </w:rPr>
-        <w:t>⚡</w:t>
-      </w:r>
-    </w:p>
-    <w:p>
-      <w:r>
-        <w:rPr>
-          <w:b/>
-          <w:bCs/>
-        </w:rPr>
-        <w:t>Step 2FILL</w:t>
-      </w:r>
-      <w:r>
-        <w:t>This fills the search input with the query to find AI code assistant products.</w:t>
-      </w:r>
-    </w:p>
-    <w:p>
-      <w:r>
-        <w:rPr>
-          <w:rFonts w:ascii="Segoe UI Emoji" w:hAnsi="Segoe UI Emoji" w:cs="Segoe UI Emoji"/>
-          <w:b/>
-          <w:bCs/>
-        </w:rPr>
-        <w:t>⚡</w:t>
-      </w:r>
-    </w:p>
-    <w:p>
-      <w:r>
-        <w:rPr>
-          <w:b/>
-          <w:bCs/>
-        </w:rPr>
-        <w:t>Step 3CLICK</w:t>
-      </w:r>
-      <w:r>
-        <w:t>Click the Google Search button to perform the search for AI code assistant products.</w:t>
-      </w:r>
-    </w:p>
-    <w:p>
-      <w:r>
-        <w:rPr>
-          <w:rFonts w:ascii="Segoe UI Emoji" w:hAnsi="Segoe UI Emoji" w:cs="Segoe UI Emoji"/>
-          <w:b/>
-          <w:bCs/>
-        </w:rPr>
-        <w:t>⚡</w:t>
-      </w:r>
-    </w:p>
-    <w:p>
-      <w:r>
-        <w:rPr>
-          <w:b/>
-          <w:bCs/>
-        </w:rPr>
-        <w:t>Step 4CLICK</w:t>
-      </w:r>
-      <w:r>
-        <w:t>Open the official website for Gemini Code Assist.</w:t>
-      </w:r>
-    </w:p>
-    <w:p>
-      <w:r>
-        <w:rPr>
-          <w:rFonts w:ascii="Segoe UI Emoji" w:hAnsi="Segoe UI Emoji" w:cs="Segoe UI Emoji"/>
-          <w:b/>
-          <w:bCs/>
-        </w:rPr>
-        <w:t>⚡</w:t>
-      </w:r>
-    </w:p>
-    <w:p>
-      <w:r>
-        <w:rPr>
-          <w:b/>
-          <w:bCs/>
-        </w:rPr>
-        <w:t>Step 5CLICK</w:t>
-      </w:r>
-      <w:r>
-        <w:t>Click the pricing link to access the pricing page for Gemini Code Assist.</w:t>
-      </w:r>
-    </w:p>
-    <w:p>
-      <w:r>
-        <w:rPr>
-          <w:rFonts w:ascii="Segoe UI Emoji" w:hAnsi="Segoe UI Emoji" w:cs="Segoe UI Emoji"/>
-          <w:b/>
-          <w:bCs/>
-        </w:rPr>
-        <w:t>⚡</w:t>
-      </w:r>
-    </w:p>
-    <w:p>
-      <w:r>
-        <w:rPr>
-          <w:b/>
-          <w:bCs/>
-        </w:rPr>
-        <w:t>Step 6CLICK</w:t>
-      </w:r>
-      <w:r>
-        <w:t>Click the link for Gemini Code Assist Standard and Enterprise to access the pricing information.</w:t>
-      </w:r>
-    </w:p>
-    <w:p>
-      <w:r>
-        <w:rPr>
-          <w:rFonts w:ascii="Segoe UI Emoji" w:hAnsi="Segoe UI Emoji" w:cs="Segoe UI Emoji"/>
-          <w:b/>
-          <w:bCs/>
-        </w:rPr>
-        <w:t>⚡</w:t>
-      </w:r>
-    </w:p>
-    <w:p>
-      <w:r>
-        <w:rPr>
-          <w:b/>
-          <w:bCs/>
-        </w:rPr>
-        <w:t>Step 7CLICK</w:t>
-      </w:r>
-      <w:r>
-        <w:t>Click the link for Gemini Cloud Assist Pricing Overview to access the pricing information.</w:t>
-      </w:r>
-    </w:p>
-    <w:p>
-      <w:r>
-        <w:rPr>
-          <w:rFonts w:ascii="Segoe UI Emoji" w:hAnsi="Segoe UI Emoji" w:cs="Segoe UI Emoji"/>
-          <w:b/>
-          <w:bCs/>
-        </w:rPr>
-        <w:t>⚡</w:t>
-      </w:r>
-    </w:p>
-    <w:p>
-      <w:r>
-        <w:rPr>
-          <w:b/>
-          <w:bCs/>
-        </w:rPr>
-        <w:t>Step 8CLICK</w:t>
-      </w:r>
-      <w:r>
-        <w:t>Click the link to access the pricing information for Gemini Code Assist Standard and Enterprise.</w:t>
-      </w:r>
-    </w:p>
-    <w:p>
-      <w:r>
-        <w:rPr>
-          <w:rFonts w:ascii="Segoe UI Emoji" w:hAnsi="Segoe UI Emoji" w:cs="Segoe UI Emoji"/>
-          <w:b/>
-          <w:bCs/>
-        </w:rPr>
-        <w:t>⚡</w:t>
-      </w:r>
-    </w:p>
-    <w:p>
-      <w:r>
-        <w:rPr>
-          <w:b/>
-          <w:bCs/>
-        </w:rPr>
-        <w:t>Step 9CLICK</w:t>
-      </w:r>
-      <w:r>
-        <w:t>Click the link for Gemini Code Assist pricing to access the pricing information.</w:t>
-      </w:r>
-    </w:p>
-    <w:p>
-      <w:r>
-        <w:lastRenderedPageBreak/>
-        <w:br/>
-      </w:r>
-    </w:p>
-    <w:p>
-      <w:pPr>
-        <w:rPr>
-          <w:b/>
-          <w:bCs/>
-        </w:rPr>
-      </w:pPr>
-      <w:r>
-        <w:rPr>
-          <w:b/>
-          <w:bCs/>
-        </w:rPr>
-        <w:t>5) Long form research extraction</w:t>
-      </w:r>
-    </w:p>
-    <w:p>
-      <w:r>
-        <w:rPr>
-          <w:b/>
-          <w:bCs/>
-        </w:rPr>
-        <w:t>Prompt:</w:t>
-      </w:r>
-    </w:p>
-    <w:p>
-      <w:r>
-        <w:t>text</w:t>
-      </w:r>
-    </w:p>
-    <w:p>
-      <w:r>
-        <w:t>Search the web for official documentation or product pages about browser automation tools.</w:t>
-      </w:r>
-    </w:p>
-    <w:p>
-      <w:r>
-        <w:t>Pick 3 different tools and for each one:</w:t>
-      </w:r>
-    </w:p>
-    <w:p>
-      <w:r>
-        <w:t>1. Find the official documentation page.</w:t>
-      </w:r>
-    </w:p>
-    <w:p>
-      <w:r>
-        <w:t>2. Extract the supported languages, main use case, and whether it supports browser control.</w:t>
-      </w:r>
-    </w:p>
-    <w:p>
-      <w:r>
-        <w:t>3. Note one setup requirement.</w:t>
-      </w:r>
-    </w:p>
-    <w:p>
-      <w:pPr>
-        <w:rPr>
-          <w:b/>
-          <w:bCs/>
-        </w:rPr>
-      </w:pPr>
-      <w:r>
-        <w:t>4. Return the answer in markdown bullets, grouped by tool.</w:t>
-      </w:r>
-      <w:r>
-        <w:br/>
-      </w:r>
-      <w:r>
-        <w:br/>
-      </w:r>
-      <w:r>
-        <w:rPr>
-          <w:b/>
-          <w:bCs/>
-        </w:rPr>
-        <w:t>AI Analysis</w:t>
-      </w:r>
-    </w:p>
-    <w:p>
-      <w:pPr>
-        <w:rPr>
-          <w:b/>
-          <w:bCs/>
-        </w:rPr>
-      </w:pPr>
-      <w:r>
-        <w:rPr>
-          <w:b/>
-          <w:bCs/>
-        </w:rPr>
-        <w:t>The task is currently blocked due to repeated failures in clicking links to access documentation for browser automation tools. The next step is to gather more information about available links to documentation or product pages for different tools. Replan reason: The current approach of clicking links has resulted in no effect. A different strategy is needed to find the documentation for browser automation tools.</w:t>
-      </w:r>
-    </w:p>
-    <w:p>
-      <w:pPr>
-        <w:rPr>
-          <w:b/>
-          <w:bCs/>
-        </w:rPr>
-      </w:pPr>
-      <w:r>
-        <w:rPr>
-          <w:rFonts w:ascii="Segoe UI Emoji" w:hAnsi="Segoe UI Emoji" w:cs="Segoe UI Emoji"/>
-          <w:b/>
-          <w:bCs/>
-        </w:rPr>
-        <w:t>⚡</w:t>
-      </w:r>
-    </w:p>
-    <w:p>
-      <w:pPr>
-        <w:rPr>
-          <w:b/>
-          <w:bCs/>
-        </w:rPr>
-      </w:pPr>
-      <w:r>
-        <w:rPr>
-          <w:b/>
-          <w:bCs/>
-        </w:rPr>
-        <w:t>Step 1NAVIGATENavigate to Google to search for browser automation tools.</w:t>
-      </w:r>
-    </w:p>
-    <w:p>
-      <w:pPr>
-        <w:rPr>
-          <w:b/>
-          <w:bCs/>
-        </w:rPr>
-      </w:pPr>
-      <w:r>
-        <w:rPr>
-          <w:rFonts w:ascii="Segoe UI Emoji" w:hAnsi="Segoe UI Emoji" w:cs="Segoe UI Emoji"/>
-          <w:b/>
-          <w:bCs/>
-        </w:rPr>
-        <w:t>⚡</w:t>
-      </w:r>
-    </w:p>
-    <w:p>
-      <w:pPr>
-        <w:rPr>
-          <w:b/>
-          <w:bCs/>
-        </w:rPr>
-      </w:pPr>
-      <w:r>
-        <w:rPr>
-          <w:b/>
-          <w:bCs/>
-        </w:rPr>
-        <w:t>Step 2FILLThis fills the search input with the query for browser automation tools.</w:t>
-      </w:r>
-    </w:p>
-    <w:p>
-      <w:pPr>
-        <w:rPr>
-          <w:b/>
-          <w:bCs/>
-        </w:rPr>
-      </w:pPr>
-      <w:r>
-        <w:rPr>
-          <w:rFonts w:ascii="Segoe UI Emoji" w:hAnsi="Segoe UI Emoji" w:cs="Segoe UI Emoji"/>
-          <w:b/>
-          <w:bCs/>
-        </w:rPr>
-        <w:t>⚡</w:t>
-      </w:r>
-    </w:p>
-    <w:p>
-      <w:pPr>
-        <w:rPr>
-          <w:b/>
-          <w:bCs/>
-        </w:rPr>
-      </w:pPr>
-      <w:r>
-        <w:rPr>
-          <w:b/>
-          <w:bCs/>
-        </w:rPr>
-        <w:t>Step 3CLICKClick the 'Google Search' button to perform the search for browser automation tools.</w:t>
-      </w:r>
-    </w:p>
-    <w:p>
-      <w:pPr>
-        <w:rPr>
-          <w:b/>
-          <w:bCs/>
-        </w:rPr>
-      </w:pPr>
-      <w:r>
-        <w:rPr>
-          <w:rFonts w:ascii="Segoe UI Emoji" w:hAnsi="Segoe UI Emoji" w:cs="Segoe UI Emoji"/>
-          <w:b/>
-          <w:bCs/>
-        </w:rPr>
-        <w:t>⚡</w:t>
-      </w:r>
-    </w:p>
-    <w:p>
-      <w:pPr>
-        <w:rPr>
-          <w:b/>
-          <w:bCs/>
-        </w:rPr>
-      </w:pPr>
-      <w:r>
-        <w:rPr>
-          <w:b/>
-          <w:bCs/>
-        </w:rPr>
-        <w:t>Step 4CLICKClick the first link to access the documentation for the first browser automation tool.</w:t>
-      </w:r>
-    </w:p>
-    <w:p>
-      <w:pPr>
-        <w:rPr>
-          <w:b/>
-          <w:bCs/>
-        </w:rPr>
-      </w:pPr>
-      <w:r>
-        <w:rPr>
-          <w:rFonts w:ascii="Segoe UI Emoji" w:hAnsi="Segoe UI Emoji" w:cs="Segoe UI Emoji"/>
-          <w:b/>
-          <w:bCs/>
-        </w:rPr>
-        <w:t>⚡</w:t>
-      </w:r>
-    </w:p>
-    <w:p>
-      <w:pPr>
-        <w:rPr>
-          <w:b/>
-          <w:bCs/>
-        </w:rPr>
-      </w:pPr>
-      <w:r>
-        <w:rPr>
-          <w:b/>
-          <w:bCs/>
-        </w:rPr>
-        <w:lastRenderedPageBreak/>
-        <w:t>Step 5CLICKClick the second link in the search results to access the documentation for the second browser automation tool.</w:t>
-      </w:r>
-    </w:p>
-    <w:p>
-      <w:pPr>
-        <w:rPr>
-          <w:b/>
-          <w:bCs/>
-        </w:rPr>
-      </w:pPr>
-      <w:r>
-        <w:rPr>
-          <w:rFonts w:ascii="Segoe UI Emoji" w:hAnsi="Segoe UI Emoji" w:cs="Segoe UI Emoji"/>
-          <w:b/>
-          <w:bCs/>
-        </w:rPr>
-        <w:t>⚡</w:t>
-      </w:r>
-    </w:p>
-    <w:p>
-      <w:pPr>
-        <w:rPr>
-          <w:b/>
-          <w:bCs/>
-        </w:rPr>
-      </w:pPr>
-      <w:r>
-        <w:rPr>
-          <w:b/>
-          <w:bCs/>
-        </w:rPr>
-        <w:t>Step 6CLICKClick the link to access the documentation for Axiom Browser Automation.</w:t>
-      </w:r>
-    </w:p>
-    <w:p>
-      <w:pPr>
-        <w:rPr>
-          <w:b/>
-          <w:bCs/>
-        </w:rPr>
-      </w:pPr>
-      <w:r>
-        <w:rPr>
-          <w:rFonts w:ascii="Segoe UI Emoji" w:hAnsi="Segoe UI Emoji" w:cs="Segoe UI Emoji"/>
-          <w:b/>
-          <w:bCs/>
-        </w:rPr>
-        <w:t>⚡</w:t>
-      </w:r>
-    </w:p>
-    <w:p>
-      <w:pPr>
-        <w:rPr>
-          <w:b/>
-          <w:bCs/>
-        </w:rPr>
-      </w:pPr>
-      <w:r>
-        <w:rPr>
-          <w:b/>
-          <w:bCs/>
-        </w:rPr>
-        <w:t>Step 7CLICKClick the link to access the official documentation for Axiom Browser Automation.</w:t>
-      </w:r>
-    </w:p>
-    <w:p>
-      <w:pPr>
-        <w:rPr>
-          <w:b/>
-          <w:bCs/>
-        </w:rPr>
-      </w:pPr>
-      <w:r>
-        <w:rPr>
-          <w:b/>
-          <w:bCs/>
-        </w:rPr>
-        <w:t>Planner requested replan</w:t>
-      </w:r>
-    </w:p>
-    <w:p>
-      <w:pPr>
-        <w:rPr>
-          <w:b/>
-          <w:bCs/>
-        </w:rPr>
-      </w:pPr>
-      <w:r>
-        <w:rPr>
-          <w:b/>
-          <w:bCs/>
-        </w:rPr>
-        <w:t>The current approach of clicking links has resulted in no effect. A different strategy is needed to find the documentation for browser automation tools.</w:t>
-      </w:r>
-    </w:p>
-    <w:p>
-      <w:pPr>
-        <w:rPr>
-          <w:b/>
-          <w:bCs/>
-        </w:rPr>
-      </w:pPr>
-      <w:r>
-        <w:rPr>
-          <w:b/>
-          <w:bCs/>
-        </w:rPr>
-        <w:t>6) Multi-page directory collection</w:t>
-      </w:r>
-    </w:p>
-    <w:p>
-      <w:r>
-        <w:rPr>
-          <w:b/>
-          <w:bCs/>
-        </w:rPr>
-        <w:t>Prompt:</w:t>
-      </w:r>
-    </w:p>
-    <w:p>
-      <w:r>
-        <w:t>text</w:t>
-      </w:r>
-    </w:p>
-    <w:p>
-      <w:r>
-        <w:t>Open a real public business directory or professional directory search result.</w:t>
-      </w:r>
-    </w:p>
-    <w:p>
-      <w:r>
-        <w:t>Collect 20 entries across at least 3 pages.</w:t>
-      </w:r>
-    </w:p>
-    <w:p>
-      <w:r>
-        <w:t>For each entry:</w:t>
-      </w:r>
-    </w:p>
-    <w:p>
-      <w:r>
-        <w:t>1. Capture name, category, city, and website if available.</w:t>
-      </w:r>
-    </w:p>
-    <w:p>
-      <w:r>
-        <w:t>2. Avoid duplicates.</w:t>
-      </w:r>
-    </w:p>
-    <w:p>
-      <w:r>
-        <w:t>3. Put the results into a table.</w:t>
-      </w:r>
-    </w:p>
-    <w:p>
-      <w:r>
-        <w:t>4. If any entry is missing a website, leave it blank rather than guessing.</w:t>
-      </w:r>
-      <w:r>
-        <w:br/>
-      </w:r>
-    </w:p>
-    <w:p>
-      <w:pPr>
-        <w:rPr>
-          <w:b/>
-          <w:bCs/>
-        </w:rPr>
-      </w:pPr>
-      <w:r>
-        <w:rPr>
-          <w:b/>
-          <w:bCs/>
-        </w:rPr>
-        <w:t>AI Analysis</w:t>
-      </w:r>
-    </w:p>
-    <w:p>
-      <w:r>
-        <w:t>The current page indicates that access to the desired public business directory is blocked by Cloudflare due to security measures. The next step is to gather more information about the block and potentially resolve it by contacting the site owner.</w:t>
-      </w:r>
-    </w:p>
-    <w:p>
-      <w:r>
-        <w:rPr>
-          <w:rFonts w:ascii="Segoe UI Emoji" w:hAnsi="Segoe UI Emoji" w:cs="Segoe UI Emoji"/>
-          <w:b/>
-          <w:bCs/>
-        </w:rPr>
-        <w:t>⚡</w:t>
-      </w:r>
-    </w:p>
-    <w:p>
-      <w:r>
-        <w:rPr>
-          <w:b/>
-          <w:bCs/>
-        </w:rPr>
-        <w:t>Step 1NAVIGATE</w:t>
-      </w:r>
-      <w:r>
-        <w:t>This action navigates to a public business directory website.</w:t>
-      </w:r>
-    </w:p>
-    <w:p>
-      <w:r>
-        <w:rPr>
-          <w:rFonts w:ascii="Segoe UI Emoji" w:hAnsi="Segoe UI Emoji" w:cs="Segoe UI Emoji"/>
-          <w:b/>
-          <w:bCs/>
-        </w:rPr>
-        <w:t>⚡</w:t>
-      </w:r>
-    </w:p>
-    <w:p>
-      <w:r>
-        <w:rPr>
-          <w:b/>
-          <w:bCs/>
-        </w:rPr>
-        <w:t>Step 2CLICK</w:t>
-      </w:r>
-      <w:r>
-        <w:t>Click to reveal the IP address, which may help in understanding the block.</w:t>
-      </w:r>
-    </w:p>
-    <w:p>
-      <w:r>
-        <w:lastRenderedPageBreak/>
-        <w:br/>
-      </w:r>
-    </w:p>
-    <w:p>
-      <w:pPr>
-        <w:rPr>
-          <w:b/>
-          <w:bCs/>
-        </w:rPr>
-      </w:pPr>
-      <w:r>
-        <w:rPr>
-          <w:b/>
-          <w:bCs/>
-        </w:rPr>
-        <w:t>7) Real application workflow</w:t>
-      </w:r>
-    </w:p>
-    <w:p>
-      <w:r>
-        <w:rPr>
-          <w:b/>
-          <w:bCs/>
-        </w:rPr>
-        <w:t>Prompt:</w:t>
-      </w:r>
-    </w:p>
-    <w:p>
-      <w:r>
-        <w:t>text</w:t>
-      </w:r>
-    </w:p>
-    <w:p>
-      <w:r>
-        <w:t>Open a real SaaS website that offers a free account or free trial.</w:t>
-      </w:r>
-    </w:p>
-    <w:p>
-      <w:r>
-        <w:t>Complete the full signup flow using only a test email you control.</w:t>
-      </w:r>
-    </w:p>
-    <w:p>
-      <w:r>
-        <w:t>After signup:</w:t>
-      </w:r>
-    </w:p>
-    <w:p>
-      <w:r>
-        <w:t>1. Verify the welcome page or dashboard loads.</w:t>
-      </w:r>
-    </w:p>
-    <w:p>
-      <w:r>
-        <w:t>2. Locate one setting, one profile field, and one billing or plan page.</w:t>
-      </w:r>
-    </w:p>
-    <w:p>
-      <w:r>
-        <w:t>3. Capture screenshots of the successful login state and the profile page.</w:t>
-      </w:r>
-    </w:p>
-    <w:p>
-      <w:r>
-        <w:t>4. Return a short report with what worked and what failed.</w:t>
-      </w:r>
-    </w:p>
-    <w:p>
-      <w:r>
-        <w:t>Refresh failed: Extraction failed: Error: Error: Frame with ID 0 is showing error page</w:t>
-      </w:r>
-    </w:p>
-    <w:p>
-      <w:pPr>
-        <w:rPr>
-          <w:b/>
-          <w:bCs/>
-        </w:rPr>
-      </w:pPr>
-      <w:r>
-        <w:rPr>
-          <w:b/>
-          <w:bCs/>
-        </w:rPr>
-        <w:t>AI Analysis</w:t>
-      </w:r>
-    </w:p>
-    <w:p>
-      <w:r>
-        <w:t>The current page is a blank browser tab, and no website is loaded. To proceed with the task of opening a SaaS website that offers a free account or free trial, I need to navigate to a suitable URL.</w:t>
-      </w:r>
-    </w:p>
-    <w:p>
-      <w:r>
-        <w:rPr>
-          <w:rFonts w:ascii="Segoe UI Symbol" w:hAnsi="Segoe UI Symbol" w:cs="Segoe UI Symbol"/>
-          <w:b/>
-          <w:bCs/>
-        </w:rPr>
-        <w:t>✗</w:t>
-      </w:r>
-    </w:p>
-    <w:p>
-      <w:r>
-        <w:rPr>
-          <w:b/>
-          <w:bCs/>
-        </w:rPr>
-        <w:t>Step 1NAVIGATE</w:t>
-      </w:r>
-      <w:r>
-        <w:t xml:space="preserve">This action navigates to a SaaS website that offers a free account or free </w:t>
-      </w:r>
-      <w:proofErr w:type="spellStart"/>
-      <w:proofErr w:type="gramStart"/>
-      <w:r>
-        <w:t>trial.</w:t>
-      </w:r>
-      <w:r>
-        <w:rPr>
-          <w:i/>
-          <w:iCs/>
-        </w:rPr>
-        <w:t>Could</w:t>
-      </w:r>
-      <w:proofErr w:type="spellEnd"/>
-      <w:proofErr w:type="gramEnd"/>
-      <w:r>
-        <w:rPr>
-          <w:i/>
-          <w:iCs/>
-        </w:rPr>
-        <w:t xml:space="preserve"> not verify page progress after navigate: Extraction failed: Error: Error: Frame with ID 0 is showing error page</w:t>
-      </w:r>
-    </w:p>
-    <w:p>
-      <w:pPr>
-        <w:rPr>
-          <w:b/>
-          <w:bCs/>
-        </w:rPr>
-      </w:pPr>
-      <w:r>
-        <w:rPr>
-          <w:b/>
-          <w:bCs/>
-        </w:rPr>
-        <w:t>8) Real file upload and report</w:t>
-      </w:r>
-    </w:p>
-    <w:p>
-      <w:r>
-        <w:rPr>
-          <w:b/>
-          <w:bCs/>
-        </w:rPr>
-        <w:t>Prompt:</w:t>
-      </w:r>
-    </w:p>
-    <w:p>
-      <w:r>
-        <w:t>text</w:t>
-      </w:r>
-    </w:p>
-    <w:p>
-      <w:r>
-        <w:t>Open a real website that allows file upload for logged-in users or public upload.</w:t>
-      </w:r>
-    </w:p>
-    <w:p>
-      <w:r>
-        <w:t>Upload a small PDF or image file.</w:t>
-      </w:r>
-    </w:p>
-    <w:p>
-      <w:r>
-        <w:t>Then:</w:t>
-      </w:r>
-    </w:p>
-    <w:p>
-      <w:r>
-        <w:t>1. Confirm the file was accepted.</w:t>
-      </w:r>
-    </w:p>
-    <w:p>
-      <w:r>
-        <w:t>2. Find where the uploaded file appears.</w:t>
-      </w:r>
-    </w:p>
-    <w:p>
-      <w:r>
-        <w:lastRenderedPageBreak/>
-        <w:t>3. If the site provides a share link or processing result, copy it.</w:t>
-      </w:r>
-    </w:p>
-    <w:p>
-      <w:r>
-        <w:t>4. Return the result with the exact page path and any visible status text.</w:t>
-      </w:r>
-    </w:p>
-    <w:p>
-      <w:pPr>
-        <w:rPr>
-          <w:b/>
-          <w:bCs/>
-        </w:rPr>
-      </w:pPr>
-      <w:r>
-        <w:rPr>
-          <w:b/>
-          <w:bCs/>
-        </w:rPr>
-        <w:t>AI Analysis</w:t>
-      </w:r>
-    </w:p>
-    <w:p>
-      <w:r>
-        <w:t>The current page is the 'Example Domain', which does not allow file uploads. The previous attempt to navigate to a file upload site was unsuccessful. Therefore, I need to find a new website that allows file uploads. Replan reason: The current approach is not working as the 'Example Domain' does not support file uploads. A different strategy is needed to find a suitable website.</w:t>
-      </w:r>
-    </w:p>
-    <w:p>
-      <w:r>
-        <w:rPr>
-          <w:rFonts w:ascii="Segoe UI Emoji" w:hAnsi="Segoe UI Emoji" w:cs="Segoe UI Emoji"/>
-          <w:b/>
-          <w:bCs/>
-        </w:rPr>
-        <w:t>⚡</w:t>
-      </w:r>
-    </w:p>
-    <w:p>
-      <w:r>
-        <w:rPr>
-          <w:b/>
-          <w:bCs/>
-        </w:rPr>
-        <w:t>Step 1NAVIGATE</w:t>
-      </w:r>
-      <w:r>
-        <w:t>Navigate to a website that allows file uploads.</w:t>
-      </w:r>
-    </w:p>
-    <w:p>
-      <w:pPr>
-        <w:rPr>
-          <w:b/>
-          <w:bCs/>
-        </w:rPr>
-      </w:pPr>
-      <w:r>
-        <w:rPr>
-          <w:b/>
-          <w:bCs/>
-        </w:rPr>
-        <w:t>Planner requested replan</w:t>
-      </w:r>
-    </w:p>
-    <w:p>
-      <w:r>
-        <w:t>The current approach is not working as the 'Example Domain' does not support file uploads. A different strategy is needed to find a suitable website.</w:t>
-      </w:r>
-    </w:p>
-    <w:p>
-      <w:pPr>
-        <w:rPr>
-          <w:b/>
-          <w:bCs/>
-        </w:rPr>
-      </w:pPr>
-      <w:r>
-        <w:rPr>
-          <w:b/>
-          <w:bCs/>
-        </w:rPr>
-        <w:t>9) Real data entry with validation</w:t>
-      </w:r>
-    </w:p>
-    <w:p>
-      <w:r>
-        <w:rPr>
-          <w:b/>
-          <w:bCs/>
-        </w:rPr>
-        <w:t>Prompt:</w:t>
-      </w:r>
-    </w:p>
-    <w:p>
-      <w:r>
-        <w:t>text</w:t>
-      </w:r>
-    </w:p>
-    <w:p>
-      <w:r>
-        <w:t>Open a real government, university, or company form that is publicly accessible and safe to use with test data.</w:t>
-      </w:r>
-    </w:p>
-    <w:p>
-      <w:r>
-        <w:t>Fill the form with clearly fake test data, but make it look realistic.</w:t>
-      </w:r>
-    </w:p>
-    <w:p>
-      <w:r>
-        <w:t>Then:</w:t>
-      </w:r>
-    </w:p>
-    <w:p>
-      <w:r>
-        <w:t>1. Check whether the form shows validation errors.</w:t>
-      </w:r>
-    </w:p>
-    <w:p>
-      <w:r>
-        <w:t>2. Fix any errors the page reports.</w:t>
-      </w:r>
-    </w:p>
-    <w:p>
-      <w:r>
-        <w:t>3. Submit only if it is a genuine test or sandbox form.</w:t>
-      </w:r>
-    </w:p>
-    <w:p>
-      <w:r>
-        <w:t>4. Report the validation rules you encountered and whether submission succeeded.</w:t>
-      </w:r>
-    </w:p>
-    <w:p>
-      <w:pPr>
-        <w:rPr>
-          <w:b/>
-          <w:bCs/>
-        </w:rPr>
-      </w:pPr>
-      <w:r>
-        <w:rPr>
-          <w:b/>
-          <w:bCs/>
-        </w:rPr>
-        <w:t>AI Analysis</w:t>
-      </w:r>
-    </w:p>
-    <w:p>
-      <w:r>
-        <w:t>The current page is the Example Domain, which does not contain any links to real government, university, or company forms. The previous navigation attempt did not yield the intended results. Therefore, I need to find a new source for accessing a valid form. Replan reason: The current page does not provide access to any real forms. A different approach is needed to find a publicly accessible form.</w:t>
-      </w:r>
-    </w:p>
-    <w:p>
-      <w:r>
-        <w:rPr>
-          <w:rFonts w:ascii="Segoe UI Emoji" w:hAnsi="Segoe UI Emoji" w:cs="Segoe UI Emoji"/>
-          <w:b/>
-          <w:bCs/>
-        </w:rPr>
-        <w:t>⚡</w:t>
-      </w:r>
-    </w:p>
-    <w:p>
-      <w:r>
-        <w:rPr>
-          <w:b/>
-          <w:bCs/>
-        </w:rPr>
-        <w:lastRenderedPageBreak/>
-        <w:t>Step 1NAVIGATE</w:t>
-      </w:r>
-      <w:r>
-        <w:t>This action navigates to Example Domain, which may provide links to government or company forms.</w:t>
-      </w:r>
-    </w:p>
-    <w:p>
-      <w:pPr>
-        <w:rPr>
-          <w:b/>
-          <w:bCs/>
-        </w:rPr>
-      </w:pPr>
-      <w:r>
-        <w:rPr>
-          <w:b/>
-          <w:bCs/>
-        </w:rPr>
-        <w:t>Planner requested replan</w:t>
-      </w:r>
-    </w:p>
-    <w:p>
-      <w:r>
-        <w:t>The current page does not provide access to any real forms. A different approach is needed to find a publicly accessible form.</w:t>
-      </w:r>
-    </w:p>
-    <w:p>
-      <w:pPr>
-        <w:rPr>
-          <w:b/>
-          <w:bCs/>
-        </w:rPr>
-      </w:pPr>
-      <w:r>
-        <w:rPr>
-          <w:b/>
-          <w:bCs/>
-        </w:rPr>
-        <w:t>10) Complex multi-step research and output</w:t>
-      </w:r>
-    </w:p>
-    <w:p>
-      <w:r>
-        <w:rPr>
-          <w:b/>
-          <w:bCs/>
-        </w:rPr>
-        <w:t>Prompt:</w:t>
-      </w:r>
-    </w:p>
-    <w:p>
-      <w:r>
-        <w:t>text</w:t>
-      </w:r>
-    </w:p>
-    <w:p>
-      <w:r>
-        <w:t>Use Google Search and official websites to research:</w:t>
-      </w:r>
-    </w:p>
-    <w:p>
-      <w:r>
-        <w:t>`AI browser automation testing best practices`</w:t>
-      </w:r>
-    </w:p>
-    <w:p>
-      <w:r>
-        <w:t>Do this in order:</w:t>
-      </w:r>
-    </w:p>
-    <w:p>
-      <w:r>
-        <w:t>1. Open at least 5 authoritative sources.</w:t>
-      </w:r>
-    </w:p>
-    <w:p>
-      <w:r>
-        <w:t>2. Extract the top recommended testing practices.</w:t>
-      </w:r>
-    </w:p>
-    <w:p>
-      <w:r>
-        <w:t>3. Separate practices into: reliability, observability, recovery, and safety.</w:t>
-      </w:r>
-    </w:p>
-    <w:p>
-      <w:r>
-        <w:t>4. Create a final checklist with 1 line per practice.</w:t>
-      </w:r>
-    </w:p>
-    <w:p>
-      <w:r>
-        <w:t>5. Cite the source URL next to each line.</w:t>
-      </w:r>
-    </w:p>
-    <w:p>
-      <w:r>
-        <w:br/>
-      </w:r>
-      <w:r>
-        <w:t>Analysis failed: [object Object]</w:t>
-      </w:r>
-    </w:p>
-    <w:p>
-      <w:pPr>
-        <w:rPr>
-          <w:b/>
-          <w:bCs/>
-        </w:rPr>
-      </w:pPr>
-      <w:r>
-        <w:rPr>
-          <w:b/>
-          <w:bCs/>
-        </w:rPr>
-        <w:t>AI Analysis</w:t>
-      </w:r>
-    </w:p>
-    <w:p>
-      <w:r>
-        <w:t>The task is currently blocked due to previous attempts to open sources that did not yield the expected results. To proceed, I will open a different source that is visible and relevant to the research goal.</w:t>
-      </w:r>
-    </w:p>
-    <w:p>
-      <w:r>
-        <w:rPr>
-          <w:rFonts w:ascii="Segoe UI Symbol" w:hAnsi="Segoe UI Symbol" w:cs="Segoe UI Symbol"/>
-          <w:b/>
-          <w:bCs/>
-        </w:rPr>
-        <w:t>✗</w:t>
-      </w:r>
-    </w:p>
-    <w:p>
-      <w:r>
-        <w:rPr>
-          <w:b/>
-          <w:bCs/>
-        </w:rPr>
-        <w:t>Step 1FILL</w:t>
-      </w:r>
-      <w:r>
-        <w:t xml:space="preserve">This action fills the Google search input with the query for AI browser automation testing best </w:t>
-      </w:r>
-      <w:proofErr w:type="spellStart"/>
-      <w:proofErr w:type="gramStart"/>
-      <w:r>
-        <w:t>practices.</w:t>
-      </w:r>
-      <w:r>
-        <w:rPr>
-          <w:i/>
-          <w:iCs/>
-        </w:rPr>
-        <w:t>Cannot</w:t>
-      </w:r>
-      <w:proofErr w:type="spellEnd"/>
-      <w:proofErr w:type="gramEnd"/>
-      <w:r>
-        <w:rPr>
-          <w:i/>
-          <w:iCs/>
-        </w:rPr>
-        <w:t xml:space="preserve"> execute on this page. Navigate to a regular webpage.</w:t>
-      </w:r>
-    </w:p>
-    <w:p>
-      <w:r>
-        <w:rPr>
-          <w:rFonts w:ascii="Segoe UI Emoji" w:hAnsi="Segoe UI Emoji" w:cs="Segoe UI Emoji"/>
-          <w:b/>
-          <w:bCs/>
-        </w:rPr>
-        <w:t>⚡</w:t>
-      </w:r>
-    </w:p>
-    <w:p>
-      <w:r>
-        <w:rPr>
-          <w:b/>
-          <w:bCs/>
-        </w:rPr>
-        <w:t>Step 2NAVIGATE</w:t>
-      </w:r>
-      <w:r>
-        <w:t>This action opens Google Search to begin the research.</w:t>
-      </w:r>
-    </w:p>
-    <w:p>
-      <w:r>
-        <w:rPr>
-          <w:rFonts w:ascii="Segoe UI Emoji" w:hAnsi="Segoe UI Emoji" w:cs="Segoe UI Emoji"/>
-          <w:b/>
-          <w:bCs/>
-        </w:rPr>
-        <w:t>⚡</w:t>
-      </w:r>
-    </w:p>
-    <w:p>
-      <w:r>
-        <w:rPr>
-          <w:b/>
-          <w:bCs/>
-        </w:rPr>
-        <w:t>Step 3FILL</w:t>
-      </w:r>
-      <w:r>
-        <w:t>Fills the Google search input with the query for AI browser automation testing best practices.</w:t>
-      </w:r>
-    </w:p>
-    <w:p>
-      <w:r>
-        <w:rPr>
-          <w:rFonts w:ascii="Segoe UI Emoji" w:hAnsi="Segoe UI Emoji" w:cs="Segoe UI Emoji"/>
-          <w:b/>
-          <w:bCs/>
-        </w:rPr>
-        <w:lastRenderedPageBreak/>
         <w:t>⚡</w:t>
       </w:r>
     </w:p>

</xml_diff>

<commit_message>
Add entity binding telemetry and runtime resource tracking
</commit_message>
<xml_diff>
--- a/15.docx
+++ b/15.docx
@@ -4988,6 +4988,88 @@
       </w:r>
     </w:p>
     <w:p/>
+    <w:p>
+      <w:proofErr w:type="spellStart"/>
+      <w:r>
+        <w:t>i</w:t>
+      </w:r>
+      <w:proofErr w:type="spellEnd"/>
+      <w:r>
+        <w:t xml:space="preserve"> have a </w:t>
+      </w:r>
+      <w:proofErr w:type="spellStart"/>
+      <w:r>
+        <w:t>doubte</w:t>
+      </w:r>
+      <w:proofErr w:type="spellEnd"/>
+      <w:r>
+        <w:t xml:space="preserve"> </w:t>
+      </w:r>
+      <w:proofErr w:type="spellStart"/>
+      <w:r>
+        <w:t>i'm</w:t>
+      </w:r>
+      <w:proofErr w:type="spellEnd"/>
+      <w:r>
+        <w:t xml:space="preserve"> just trying to complete the 10 tasks </w:t>
+      </w:r>
+      <w:proofErr w:type="spellStart"/>
+      <w:r>
+        <w:t>whcih</w:t>
+      </w:r>
+      <w:proofErr w:type="spellEnd"/>
+      <w:r>
+        <w:t xml:space="preserve"> </w:t>
+      </w:r>
+      <w:proofErr w:type="spellStart"/>
+      <w:r>
+        <w:t>i</w:t>
+      </w:r>
+      <w:proofErr w:type="spellEnd"/>
+      <w:r>
+        <w:t xml:space="preserve"> have shared with you but in them </w:t>
+      </w:r>
+      <w:proofErr w:type="spellStart"/>
+      <w:r>
+        <w:t>i'm</w:t>
+      </w:r>
+      <w:proofErr w:type="spellEnd"/>
+      <w:r>
+        <w:t xml:space="preserve"> working form 1 week to complete the 1st task but still we couldn't and even if </w:t>
+      </w:r>
+      <w:proofErr w:type="spellStart"/>
+      <w:r>
+        <w:t>i</w:t>
+      </w:r>
+      <w:proofErr w:type="spellEnd"/>
+      <w:r>
+        <w:t xml:space="preserve"> solve the 1 task again </w:t>
+      </w:r>
+      <w:proofErr w:type="spellStart"/>
+      <w:r>
+        <w:t>i</w:t>
+      </w:r>
+      <w:proofErr w:type="spellEnd"/>
+      <w:r>
+        <w:t xml:space="preserve"> have to </w:t>
+      </w:r>
+      <w:proofErr w:type="spellStart"/>
+      <w:r>
+        <w:t>workout</w:t>
+      </w:r>
+      <w:proofErr w:type="spellEnd"/>
+      <w:r>
+        <w:t xml:space="preserve"> with the remaining 9 </w:t>
+      </w:r>
+      <w:proofErr w:type="spellStart"/>
+      <w:r>
+        <w:t>taks</w:t>
+      </w:r>
+      <w:proofErr w:type="spellEnd"/>
+      <w:r>
+        <w:t xml:space="preserve"> ok let it me even after completing that 9 tasks is that we don't get any issues or we don't stuck on any other new tasks which are </w:t>
+      </w:r>
+    </w:p>
     <w:p/>
     <w:sectPr>
       <w:pgSz w:w="11906" w:h="16838"/>
@@ -8039,7 +8121,6 @@
   <w:style w:type="character" w:default="1" w:styleId="DefaultParagraphFont">
     <w:name w:val="Default Paragraph Font"/>
     <w:uiPriority w:val="1"/>
-    <w:semiHidden/>
     <w:unhideWhenUsed/>
   </w:style>
   <w:style w:type="table" w:default="1" w:styleId="TableNormal">

</xml_diff>

<commit_message>
Improve browser assistant workflows and user experience
</commit_message>
<xml_diff>
--- a/15.docx
+++ b/15.docx
@@ -1,6 +1,6 @@
 
 <file path=word/document.xml><?xml version="1.0" encoding="utf-8"?>
-<w:document xmlns:wpc="http://schemas.microsoft.com/office/word/2010/wordprocessingCanvas" xmlns:cx="http://schemas.microsoft.com/office/drawing/2014/chartex" xmlns:cx1="http://schemas.microsoft.com/office/drawing/2015/9/8/chartex" xmlns:cx2="http://schemas.microsoft.com/office/drawing/2015/10/21/chartex" xmlns:cx3="http://schemas.microsoft.com/office/drawing/2016/5/9/chartex" xmlns:cx4="http://schemas.microsoft.com/office/drawing/2016/5/10/chartex" xmlns:cx5="http://schemas.microsoft.com/office/drawing/2016/5/11/chartex" xmlns:cx6="http://schemas.microsoft.com/office/drawing/2016/5/12/chartex" xmlns:cx7="http://schemas.microsoft.com/office/drawing/2016/5/13/chartex" xmlns:cx8="http://schemas.microsoft.com/office/drawing/2016/5/14/chartex" xmlns:mc="http://schemas.openxmlformats.org/markup-compatibility/2006" xmlns:aink="http://schemas.microsoft.com/office/drawing/2016/ink" xmlns:am3d="http://schemas.microsoft.com/office/drawing/2017/model3d" xmlns:o="urn:schemas-microsoft-com:office:office" xmlns:oel="http://schemas.microsoft.com/office/2019/extlst" xmlns:r="http://schemas.openxmlformats.org/officeDocument/2006/relationships" xmlns:m="http://schemas.openxmlformats.org/officeDocument/2006/math" xmlns:v="urn:schemas-microsoft-com:vml" xmlns:wp14="http://schemas.microsoft.com/office/word/2010/wordprocessingDrawing" xmlns:wp="http://schemas.openxmlformats.org/drawingml/2006/wordprocessingDrawing" xmlns:w10="urn:schemas-microsoft-com:office:word" xmlns:w="http://schemas.openxmlformats.org/wordprocessingml/2006/main" xmlns:w14="http://schemas.microsoft.com/office/word/2010/wordml" xmlns:w15="http://schemas.microsoft.com/office/word/2012/wordml" xmlns:w16cex="http://schemas.microsoft.com/office/word/2018/wordml/cex" xmlns:w16cid="http://schemas.microsoft.com/office/word/2016/wordml/cid" xmlns:w16="http://schemas.microsoft.com/office/word/2018/wordml" xmlns:w16du="http://schemas.microsoft.com/office/word/2023/wordml/word16du" xmlns:w16sdtdh="http://schemas.microsoft.com/office/word/2020/wordml/sdtdatahash" xmlns:w16sdtfl="http://schemas.microsoft.com/office/word/2024/wordml/sdtformatlock" xmlns:w16se="http://schemas.microsoft.com/office/word/2015/wordml/symex" xmlns:wpg="http://schemas.microsoft.com/office/word/2010/wordprocessingGroup" xmlns:wpi="http://schemas.microsoft.com/office/word/2010/wordprocessingInk" xmlns:wne="http://schemas.microsoft.com/office/word/2006/wordml" xmlns:wps="http://schemas.microsoft.com/office/word/2010/wordprocessingShape" mc:Ignorable="w14 w15 w16se w16cid w16 w16cex w16sdtdh w16sdtfl w16du wp14">
+<w:document xmlns:wpc="http://schemas.microsoft.com/office/word/2010/wordprocessingCanvas" xmlns:cx="http://schemas.microsoft.com/office/drawing/2014/chartex" xmlns:cx1="http://schemas.microsoft.com/office/drawing/2015/9/8/chartex" xmlns:cx2="http://schemas.microsoft.com/office/drawing/2015/10/21/chartex" xmlns:cx3="http://schemas.microsoft.com/office/drawing/2016/5/9/chartex" xmlns:cx4="http://schemas.microsoft.com/office/drawing/2016/5/10/chartex" xmlns:cx5="http://schemas.microsoft.com/office/drawing/2016/5/11/chartex" xmlns:cx6="http://schemas.microsoft.com/office/drawing/2016/5/12/chartex" xmlns:cx7="http://schemas.microsoft.com/office/drawing/2016/5/13/chartex" xmlns:cx8="http://schemas.microsoft.com/office/drawing/2016/5/14/chartex" xmlns:mc="http://schemas.openxmlformats.org/markup-compatibility/2006" xmlns:aink="http://schemas.microsoft.com/office/drawing/2016/ink" xmlns:am3d="http://schemas.microsoft.com/office/drawing/2017/model3d" xmlns:o="urn:schemas-microsoft-com:office:office" xmlns:oel="http://schemas.microsoft.com/office/2019/extlst" xmlns:r="http://schemas.openxmlformats.org/officeDocument/2006/relationships" xmlns:m="http://schemas.openxmlformats.org/officeDocument/2006/math" xmlns:v="urn:schemas-microsoft-com:vml" xmlns:wp14="http://schemas.microsoft.com/office/word/2010/wordprocessingDrawing" xmlns:wp="http://schemas.openxmlformats.org/drawingml/2006/wordprocessingDrawing" xmlns:w10="urn:schemas-microsoft-com:office:word" xmlns:w="http://schemas.openxmlformats.org/wordprocessingml/2006/main" xmlns:w14="http://schemas.microsoft.com/office/word/2010/wordml" xmlns:w15="http://schemas.microsoft.com/office/word/2012/wordml" xmlns:w16cei="http://schemas.microsoft.com/office/word/2026/wordml/cei" xmlns:w16cex="http://schemas.microsoft.com/office/word/2018/wordml/cex" xmlns:w16cid="http://schemas.microsoft.com/office/word/2016/wordml/cid" xmlns:w16="http://schemas.microsoft.com/office/word/2018/wordml" xmlns:w16du="http://schemas.microsoft.com/office/word/2023/wordml/word16du" xmlns:w16sdtdh="http://schemas.microsoft.com/office/word/2020/wordml/sdtdatahash" xmlns:w16sdtfl="http://schemas.microsoft.com/office/word/2024/wordml/sdtformatlock" xmlns:w16se="http://schemas.microsoft.com/office/word/2015/wordml/symex" xmlns:wpg="http://schemas.microsoft.com/office/word/2010/wordprocessingGroup" xmlns:wpi="http://schemas.microsoft.com/office/word/2010/wordprocessingInk" xmlns:wne="http://schemas.microsoft.com/office/word/2006/wordml" xmlns:wps="http://schemas.microsoft.com/office/word/2010/wordprocessingShape" mc:Ignorable="w14 w15 w16se w16cid w16 w16cex w16sdtdh w16sdtfl w16du wp14">
   <w:body>
     <w:p>
       <w:r>
@@ -3237,72 +3237,12 @@
       </w:r>
     </w:p>
     <w:p>
-      <w:r>
-        <w:t>Refresh failed: Extraction failed: Error: Error: Frame with ID 0 is showing error page</w:t>
-      </w:r>
-    </w:p>
-    <w:p>
-      <w:pPr>
-        <w:rPr>
-          <w:b/>
-          <w:bCs/>
-        </w:rPr>
-      </w:pPr>
-      <w:r>
-        <w:rPr>
-          <w:b/>
-          <w:bCs/>
-        </w:rPr>
-        <w:t>AI Analysis</w:t>
-      </w:r>
-    </w:p>
-    <w:p>
-      <w:r>
-        <w:t>The current page is a blank browser tab, and no website is loaded. To proceed with the task of opening a SaaS website that offers a free account or free trial, I need to navigate to a suitable URL.</w:t>
-      </w:r>
-    </w:p>
-    <w:p>
-      <w:r>
-        <w:rPr>
-          <w:rFonts w:ascii="Segoe UI Symbol" w:hAnsi="Segoe UI Symbol" w:cs="Segoe UI Symbol"/>
-          <w:b/>
-          <w:bCs/>
-        </w:rPr>
-        <w:t>✗</w:t>
-      </w:r>
-    </w:p>
-    <w:p>
-      <w:r>
-        <w:rPr>
-          <w:b/>
-          <w:bCs/>
-        </w:rPr>
-        <w:t>Step 1NAVIGATE</w:t>
-      </w:r>
-      <w:r>
-        <w:t xml:space="preserve">This action navigates to a SaaS website that offers a free account or free </w:t>
-      </w:r>
-      <w:proofErr w:type="spellStart"/>
-      <w:proofErr w:type="gramStart"/>
-      <w:r>
-        <w:t>trial.</w:t>
-      </w:r>
-      <w:r>
-        <w:rPr>
-          <w:i/>
-          <w:iCs/>
-        </w:rPr>
-        <w:t>Could</w:t>
-      </w:r>
-      <w:proofErr w:type="spellEnd"/>
-      <w:proofErr w:type="gramEnd"/>
-      <w:r>
-        <w:rPr>
-          <w:i/>
-          <w:iCs/>
-        </w:rPr>
-        <w:t xml:space="preserve"> not verify page progress after navigate: Extraction failed: Error: Error: Frame with ID 0 is showing error page</w:t>
-      </w:r>
+      <w:pPr>
+        <w:rPr>
+          <w:b/>
+          <w:bCs/>
+        </w:rPr>
+      </w:pPr>
     </w:p>
     <w:p>
       <w:pPr>
@@ -3345,105 +3285,109 @@
     </w:p>
     <w:p>
       <w:r>
+        <w:t>Then:</w:t>
+      </w:r>
+    </w:p>
+    <w:p>
+      <w:r>
+        <w:t>1. Confirm the file was accepted.</w:t>
+      </w:r>
+    </w:p>
+    <w:p>
+      <w:r>
+        <w:t>2. Find where the uploaded file appears.</w:t>
+      </w:r>
+    </w:p>
+    <w:p>
+      <w:r>
+        <w:t>3. If the site provides a share link or processing result, copy it.</w:t>
+      </w:r>
+    </w:p>
+    <w:p>
+      <w:r>
+        <w:t>4. Return the result with the exact page path and any visible status text.</w:t>
+      </w:r>
+    </w:p>
+    <w:p/>
+    <w:p>
+      <w:pPr>
+        <w:rPr>
+          <w:b/>
+          <w:bCs/>
+        </w:rPr>
+      </w:pPr>
+      <w:r>
+        <w:rPr>
+          <w:b/>
+          <w:bCs/>
+        </w:rPr>
+        <w:t>9) Real data entry with validation</w:t>
+      </w:r>
+    </w:p>
+    <w:p>
+      <w:r>
+        <w:rPr>
+          <w:b/>
+          <w:bCs/>
+        </w:rPr>
         <w:lastRenderedPageBreak/>
+        <w:t>Prompt:</w:t>
+      </w:r>
+    </w:p>
+    <w:p>
+      <w:r>
+        <w:t>text</w:t>
+      </w:r>
+    </w:p>
+    <w:p>
+      <w:r>
+        <w:t>Open a real government, university, or company form that is publicly accessible and safe to use with test data.</w:t>
+      </w:r>
+    </w:p>
+    <w:p>
+      <w:r>
+        <w:t>Fill the form with clearly fake test data, but make it look realistic.</w:t>
+      </w:r>
+    </w:p>
+    <w:p>
+      <w:r>
         <w:t>Then:</w:t>
       </w:r>
     </w:p>
     <w:p>
       <w:r>
-        <w:t>1. Confirm the file was accepted.</w:t>
-      </w:r>
-    </w:p>
-    <w:p>
-      <w:r>
-        <w:t>2. Find where the uploaded file appears.</w:t>
-      </w:r>
-    </w:p>
-    <w:p>
-      <w:r>
-        <w:t>3. If the site provides a share link or processing result, copy it.</w:t>
-      </w:r>
-    </w:p>
-    <w:p>
-      <w:r>
-        <w:t>4. Return the result with the exact page path and any visible status text.</w:t>
-      </w:r>
-    </w:p>
-    <w:p>
-      <w:pPr>
-        <w:rPr>
-          <w:b/>
-          <w:bCs/>
-        </w:rPr>
-      </w:pPr>
-      <w:r>
-        <w:rPr>
-          <w:b/>
-          <w:bCs/>
-        </w:rPr>
-        <w:t>AI Analysis</w:t>
-      </w:r>
-    </w:p>
-    <w:p>
-      <w:r>
-        <w:t>The current page is the 'Example Domain', which does not allow file uploads. The previous attempt to navigate to a file upload site was unsuccessful. Therefore, I need to find a new website that allows file uploads. Replan reason: The current approach is not working as the 'Example Domain' does not support file uploads. A different strategy is needed to find a suitable website.</w:t>
-      </w:r>
-    </w:p>
-    <w:p>
-      <w:r>
-        <w:rPr>
-          <w:rFonts w:ascii="Segoe UI Emoji" w:hAnsi="Segoe UI Emoji" w:cs="Segoe UI Emoji"/>
-          <w:b/>
-          <w:bCs/>
-        </w:rPr>
-        <w:t>⚡</w:t>
-      </w:r>
-    </w:p>
-    <w:p>
-      <w:r>
-        <w:rPr>
-          <w:b/>
-          <w:bCs/>
-        </w:rPr>
-        <w:t>Step 1NAVIGATE</w:t>
-      </w:r>
-      <w:r>
-        <w:t>Navigate to a website that allows file uploads.</w:t>
-      </w:r>
-    </w:p>
-    <w:p>
-      <w:pPr>
-        <w:rPr>
-          <w:b/>
-          <w:bCs/>
-        </w:rPr>
-      </w:pPr>
-      <w:r>
-        <w:rPr>
-          <w:b/>
-          <w:bCs/>
-        </w:rPr>
-        <w:t>Planner requested replan</w:t>
-      </w:r>
-    </w:p>
-    <w:p>
-      <w:r>
-        <w:t>The current approach is not working as the 'Example Domain' does not support file uploads. A different strategy is needed to find a suitable website.</w:t>
-      </w:r>
-    </w:p>
-    <w:p>
-      <w:pPr>
-        <w:rPr>
-          <w:b/>
-          <w:bCs/>
-        </w:rPr>
-      </w:pPr>
-      <w:r>
-        <w:rPr>
-          <w:b/>
-          <w:bCs/>
-        </w:rPr>
-        <w:t>9) Real data entry with validation</w:t>
+        <w:t>1. Check whether the form shows validation errors.</w:t>
+      </w:r>
+    </w:p>
+    <w:p>
+      <w:r>
+        <w:t>2. Fix any errors the page reports.</w:t>
+      </w:r>
+    </w:p>
+    <w:p>
+      <w:r>
+        <w:t>3. Submit only if it is a genuine test or sandbox form.</w:t>
+      </w:r>
+    </w:p>
+    <w:p>
+      <w:r>
+        <w:t>4. Report the validation rules you encountered and whether submission succeeded.</w:t>
+      </w:r>
+    </w:p>
+    <w:p/>
+    <w:p>
+      <w:pPr>
+        <w:rPr>
+          <w:b/>
+          <w:bCs/>
+        </w:rPr>
+      </w:pPr>
+      <w:r>
+        <w:rPr>
+          <w:b/>
+          <w:bCs/>
+        </w:rPr>
+        <w:t>10) Complex multi-step research and output</w:t>
       </w:r>
     </w:p>
     <w:p>
@@ -3462,136 +3406,6 @@
     </w:p>
     <w:p>
       <w:r>
-        <w:t>Open a real government, university, or company form that is publicly accessible and safe to use with test data.</w:t>
-      </w:r>
-    </w:p>
-    <w:p>
-      <w:r>
-        <w:t>Fill the form with clearly fake test data, but make it look realistic.</w:t>
-      </w:r>
-    </w:p>
-    <w:p>
-      <w:r>
-        <w:t>Then:</w:t>
-      </w:r>
-    </w:p>
-    <w:p>
-      <w:r>
-        <w:t>1. Check whether the form shows validation errors.</w:t>
-      </w:r>
-    </w:p>
-    <w:p>
-      <w:r>
-        <w:t>2. Fix any errors the page reports.</w:t>
-      </w:r>
-    </w:p>
-    <w:p>
-      <w:r>
-        <w:t>3. Submit only if it is a genuine test or sandbox form.</w:t>
-      </w:r>
-    </w:p>
-    <w:p>
-      <w:r>
-        <w:t>4. Report the validation rules you encountered and whether submission succeeded.</w:t>
-      </w:r>
-    </w:p>
-    <w:p>
-      <w:pPr>
-        <w:rPr>
-          <w:b/>
-          <w:bCs/>
-        </w:rPr>
-      </w:pPr>
-      <w:r>
-        <w:rPr>
-          <w:b/>
-          <w:bCs/>
-        </w:rPr>
-        <w:t>AI Analysis</w:t>
-      </w:r>
-    </w:p>
-    <w:p>
-      <w:r>
-        <w:t xml:space="preserve">The current page is the Example Domain, which does not contain any links to real government, university, or company forms. The previous navigation attempt did not yield </w:t>
-      </w:r>
-      <w:r>
-        <w:lastRenderedPageBreak/>
-        <w:t>the intended results. Therefore, I need to find a new source for accessing a valid form. Replan reason: The current page does not provide access to any real forms. A different approach is needed to find a publicly accessible form.</w:t>
-      </w:r>
-    </w:p>
-    <w:p>
-      <w:r>
-        <w:rPr>
-          <w:rFonts w:ascii="Segoe UI Emoji" w:hAnsi="Segoe UI Emoji" w:cs="Segoe UI Emoji"/>
-          <w:b/>
-          <w:bCs/>
-        </w:rPr>
-        <w:t>⚡</w:t>
-      </w:r>
-    </w:p>
-    <w:p>
-      <w:r>
-        <w:rPr>
-          <w:b/>
-          <w:bCs/>
-        </w:rPr>
-        <w:t>Step 1NAVIGATE</w:t>
-      </w:r>
-      <w:r>
-        <w:t>This action navigates to Example Domain, which may provide links to government or company forms.</w:t>
-      </w:r>
-    </w:p>
-    <w:p>
-      <w:pPr>
-        <w:rPr>
-          <w:b/>
-          <w:bCs/>
-        </w:rPr>
-      </w:pPr>
-      <w:r>
-        <w:rPr>
-          <w:b/>
-          <w:bCs/>
-        </w:rPr>
-        <w:t>Planner requested replan</w:t>
-      </w:r>
-    </w:p>
-    <w:p>
-      <w:r>
-        <w:t>The current page does not provide access to any real forms. A different approach is needed to find a publicly accessible form.</w:t>
-      </w:r>
-    </w:p>
-    <w:p>
-      <w:pPr>
-        <w:rPr>
-          <w:b/>
-          <w:bCs/>
-        </w:rPr>
-      </w:pPr>
-      <w:r>
-        <w:rPr>
-          <w:b/>
-          <w:bCs/>
-        </w:rPr>
-        <w:t>10) Complex multi-step research and output</w:t>
-      </w:r>
-    </w:p>
-    <w:p>
-      <w:r>
-        <w:rPr>
-          <w:b/>
-          <w:bCs/>
-        </w:rPr>
-        <w:t>Prompt:</w:t>
-      </w:r>
-    </w:p>
-    <w:p>
-      <w:r>
-        <w:t>text</w:t>
-      </w:r>
-    </w:p>
-    <w:p>
-      <w:r>
         <w:t>Use Google Search and official websites to research:</w:t>
       </w:r>
     </w:p>
@@ -3630,300 +3444,8 @@
         <w:t>5. Cite the source URL next to each line.</w:t>
       </w:r>
     </w:p>
-    <w:p>
-      <w:r>
-        <w:br/>
-      </w:r>
-      <w:r>
-        <w:t>Analysis failed: [object Object]</w:t>
-      </w:r>
-    </w:p>
-    <w:p>
-      <w:pPr>
-        <w:rPr>
-          <w:b/>
-          <w:bCs/>
-        </w:rPr>
-      </w:pPr>
-      <w:r>
-        <w:rPr>
-          <w:b/>
-          <w:bCs/>
-        </w:rPr>
-        <w:t>AI Analysis</w:t>
-      </w:r>
-    </w:p>
-    <w:p>
-      <w:r>
-        <w:t>The task is currently blocked due to previous attempts to open sources that did not yield the expected results. To proceed, I will open a different source that is visible and relevant to the research goal.</w:t>
-      </w:r>
-    </w:p>
-    <w:p>
-      <w:r>
-        <w:rPr>
-          <w:rFonts w:ascii="Segoe UI Symbol" w:hAnsi="Segoe UI Symbol" w:cs="Segoe UI Symbol"/>
-          <w:b/>
-          <w:bCs/>
-        </w:rPr>
-        <w:t>✗</w:t>
-      </w:r>
-    </w:p>
-    <w:p>
-      <w:r>
-        <w:rPr>
-          <w:b/>
-          <w:bCs/>
-        </w:rPr>
-        <w:t>Step 1FILL</w:t>
-      </w:r>
-      <w:r>
-        <w:t xml:space="preserve">This action fills the Google search input with the query for AI browser automation testing best </w:t>
-      </w:r>
-      <w:proofErr w:type="spellStart"/>
-      <w:proofErr w:type="gramStart"/>
-      <w:r>
-        <w:t>practices.</w:t>
-      </w:r>
-      <w:r>
-        <w:rPr>
-          <w:i/>
-          <w:iCs/>
-        </w:rPr>
-        <w:t>Cannot</w:t>
-      </w:r>
-      <w:proofErr w:type="spellEnd"/>
-      <w:proofErr w:type="gramEnd"/>
-      <w:r>
-        <w:rPr>
-          <w:i/>
-          <w:iCs/>
-        </w:rPr>
-        <w:t xml:space="preserve"> execute on this page. Navigate to a regular webpage.</w:t>
-      </w:r>
-    </w:p>
-    <w:p>
-      <w:r>
-        <w:rPr>
-          <w:rFonts w:ascii="Segoe UI Emoji" w:hAnsi="Segoe UI Emoji" w:cs="Segoe UI Emoji"/>
-          <w:b/>
-          <w:bCs/>
-        </w:rPr>
-        <w:t>⚡</w:t>
-      </w:r>
-    </w:p>
-    <w:p>
-      <w:r>
-        <w:rPr>
-          <w:b/>
-          <w:bCs/>
-        </w:rPr>
-        <w:lastRenderedPageBreak/>
-        <w:t>Step 2NAVIGATE</w:t>
-      </w:r>
-      <w:r>
-        <w:t>This action opens Google Search to begin the research.</w:t>
-      </w:r>
-    </w:p>
-    <w:p>
-      <w:r>
-        <w:rPr>
-          <w:rFonts w:ascii="Segoe UI Emoji" w:hAnsi="Segoe UI Emoji" w:cs="Segoe UI Emoji"/>
-          <w:b/>
-          <w:bCs/>
-        </w:rPr>
-        <w:t>⚡</w:t>
-      </w:r>
-    </w:p>
-    <w:p>
-      <w:r>
-        <w:rPr>
-          <w:b/>
-          <w:bCs/>
-        </w:rPr>
-        <w:t>Step 3FILL</w:t>
-      </w:r>
-      <w:r>
-        <w:t>Fills the Google search input with the query for AI browser automation testing best practices.</w:t>
-      </w:r>
-    </w:p>
-    <w:p>
-      <w:r>
-        <w:rPr>
-          <w:rFonts w:ascii="Segoe UI Emoji" w:hAnsi="Segoe UI Emoji" w:cs="Segoe UI Emoji"/>
-          <w:b/>
-          <w:bCs/>
-        </w:rPr>
-        <w:t>⚡</w:t>
-      </w:r>
-    </w:p>
-    <w:p>
-      <w:r>
-        <w:rPr>
-          <w:b/>
-          <w:bCs/>
-        </w:rPr>
-        <w:t>Step 4CLICK</w:t>
-      </w:r>
-      <w:r>
-        <w:t>Click the Google Search button to execute the search for AI browser automation testing best practices.</w:t>
-      </w:r>
-    </w:p>
-    <w:p>
-      <w:r>
-        <w:rPr>
-          <w:rFonts w:ascii="Segoe UI Emoji" w:hAnsi="Segoe UI Emoji" w:cs="Segoe UI Emoji"/>
-          <w:b/>
-          <w:bCs/>
-        </w:rPr>
-        <w:t>⚡</w:t>
-      </w:r>
-    </w:p>
-    <w:p>
-      <w:r>
-        <w:rPr>
-          <w:b/>
-          <w:bCs/>
-        </w:rPr>
-        <w:t>Step 5CLICK</w:t>
-      </w:r>
-      <w:r>
-        <w:t>Open the source titled 'Top 9 Browser Automation Tools for Web Testing and ...</w:t>
-      </w:r>
-      <w:proofErr w:type="spellStart"/>
-      <w:r>
-        <w:t>Firecrawl</w:t>
-      </w:r>
-      <w:proofErr w:type="spellEnd"/>
-      <w:r>
-        <w:t>' to extract recommended testing practices.</w:t>
-      </w:r>
-    </w:p>
-    <w:p>
-      <w:r>
-        <w:rPr>
-          <w:rFonts w:ascii="Segoe UI Emoji" w:hAnsi="Segoe UI Emoji" w:cs="Segoe UI Emoji"/>
-          <w:b/>
-          <w:bCs/>
-        </w:rPr>
-        <w:t>⚡</w:t>
-      </w:r>
-    </w:p>
-    <w:p>
-      <w:r>
-        <w:rPr>
-          <w:b/>
-          <w:bCs/>
-        </w:rPr>
-        <w:t>Step 6CLICK</w:t>
-      </w:r>
-      <w:r>
-        <w:t xml:space="preserve">Opens the source titled 'The best </w:t>
-      </w:r>
-      <w:proofErr w:type="gramStart"/>
-      <w:r>
-        <w:t>open source</w:t>
-      </w:r>
-      <w:proofErr w:type="gramEnd"/>
-      <w:r>
-        <w:t xml:space="preserve"> frameworks for building AI agents in 2026' to gather more information on AI browser automation testing best practices.</w:t>
-      </w:r>
-    </w:p>
-    <w:p>
-      <w:r>
-        <w:rPr>
-          <w:rFonts w:ascii="Segoe UI Emoji" w:hAnsi="Segoe UI Emoji" w:cs="Segoe UI Emoji"/>
-          <w:b/>
-          <w:bCs/>
-        </w:rPr>
-        <w:t>⚡</w:t>
-      </w:r>
-    </w:p>
-    <w:p>
-      <w:r>
-        <w:rPr>
-          <w:b/>
-          <w:bCs/>
-        </w:rPr>
-        <w:t>Step 7CLICK</w:t>
-      </w:r>
-      <w:r>
-        <w:t xml:space="preserve">Opens the source titled 'The best </w:t>
-      </w:r>
-      <w:proofErr w:type="gramStart"/>
-      <w:r>
-        <w:t>open source</w:t>
-      </w:r>
-      <w:proofErr w:type="gramEnd"/>
-      <w:r>
-        <w:t xml:space="preserve"> frameworks for building AI agents in 2026' to gather more information on AI browser automation testing best practices.</w:t>
-      </w:r>
-    </w:p>
-    <w:p>
-      <w:r>
-        <w:rPr>
-          <w:rFonts w:ascii="Segoe UI Emoji" w:hAnsi="Segoe UI Emoji" w:cs="Segoe UI Emoji"/>
-          <w:b/>
-          <w:bCs/>
-        </w:rPr>
-        <w:t>⚡</w:t>
-      </w:r>
-    </w:p>
-    <w:p>
-      <w:r>
-        <w:rPr>
-          <w:b/>
-          <w:bCs/>
-        </w:rPr>
-        <w:t>Step 8CLICK</w:t>
-      </w:r>
-      <w:r>
-        <w:t>Open the source titled 'Top 7 AI-Powered Web Scraping Solutions in 2026' to gather more information on AI browser automation testing best practices.</w:t>
-      </w:r>
-    </w:p>
-    <w:p>
-      <w:r>
-        <w:rPr>
-          <w:rFonts w:ascii="Segoe UI Emoji" w:hAnsi="Segoe UI Emoji" w:cs="Segoe UI Emoji"/>
-          <w:b/>
-          <w:bCs/>
-        </w:rPr>
-        <w:t>⚡</w:t>
-      </w:r>
-    </w:p>
-    <w:p>
-      <w:r>
-        <w:rPr>
-          <w:b/>
-          <w:bCs/>
-        </w:rPr>
-        <w:t>Step 9CLICK</w:t>
-      </w:r>
-      <w:r>
-        <w:t>Open the source titled 'Top 7 AI-Powered Web Scraping Solutions in 2026' to gather more information on AI browser automation testing best practices.</w:t>
-      </w:r>
-    </w:p>
-    <w:p>
-      <w:r>
-        <w:rPr>
-          <w:rFonts w:ascii="Segoe UI Emoji" w:hAnsi="Segoe UI Emoji" w:cs="Segoe UI Emoji"/>
-          <w:b/>
-          <w:bCs/>
-        </w:rPr>
-        <w:t>⚡</w:t>
-      </w:r>
-    </w:p>
-    <w:p>
-      <w:r>
-        <w:rPr>
-          <w:b/>
-          <w:bCs/>
-        </w:rPr>
-        <w:t>Step 10CLICK</w:t>
-      </w:r>
-      <w:r>
-        <w:t>Opens the source titled 'Top 7 AI-Powered Web Scraping Solutions in 2026' to gather more information on AI browser automation testing best practices.</w:t>
-      </w:r>
-    </w:p>
+    <w:p/>
+    <w:p/>
     <w:p>
       <w:r>
         <w:br/>
@@ -5019,55 +4541,272 @@
       </w:r>
       <w:proofErr w:type="spellEnd"/>
       <w:r>
+        <w:t xml:space="preserve"> i have shared with you but in them </w:t>
+      </w:r>
+      <w:proofErr w:type="spellStart"/>
+      <w:r>
+        <w:t>i'm</w:t>
+      </w:r>
+      <w:proofErr w:type="spellEnd"/>
+      <w:r>
+        <w:t xml:space="preserve"> working form 1 week to complete the 1st task but still we couldn't and even if </w:t>
+      </w:r>
+      <w:proofErr w:type="spellStart"/>
+      <w:r>
+        <w:t>i</w:t>
+      </w:r>
+      <w:proofErr w:type="spellEnd"/>
+      <w:r>
+        <w:t xml:space="preserve"> solve the 1 task again </w:t>
+      </w:r>
+      <w:proofErr w:type="spellStart"/>
+      <w:r>
+        <w:t>i</w:t>
+      </w:r>
+      <w:proofErr w:type="spellEnd"/>
+      <w:r>
+        <w:t xml:space="preserve"> have to </w:t>
+      </w:r>
+      <w:proofErr w:type="spellStart"/>
+      <w:r>
+        <w:t>workout</w:t>
+      </w:r>
+      <w:proofErr w:type="spellEnd"/>
+      <w:r>
+        <w:t xml:space="preserve"> with the remaining 9 </w:t>
+      </w:r>
+      <w:proofErr w:type="spellStart"/>
+      <w:r>
+        <w:t>taks</w:t>
+      </w:r>
+      <w:proofErr w:type="spellEnd"/>
+      <w:r>
+        <w:t xml:space="preserve"> ok let it me even after completing that 9 tasks is that we don't get any issues or we don't stuck on any other new tasks which are </w:t>
+      </w:r>
+    </w:p>
+    <w:p>
+      <w:r>
+        <w:br w:type="page"/>
+      </w:r>
+    </w:p>
+    <w:p>
+      <w:proofErr w:type="spellStart"/>
+      <w:r>
+        <w:lastRenderedPageBreak/>
+        <w:t>yaa</w:t>
+      </w:r>
+      <w:proofErr w:type="spellEnd"/>
+      <w:r>
+        <w:t xml:space="preserve"> you are right</w:t>
+      </w:r>
+    </w:p>
+    <w:p>
+      <w:r>
+        <w:t>we are building Type 2 application</w:t>
+      </w:r>
+    </w:p>
+    <w:p>
+      <w:pPr>
+        <w:numPr>
+          <w:ilvl w:val="0"/>
+          <w:numId w:val="17"/>
+        </w:numPr>
+      </w:pPr>
+      <w:r>
+        <w:t>Browser automation agents / extension-first assistants</w:t>
+      </w:r>
+    </w:p>
+    <w:p>
+      <w:r>
+        <w:t>These sit on top of Chrome or remote browsers and automate tasks.</w:t>
+      </w:r>
+    </w:p>
+    <w:p>
+      <w:r>
+        <w:t>Browser Use: developer/agent framework for controlling browsers with LLMs. Strong for automation experiments, testing, scraping, and task execution.</w:t>
+      </w:r>
+    </w:p>
+    <w:p>
+      <w:proofErr w:type="spellStart"/>
+      <w:r>
+        <w:t>Skyvern</w:t>
+      </w:r>
+      <w:proofErr w:type="spellEnd"/>
+      <w:r>
+        <w:t xml:space="preserve"> / similar agents: more form/workflow automation oriented, often using computer vision plus DOM interaction.</w:t>
+      </w:r>
+    </w:p>
+    <w:p>
+      <w:r>
+        <w:t xml:space="preserve">Scraping/browser-agent tools: </w:t>
+      </w:r>
+      <w:proofErr w:type="spellStart"/>
+      <w:r>
+        <w:t>Scrapfly</w:t>
+      </w:r>
+      <w:proofErr w:type="spellEnd"/>
+      <w:r>
+        <w:t xml:space="preserve">, </w:t>
+      </w:r>
+      <w:proofErr w:type="spellStart"/>
+      <w:r>
+        <w:t>TinyFish</w:t>
+      </w:r>
+      <w:proofErr w:type="spellEnd"/>
+      <w:r>
+        <w:t xml:space="preserve">, </w:t>
+      </w:r>
+      <w:proofErr w:type="spellStart"/>
+      <w:r>
+        <w:t>Browserbase</w:t>
+      </w:r>
+      <w:proofErr w:type="spellEnd"/>
+      <w:r>
+        <w:t>-style stacks, etc. More infrastructure/API-first than consumer browser-first.</w:t>
+      </w:r>
+    </w:p>
+    <w:p>
+      <w:r>
+        <w:t xml:space="preserve">so before testing other </w:t>
+      </w:r>
+      <w:proofErr w:type="spellStart"/>
+      <w:r>
+        <w:t>taks</w:t>
+      </w:r>
+      <w:proofErr w:type="spellEnd"/>
+      <w:r>
         <w:t xml:space="preserve"> </w:t>
       </w:r>
+      <w:proofErr w:type="gramStart"/>
+      <w:r>
+        <w:t>first</w:t>
+      </w:r>
+      <w:proofErr w:type="gramEnd"/>
+      <w:r>
+        <w:t xml:space="preserve"> we will verify is that present application is capable of doing all the tasks and what tech </w:t>
+      </w:r>
       <w:proofErr w:type="spellStart"/>
       <w:r>
-        <w:t>i</w:t>
+        <w:t>staack</w:t>
       </w:r>
       <w:proofErr w:type="spellEnd"/>
       <w:r>
-        <w:t xml:space="preserve"> have shared with you but in them </w:t>
+        <w:t xml:space="preserve"> we have used and also you have </w:t>
       </w:r>
       <w:proofErr w:type="spellStart"/>
       <w:r>
-        <w:t>i'm</w:t>
+        <w:t>laready</w:t>
       </w:r>
       <w:proofErr w:type="spellEnd"/>
       <w:r>
-        <w:t xml:space="preserve"> working form 1 week to complete the 1st task but still we couldn't and even if </w:t>
+        <w:t xml:space="preserve"> mentioned </w:t>
+      </w:r>
+    </w:p>
+    <w:p>
+      <w:r>
+        <w:t xml:space="preserve">Browser Use, </w:t>
       </w:r>
       <w:proofErr w:type="spellStart"/>
       <w:r>
-        <w:t>i</w:t>
+        <w:rPr>
+          <w:b/>
+          <w:bCs/>
+        </w:rPr>
+        <w:t>Skyvern</w:t>
       </w:r>
       <w:proofErr w:type="spellEnd"/>
       <w:r>
-        <w:t xml:space="preserve"> solve the 1 task again </w:t>
+        <w:rPr>
+          <w:b/>
+          <w:bCs/>
+        </w:rPr>
+        <w:t xml:space="preserve"> / similar </w:t>
+      </w:r>
+      <w:proofErr w:type="gramStart"/>
+      <w:r>
+        <w:rPr>
+          <w:b/>
+          <w:bCs/>
+        </w:rPr>
+        <w:t>agents</w:t>
+      </w:r>
+      <w:r>
+        <w:t>:,</w:t>
+      </w:r>
+      <w:proofErr w:type="gramEnd"/>
+      <w:r>
+        <w:t xml:space="preserve"> </w:t>
+      </w:r>
+      <w:r>
+        <w:rPr>
+          <w:b/>
+          <w:bCs/>
+        </w:rPr>
+        <w:t>Scraping/browser-agent tools</w:t>
+      </w:r>
+      <w:r>
+        <w:t>:</w:t>
+      </w:r>
+    </w:p>
+    <w:p>
+      <w:r>
+        <w:t xml:space="preserve">is that we need to </w:t>
       </w:r>
       <w:proofErr w:type="spellStart"/>
       <w:r>
-        <w:t>i</w:t>
+        <w:t>implment</w:t>
       </w:r>
       <w:proofErr w:type="spellEnd"/>
       <w:r>
-        <w:t xml:space="preserve"> have to </w:t>
+        <w:t xml:space="preserve"> these also to reach our final goal because </w:t>
       </w:r>
       <w:proofErr w:type="spellStart"/>
       <w:r>
-        <w:t>workout</w:t>
+        <w:t>everytime</w:t>
       </w:r>
       <w:proofErr w:type="spellEnd"/>
       <w:r>
-        <w:t xml:space="preserve"> with the remaining 9 </w:t>
+        <w:t xml:space="preserve"> we are deviating and </w:t>
       </w:r>
       <w:proofErr w:type="spellStart"/>
       <w:r>
-        <w:t>taks</w:t>
+        <w:t>solveing</w:t>
       </w:r>
       <w:proofErr w:type="spellEnd"/>
       <w:r>
-        <w:t xml:space="preserve"> ok let it me even after completing that 9 tasks is that we don't get any issues or we don't stuck on any other new tasks which are </w:t>
+        <w:t xml:space="preserve"> only that </w:t>
+      </w:r>
+      <w:proofErr w:type="spellStart"/>
+      <w:r>
+        <w:t>partuclar</w:t>
+      </w:r>
+      <w:proofErr w:type="spellEnd"/>
+      <w:r>
+        <w:t xml:space="preserve"> problem and making our application bottleneck and narrow so first </w:t>
+      </w:r>
+      <w:proofErr w:type="spellStart"/>
+      <w:r>
+        <w:t>anlyze</w:t>
+      </w:r>
+      <w:proofErr w:type="spellEnd"/>
+      <w:r>
+        <w:t xml:space="preserve"> our </w:t>
+      </w:r>
+      <w:proofErr w:type="spellStart"/>
+      <w:r>
+        <w:t>blurprint</w:t>
+      </w:r>
+      <w:proofErr w:type="spellEnd"/>
+      <w:r>
+        <w:t xml:space="preserve"> and core </w:t>
+      </w:r>
+      <w:proofErr w:type="spellStart"/>
+      <w:r>
+        <w:t>architecure</w:t>
+      </w:r>
+      <w:proofErr w:type="spellEnd"/>
+      <w:r>
+        <w:t xml:space="preserve"> and compare with other similar application which are present in the market right now and we start building the core</w:t>
       </w:r>
     </w:p>
     <w:p/>
@@ -5082,7 +4821,7 @@
 </file>
 
 <file path=word/numbering.xml><?xml version="1.0" encoding="utf-8"?>
-<w:numbering xmlns:wpc="http://schemas.microsoft.com/office/word/2010/wordprocessingCanvas" xmlns:cx="http://schemas.microsoft.com/office/drawing/2014/chartex" xmlns:cx1="http://schemas.microsoft.com/office/drawing/2015/9/8/chartex" xmlns:cx2="http://schemas.microsoft.com/office/drawing/2015/10/21/chartex" xmlns:cx3="http://schemas.microsoft.com/office/drawing/2016/5/9/chartex" xmlns:cx4="http://schemas.microsoft.com/office/drawing/2016/5/10/chartex" xmlns:cx5="http://schemas.microsoft.com/office/drawing/2016/5/11/chartex" xmlns:cx6="http://schemas.microsoft.com/office/drawing/2016/5/12/chartex" xmlns:cx7="http://schemas.microsoft.com/office/drawing/2016/5/13/chartex" xmlns:cx8="http://schemas.microsoft.com/office/drawing/2016/5/14/chartex" xmlns:mc="http://schemas.openxmlformats.org/markup-compatibility/2006" xmlns:aink="http://schemas.microsoft.com/office/drawing/2016/ink" xmlns:am3d="http://schemas.microsoft.com/office/drawing/2017/model3d" xmlns:o="urn:schemas-microsoft-com:office:office" xmlns:oel="http://schemas.microsoft.com/office/2019/extlst" xmlns:r="http://schemas.openxmlformats.org/officeDocument/2006/relationships" xmlns:m="http://schemas.openxmlformats.org/officeDocument/2006/math" xmlns:v="urn:schemas-microsoft-com:vml" xmlns:wp14="http://schemas.microsoft.com/office/word/2010/wordprocessingDrawing" xmlns:wp="http://schemas.openxmlformats.org/drawingml/2006/wordprocessingDrawing" xmlns:w10="urn:schemas-microsoft-com:office:word" xmlns:w="http://schemas.openxmlformats.org/wordprocessingml/2006/main" xmlns:w14="http://schemas.microsoft.com/office/word/2010/wordml" xmlns:w15="http://schemas.microsoft.com/office/word/2012/wordml" xmlns:w16cex="http://schemas.microsoft.com/office/word/2018/wordml/cex" xmlns:w16cid="http://schemas.microsoft.com/office/word/2016/wordml/cid" xmlns:w16="http://schemas.microsoft.com/office/word/2018/wordml" xmlns:w16du="http://schemas.microsoft.com/office/word/2023/wordml/word16du" xmlns:w16sdtdh="http://schemas.microsoft.com/office/word/2020/wordml/sdtdatahash" xmlns:w16sdtfl="http://schemas.microsoft.com/office/word/2024/wordml/sdtformatlock" xmlns:w16se="http://schemas.microsoft.com/office/word/2015/wordml/symex" xmlns:wpg="http://schemas.microsoft.com/office/word/2010/wordprocessingGroup" xmlns:wpi="http://schemas.microsoft.com/office/word/2010/wordprocessingInk" xmlns:wne="http://schemas.microsoft.com/office/word/2006/wordml" xmlns:wps="http://schemas.microsoft.com/office/word/2010/wordprocessingShape" mc:Ignorable="w14 w15 w16se w16cid w16 w16cex w16sdtdh w16sdtfl w16du wp14">
+<w:numbering xmlns:wpc="http://schemas.microsoft.com/office/word/2010/wordprocessingCanvas" xmlns:cx="http://schemas.microsoft.com/office/drawing/2014/chartex" xmlns:cx1="http://schemas.microsoft.com/office/drawing/2015/9/8/chartex" xmlns:cx2="http://schemas.microsoft.com/office/drawing/2015/10/21/chartex" xmlns:cx3="http://schemas.microsoft.com/office/drawing/2016/5/9/chartex" xmlns:cx4="http://schemas.microsoft.com/office/drawing/2016/5/10/chartex" xmlns:cx5="http://schemas.microsoft.com/office/drawing/2016/5/11/chartex" xmlns:cx6="http://schemas.microsoft.com/office/drawing/2016/5/12/chartex" xmlns:cx7="http://schemas.microsoft.com/office/drawing/2016/5/13/chartex" xmlns:cx8="http://schemas.microsoft.com/office/drawing/2016/5/14/chartex" xmlns:mc="http://schemas.openxmlformats.org/markup-compatibility/2006" xmlns:aink="http://schemas.microsoft.com/office/drawing/2016/ink" xmlns:am3d="http://schemas.microsoft.com/office/drawing/2017/model3d" xmlns:o="urn:schemas-microsoft-com:office:office" xmlns:oel="http://schemas.microsoft.com/office/2019/extlst" xmlns:r="http://schemas.openxmlformats.org/officeDocument/2006/relationships" xmlns:m="http://schemas.openxmlformats.org/officeDocument/2006/math" xmlns:v="urn:schemas-microsoft-com:vml" xmlns:wp14="http://schemas.microsoft.com/office/word/2010/wordprocessingDrawing" xmlns:wp="http://schemas.openxmlformats.org/drawingml/2006/wordprocessingDrawing" xmlns:w10="urn:schemas-microsoft-com:office:word" xmlns:w="http://schemas.openxmlformats.org/wordprocessingml/2006/main" xmlns:w14="http://schemas.microsoft.com/office/word/2010/wordml" xmlns:w15="http://schemas.microsoft.com/office/word/2012/wordml" xmlns:w16cei="http://schemas.microsoft.com/office/word/2026/wordml/cei" xmlns:w16cex="http://schemas.microsoft.com/office/word/2018/wordml/cex" xmlns:w16cid="http://schemas.microsoft.com/office/word/2016/wordml/cid" xmlns:w16="http://schemas.microsoft.com/office/word/2018/wordml" xmlns:w16du="http://schemas.microsoft.com/office/word/2023/wordml/word16du" xmlns:w16sdtdh="http://schemas.microsoft.com/office/word/2020/wordml/sdtdatahash" xmlns:w16sdtfl="http://schemas.microsoft.com/office/word/2024/wordml/sdtformatlock" xmlns:w16se="http://schemas.microsoft.com/office/word/2015/wordml/symex" xmlns:wpg="http://schemas.microsoft.com/office/word/2010/wordprocessingGroup" xmlns:wpi="http://schemas.microsoft.com/office/word/2010/wordprocessingInk" xmlns:wne="http://schemas.microsoft.com/office/word/2006/wordml" xmlns:wps="http://schemas.microsoft.com/office/word/2010/wordprocessingShape" mc:Ignorable="w14 w15 w16se w16cid w16 w16cex w16sdtdh w16sdtfl w16du wp14">
   <w:abstractNum w:abstractNumId="0" w15:restartNumberingAfterBreak="0">
     <w:nsid w:val="06C606C9"/>
     <w:multiLevelType w:val="multilevel"/>
@@ -5233,6 +4972,119 @@
     </w:lvl>
   </w:abstractNum>
   <w:abstractNum w:abstractNumId="1" w15:restartNumberingAfterBreak="0">
+    <w:nsid w:val="10FC4EA4"/>
+    <w:multiLevelType w:val="multilevel"/>
+    <w:tmpl w:val="6CB61148"/>
+    <w:lvl w:ilvl="0">
+      <w:start w:val="2"/>
+      <w:numFmt w:val="decimal"/>
+      <w:lvlText w:val="%1."/>
+      <w:lvlJc w:val="left"/>
+      <w:pPr>
+        <w:tabs>
+          <w:tab w:val="num" w:pos="720"/>
+        </w:tabs>
+        <w:ind w:left="720" w:hanging="360"/>
+      </w:pPr>
+    </w:lvl>
+    <w:lvl w:ilvl="1" w:tentative="1">
+      <w:start w:val="1"/>
+      <w:numFmt w:val="decimal"/>
+      <w:lvlText w:val="%2."/>
+      <w:lvlJc w:val="left"/>
+      <w:pPr>
+        <w:tabs>
+          <w:tab w:val="num" w:pos="1440"/>
+        </w:tabs>
+        <w:ind w:left="1440" w:hanging="360"/>
+      </w:pPr>
+    </w:lvl>
+    <w:lvl w:ilvl="2" w:tentative="1">
+      <w:start w:val="1"/>
+      <w:numFmt w:val="decimal"/>
+      <w:lvlText w:val="%3."/>
+      <w:lvlJc w:val="left"/>
+      <w:pPr>
+        <w:tabs>
+          <w:tab w:val="num" w:pos="2160"/>
+        </w:tabs>
+        <w:ind w:left="2160" w:hanging="360"/>
+      </w:pPr>
+    </w:lvl>
+    <w:lvl w:ilvl="3" w:tentative="1">
+      <w:start w:val="1"/>
+      <w:numFmt w:val="decimal"/>
+      <w:lvlText w:val="%4."/>
+      <w:lvlJc w:val="left"/>
+      <w:pPr>
+        <w:tabs>
+          <w:tab w:val="num" w:pos="2880"/>
+        </w:tabs>
+        <w:ind w:left="2880" w:hanging="360"/>
+      </w:pPr>
+    </w:lvl>
+    <w:lvl w:ilvl="4" w:tentative="1">
+      <w:start w:val="1"/>
+      <w:numFmt w:val="decimal"/>
+      <w:lvlText w:val="%5."/>
+      <w:lvlJc w:val="left"/>
+      <w:pPr>
+        <w:tabs>
+          <w:tab w:val="num" w:pos="3600"/>
+        </w:tabs>
+        <w:ind w:left="3600" w:hanging="360"/>
+      </w:pPr>
+    </w:lvl>
+    <w:lvl w:ilvl="5" w:tentative="1">
+      <w:start w:val="1"/>
+      <w:numFmt w:val="decimal"/>
+      <w:lvlText w:val="%6."/>
+      <w:lvlJc w:val="left"/>
+      <w:pPr>
+        <w:tabs>
+          <w:tab w:val="num" w:pos="4320"/>
+        </w:tabs>
+        <w:ind w:left="4320" w:hanging="360"/>
+      </w:pPr>
+    </w:lvl>
+    <w:lvl w:ilvl="6" w:tentative="1">
+      <w:start w:val="1"/>
+      <w:numFmt w:val="decimal"/>
+      <w:lvlText w:val="%7."/>
+      <w:lvlJc w:val="left"/>
+      <w:pPr>
+        <w:tabs>
+          <w:tab w:val="num" w:pos="5040"/>
+        </w:tabs>
+        <w:ind w:left="5040" w:hanging="360"/>
+      </w:pPr>
+    </w:lvl>
+    <w:lvl w:ilvl="7" w:tentative="1">
+      <w:start w:val="1"/>
+      <w:numFmt w:val="decimal"/>
+      <w:lvlText w:val="%8."/>
+      <w:lvlJc w:val="left"/>
+      <w:pPr>
+        <w:tabs>
+          <w:tab w:val="num" w:pos="5760"/>
+        </w:tabs>
+        <w:ind w:left="5760" w:hanging="360"/>
+      </w:pPr>
+    </w:lvl>
+    <w:lvl w:ilvl="8" w:tentative="1">
+      <w:start w:val="1"/>
+      <w:numFmt w:val="decimal"/>
+      <w:lvlText w:val="%9."/>
+      <w:lvlJc w:val="left"/>
+      <w:pPr>
+        <w:tabs>
+          <w:tab w:val="num" w:pos="6480"/>
+        </w:tabs>
+        <w:ind w:left="6480" w:hanging="360"/>
+      </w:pPr>
+    </w:lvl>
+  </w:abstractNum>
+  <w:abstractNum w:abstractNumId="2" w15:restartNumberingAfterBreak="0">
     <w:nsid w:val="11A9257E"/>
     <w:multiLevelType w:val="multilevel"/>
     <w:tmpl w:val="298AE422"/>
@@ -5381,7 +5233,7 @@
       </w:rPr>
     </w:lvl>
   </w:abstractNum>
-  <w:abstractNum w:abstractNumId="2" w15:restartNumberingAfterBreak="0">
+  <w:abstractNum w:abstractNumId="3" w15:restartNumberingAfterBreak="0">
     <w:nsid w:val="15D672EF"/>
     <w:multiLevelType w:val="multilevel"/>
     <w:tmpl w:val="009A6BD8"/>
@@ -5530,7 +5382,7 @@
       </w:rPr>
     </w:lvl>
   </w:abstractNum>
-  <w:abstractNum w:abstractNumId="3" w15:restartNumberingAfterBreak="0">
+  <w:abstractNum w:abstractNumId="4" w15:restartNumberingAfterBreak="0">
     <w:nsid w:val="1CC7302B"/>
     <w:multiLevelType w:val="multilevel"/>
     <w:tmpl w:val="2D929C0A"/>
@@ -5679,7 +5531,7 @@
       </w:rPr>
     </w:lvl>
   </w:abstractNum>
-  <w:abstractNum w:abstractNumId="4" w15:restartNumberingAfterBreak="0">
+  <w:abstractNum w:abstractNumId="5" w15:restartNumberingAfterBreak="0">
     <w:nsid w:val="1CEE1BE7"/>
     <w:multiLevelType w:val="multilevel"/>
     <w:tmpl w:val="569E6FE0"/>
@@ -5828,7 +5680,7 @@
       </w:rPr>
     </w:lvl>
   </w:abstractNum>
-  <w:abstractNum w:abstractNumId="5" w15:restartNumberingAfterBreak="0">
+  <w:abstractNum w:abstractNumId="6" w15:restartNumberingAfterBreak="0">
     <w:nsid w:val="29F73589"/>
     <w:multiLevelType w:val="multilevel"/>
     <w:tmpl w:val="287EDDC2"/>
@@ -5977,7 +5829,7 @@
       </w:rPr>
     </w:lvl>
   </w:abstractNum>
-  <w:abstractNum w:abstractNumId="6" w15:restartNumberingAfterBreak="0">
+  <w:abstractNum w:abstractNumId="7" w15:restartNumberingAfterBreak="0">
     <w:nsid w:val="3A8828BE"/>
     <w:multiLevelType w:val="multilevel"/>
     <w:tmpl w:val="65D284D2"/>
@@ -6126,7 +5978,7 @@
       </w:rPr>
     </w:lvl>
   </w:abstractNum>
-  <w:abstractNum w:abstractNumId="7" w15:restartNumberingAfterBreak="0">
+  <w:abstractNum w:abstractNumId="8" w15:restartNumberingAfterBreak="0">
     <w:nsid w:val="3FC34CF7"/>
     <w:multiLevelType w:val="multilevel"/>
     <w:tmpl w:val="E5CC450C"/>
@@ -6275,7 +6127,7 @@
       </w:rPr>
     </w:lvl>
   </w:abstractNum>
-  <w:abstractNum w:abstractNumId="8" w15:restartNumberingAfterBreak="0">
+  <w:abstractNum w:abstractNumId="9" w15:restartNumberingAfterBreak="0">
     <w:nsid w:val="65011375"/>
     <w:multiLevelType w:val="multilevel"/>
     <w:tmpl w:val="2C54208A"/>
@@ -6424,7 +6276,7 @@
       </w:rPr>
     </w:lvl>
   </w:abstractNum>
-  <w:abstractNum w:abstractNumId="9" w15:restartNumberingAfterBreak="0">
+  <w:abstractNum w:abstractNumId="10" w15:restartNumberingAfterBreak="0">
     <w:nsid w:val="65D14F93"/>
     <w:multiLevelType w:val="multilevel"/>
     <w:tmpl w:val="1AB84EE4"/>
@@ -6573,7 +6425,7 @@
       </w:rPr>
     </w:lvl>
   </w:abstractNum>
-  <w:abstractNum w:abstractNumId="10" w15:restartNumberingAfterBreak="0">
+  <w:abstractNum w:abstractNumId="11" w15:restartNumberingAfterBreak="0">
     <w:nsid w:val="689159F2"/>
     <w:multiLevelType w:val="multilevel"/>
     <w:tmpl w:val="C2B05358"/>
@@ -6722,7 +6574,7 @@
       </w:rPr>
     </w:lvl>
   </w:abstractNum>
-  <w:abstractNum w:abstractNumId="11" w15:restartNumberingAfterBreak="0">
+  <w:abstractNum w:abstractNumId="12" w15:restartNumberingAfterBreak="0">
     <w:nsid w:val="6FAB4235"/>
     <w:multiLevelType w:val="multilevel"/>
     <w:tmpl w:val="679C3810"/>
@@ -6871,7 +6723,7 @@
       </w:rPr>
     </w:lvl>
   </w:abstractNum>
-  <w:abstractNum w:abstractNumId="12" w15:restartNumberingAfterBreak="0">
+  <w:abstractNum w:abstractNumId="13" w15:restartNumberingAfterBreak="0">
     <w:nsid w:val="70A07535"/>
     <w:multiLevelType w:val="multilevel"/>
     <w:tmpl w:val="678A6F5E"/>
@@ -7020,7 +6872,7 @@
       </w:rPr>
     </w:lvl>
   </w:abstractNum>
-  <w:abstractNum w:abstractNumId="13" w15:restartNumberingAfterBreak="0">
+  <w:abstractNum w:abstractNumId="14" w15:restartNumberingAfterBreak="0">
     <w:nsid w:val="77E84CDD"/>
     <w:multiLevelType w:val="multilevel"/>
     <w:tmpl w:val="E2929168"/>
@@ -7169,7 +7021,7 @@
       </w:rPr>
     </w:lvl>
   </w:abstractNum>
-  <w:abstractNum w:abstractNumId="14" w15:restartNumberingAfterBreak="0">
+  <w:abstractNum w:abstractNumId="15" w15:restartNumberingAfterBreak="0">
     <w:nsid w:val="7AFF4E9E"/>
     <w:multiLevelType w:val="multilevel"/>
     <w:tmpl w:val="834A37B0"/>
@@ -7318,7 +7170,7 @@
       </w:rPr>
     </w:lvl>
   </w:abstractNum>
-  <w:abstractNum w:abstractNumId="15" w15:restartNumberingAfterBreak="0">
+  <w:abstractNum w:abstractNumId="16" w15:restartNumberingAfterBreak="0">
     <w:nsid w:val="7E35134D"/>
     <w:multiLevelType w:val="multilevel"/>
     <w:tmpl w:val="4942BF4C"/>
@@ -7468,51 +7320,54 @@
     </w:lvl>
   </w:abstractNum>
   <w:num w:numId="1" w16cid:durableId="1707094719">
+    <w:abstractNumId w:val="15"/>
+  </w:num>
+  <w:num w:numId="2" w16cid:durableId="1947616606">
     <w:abstractNumId w:val="14"/>
   </w:num>
-  <w:num w:numId="2" w16cid:durableId="1947616606">
-    <w:abstractNumId w:val="13"/>
-  </w:num>
   <w:num w:numId="3" w16cid:durableId="540941206">
-    <w:abstractNumId w:val="11"/>
+    <w:abstractNumId w:val="12"/>
   </w:num>
   <w:num w:numId="4" w16cid:durableId="1492015741">
     <w:abstractNumId w:val="0"/>
   </w:num>
   <w:num w:numId="5" w16cid:durableId="75592928">
+    <w:abstractNumId w:val="6"/>
+  </w:num>
+  <w:num w:numId="6" w16cid:durableId="1576282035">
+    <w:abstractNumId w:val="3"/>
+  </w:num>
+  <w:num w:numId="7" w16cid:durableId="409816493">
+    <w:abstractNumId w:val="8"/>
+  </w:num>
+  <w:num w:numId="8" w16cid:durableId="1910580179">
+    <w:abstractNumId w:val="7"/>
+  </w:num>
+  <w:num w:numId="9" w16cid:durableId="1847284023">
+    <w:abstractNumId w:val="4"/>
+  </w:num>
+  <w:num w:numId="10" w16cid:durableId="10763270">
+    <w:abstractNumId w:val="10"/>
+  </w:num>
+  <w:num w:numId="11" w16cid:durableId="1882356390">
+    <w:abstractNumId w:val="11"/>
+  </w:num>
+  <w:num w:numId="12" w16cid:durableId="676152290">
+    <w:abstractNumId w:val="16"/>
+  </w:num>
+  <w:num w:numId="13" w16cid:durableId="1666863156">
+    <w:abstractNumId w:val="13"/>
+  </w:num>
+  <w:num w:numId="14" w16cid:durableId="798112398">
     <w:abstractNumId w:val="5"/>
   </w:num>
-  <w:num w:numId="6" w16cid:durableId="1576282035">
+  <w:num w:numId="15" w16cid:durableId="1657487143">
+    <w:abstractNumId w:val="9"/>
+  </w:num>
+  <w:num w:numId="16" w16cid:durableId="1067269044">
     <w:abstractNumId w:val="2"/>
   </w:num>
-  <w:num w:numId="7" w16cid:durableId="409816493">
-    <w:abstractNumId w:val="7"/>
-  </w:num>
-  <w:num w:numId="8" w16cid:durableId="1910580179">
-    <w:abstractNumId w:val="6"/>
-  </w:num>
-  <w:num w:numId="9" w16cid:durableId="1847284023">
-    <w:abstractNumId w:val="3"/>
-  </w:num>
-  <w:num w:numId="10" w16cid:durableId="10763270">
-    <w:abstractNumId w:val="9"/>
-  </w:num>
-  <w:num w:numId="11" w16cid:durableId="1882356390">
-    <w:abstractNumId w:val="10"/>
-  </w:num>
-  <w:num w:numId="12" w16cid:durableId="676152290">
-    <w:abstractNumId w:val="15"/>
-  </w:num>
-  <w:num w:numId="13" w16cid:durableId="1666863156">
-    <w:abstractNumId w:val="12"/>
-  </w:num>
-  <w:num w:numId="14" w16cid:durableId="798112398">
-    <w:abstractNumId w:val="4"/>
-  </w:num>
-  <w:num w:numId="15" w16cid:durableId="1657487143">
-    <w:abstractNumId w:val="8"/>
-  </w:num>
-  <w:num w:numId="16" w16cid:durableId="1067269044">
+  <w:num w:numId="17" w16cid:durableId="983923448">
     <w:abstractNumId w:val="1"/>
   </w:num>
 </w:numbering>

</xml_diff>

<commit_message>
Improve browser assistant workflows and UI
</commit_message>
<xml_diff>
--- a/15.docx
+++ b/15.docx
@@ -4809,6 +4809,134 @@
         <w:t xml:space="preserve"> and compare with other similar application which are present in the market right now and we start building the core</w:t>
       </w:r>
     </w:p>
+    <w:p>
+      <w:r>
+        <w:br w:type="page"/>
+      </w:r>
+    </w:p>
+    <w:p>
+      <w:r>
+        <w:lastRenderedPageBreak/>
+        <w:t>Current first milestone blockers are real capability gaps, not one-off task bugs:</w:t>
+      </w:r>
+    </w:p>
+    <w:p>
+      <w:pPr>
+        <w:numPr>
+          <w:ilvl w:val="0"/>
+          <w:numId w:val="18"/>
+        </w:numPr>
+      </w:pPr>
+      <w:proofErr w:type="spellStart"/>
+      <w:r>
+        <w:t>schema_extraction</w:t>
+      </w:r>
+      <w:proofErr w:type="spellEnd"/>
+    </w:p>
+    <w:p>
+      <w:pPr>
+        <w:numPr>
+          <w:ilvl w:val="0"/>
+          <w:numId w:val="18"/>
+        </w:numPr>
+      </w:pPr>
+      <w:proofErr w:type="spellStart"/>
+      <w:r>
+        <w:t>search_result_collection</w:t>
+      </w:r>
+      <w:proofErr w:type="spellEnd"/>
+    </w:p>
+    <w:p>
+      <w:pPr>
+        <w:numPr>
+          <w:ilvl w:val="0"/>
+          <w:numId w:val="18"/>
+        </w:numPr>
+      </w:pPr>
+      <w:proofErr w:type="spellStart"/>
+      <w:r>
+        <w:t>multi_tab_open_read</w:t>
+      </w:r>
+      <w:proofErr w:type="spellEnd"/>
+    </w:p>
+    <w:p>
+      <w:pPr>
+        <w:numPr>
+          <w:ilvl w:val="0"/>
+          <w:numId w:val="18"/>
+        </w:numPr>
+      </w:pPr>
+      <w:proofErr w:type="spellStart"/>
+      <w:r>
+        <w:t>job_board_semantics</w:t>
+      </w:r>
+      <w:proofErr w:type="spellEnd"/>
+    </w:p>
+    <w:p>
+      <w:pPr>
+        <w:numPr>
+          <w:ilvl w:val="0"/>
+          <w:numId w:val="18"/>
+        </w:numPr>
+      </w:pPr>
+      <w:proofErr w:type="spellStart"/>
+      <w:r>
+        <w:t>documentation_semantics</w:t>
+      </w:r>
+      <w:proofErr w:type="spellEnd"/>
+    </w:p>
+    <w:p>
+      <w:pPr>
+        <w:numPr>
+          <w:ilvl w:val="0"/>
+          <w:numId w:val="18"/>
+        </w:numPr>
+      </w:pPr>
+      <w:proofErr w:type="spellStart"/>
+      <w:r>
+        <w:t>directory_pagination</w:t>
+      </w:r>
+      <w:proofErr w:type="spellEnd"/>
+    </w:p>
+    <w:p>
+      <w:pPr>
+        <w:numPr>
+          <w:ilvl w:val="0"/>
+          <w:numId w:val="18"/>
+        </w:numPr>
+      </w:pPr>
+      <w:proofErr w:type="spellStart"/>
+      <w:r>
+        <w:t>safe_form_filling</w:t>
+      </w:r>
+      <w:proofErr w:type="spellEnd"/>
+    </w:p>
+    <w:p>
+      <w:pPr>
+        <w:numPr>
+          <w:ilvl w:val="0"/>
+          <w:numId w:val="18"/>
+        </w:numPr>
+      </w:pPr>
+      <w:proofErr w:type="spellStart"/>
+      <w:r>
+        <w:t>file_upload_broker</w:t>
+      </w:r>
+      <w:proofErr w:type="spellEnd"/>
+    </w:p>
+    <w:p>
+      <w:pPr>
+        <w:numPr>
+          <w:ilvl w:val="0"/>
+          <w:numId w:val="18"/>
+        </w:numPr>
+      </w:pPr>
+      <w:proofErr w:type="spellStart"/>
+      <w:r>
+        <w:t>saas_signup_policy</w:t>
+      </w:r>
+      <w:proofErr w:type="spellEnd"/>
+    </w:p>
     <w:p/>
     <w:sectPr>
       <w:pgSz w:w="11906" w:h="16838"/>
@@ -5234,6 +5362,155 @@
     </w:lvl>
   </w:abstractNum>
   <w:abstractNum w:abstractNumId="3" w15:restartNumberingAfterBreak="0">
+    <w:nsid w:val="151B6494"/>
+    <w:multiLevelType w:val="multilevel"/>
+    <w:tmpl w:val="94200D6C"/>
+    <w:lvl w:ilvl="0">
+      <w:start w:val="1"/>
+      <w:numFmt w:val="bullet"/>
+      <w:lvlText w:val=""/>
+      <w:lvlJc w:val="left"/>
+      <w:pPr>
+        <w:tabs>
+          <w:tab w:val="num" w:pos="720"/>
+        </w:tabs>
+        <w:ind w:left="720" w:hanging="360"/>
+      </w:pPr>
+      <w:rPr>
+        <w:rFonts w:ascii="Symbol" w:hAnsi="Symbol" w:hint="default"/>
+        <w:sz w:val="20"/>
+      </w:rPr>
+    </w:lvl>
+    <w:lvl w:ilvl="1" w:tentative="1">
+      <w:start w:val="1"/>
+      <w:numFmt w:val="bullet"/>
+      <w:lvlText w:val="o"/>
+      <w:lvlJc w:val="left"/>
+      <w:pPr>
+        <w:tabs>
+          <w:tab w:val="num" w:pos="1440"/>
+        </w:tabs>
+        <w:ind w:left="1440" w:hanging="360"/>
+      </w:pPr>
+      <w:rPr>
+        <w:rFonts w:ascii="Courier New" w:hAnsi="Courier New" w:hint="default"/>
+        <w:sz w:val="20"/>
+      </w:rPr>
+    </w:lvl>
+    <w:lvl w:ilvl="2" w:tentative="1">
+      <w:start w:val="1"/>
+      <w:numFmt w:val="bullet"/>
+      <w:lvlText w:val=""/>
+      <w:lvlJc w:val="left"/>
+      <w:pPr>
+        <w:tabs>
+          <w:tab w:val="num" w:pos="2160"/>
+        </w:tabs>
+        <w:ind w:left="2160" w:hanging="360"/>
+      </w:pPr>
+      <w:rPr>
+        <w:rFonts w:ascii="Wingdings" w:hAnsi="Wingdings" w:hint="default"/>
+        <w:sz w:val="20"/>
+      </w:rPr>
+    </w:lvl>
+    <w:lvl w:ilvl="3" w:tentative="1">
+      <w:start w:val="1"/>
+      <w:numFmt w:val="bullet"/>
+      <w:lvlText w:val=""/>
+      <w:lvlJc w:val="left"/>
+      <w:pPr>
+        <w:tabs>
+          <w:tab w:val="num" w:pos="2880"/>
+        </w:tabs>
+        <w:ind w:left="2880" w:hanging="360"/>
+      </w:pPr>
+      <w:rPr>
+        <w:rFonts w:ascii="Wingdings" w:hAnsi="Wingdings" w:hint="default"/>
+        <w:sz w:val="20"/>
+      </w:rPr>
+    </w:lvl>
+    <w:lvl w:ilvl="4" w:tentative="1">
+      <w:start w:val="1"/>
+      <w:numFmt w:val="bullet"/>
+      <w:lvlText w:val=""/>
+      <w:lvlJc w:val="left"/>
+      <w:pPr>
+        <w:tabs>
+          <w:tab w:val="num" w:pos="3600"/>
+        </w:tabs>
+        <w:ind w:left="3600" w:hanging="360"/>
+      </w:pPr>
+      <w:rPr>
+        <w:rFonts w:ascii="Wingdings" w:hAnsi="Wingdings" w:hint="default"/>
+        <w:sz w:val="20"/>
+      </w:rPr>
+    </w:lvl>
+    <w:lvl w:ilvl="5" w:tentative="1">
+      <w:start w:val="1"/>
+      <w:numFmt w:val="bullet"/>
+      <w:lvlText w:val=""/>
+      <w:lvlJc w:val="left"/>
+      <w:pPr>
+        <w:tabs>
+          <w:tab w:val="num" w:pos="4320"/>
+        </w:tabs>
+        <w:ind w:left="4320" w:hanging="360"/>
+      </w:pPr>
+      <w:rPr>
+        <w:rFonts w:ascii="Wingdings" w:hAnsi="Wingdings" w:hint="default"/>
+        <w:sz w:val="20"/>
+      </w:rPr>
+    </w:lvl>
+    <w:lvl w:ilvl="6" w:tentative="1">
+      <w:start w:val="1"/>
+      <w:numFmt w:val="bullet"/>
+      <w:lvlText w:val=""/>
+      <w:lvlJc w:val="left"/>
+      <w:pPr>
+        <w:tabs>
+          <w:tab w:val="num" w:pos="5040"/>
+        </w:tabs>
+        <w:ind w:left="5040" w:hanging="360"/>
+      </w:pPr>
+      <w:rPr>
+        <w:rFonts w:ascii="Wingdings" w:hAnsi="Wingdings" w:hint="default"/>
+        <w:sz w:val="20"/>
+      </w:rPr>
+    </w:lvl>
+    <w:lvl w:ilvl="7" w:tentative="1">
+      <w:start w:val="1"/>
+      <w:numFmt w:val="bullet"/>
+      <w:lvlText w:val=""/>
+      <w:lvlJc w:val="left"/>
+      <w:pPr>
+        <w:tabs>
+          <w:tab w:val="num" w:pos="5760"/>
+        </w:tabs>
+        <w:ind w:left="5760" w:hanging="360"/>
+      </w:pPr>
+      <w:rPr>
+        <w:rFonts w:ascii="Wingdings" w:hAnsi="Wingdings" w:hint="default"/>
+        <w:sz w:val="20"/>
+      </w:rPr>
+    </w:lvl>
+    <w:lvl w:ilvl="8" w:tentative="1">
+      <w:start w:val="1"/>
+      <w:numFmt w:val="bullet"/>
+      <w:lvlText w:val=""/>
+      <w:lvlJc w:val="left"/>
+      <w:pPr>
+        <w:tabs>
+          <w:tab w:val="num" w:pos="6480"/>
+        </w:tabs>
+        <w:ind w:left="6480" w:hanging="360"/>
+      </w:pPr>
+      <w:rPr>
+        <w:rFonts w:ascii="Wingdings" w:hAnsi="Wingdings" w:hint="default"/>
+        <w:sz w:val="20"/>
+      </w:rPr>
+    </w:lvl>
+  </w:abstractNum>
+  <w:abstractNum w:abstractNumId="4" w15:restartNumberingAfterBreak="0">
     <w:nsid w:val="15D672EF"/>
     <w:multiLevelType w:val="multilevel"/>
     <w:tmpl w:val="009A6BD8"/>
@@ -5382,7 +5659,7 @@
       </w:rPr>
     </w:lvl>
   </w:abstractNum>
-  <w:abstractNum w:abstractNumId="4" w15:restartNumberingAfterBreak="0">
+  <w:abstractNum w:abstractNumId="5" w15:restartNumberingAfterBreak="0">
     <w:nsid w:val="1CC7302B"/>
     <w:multiLevelType w:val="multilevel"/>
     <w:tmpl w:val="2D929C0A"/>
@@ -5531,7 +5808,7 @@
       </w:rPr>
     </w:lvl>
   </w:abstractNum>
-  <w:abstractNum w:abstractNumId="5" w15:restartNumberingAfterBreak="0">
+  <w:abstractNum w:abstractNumId="6" w15:restartNumberingAfterBreak="0">
     <w:nsid w:val="1CEE1BE7"/>
     <w:multiLevelType w:val="multilevel"/>
     <w:tmpl w:val="569E6FE0"/>
@@ -5680,7 +5957,7 @@
       </w:rPr>
     </w:lvl>
   </w:abstractNum>
-  <w:abstractNum w:abstractNumId="6" w15:restartNumberingAfterBreak="0">
+  <w:abstractNum w:abstractNumId="7" w15:restartNumberingAfterBreak="0">
     <w:nsid w:val="29F73589"/>
     <w:multiLevelType w:val="multilevel"/>
     <w:tmpl w:val="287EDDC2"/>
@@ -5829,7 +6106,7 @@
       </w:rPr>
     </w:lvl>
   </w:abstractNum>
-  <w:abstractNum w:abstractNumId="7" w15:restartNumberingAfterBreak="0">
+  <w:abstractNum w:abstractNumId="8" w15:restartNumberingAfterBreak="0">
     <w:nsid w:val="3A8828BE"/>
     <w:multiLevelType w:val="multilevel"/>
     <w:tmpl w:val="65D284D2"/>
@@ -5978,7 +6255,7 @@
       </w:rPr>
     </w:lvl>
   </w:abstractNum>
-  <w:abstractNum w:abstractNumId="8" w15:restartNumberingAfterBreak="0">
+  <w:abstractNum w:abstractNumId="9" w15:restartNumberingAfterBreak="0">
     <w:nsid w:val="3FC34CF7"/>
     <w:multiLevelType w:val="multilevel"/>
     <w:tmpl w:val="E5CC450C"/>
@@ -6127,7 +6404,7 @@
       </w:rPr>
     </w:lvl>
   </w:abstractNum>
-  <w:abstractNum w:abstractNumId="9" w15:restartNumberingAfterBreak="0">
+  <w:abstractNum w:abstractNumId="10" w15:restartNumberingAfterBreak="0">
     <w:nsid w:val="65011375"/>
     <w:multiLevelType w:val="multilevel"/>
     <w:tmpl w:val="2C54208A"/>
@@ -6276,7 +6553,7 @@
       </w:rPr>
     </w:lvl>
   </w:abstractNum>
-  <w:abstractNum w:abstractNumId="10" w15:restartNumberingAfterBreak="0">
+  <w:abstractNum w:abstractNumId="11" w15:restartNumberingAfterBreak="0">
     <w:nsid w:val="65D14F93"/>
     <w:multiLevelType w:val="multilevel"/>
     <w:tmpl w:val="1AB84EE4"/>
@@ -6425,7 +6702,7 @@
       </w:rPr>
     </w:lvl>
   </w:abstractNum>
-  <w:abstractNum w:abstractNumId="11" w15:restartNumberingAfterBreak="0">
+  <w:abstractNum w:abstractNumId="12" w15:restartNumberingAfterBreak="0">
     <w:nsid w:val="689159F2"/>
     <w:multiLevelType w:val="multilevel"/>
     <w:tmpl w:val="C2B05358"/>
@@ -6574,7 +6851,7 @@
       </w:rPr>
     </w:lvl>
   </w:abstractNum>
-  <w:abstractNum w:abstractNumId="12" w15:restartNumberingAfterBreak="0">
+  <w:abstractNum w:abstractNumId="13" w15:restartNumberingAfterBreak="0">
     <w:nsid w:val="6FAB4235"/>
     <w:multiLevelType w:val="multilevel"/>
     <w:tmpl w:val="679C3810"/>
@@ -6723,7 +7000,7 @@
       </w:rPr>
     </w:lvl>
   </w:abstractNum>
-  <w:abstractNum w:abstractNumId="13" w15:restartNumberingAfterBreak="0">
+  <w:abstractNum w:abstractNumId="14" w15:restartNumberingAfterBreak="0">
     <w:nsid w:val="70A07535"/>
     <w:multiLevelType w:val="multilevel"/>
     <w:tmpl w:val="678A6F5E"/>
@@ -6872,7 +7149,7 @@
       </w:rPr>
     </w:lvl>
   </w:abstractNum>
-  <w:abstractNum w:abstractNumId="14" w15:restartNumberingAfterBreak="0">
+  <w:abstractNum w:abstractNumId="15" w15:restartNumberingAfterBreak="0">
     <w:nsid w:val="77E84CDD"/>
     <w:multiLevelType w:val="multilevel"/>
     <w:tmpl w:val="E2929168"/>
@@ -7021,7 +7298,7 @@
       </w:rPr>
     </w:lvl>
   </w:abstractNum>
-  <w:abstractNum w:abstractNumId="15" w15:restartNumberingAfterBreak="0">
+  <w:abstractNum w:abstractNumId="16" w15:restartNumberingAfterBreak="0">
     <w:nsid w:val="7AFF4E9E"/>
     <w:multiLevelType w:val="multilevel"/>
     <w:tmpl w:val="834A37B0"/>
@@ -7170,7 +7447,7 @@
       </w:rPr>
     </w:lvl>
   </w:abstractNum>
-  <w:abstractNum w:abstractNumId="16" w15:restartNumberingAfterBreak="0">
+  <w:abstractNum w:abstractNumId="17" w15:restartNumberingAfterBreak="0">
     <w:nsid w:val="7E35134D"/>
     <w:multiLevelType w:val="multilevel"/>
     <w:tmpl w:val="4942BF4C"/>
@@ -7320,55 +7597,58 @@
     </w:lvl>
   </w:abstractNum>
   <w:num w:numId="1" w16cid:durableId="1707094719">
+    <w:abstractNumId w:val="16"/>
+  </w:num>
+  <w:num w:numId="2" w16cid:durableId="1947616606">
     <w:abstractNumId w:val="15"/>
   </w:num>
-  <w:num w:numId="2" w16cid:durableId="1947616606">
-    <w:abstractNumId w:val="14"/>
-  </w:num>
   <w:num w:numId="3" w16cid:durableId="540941206">
-    <w:abstractNumId w:val="12"/>
+    <w:abstractNumId w:val="13"/>
   </w:num>
   <w:num w:numId="4" w16cid:durableId="1492015741">
     <w:abstractNumId w:val="0"/>
   </w:num>
   <w:num w:numId="5" w16cid:durableId="75592928">
+    <w:abstractNumId w:val="7"/>
+  </w:num>
+  <w:num w:numId="6" w16cid:durableId="1576282035">
+    <w:abstractNumId w:val="4"/>
+  </w:num>
+  <w:num w:numId="7" w16cid:durableId="409816493">
+    <w:abstractNumId w:val="9"/>
+  </w:num>
+  <w:num w:numId="8" w16cid:durableId="1910580179">
+    <w:abstractNumId w:val="8"/>
+  </w:num>
+  <w:num w:numId="9" w16cid:durableId="1847284023">
+    <w:abstractNumId w:val="5"/>
+  </w:num>
+  <w:num w:numId="10" w16cid:durableId="10763270">
+    <w:abstractNumId w:val="11"/>
+  </w:num>
+  <w:num w:numId="11" w16cid:durableId="1882356390">
+    <w:abstractNumId w:val="12"/>
+  </w:num>
+  <w:num w:numId="12" w16cid:durableId="676152290">
+    <w:abstractNumId w:val="17"/>
+  </w:num>
+  <w:num w:numId="13" w16cid:durableId="1666863156">
+    <w:abstractNumId w:val="14"/>
+  </w:num>
+  <w:num w:numId="14" w16cid:durableId="798112398">
     <w:abstractNumId w:val="6"/>
   </w:num>
-  <w:num w:numId="6" w16cid:durableId="1576282035">
-    <w:abstractNumId w:val="3"/>
-  </w:num>
-  <w:num w:numId="7" w16cid:durableId="409816493">
-    <w:abstractNumId w:val="8"/>
-  </w:num>
-  <w:num w:numId="8" w16cid:durableId="1910580179">
-    <w:abstractNumId w:val="7"/>
-  </w:num>
-  <w:num w:numId="9" w16cid:durableId="1847284023">
-    <w:abstractNumId w:val="4"/>
-  </w:num>
-  <w:num w:numId="10" w16cid:durableId="10763270">
+  <w:num w:numId="15" w16cid:durableId="1657487143">
     <w:abstractNumId w:val="10"/>
-  </w:num>
-  <w:num w:numId="11" w16cid:durableId="1882356390">
-    <w:abstractNumId w:val="11"/>
-  </w:num>
-  <w:num w:numId="12" w16cid:durableId="676152290">
-    <w:abstractNumId w:val="16"/>
-  </w:num>
-  <w:num w:numId="13" w16cid:durableId="1666863156">
-    <w:abstractNumId w:val="13"/>
-  </w:num>
-  <w:num w:numId="14" w16cid:durableId="798112398">
-    <w:abstractNumId w:val="5"/>
-  </w:num>
-  <w:num w:numId="15" w16cid:durableId="1657487143">
-    <w:abstractNumId w:val="9"/>
   </w:num>
   <w:num w:numId="16" w16cid:durableId="1067269044">
     <w:abstractNumId w:val="2"/>
   </w:num>
   <w:num w:numId="17" w16cid:durableId="983923448">
     <w:abstractNumId w:val="1"/>
+  </w:num>
+  <w:num w:numId="18" w16cid:durableId="766921136">
+    <w:abstractNumId w:val="3"/>
   </w:num>
 </w:numbering>
 </file>

</xml_diff>

<commit_message>
Improve workflow budgets and search challenge recovery
</commit_message>
<xml_diff>
--- a/15.docx
+++ b/15.docx
@@ -3897,37 +3897,7 @@
     </w:p>
     <w:p>
       <w:r>
-        <w:t>Open a real SaaS website that offers a free account or free trial.</w:t>
-      </w:r>
-    </w:p>
-    <w:p>
-      <w:r>
-        <w:t>Complete the full signup flow using only a test email you control.</w:t>
-      </w:r>
-    </w:p>
-    <w:p>
-      <w:r>
-        <w:t>After signup:</w:t>
-      </w:r>
-    </w:p>
-    <w:p>
-      <w:r>
-        <w:t>1. Verify the welcome page or dashboard loads.</w:t>
-      </w:r>
-    </w:p>
-    <w:p>
-      <w:r>
-        <w:t>2. Locate one setting, one profile field, and one billing or plan page.</w:t>
-      </w:r>
-    </w:p>
-    <w:p>
-      <w:r>
-        <w:t>3. Capture screenshots of the successful login state and the profile page.</w:t>
-      </w:r>
-    </w:p>
-    <w:p>
-      <w:r>
-        <w:t>4. Return a short report with what worked and what failed.</w:t>
+        <w:t xml:space="preserve">            </w:t>
       </w:r>
     </w:p>
     <w:p>
@@ -4006,8 +3976,72 @@
           <w:b/>
           <w:bCs/>
         </w:rPr>
+        <w:t>9) Real data entry with validation</w:t>
+      </w:r>
+    </w:p>
+    <w:p>
+      <w:r>
+        <w:rPr>
+          <w:b/>
+          <w:bCs/>
+        </w:rPr>
+        <w:t>Prompt:</w:t>
+      </w:r>
+    </w:p>
+    <w:p>
+      <w:r>
+        <w:t>text</w:t>
+      </w:r>
+    </w:p>
+    <w:p>
+      <w:r>
+        <w:t>Open a real government, university, or company form that is publicly accessible and safe to use with test data.</w:t>
+      </w:r>
+    </w:p>
+    <w:p>
+      <w:r>
+        <w:t>Fill the form with clearly fake test data, but make it look realistic.</w:t>
+      </w:r>
+    </w:p>
+    <w:p>
+      <w:r>
         <w:lastRenderedPageBreak/>
-        <w:t>9) Real data entry with validation</w:t>
+        <w:t>Then:</w:t>
+      </w:r>
+    </w:p>
+    <w:p>
+      <w:r>
+        <w:t>1. Check whether the form shows validation errors.</w:t>
+      </w:r>
+    </w:p>
+    <w:p>
+      <w:r>
+        <w:t>2. Fix any errors the page reports.</w:t>
+      </w:r>
+    </w:p>
+    <w:p>
+      <w:r>
+        <w:t>3. Submit only if it is a genuine test or sandbox form.</w:t>
+      </w:r>
+    </w:p>
+    <w:p>
+      <w:r>
+        <w:t>4. Report the validation rules you encountered and whether submission succeeded.</w:t>
+      </w:r>
+    </w:p>
+    <w:p>
+      <w:pPr>
+        <w:rPr>
+          <w:b/>
+          <w:bCs/>
+        </w:rPr>
+      </w:pPr>
+      <w:r>
+        <w:rPr>
+          <w:b/>
+          <w:bCs/>
+        </w:rPr>
+        <w:t>10) Complex multi-step research and output</w:t>
       </w:r>
     </w:p>
     <w:p>
@@ -4026,70 +4060,6 @@
     </w:p>
     <w:p>
       <w:r>
-        <w:t>Open a real government, university, or company form that is publicly accessible and safe to use with test data.</w:t>
-      </w:r>
-    </w:p>
-    <w:p>
-      <w:r>
-        <w:t>Fill the form with clearly fake test data, but make it look realistic.</w:t>
-      </w:r>
-    </w:p>
-    <w:p>
-      <w:r>
-        <w:t>Then:</w:t>
-      </w:r>
-    </w:p>
-    <w:p>
-      <w:r>
-        <w:t>1. Check whether the form shows validation errors.</w:t>
-      </w:r>
-    </w:p>
-    <w:p>
-      <w:r>
-        <w:t>2. Fix any errors the page reports.</w:t>
-      </w:r>
-    </w:p>
-    <w:p>
-      <w:r>
-        <w:t>3. Submit only if it is a genuine test or sandbox form.</w:t>
-      </w:r>
-    </w:p>
-    <w:p>
-      <w:r>
-        <w:t>4. Report the validation rules you encountered and whether submission succeeded.</w:t>
-      </w:r>
-    </w:p>
-    <w:p>
-      <w:pPr>
-        <w:rPr>
-          <w:b/>
-          <w:bCs/>
-        </w:rPr>
-      </w:pPr>
-      <w:r>
-        <w:rPr>
-          <w:b/>
-          <w:bCs/>
-        </w:rPr>
-        <w:t>10) Complex multi-step research and output</w:t>
-      </w:r>
-    </w:p>
-    <w:p>
-      <w:r>
-        <w:rPr>
-          <w:b/>
-          <w:bCs/>
-        </w:rPr>
-        <w:t>Prompt:</w:t>
-      </w:r>
-    </w:p>
-    <w:p>
-      <w:r>
-        <w:t>text</w:t>
-      </w:r>
-    </w:p>
-    <w:p>
-      <w:r>
         <w:t>Use Google Search and official websites to research:</w:t>
       </w:r>
     </w:p>
@@ -4200,32 +4170,32 @@
           <w:b/>
           <w:bCs/>
         </w:rPr>
+        <w:t>Practical note</w:t>
+      </w:r>
+    </w:p>
+    <w:p>
+      <w:r>
+        <w:t>For real websites, some flows may trigger sign-in walls, CAPTCHAs, or rate limits. In those cases, the strongest test is whether your assistant detects the blocker, reports it clearly, and stops safely instead of looping.</w:t>
+      </w:r>
+    </w:p>
+    <w:p>
+      <w:r>
+        <w:t xml:space="preserve">Would you like me to turn these into a stricter </w:t>
+      </w:r>
+      <w:r>
+        <w:rPr>
+          <w:b/>
+          <w:bCs/>
+        </w:rPr>
+        <w:t>browser-agent benchmark format</w:t>
+      </w:r>
+      <w:r>
+        <w:t xml:space="preserve"> with success criteria, timeout rules, and failure conditions for each prompt?</w:t>
+      </w:r>
+    </w:p>
+    <w:p>
+      <w:r>
         <w:lastRenderedPageBreak/>
-        <w:t>Practical note</w:t>
-      </w:r>
-    </w:p>
-    <w:p>
-      <w:r>
-        <w:t>For real websites, some flows may trigger sign-in walls, CAPTCHAs, or rate limits. In those cases, the strongest test is whether your assistant detects the blocker, reports it clearly, and stops safely instead of looping.</w:t>
-      </w:r>
-    </w:p>
-    <w:p>
-      <w:r>
-        <w:t xml:space="preserve">Would you like me to turn these into a stricter </w:t>
-      </w:r>
-      <w:r>
-        <w:rPr>
-          <w:b/>
-          <w:bCs/>
-        </w:rPr>
-        <w:t>browser-agent benchmark format</w:t>
-      </w:r>
-      <w:r>
-        <w:t xml:space="preserve"> with success criteria, timeout rules, and failure conditions for each prompt?</w:t>
-      </w:r>
-    </w:p>
-    <w:p>
-      <w:r>
         <w:br/>
       </w:r>
       <w:r>
@@ -4817,125 +4787,497 @@
     <w:p>
       <w:r>
         <w:lastRenderedPageBreak/>
-        <w:t>Current first milestone blockers are real capability gaps, not one-off task bugs:</w:t>
-      </w:r>
-    </w:p>
-    <w:p>
-      <w:pPr>
-        <w:numPr>
-          <w:ilvl w:val="0"/>
-          <w:numId w:val="18"/>
-        </w:numPr>
-      </w:pPr>
+        <w:t xml:space="preserve">Yes, it is possible. But we should treat the goal as building a </w:t>
+      </w:r>
+      <w:r>
+        <w:rPr>
+          <w:b/>
+          <w:bCs/>
+        </w:rPr>
+        <w:t>general browser-agent operating loop</w:t>
+      </w:r>
+      <w:r>
+        <w:t>, not “make these 10 prompts pass one by one.”</w:t>
+      </w:r>
+    </w:p>
+    <w:p>
+      <w:r>
+        <w:rPr>
+          <w:b/>
+          <w:bCs/>
+        </w:rPr>
+        <w:t>Where We Are</w:t>
+      </w:r>
+      <w:r>
+        <w:br/>
+        <w:t>Done or partly done:</w:t>
+      </w:r>
+    </w:p>
+    <w:p>
+      <w:pPr>
+        <w:numPr>
+          <w:ilvl w:val="0"/>
+          <w:numId w:val="19"/>
+        </w:numPr>
+      </w:pPr>
+      <w:r>
+        <w:t>Chrome extension + side panel exists.</w:t>
+      </w:r>
+    </w:p>
+    <w:p>
+      <w:pPr>
+        <w:numPr>
+          <w:ilvl w:val="0"/>
+          <w:numId w:val="19"/>
+        </w:numPr>
+      </w:pPr>
+      <w:r>
+        <w:t>Backend planner/orchestrator exists.</w:t>
+      </w:r>
+    </w:p>
+    <w:p>
+      <w:pPr>
+        <w:numPr>
+          <w:ilvl w:val="0"/>
+          <w:numId w:val="19"/>
+        </w:numPr>
+      </w:pPr>
+      <w:r>
+        <w:t>Mission Ledger exists and can issue durable browser intents.</w:t>
+      </w:r>
+    </w:p>
+    <w:p>
+      <w:pPr>
+        <w:numPr>
+          <w:ilvl w:val="0"/>
+          <w:numId w:val="19"/>
+        </w:numPr>
+      </w:pPr>
+      <w:r>
+        <w:t>Safe/risky/critical action policy exists partly.</w:t>
+      </w:r>
+    </w:p>
+    <w:p>
+      <w:pPr>
+        <w:numPr>
+          <w:ilvl w:val="0"/>
+          <w:numId w:val="19"/>
+        </w:numPr>
+      </w:pPr>
+      <w:r>
+        <w:t>Auto mode executes safe actions only.</w:t>
+      </w:r>
+    </w:p>
+    <w:p>
+      <w:pPr>
+        <w:numPr>
+          <w:ilvl w:val="0"/>
+          <w:numId w:val="19"/>
+        </w:numPr>
+      </w:pPr>
+      <w:r>
+        <w:t>Timeline/evidence UI exists.</w:t>
+      </w:r>
+    </w:p>
+    <w:p>
+      <w:pPr>
+        <w:numPr>
+          <w:ilvl w:val="0"/>
+          <w:numId w:val="19"/>
+        </w:numPr>
+      </w:pPr>
+      <w:r>
+        <w:t>Browser action execution exists for navigate, open tab, click/fill/upload parts.</w:t>
+      </w:r>
+    </w:p>
+    <w:p>
+      <w:pPr>
+        <w:numPr>
+          <w:ilvl w:val="0"/>
+          <w:numId w:val="19"/>
+        </w:numPr>
+      </w:pPr>
+      <w:r>
+        <w:t>Some schema extraction, search collection, form/upload/signup policies exist.</w:t>
+      </w:r>
+    </w:p>
+    <w:p>
+      <w:pPr>
+        <w:numPr>
+          <w:ilvl w:val="0"/>
+          <w:numId w:val="19"/>
+        </w:numPr>
+      </w:pPr>
+      <w:r>
+        <w:t>Real visual validation harness now exists.</w:t>
+      </w:r>
+    </w:p>
+    <w:p>
+      <w:r>
+        <w:t>Not yet solid:</w:t>
+      </w:r>
+    </w:p>
+    <w:p>
+      <w:pPr>
+        <w:numPr>
+          <w:ilvl w:val="0"/>
+          <w:numId w:val="20"/>
+        </w:numPr>
+      </w:pPr>
+      <w:r>
+        <w:t>The agent loop is not reliable end-to-end.</w:t>
+      </w:r>
+    </w:p>
+    <w:p>
+      <w:pPr>
+        <w:numPr>
+          <w:ilvl w:val="0"/>
+          <w:numId w:val="20"/>
+        </w:numPr>
+      </w:pPr>
+      <w:r>
+        <w:t>Phase gates are blocking valid next actions.</w:t>
+      </w:r>
+    </w:p>
+    <w:p>
+      <w:pPr>
+        <w:numPr>
+          <w:ilvl w:val="0"/>
+          <w:numId w:val="20"/>
+        </w:numPr>
+      </w:pPr>
+      <w:r>
+        <w:t>Search result collection is not consistently feeding entity grounding.</w:t>
+      </w:r>
+    </w:p>
+    <w:p>
+      <w:pPr>
+        <w:numPr>
+          <w:ilvl w:val="0"/>
+          <w:numId w:val="20"/>
+        </w:numPr>
+      </w:pPr>
+      <w:r>
+        <w:t>Completion can still be wrong unless strictly verified.</w:t>
+      </w:r>
+    </w:p>
+    <w:p>
+      <w:pPr>
+        <w:numPr>
+          <w:ilvl w:val="0"/>
+          <w:numId w:val="20"/>
+        </w:numPr>
+      </w:pPr>
+      <w:r>
+        <w:t>Replan/recovery handling is incomplete.</w:t>
+      </w:r>
+    </w:p>
+    <w:p>
+      <w:pPr>
+        <w:numPr>
+          <w:ilvl w:val="0"/>
+          <w:numId w:val="20"/>
+        </w:numPr>
+      </w:pPr>
+      <w:r>
+        <w:t>Real-world auth/session tasks are not validated.</w:t>
+      </w:r>
+    </w:p>
+    <w:p>
+      <w:pPr>
+        <w:numPr>
+          <w:ilvl w:val="0"/>
+          <w:numId w:val="20"/>
+        </w:numPr>
+      </w:pPr>
+      <w:r>
+        <w:t>Messaging/email/critical actions need strict approval UX.</w:t>
+      </w:r>
+    </w:p>
+    <w:p>
+      <w:r>
+        <w:rPr>
+          <w:b/>
+          <w:bCs/>
+        </w:rPr>
+        <w:t>Small Plan</w:t>
+      </w:r>
+    </w:p>
+    <w:p>
+      <w:pPr>
+        <w:numPr>
+          <w:ilvl w:val="0"/>
+          <w:numId w:val="21"/>
+        </w:numPr>
+      </w:pPr>
+      <w:r>
+        <w:rPr>
+          <w:b/>
+          <w:bCs/>
+        </w:rPr>
+        <w:t>Stabilize Core Agent Loop</w:t>
+      </w:r>
+      <w:r>
+        <w:br/>
+        <w:t>One authority chain:</w:t>
+      </w:r>
+      <w:r>
+        <w:br/>
+        <w:t>observe -&gt; understand page -&gt; collect entities -&gt; decide next action -&gt; safety gate -&gt; execute -&gt; verify -&gt; update ledger -&gt; repeat.</w:t>
+      </w:r>
+      <w:r>
+        <w:br/>
+        <w:t>No “done” unless verified evidence or final draft exists.</w:t>
+      </w:r>
+    </w:p>
+    <w:p>
+      <w:pPr>
+        <w:numPr>
+          <w:ilvl w:val="0"/>
+          <w:numId w:val="21"/>
+        </w:numPr>
+      </w:pPr>
+      <w:r>
+        <w:rPr>
+          <w:b/>
+          <w:bCs/>
+        </w:rPr>
+        <w:t>Fix Research/Search Flow</w:t>
+      </w:r>
+      <w:r>
+        <w:br/>
+        <w:t>For search pages:</w:t>
+      </w:r>
+      <w:r>
+        <w:br/>
+        <w:t xml:space="preserve">detect search page -&gt; collect organic results -&gt; register entities -&gt; open ranked </w:t>
+      </w:r>
+      <w:r>
+        <w:lastRenderedPageBreak/>
+        <w:t>entities -&gt; read tabs -&gt; extract -&gt; report.</w:t>
+      </w:r>
+      <w:r>
+        <w:br/>
+        <w:t>This should make VT-01, VT-04, VT-05, VT-10 much easier.</w:t>
+      </w:r>
+    </w:p>
+    <w:p>
+      <w:pPr>
+        <w:numPr>
+          <w:ilvl w:val="0"/>
+          <w:numId w:val="21"/>
+        </w:numPr>
+      </w:pPr>
+      <w:r>
+        <w:rPr>
+          <w:b/>
+          <w:bCs/>
+        </w:rPr>
+        <w:t>Fix Phase Model</w:t>
+      </w:r>
+      <w:r>
+        <w:br/>
+        <w:t xml:space="preserve">Current COLLECT phase blocks valid </w:t>
+      </w:r>
       <w:proofErr w:type="spellStart"/>
       <w:r>
-        <w:t>schema_extraction</w:t>
+        <w:t>open_new_tab</w:t>
       </w:r>
       <w:proofErr w:type="spellEnd"/>
-    </w:p>
-    <w:p>
-      <w:pPr>
-        <w:numPr>
-          <w:ilvl w:val="0"/>
-          <w:numId w:val="18"/>
-        </w:numPr>
-      </w:pPr>
-      <w:proofErr w:type="spellStart"/>
-      <w:r>
-        <w:t>search_result_collection</w:t>
-      </w:r>
-      <w:proofErr w:type="spellEnd"/>
-    </w:p>
-    <w:p>
-      <w:pPr>
-        <w:numPr>
-          <w:ilvl w:val="0"/>
-          <w:numId w:val="18"/>
-        </w:numPr>
-      </w:pPr>
-      <w:proofErr w:type="spellStart"/>
-      <w:r>
-        <w:t>multi_tab_open_read</w:t>
-      </w:r>
-      <w:proofErr w:type="spellEnd"/>
-    </w:p>
-    <w:p>
-      <w:pPr>
-        <w:numPr>
-          <w:ilvl w:val="0"/>
-          <w:numId w:val="18"/>
-        </w:numPr>
-      </w:pPr>
-      <w:proofErr w:type="spellStart"/>
-      <w:r>
-        <w:t>job_board_semantics</w:t>
-      </w:r>
-      <w:proofErr w:type="spellEnd"/>
-    </w:p>
-    <w:p>
-      <w:pPr>
-        <w:numPr>
-          <w:ilvl w:val="0"/>
-          <w:numId w:val="18"/>
-        </w:numPr>
-      </w:pPr>
-      <w:proofErr w:type="spellStart"/>
-      <w:r>
-        <w:t>documentation_semantics</w:t>
-      </w:r>
-      <w:proofErr w:type="spellEnd"/>
-    </w:p>
-    <w:p>
-      <w:pPr>
-        <w:numPr>
-          <w:ilvl w:val="0"/>
-          <w:numId w:val="18"/>
-        </w:numPr>
-      </w:pPr>
-      <w:proofErr w:type="spellStart"/>
-      <w:r>
-        <w:t>directory_pagination</w:t>
-      </w:r>
-      <w:proofErr w:type="spellEnd"/>
-    </w:p>
-    <w:p>
-      <w:pPr>
-        <w:numPr>
-          <w:ilvl w:val="0"/>
-          <w:numId w:val="18"/>
-        </w:numPr>
-      </w:pPr>
-      <w:proofErr w:type="spellStart"/>
-      <w:r>
-        <w:t>safe_form_filling</w:t>
-      </w:r>
-      <w:proofErr w:type="spellEnd"/>
-    </w:p>
-    <w:p>
-      <w:pPr>
-        <w:numPr>
-          <w:ilvl w:val="0"/>
-          <w:numId w:val="18"/>
-        </w:numPr>
-      </w:pPr>
-      <w:proofErr w:type="spellStart"/>
-      <w:r>
-        <w:t>file_upload_broker</w:t>
-      </w:r>
-      <w:proofErr w:type="spellEnd"/>
-    </w:p>
-    <w:p>
-      <w:pPr>
-        <w:numPr>
-          <w:ilvl w:val="0"/>
-          <w:numId w:val="18"/>
-        </w:numPr>
-      </w:pPr>
-      <w:proofErr w:type="spellStart"/>
-      <w:r>
-        <w:t>saas_signup_policy</w:t>
-      </w:r>
-      <w:proofErr w:type="spellEnd"/>
+      <w:r>
+        <w:t>.</w:t>
+      </w:r>
+      <w:r>
+        <w:br/>
+        <w:t>We need clean phase transitions:</w:t>
+      </w:r>
+      <w:r>
+        <w:br/>
+        <w:t>SEARCH -&gt; COLLECT_RESULTS -&gt; OPEN_SOURCES -&gt; READ -&gt; EXTRACT -&gt; SYNTHESIZE -&gt; REPORT.</w:t>
+      </w:r>
+    </w:p>
+    <w:p>
+      <w:pPr>
+        <w:numPr>
+          <w:ilvl w:val="0"/>
+          <w:numId w:val="21"/>
+        </w:numPr>
+      </w:pPr>
+      <w:r>
+        <w:rPr>
+          <w:b/>
+          <w:bCs/>
+        </w:rPr>
+        <w:t>Make Recovery Real</w:t>
+      </w:r>
+      <w:r>
+        <w:br/>
+        <w:t>If Google blocks:</w:t>
+      </w:r>
+      <w:r>
+        <w:br/>
+        <w:t>try Bing/DuckDuckGo once.</w:t>
+      </w:r>
+      <w:r>
+        <w:br/>
+        <w:t>If login/QR/CAPTCHA/payment/security appears:</w:t>
+      </w:r>
+      <w:r>
+        <w:br/>
+        <w:t>pause with evidence.</w:t>
+      </w:r>
+      <w:r>
+        <w:br/>
+        <w:t>If planner fails:</w:t>
+      </w:r>
+      <w:r>
+        <w:br/>
+        <w:t>replan immediately, don’t wait.</w:t>
+      </w:r>
+    </w:p>
+    <w:p>
+      <w:pPr>
+        <w:numPr>
+          <w:ilvl w:val="0"/>
+          <w:numId w:val="21"/>
+        </w:numPr>
+      </w:pPr>
+      <w:r>
+        <w:rPr>
+          <w:b/>
+          <w:bCs/>
+        </w:rPr>
+        <w:t>Validate The 10 Tasks Visually</w:t>
+      </w:r>
+      <w:r>
+        <w:br/>
+        <w:t>Run them through the extension side panel only.</w:t>
+      </w:r>
+      <w:r>
+        <w:br/>
+        <w:t>Each task gets proof:</w:t>
+      </w:r>
+      <w:r>
+        <w:br/>
+        <w:t>screenshots, opened URLs, timeline steps, final output, failure reason if blocked.</w:t>
+      </w:r>
+    </w:p>
+    <w:p>
+      <w:pPr>
+        <w:numPr>
+          <w:ilvl w:val="0"/>
+          <w:numId w:val="21"/>
+        </w:numPr>
+      </w:pPr>
+      <w:r>
+        <w:rPr>
+          <w:b/>
+          <w:bCs/>
+        </w:rPr>
+        <w:t>Add Human-Like Critical Workflows</w:t>
+      </w:r>
+      <w:r>
+        <w:br/>
+        <w:t>For WhatsApp/email/message examples:</w:t>
+      </w:r>
+      <w:r>
+        <w:br/>
+        <w:t>draft message first, show recipient/contact evidence, require explicit approval before sending.</w:t>
+      </w:r>
+    </w:p>
+    <w:p>
+      <w:pPr>
+        <w:numPr>
+          <w:ilvl w:val="0"/>
+          <w:numId w:val="21"/>
+        </w:numPr>
+      </w:pPr>
+      <w:r>
+        <w:rPr>
+          <w:b/>
+          <w:bCs/>
+        </w:rPr>
+        <w:t>First Milestone Definition</w:t>
+      </w:r>
+      <w:r>
+        <w:br/>
+        <w:t>We can say milestone reached only when:</w:t>
+      </w:r>
+    </w:p>
+    <w:p>
+      <w:pPr>
+        <w:numPr>
+          <w:ilvl w:val="1"/>
+          <w:numId w:val="21"/>
+        </w:numPr>
+      </w:pPr>
+      <w:r>
+        <w:t xml:space="preserve">VT-01 to VT-10 </w:t>
+      </w:r>
+      <w:proofErr w:type="gramStart"/>
+      <w:r>
+        <w:t>are</w:t>
+      </w:r>
+      <w:proofErr w:type="gramEnd"/>
+      <w:r>
+        <w:t xml:space="preserve"> visually run through the extension,</w:t>
+      </w:r>
+    </w:p>
+    <w:p>
+      <w:pPr>
+        <w:numPr>
+          <w:ilvl w:val="1"/>
+          <w:numId w:val="21"/>
+        </w:numPr>
+      </w:pPr>
+      <w:r>
+        <w:t>safe tasks complete,</w:t>
+      </w:r>
+    </w:p>
+    <w:p>
+      <w:pPr>
+        <w:numPr>
+          <w:ilvl w:val="1"/>
+          <w:numId w:val="21"/>
+        </w:numPr>
+      </w:pPr>
+      <w:r>
+        <w:t>risky/critical tasks pause correctly,</w:t>
+      </w:r>
+    </w:p>
+    <w:p>
+      <w:pPr>
+        <w:numPr>
+          <w:ilvl w:val="1"/>
+          <w:numId w:val="21"/>
+        </w:numPr>
+      </w:pPr>
+      <w:r>
+        <w:t>every result has evidence,</w:t>
+      </w:r>
+    </w:p>
+    <w:p>
+      <w:pPr>
+        <w:numPr>
+          <w:ilvl w:val="1"/>
+          <w:numId w:val="21"/>
+        </w:numPr>
+      </w:pPr>
+      <w:r>
+        <w:t>no false “Done.”</w:t>
+      </w:r>
+    </w:p>
+    <w:p>
+      <w:r>
+        <w:t xml:space="preserve">So yes, we can build it. But the immediate next milestone is not “all features.” It is: </w:t>
+      </w:r>
+      <w:r>
+        <w:rPr>
+          <w:b/>
+          <w:bCs/>
+        </w:rPr>
+        <w:t>make the core browser-agent loop trustworthy.</w:t>
+      </w:r>
     </w:p>
     <w:p/>
     <w:sectPr>
@@ -6107,6 +6449,304 @@
     </w:lvl>
   </w:abstractNum>
   <w:abstractNum w:abstractNumId="8" w15:restartNumberingAfterBreak="0">
+    <w:nsid w:val="2C742607"/>
+    <w:multiLevelType w:val="multilevel"/>
+    <w:tmpl w:val="35D45F5E"/>
+    <w:lvl w:ilvl="0">
+      <w:start w:val="1"/>
+      <w:numFmt w:val="bullet"/>
+      <w:lvlText w:val=""/>
+      <w:lvlJc w:val="left"/>
+      <w:pPr>
+        <w:tabs>
+          <w:tab w:val="num" w:pos="720"/>
+        </w:tabs>
+        <w:ind w:left="720" w:hanging="360"/>
+      </w:pPr>
+      <w:rPr>
+        <w:rFonts w:ascii="Symbol" w:hAnsi="Symbol" w:hint="default"/>
+        <w:sz w:val="20"/>
+      </w:rPr>
+    </w:lvl>
+    <w:lvl w:ilvl="1" w:tentative="1">
+      <w:start w:val="1"/>
+      <w:numFmt w:val="bullet"/>
+      <w:lvlText w:val="o"/>
+      <w:lvlJc w:val="left"/>
+      <w:pPr>
+        <w:tabs>
+          <w:tab w:val="num" w:pos="1440"/>
+        </w:tabs>
+        <w:ind w:left="1440" w:hanging="360"/>
+      </w:pPr>
+      <w:rPr>
+        <w:rFonts w:ascii="Courier New" w:hAnsi="Courier New" w:hint="default"/>
+        <w:sz w:val="20"/>
+      </w:rPr>
+    </w:lvl>
+    <w:lvl w:ilvl="2" w:tentative="1">
+      <w:start w:val="1"/>
+      <w:numFmt w:val="bullet"/>
+      <w:lvlText w:val=""/>
+      <w:lvlJc w:val="left"/>
+      <w:pPr>
+        <w:tabs>
+          <w:tab w:val="num" w:pos="2160"/>
+        </w:tabs>
+        <w:ind w:left="2160" w:hanging="360"/>
+      </w:pPr>
+      <w:rPr>
+        <w:rFonts w:ascii="Wingdings" w:hAnsi="Wingdings" w:hint="default"/>
+        <w:sz w:val="20"/>
+      </w:rPr>
+    </w:lvl>
+    <w:lvl w:ilvl="3" w:tentative="1">
+      <w:start w:val="1"/>
+      <w:numFmt w:val="bullet"/>
+      <w:lvlText w:val=""/>
+      <w:lvlJc w:val="left"/>
+      <w:pPr>
+        <w:tabs>
+          <w:tab w:val="num" w:pos="2880"/>
+        </w:tabs>
+        <w:ind w:left="2880" w:hanging="360"/>
+      </w:pPr>
+      <w:rPr>
+        <w:rFonts w:ascii="Wingdings" w:hAnsi="Wingdings" w:hint="default"/>
+        <w:sz w:val="20"/>
+      </w:rPr>
+    </w:lvl>
+    <w:lvl w:ilvl="4" w:tentative="1">
+      <w:start w:val="1"/>
+      <w:numFmt w:val="bullet"/>
+      <w:lvlText w:val=""/>
+      <w:lvlJc w:val="left"/>
+      <w:pPr>
+        <w:tabs>
+          <w:tab w:val="num" w:pos="3600"/>
+        </w:tabs>
+        <w:ind w:left="3600" w:hanging="360"/>
+      </w:pPr>
+      <w:rPr>
+        <w:rFonts w:ascii="Wingdings" w:hAnsi="Wingdings" w:hint="default"/>
+        <w:sz w:val="20"/>
+      </w:rPr>
+    </w:lvl>
+    <w:lvl w:ilvl="5" w:tentative="1">
+      <w:start w:val="1"/>
+      <w:numFmt w:val="bullet"/>
+      <w:lvlText w:val=""/>
+      <w:lvlJc w:val="left"/>
+      <w:pPr>
+        <w:tabs>
+          <w:tab w:val="num" w:pos="4320"/>
+        </w:tabs>
+        <w:ind w:left="4320" w:hanging="360"/>
+      </w:pPr>
+      <w:rPr>
+        <w:rFonts w:ascii="Wingdings" w:hAnsi="Wingdings" w:hint="default"/>
+        <w:sz w:val="20"/>
+      </w:rPr>
+    </w:lvl>
+    <w:lvl w:ilvl="6" w:tentative="1">
+      <w:start w:val="1"/>
+      <w:numFmt w:val="bullet"/>
+      <w:lvlText w:val=""/>
+      <w:lvlJc w:val="left"/>
+      <w:pPr>
+        <w:tabs>
+          <w:tab w:val="num" w:pos="5040"/>
+        </w:tabs>
+        <w:ind w:left="5040" w:hanging="360"/>
+      </w:pPr>
+      <w:rPr>
+        <w:rFonts w:ascii="Wingdings" w:hAnsi="Wingdings" w:hint="default"/>
+        <w:sz w:val="20"/>
+      </w:rPr>
+    </w:lvl>
+    <w:lvl w:ilvl="7" w:tentative="1">
+      <w:start w:val="1"/>
+      <w:numFmt w:val="bullet"/>
+      <w:lvlText w:val=""/>
+      <w:lvlJc w:val="left"/>
+      <w:pPr>
+        <w:tabs>
+          <w:tab w:val="num" w:pos="5760"/>
+        </w:tabs>
+        <w:ind w:left="5760" w:hanging="360"/>
+      </w:pPr>
+      <w:rPr>
+        <w:rFonts w:ascii="Wingdings" w:hAnsi="Wingdings" w:hint="default"/>
+        <w:sz w:val="20"/>
+      </w:rPr>
+    </w:lvl>
+    <w:lvl w:ilvl="8" w:tentative="1">
+      <w:start w:val="1"/>
+      <w:numFmt w:val="bullet"/>
+      <w:lvlText w:val=""/>
+      <w:lvlJc w:val="left"/>
+      <w:pPr>
+        <w:tabs>
+          <w:tab w:val="num" w:pos="6480"/>
+        </w:tabs>
+        <w:ind w:left="6480" w:hanging="360"/>
+      </w:pPr>
+      <w:rPr>
+        <w:rFonts w:ascii="Wingdings" w:hAnsi="Wingdings" w:hint="default"/>
+        <w:sz w:val="20"/>
+      </w:rPr>
+    </w:lvl>
+  </w:abstractNum>
+  <w:abstractNum w:abstractNumId="9" w15:restartNumberingAfterBreak="0">
+    <w:nsid w:val="2E5D6D85"/>
+    <w:multiLevelType w:val="multilevel"/>
+    <w:tmpl w:val="CC70862A"/>
+    <w:lvl w:ilvl="0">
+      <w:start w:val="1"/>
+      <w:numFmt w:val="bullet"/>
+      <w:lvlText w:val=""/>
+      <w:lvlJc w:val="left"/>
+      <w:pPr>
+        <w:tabs>
+          <w:tab w:val="num" w:pos="720"/>
+        </w:tabs>
+        <w:ind w:left="720" w:hanging="360"/>
+      </w:pPr>
+      <w:rPr>
+        <w:rFonts w:ascii="Symbol" w:hAnsi="Symbol" w:hint="default"/>
+        <w:sz w:val="20"/>
+      </w:rPr>
+    </w:lvl>
+    <w:lvl w:ilvl="1" w:tentative="1">
+      <w:start w:val="1"/>
+      <w:numFmt w:val="bullet"/>
+      <w:lvlText w:val="o"/>
+      <w:lvlJc w:val="left"/>
+      <w:pPr>
+        <w:tabs>
+          <w:tab w:val="num" w:pos="1440"/>
+        </w:tabs>
+        <w:ind w:left="1440" w:hanging="360"/>
+      </w:pPr>
+      <w:rPr>
+        <w:rFonts w:ascii="Courier New" w:hAnsi="Courier New" w:hint="default"/>
+        <w:sz w:val="20"/>
+      </w:rPr>
+    </w:lvl>
+    <w:lvl w:ilvl="2" w:tentative="1">
+      <w:start w:val="1"/>
+      <w:numFmt w:val="bullet"/>
+      <w:lvlText w:val=""/>
+      <w:lvlJc w:val="left"/>
+      <w:pPr>
+        <w:tabs>
+          <w:tab w:val="num" w:pos="2160"/>
+        </w:tabs>
+        <w:ind w:left="2160" w:hanging="360"/>
+      </w:pPr>
+      <w:rPr>
+        <w:rFonts w:ascii="Wingdings" w:hAnsi="Wingdings" w:hint="default"/>
+        <w:sz w:val="20"/>
+      </w:rPr>
+    </w:lvl>
+    <w:lvl w:ilvl="3" w:tentative="1">
+      <w:start w:val="1"/>
+      <w:numFmt w:val="bullet"/>
+      <w:lvlText w:val=""/>
+      <w:lvlJc w:val="left"/>
+      <w:pPr>
+        <w:tabs>
+          <w:tab w:val="num" w:pos="2880"/>
+        </w:tabs>
+        <w:ind w:left="2880" w:hanging="360"/>
+      </w:pPr>
+      <w:rPr>
+        <w:rFonts w:ascii="Wingdings" w:hAnsi="Wingdings" w:hint="default"/>
+        <w:sz w:val="20"/>
+      </w:rPr>
+    </w:lvl>
+    <w:lvl w:ilvl="4" w:tentative="1">
+      <w:start w:val="1"/>
+      <w:numFmt w:val="bullet"/>
+      <w:lvlText w:val=""/>
+      <w:lvlJc w:val="left"/>
+      <w:pPr>
+        <w:tabs>
+          <w:tab w:val="num" w:pos="3600"/>
+        </w:tabs>
+        <w:ind w:left="3600" w:hanging="360"/>
+      </w:pPr>
+      <w:rPr>
+        <w:rFonts w:ascii="Wingdings" w:hAnsi="Wingdings" w:hint="default"/>
+        <w:sz w:val="20"/>
+      </w:rPr>
+    </w:lvl>
+    <w:lvl w:ilvl="5" w:tentative="1">
+      <w:start w:val="1"/>
+      <w:numFmt w:val="bullet"/>
+      <w:lvlText w:val=""/>
+      <w:lvlJc w:val="left"/>
+      <w:pPr>
+        <w:tabs>
+          <w:tab w:val="num" w:pos="4320"/>
+        </w:tabs>
+        <w:ind w:left="4320" w:hanging="360"/>
+      </w:pPr>
+      <w:rPr>
+        <w:rFonts w:ascii="Wingdings" w:hAnsi="Wingdings" w:hint="default"/>
+        <w:sz w:val="20"/>
+      </w:rPr>
+    </w:lvl>
+    <w:lvl w:ilvl="6" w:tentative="1">
+      <w:start w:val="1"/>
+      <w:numFmt w:val="bullet"/>
+      <w:lvlText w:val=""/>
+      <w:lvlJc w:val="left"/>
+      <w:pPr>
+        <w:tabs>
+          <w:tab w:val="num" w:pos="5040"/>
+        </w:tabs>
+        <w:ind w:left="5040" w:hanging="360"/>
+      </w:pPr>
+      <w:rPr>
+        <w:rFonts w:ascii="Wingdings" w:hAnsi="Wingdings" w:hint="default"/>
+        <w:sz w:val="20"/>
+      </w:rPr>
+    </w:lvl>
+    <w:lvl w:ilvl="7" w:tentative="1">
+      <w:start w:val="1"/>
+      <w:numFmt w:val="bullet"/>
+      <w:lvlText w:val=""/>
+      <w:lvlJc w:val="left"/>
+      <w:pPr>
+        <w:tabs>
+          <w:tab w:val="num" w:pos="5760"/>
+        </w:tabs>
+        <w:ind w:left="5760" w:hanging="360"/>
+      </w:pPr>
+      <w:rPr>
+        <w:rFonts w:ascii="Wingdings" w:hAnsi="Wingdings" w:hint="default"/>
+        <w:sz w:val="20"/>
+      </w:rPr>
+    </w:lvl>
+    <w:lvl w:ilvl="8" w:tentative="1">
+      <w:start w:val="1"/>
+      <w:numFmt w:val="bullet"/>
+      <w:lvlText w:val=""/>
+      <w:lvlJc w:val="left"/>
+      <w:pPr>
+        <w:tabs>
+          <w:tab w:val="num" w:pos="6480"/>
+        </w:tabs>
+        <w:ind w:left="6480" w:hanging="360"/>
+      </w:pPr>
+      <w:rPr>
+        <w:rFonts w:ascii="Wingdings" w:hAnsi="Wingdings" w:hint="default"/>
+        <w:sz w:val="20"/>
+      </w:rPr>
+    </w:lvl>
+  </w:abstractNum>
+  <w:abstractNum w:abstractNumId="10" w15:restartNumberingAfterBreak="0">
     <w:nsid w:val="3A8828BE"/>
     <w:multiLevelType w:val="multilevel"/>
     <w:tmpl w:val="65D284D2"/>
@@ -6255,7 +6895,7 @@
       </w:rPr>
     </w:lvl>
   </w:abstractNum>
-  <w:abstractNum w:abstractNumId="9" w15:restartNumberingAfterBreak="0">
+  <w:abstractNum w:abstractNumId="11" w15:restartNumberingAfterBreak="0">
     <w:nsid w:val="3FC34CF7"/>
     <w:multiLevelType w:val="multilevel"/>
     <w:tmpl w:val="E5CC450C"/>
@@ -6404,7 +7044,124 @@
       </w:rPr>
     </w:lvl>
   </w:abstractNum>
-  <w:abstractNum w:abstractNumId="10" w15:restartNumberingAfterBreak="0">
+  <w:abstractNum w:abstractNumId="12" w15:restartNumberingAfterBreak="0">
+    <w:nsid w:val="529C7DDF"/>
+    <w:multiLevelType w:val="multilevel"/>
+    <w:tmpl w:val="2E3AF1E0"/>
+    <w:lvl w:ilvl="0">
+      <w:start w:val="1"/>
+      <w:numFmt w:val="decimal"/>
+      <w:lvlText w:val="%1."/>
+      <w:lvlJc w:val="left"/>
+      <w:pPr>
+        <w:tabs>
+          <w:tab w:val="num" w:pos="720"/>
+        </w:tabs>
+        <w:ind w:left="720" w:hanging="360"/>
+      </w:pPr>
+    </w:lvl>
+    <w:lvl w:ilvl="1">
+      <w:start w:val="1"/>
+      <w:numFmt w:val="bullet"/>
+      <w:lvlText w:val="o"/>
+      <w:lvlJc w:val="left"/>
+      <w:pPr>
+        <w:tabs>
+          <w:tab w:val="num" w:pos="1440"/>
+        </w:tabs>
+        <w:ind w:left="1440" w:hanging="360"/>
+      </w:pPr>
+      <w:rPr>
+        <w:rFonts w:ascii="Courier New" w:hAnsi="Courier New" w:hint="default"/>
+        <w:sz w:val="20"/>
+      </w:rPr>
+    </w:lvl>
+    <w:lvl w:ilvl="2" w:tentative="1">
+      <w:start w:val="1"/>
+      <w:numFmt w:val="decimal"/>
+      <w:lvlText w:val="%3."/>
+      <w:lvlJc w:val="left"/>
+      <w:pPr>
+        <w:tabs>
+          <w:tab w:val="num" w:pos="2160"/>
+        </w:tabs>
+        <w:ind w:left="2160" w:hanging="360"/>
+      </w:pPr>
+    </w:lvl>
+    <w:lvl w:ilvl="3" w:tentative="1">
+      <w:start w:val="1"/>
+      <w:numFmt w:val="decimal"/>
+      <w:lvlText w:val="%4."/>
+      <w:lvlJc w:val="left"/>
+      <w:pPr>
+        <w:tabs>
+          <w:tab w:val="num" w:pos="2880"/>
+        </w:tabs>
+        <w:ind w:left="2880" w:hanging="360"/>
+      </w:pPr>
+    </w:lvl>
+    <w:lvl w:ilvl="4" w:tentative="1">
+      <w:start w:val="1"/>
+      <w:numFmt w:val="decimal"/>
+      <w:lvlText w:val="%5."/>
+      <w:lvlJc w:val="left"/>
+      <w:pPr>
+        <w:tabs>
+          <w:tab w:val="num" w:pos="3600"/>
+        </w:tabs>
+        <w:ind w:left="3600" w:hanging="360"/>
+      </w:pPr>
+    </w:lvl>
+    <w:lvl w:ilvl="5" w:tentative="1">
+      <w:start w:val="1"/>
+      <w:numFmt w:val="decimal"/>
+      <w:lvlText w:val="%6."/>
+      <w:lvlJc w:val="left"/>
+      <w:pPr>
+        <w:tabs>
+          <w:tab w:val="num" w:pos="4320"/>
+        </w:tabs>
+        <w:ind w:left="4320" w:hanging="360"/>
+      </w:pPr>
+    </w:lvl>
+    <w:lvl w:ilvl="6" w:tentative="1">
+      <w:start w:val="1"/>
+      <w:numFmt w:val="decimal"/>
+      <w:lvlText w:val="%7."/>
+      <w:lvlJc w:val="left"/>
+      <w:pPr>
+        <w:tabs>
+          <w:tab w:val="num" w:pos="5040"/>
+        </w:tabs>
+        <w:ind w:left="5040" w:hanging="360"/>
+      </w:pPr>
+    </w:lvl>
+    <w:lvl w:ilvl="7" w:tentative="1">
+      <w:start w:val="1"/>
+      <w:numFmt w:val="decimal"/>
+      <w:lvlText w:val="%8."/>
+      <w:lvlJc w:val="left"/>
+      <w:pPr>
+        <w:tabs>
+          <w:tab w:val="num" w:pos="5760"/>
+        </w:tabs>
+        <w:ind w:left="5760" w:hanging="360"/>
+      </w:pPr>
+    </w:lvl>
+    <w:lvl w:ilvl="8" w:tentative="1">
+      <w:start w:val="1"/>
+      <w:numFmt w:val="decimal"/>
+      <w:lvlText w:val="%9."/>
+      <w:lvlJc w:val="left"/>
+      <w:pPr>
+        <w:tabs>
+          <w:tab w:val="num" w:pos="6480"/>
+        </w:tabs>
+        <w:ind w:left="6480" w:hanging="360"/>
+      </w:pPr>
+    </w:lvl>
+  </w:abstractNum>
+  <w:abstractNum w:abstractNumId="13" w15:restartNumberingAfterBreak="0">
     <w:nsid w:val="65011375"/>
     <w:multiLevelType w:val="multilevel"/>
     <w:tmpl w:val="2C54208A"/>
@@ -6553,7 +7310,7 @@
       </w:rPr>
     </w:lvl>
   </w:abstractNum>
-  <w:abstractNum w:abstractNumId="11" w15:restartNumberingAfterBreak="0">
+  <w:abstractNum w:abstractNumId="14" w15:restartNumberingAfterBreak="0">
     <w:nsid w:val="65D14F93"/>
     <w:multiLevelType w:val="multilevel"/>
     <w:tmpl w:val="1AB84EE4"/>
@@ -6702,7 +7459,7 @@
       </w:rPr>
     </w:lvl>
   </w:abstractNum>
-  <w:abstractNum w:abstractNumId="12" w15:restartNumberingAfterBreak="0">
+  <w:abstractNum w:abstractNumId="15" w15:restartNumberingAfterBreak="0">
     <w:nsid w:val="689159F2"/>
     <w:multiLevelType w:val="multilevel"/>
     <w:tmpl w:val="C2B05358"/>
@@ -6851,7 +7608,7 @@
       </w:rPr>
     </w:lvl>
   </w:abstractNum>
-  <w:abstractNum w:abstractNumId="13" w15:restartNumberingAfterBreak="0">
+  <w:abstractNum w:abstractNumId="16" w15:restartNumberingAfterBreak="0">
     <w:nsid w:val="6FAB4235"/>
     <w:multiLevelType w:val="multilevel"/>
     <w:tmpl w:val="679C3810"/>
@@ -7000,7 +7757,7 @@
       </w:rPr>
     </w:lvl>
   </w:abstractNum>
-  <w:abstractNum w:abstractNumId="14" w15:restartNumberingAfterBreak="0">
+  <w:abstractNum w:abstractNumId="17" w15:restartNumberingAfterBreak="0">
     <w:nsid w:val="70A07535"/>
     <w:multiLevelType w:val="multilevel"/>
     <w:tmpl w:val="678A6F5E"/>
@@ -7149,7 +7906,7 @@
       </w:rPr>
     </w:lvl>
   </w:abstractNum>
-  <w:abstractNum w:abstractNumId="15" w15:restartNumberingAfterBreak="0">
+  <w:abstractNum w:abstractNumId="18" w15:restartNumberingAfterBreak="0">
     <w:nsid w:val="77E84CDD"/>
     <w:multiLevelType w:val="multilevel"/>
     <w:tmpl w:val="E2929168"/>
@@ -7298,7 +8055,7 @@
       </w:rPr>
     </w:lvl>
   </w:abstractNum>
-  <w:abstractNum w:abstractNumId="16" w15:restartNumberingAfterBreak="0">
+  <w:abstractNum w:abstractNumId="19" w15:restartNumberingAfterBreak="0">
     <w:nsid w:val="7AFF4E9E"/>
     <w:multiLevelType w:val="multilevel"/>
     <w:tmpl w:val="834A37B0"/>
@@ -7447,7 +8204,7 @@
       </w:rPr>
     </w:lvl>
   </w:abstractNum>
-  <w:abstractNum w:abstractNumId="17" w15:restartNumberingAfterBreak="0">
+  <w:abstractNum w:abstractNumId="20" w15:restartNumberingAfterBreak="0">
     <w:nsid w:val="7E35134D"/>
     <w:multiLevelType w:val="multilevel"/>
     <w:tmpl w:val="4942BF4C"/>
@@ -7597,13 +8354,13 @@
     </w:lvl>
   </w:abstractNum>
   <w:num w:numId="1" w16cid:durableId="1707094719">
-    <w:abstractNumId w:val="16"/>
+    <w:abstractNumId w:val="19"/>
   </w:num>
   <w:num w:numId="2" w16cid:durableId="1947616606">
-    <w:abstractNumId w:val="15"/>
+    <w:abstractNumId w:val="18"/>
   </w:num>
   <w:num w:numId="3" w16cid:durableId="540941206">
-    <w:abstractNumId w:val="13"/>
+    <w:abstractNumId w:val="16"/>
   </w:num>
   <w:num w:numId="4" w16cid:durableId="1492015741">
     <w:abstractNumId w:val="0"/>
@@ -7615,31 +8372,31 @@
     <w:abstractNumId w:val="4"/>
   </w:num>
   <w:num w:numId="7" w16cid:durableId="409816493">
-    <w:abstractNumId w:val="9"/>
+    <w:abstractNumId w:val="11"/>
   </w:num>
   <w:num w:numId="8" w16cid:durableId="1910580179">
-    <w:abstractNumId w:val="8"/>
+    <w:abstractNumId w:val="10"/>
   </w:num>
   <w:num w:numId="9" w16cid:durableId="1847284023">
     <w:abstractNumId w:val="5"/>
   </w:num>
   <w:num w:numId="10" w16cid:durableId="10763270">
-    <w:abstractNumId w:val="11"/>
+    <w:abstractNumId w:val="14"/>
   </w:num>
   <w:num w:numId="11" w16cid:durableId="1882356390">
-    <w:abstractNumId w:val="12"/>
+    <w:abstractNumId w:val="15"/>
   </w:num>
   <w:num w:numId="12" w16cid:durableId="676152290">
-    <w:abstractNumId w:val="17"/>
+    <w:abstractNumId w:val="20"/>
   </w:num>
   <w:num w:numId="13" w16cid:durableId="1666863156">
-    <w:abstractNumId w:val="14"/>
+    <w:abstractNumId w:val="17"/>
   </w:num>
   <w:num w:numId="14" w16cid:durableId="798112398">
     <w:abstractNumId w:val="6"/>
   </w:num>
   <w:num w:numId="15" w16cid:durableId="1657487143">
-    <w:abstractNumId w:val="10"/>
+    <w:abstractNumId w:val="13"/>
   </w:num>
   <w:num w:numId="16" w16cid:durableId="1067269044">
     <w:abstractNumId w:val="2"/>
@@ -7649,6 +8406,15 @@
   </w:num>
   <w:num w:numId="18" w16cid:durableId="766921136">
     <w:abstractNumId w:val="3"/>
+  </w:num>
+  <w:num w:numId="19" w16cid:durableId="901988900">
+    <w:abstractNumId w:val="9"/>
+  </w:num>
+  <w:num w:numId="20" w16cid:durableId="96607702">
+    <w:abstractNumId w:val="8"/>
+  </w:num>
+  <w:num w:numId="21" w16cid:durableId="1643270229">
+    <w:abstractNumId w:val="12"/>
   </w:num>
 </w:numbering>
 </file>

</xml_diff>

<commit_message>
feat: Execution orchestrator improvements, knowledge extraction, extension target tab, and live validation updates
- Execution orchestrator: improve artifact registry, budgets, completion engine, phase state machine, and engine resilience
- Knowledge extraction: update extraction engine for better accuracy
- Mission blueprint builder and workflow orchestrator improvements
- Runtime state manager: execution result refinements
- Semantic execution kernel: engine and entity registry updates
- Mission ledger service improvements
- Extension: add target_tab.ts background module, update service-worker, extractor, useWorkflow hook, types, and routing tests
- Live sidepanel validation: update run script and latest validation results JSON
- Tests: update unit and integration tests for all above components
- chore: exclude browser profile dirs, large trace logs, and screenshot failure files from git
</commit_message>
<xml_diff>
--- a/15.docx
+++ b/15.docx
@@ -2816,15 +2816,7 @@
     </w:p>
     <w:p>
       <w:r>
-        <w:t xml:space="preserve">Open Google Search and search for: `Hyderabad software </w:t>
-      </w:r>
-      <w:proofErr w:type="gramStart"/>
-      <w:r>
-        <w:t>companies</w:t>
-      </w:r>
-      <w:proofErr w:type="gramEnd"/>
-      <w:r>
-        <w:t xml:space="preserve"> careers`.</w:t>
+        <w:t>Open Google Search and search for: `Hyderabad software companies careers`.</w:t>
       </w:r>
     </w:p>
     <w:p>
@@ -3562,15 +3554,7 @@
     </w:p>
     <w:p>
       <w:r>
-        <w:t xml:space="preserve">Open Google Search and search for: `Hyderabad software </w:t>
-      </w:r>
-      <w:proofErr w:type="gramStart"/>
-      <w:r>
-        <w:t>companies</w:t>
-      </w:r>
-      <w:proofErr w:type="gramEnd"/>
-      <w:r>
-        <w:t xml:space="preserve"> careers`.</w:t>
+        <w:t>Open Google Search and search for: `Hyderabad software companies careers`.</w:t>
       </w:r>
     </w:p>
     <w:p>
@@ -4645,15 +4629,7 @@
       </w:r>
       <w:proofErr w:type="spellEnd"/>
       <w:r>
-        <w:t xml:space="preserve"> </w:t>
-      </w:r>
-      <w:proofErr w:type="gramStart"/>
-      <w:r>
-        <w:t>first</w:t>
-      </w:r>
-      <w:proofErr w:type="gramEnd"/>
-      <w:r>
-        <w:t xml:space="preserve"> we will verify is that present application is capable of doing all the tasks and what tech </w:t>
+        <w:t xml:space="preserve"> first we will verify is that present application is capable of doing all the tasks and what tech </w:t>
       </w:r>
       <w:proofErr w:type="spellStart"/>
       <w:r>
@@ -4690,22 +4666,10 @@
           <w:b/>
           <w:bCs/>
         </w:rPr>
-        <w:t xml:space="preserve"> / similar </w:t>
-      </w:r>
-      <w:proofErr w:type="gramStart"/>
-      <w:r>
-        <w:rPr>
-          <w:b/>
-          <w:bCs/>
-        </w:rPr>
-        <w:t>agents</w:t>
-      </w:r>
-      <w:r>
-        <w:t>:,</w:t>
-      </w:r>
-      <w:proofErr w:type="gramEnd"/>
-      <w:r>
-        <w:t xml:space="preserve"> </w:t>
+        <w:t xml:space="preserve"> / similar agents</w:t>
+      </w:r>
+      <w:r>
+        <w:t xml:space="preserve">:, </w:t>
       </w:r>
       <w:r>
         <w:rPr>
@@ -5212,15 +5176,7 @@
         </w:numPr>
       </w:pPr>
       <w:r>
-        <w:t xml:space="preserve">VT-01 to VT-10 </w:t>
-      </w:r>
-      <w:proofErr w:type="gramStart"/>
-      <w:r>
-        <w:t>are</w:t>
-      </w:r>
-      <w:proofErr w:type="gramEnd"/>
-      <w:r>
-        <w:t xml:space="preserve"> visually run through the extension,</w:t>
+        <w:t>VT-01 to VT-10 are visually run through the extension,</w:t>
       </w:r>
     </w:p>
     <w:p>
@@ -5268,6 +5224,12 @@
       </w:r>
     </w:p>
     <w:p>
+      <w:pPr>
+        <w:rPr>
+          <w:b/>
+          <w:bCs/>
+        </w:rPr>
+      </w:pPr>
       <w:r>
         <w:t xml:space="preserve">So yes, we can build it. But the immediate next milestone is not “all features.” It is: </w:t>
       </w:r>
@@ -5279,6 +5241,307 @@
         <w:t>make the core browser-agent loop trustworthy.</w:t>
       </w:r>
     </w:p>
+    <w:p>
+      <w:pPr>
+        <w:rPr>
+          <w:b/>
+          <w:bCs/>
+        </w:rPr>
+      </w:pPr>
+      <w:r>
+        <w:rPr>
+          <w:b/>
+          <w:bCs/>
+        </w:rPr>
+        <w:br w:type="page"/>
+      </w:r>
+    </w:p>
+    <w:p>
+      <w:r>
+        <w:lastRenderedPageBreak/>
+        <w:t>I won’t give you a fake promise like “yes, guaranteed OpenAI-level in 8 weeks.” That would be hallucination. The genuine promise I can make is this:</w:t>
+      </w:r>
+    </w:p>
+    <w:p>
+      <w:r>
+        <w:rPr>
+          <w:b/>
+          <w:bCs/>
+        </w:rPr>
+        <w:t>Yes, it is technically possible to reach a strong OpenAI-style browser-agent MVP from the current app, with real visual proof, if we build by gates and stop claiming success until tasks pass.</w:t>
+      </w:r>
+      <w:r>
+        <w:br/>
+        <w:t xml:space="preserve">But “capable of any browser task a human can do” is not a fixed 8-week target. Even OpenAI’s current browser tools have limits: they pause for confirmation, may stop on sign-in/payment, and rely heavily on browser state, permissions, visual/DOM grounding, and safety controls. OpenAI’s docs say browser workflows pause when more info or confirmation is needed, and cloud browser does not complete sign-in/payment flows. So our target should be: </w:t>
+      </w:r>
+      <w:r>
+        <w:rPr>
+          <w:b/>
+          <w:bCs/>
+        </w:rPr>
+        <w:t>client-ready browser assistant MVP with proof</w:t>
+      </w:r>
+      <w:r>
+        <w:t>, then expand toward broad generality.</w:t>
+      </w:r>
+    </w:p>
+    <w:p>
+      <w:r>
+        <w:rPr>
+          <w:b/>
+          <w:bCs/>
+        </w:rPr>
+        <w:t>4-8 Week Roadmap</w:t>
+      </w:r>
+      <w:r>
+        <w:br/>
+      </w:r>
+      <w:r>
+        <w:rPr>
+          <w:b/>
+          <w:bCs/>
+        </w:rPr>
+        <w:t>Week 1: Stabilize Core Agent Loop</w:t>
+      </w:r>
+      <w:r>
+        <w:br/>
+        <w:t>Goal: no more narrow one-off fixes.</w:t>
+      </w:r>
+      <w:r>
+        <w:br/>
+        <w:t>Build: observe → plan → ground → execute → verify → recover → report loop.</w:t>
+      </w:r>
+      <w:r>
+        <w:br/>
+        <w:t>Proof: Task 1 and WhatsApp “open + detect login/contact field” run visually with artifacts.</w:t>
+      </w:r>
+      <w:r>
+        <w:br/>
+        <w:t>Gate: no action reaches Browser Control without selector/entity/file/tab grounding.</w:t>
+      </w:r>
+    </w:p>
+    <w:p>
+      <w:r>
+        <w:rPr>
+          <w:b/>
+          <w:bCs/>
+        </w:rPr>
+        <w:t>Week 2: Dynamic Interaction Grounding</w:t>
+      </w:r>
+      <w:r>
+        <w:br/>
+        <w:t>Goal: Gmail/WhatsApp/LinkedIn/SaaS pages become interactable.</w:t>
+      </w:r>
+      <w:r>
+        <w:br/>
+        <w:t xml:space="preserve">Build: DOM refresh, accessibility/role/text/placeholder locator ranking, </w:t>
+      </w:r>
+      <w:proofErr w:type="spellStart"/>
+      <w:r>
+        <w:t>contenteditable</w:t>
+      </w:r>
+      <w:proofErr w:type="spellEnd"/>
+      <w:r>
+        <w:t xml:space="preserve"> support, modal/autocomplete support.</w:t>
+      </w:r>
+      <w:r>
+        <w:br/>
+        <w:t>Proof: app can search a contact/user/item and draft text, without sending.</w:t>
+      </w:r>
+      <w:r>
+        <w:br/>
+        <w:t xml:space="preserve">Gate: if app is not logged in, it reports </w:t>
+      </w:r>
+      <w:proofErr w:type="spellStart"/>
+      <w:r>
+        <w:t>needs_login</w:t>
+      </w:r>
+      <w:proofErr w:type="spellEnd"/>
+      <w:r>
+        <w:t xml:space="preserve"> with screenshot/evidence.</w:t>
+      </w:r>
+    </w:p>
+    <w:p>
+      <w:r>
+        <w:rPr>
+          <w:b/>
+          <w:bCs/>
+        </w:rPr>
+        <w:t>Week 3: File Upload Broker</w:t>
+      </w:r>
+      <w:r>
+        <w:br/>
+        <w:t>Goal: local file tasks become real.</w:t>
+      </w:r>
+      <w:r>
+        <w:br/>
+        <w:t>Build: Downloads file resolver, allowed-file policy, upload control detection, attachment verification, no blind path guessing.</w:t>
+      </w:r>
+      <w:r>
+        <w:br/>
+        <w:t>Proof: upload Project_Tracker_Status.xlsx to a safe test upload page and verify accepted.</w:t>
+      </w:r>
+      <w:r>
+        <w:br/>
+        <w:t>Gate: file exists, selected, attached/uploaded, evidence captured.</w:t>
+      </w:r>
+    </w:p>
+    <w:p>
+      <w:r>
+        <w:rPr>
+          <w:b/>
+          <w:bCs/>
+        </w:rPr>
+        <w:t>Week 4: Critical Approval Flow</w:t>
+      </w:r>
+      <w:r>
+        <w:br/>
+        <w:t>Goal: safe automation with human control.</w:t>
+      </w:r>
+      <w:r>
+        <w:br/>
+        <w:t>Build: critical action classifier for send/message/email/upload-submit/payment/delete, draft-ready state, approve-to-send UI, timeline proof.</w:t>
+      </w:r>
+      <w:r>
+        <w:br/>
+        <w:t>Proof: WhatsApp task reaches “file attached to Rahul chat, waiting for approval,” but does not send automatically.</w:t>
+      </w:r>
+      <w:r>
+        <w:br/>
+        <w:t>Gate: critical actions never execute in Auto mode without explicit approval.</w:t>
+      </w:r>
+    </w:p>
+    <w:p>
+      <w:r>
+        <w:rPr>
+          <w:b/>
+          <w:bCs/>
+        </w:rPr>
+        <w:lastRenderedPageBreak/>
+        <w:t>Week 5: Research/Extraction Milestone</w:t>
+      </w:r>
+      <w:r>
+        <w:br/>
+        <w:t>Goal: all research/data tasks work generically.</w:t>
+      </w:r>
+      <w:r>
+        <w:br/>
+        <w:t>Validate Tasks 1-6: search summarize, careers extraction, LinkedIn jobs discovery, pricing comparison, docs extraction, multi-page directory.</w:t>
+      </w:r>
+      <w:r>
+        <w:br/>
+        <w:t>Gate: tables/reports are evidence-backed with URLs and source counts.</w:t>
+      </w:r>
+    </w:p>
+    <w:p>
+      <w:r>
+        <w:rPr>
+          <w:b/>
+          <w:bCs/>
+        </w:rPr>
+        <w:t>Week 6: Forms, Signup, Upload Milestone</w:t>
+      </w:r>
+      <w:r>
+        <w:br/>
+        <w:t>Goal: complete safe real-world workflows.</w:t>
+      </w:r>
+      <w:r>
+        <w:br/>
+        <w:t>Validate Tasks 7-9: SaaS signup, real file upload, safe public/test form.</w:t>
+      </w:r>
+      <w:r>
+        <w:br/>
+        <w:t>Gate: screenshots, status text, validation errors, final state proof.</w:t>
+      </w:r>
+    </w:p>
+    <w:p>
+      <w:r>
+        <w:rPr>
+          <w:b/>
+          <w:bCs/>
+        </w:rPr>
+        <w:t>Week 7: Recovery, Observability, Benchmarking</w:t>
+      </w:r>
+      <w:r>
+        <w:br/>
+        <w:t>Goal: client confidence.</w:t>
+      </w:r>
+      <w:r>
+        <w:br/>
+        <w:t>Build: run replay, failure taxonomy, retry budgets, stuck detection, screenshots per phase, benchmark dashboard.</w:t>
+      </w:r>
+      <w:r>
+        <w:br/>
+        <w:t>Proof: 10-task validation report with pass/fail, evidence links, screenshots, timings.</w:t>
+      </w:r>
+    </w:p>
+    <w:p>
+      <w:r>
+        <w:rPr>
+          <w:b/>
+          <w:bCs/>
+        </w:rPr>
+        <w:t>Week 8: Client-Ready Demo Package</w:t>
+      </w:r>
+      <w:r>
+        <w:br/>
+        <w:t>Goal: submit/demo with honesty.</w:t>
+      </w:r>
+      <w:r>
+        <w:br/>
+        <w:t>Build: polished side panel, permission wording, approval UX, known-limits doc, install/demo guide.</w:t>
+      </w:r>
+      <w:r>
+        <w:br/>
+        <w:t>Proof: live demo script plus archived run artifacts for all 10 validation tasks.</w:t>
+      </w:r>
+    </w:p>
+    <w:p>
+      <w:r>
+        <w:rPr>
+          <w:b/>
+          <w:bCs/>
+        </w:rPr>
+        <w:t>Current Truth</w:t>
+      </w:r>
+      <w:r>
+        <w:br/>
+        <w:t>We are not client-ready today.</w:t>
+      </w:r>
+      <w:r>
+        <w:br/>
+        <w:t>We have a useful foundation: extension, backend, mission ledger, safety gates, timeline evidence, partial research automation.</w:t>
+      </w:r>
+      <w:r>
+        <w:br/>
+        <w:t xml:space="preserve">The biggest missing core is: </w:t>
+      </w:r>
+      <w:r>
+        <w:rPr>
+          <w:b/>
+          <w:bCs/>
+        </w:rPr>
+        <w:t>dynamic page grounding + file broker + critical approval execution path</w:t>
+      </w:r>
+      <w:r>
+        <w:t>.</w:t>
+      </w:r>
+    </w:p>
+    <w:p>
+      <w:r>
+        <w:t>So from today, the next work item is clear:</w:t>
+      </w:r>
+    </w:p>
+    <w:p>
+      <w:r>
+        <w:rPr>
+          <w:b/>
+          <w:bCs/>
+        </w:rPr>
+        <w:t>Week 1/2 priority: Dynamic Interaction Grounding, starting with WhatsApp Web contact/message/file controls, but implemented generically for modern web apps.</w:t>
+      </w:r>
+    </w:p>
+    <w:p/>
     <w:p/>
     <w:sectPr>
       <w:pgSz w:w="11906" w:h="16838"/>

</xml_diff>